<commit_message>
Rename project to HarmonyBlend (HB) across README, roadmap docs, and build scripts
The GitHub repo name confirmed this is the actual product name, not a
leftover from an earlier concept as previously assumed. Regenerated
roadmap.pdf/roadmap.docx from the updated docs/roadmap.md source.

Co-Authored-By: Claude Sonnet 5 <noreply@anthropic.com>
</commit_message>
<xml_diff>
--- a/docs/output/roadmap.docx
+++ b/docs/output/roadmap.docx
@@ -30,7 +30,7 @@
           <w:sz w:val="52"/>
           <w:szCs w:val="52"/>
         </w:rPr>
-        <w:t xml:space="preserve">B2B Sipariş &amp; Bayi Yönetim Sistemi</w:t>
+        <w:t xml:space="preserve">HarmonyBlend (HB)</w:t>
       </w:r>
     </w:p>
     <w:p>
@@ -43,7 +43,7 @@
           <w:sz w:val="26"/>
           <w:szCs w:val="26"/>
         </w:rPr>
-        <w:t xml:space="preserve">Sistem Mimarisi, Veri Modeli ve Fazlandırılmış Yol Haritası</w:t>
+        <w:t xml:space="preserve">B2B Sipariş &amp; Bayi Yönetim Sistemi — Sistem Mimarisi, Veri Modeli ve Fazlandırılmış Yol Haritası</w:t>
       </w:r>
     </w:p>
     <w:p>
@@ -87,7 +87,7 @@
         <w:rPr>
           <w:color w:val="1A2420"/>
         </w:rPr>
-        <w:t xml:space="preserve">B2B Sipariş &amp;amp; Bayi Yönetim Sistemi</w:t>
+        <w:t xml:space="preserve">HarmonyBlend (HB)</w:t>
       </w:r>
     </w:p>
     <w:p>
@@ -101,8 +101,8 @@
           <w:szCs w:val="21"/>
         </w:rPr>
         <w:t xml:space="preserve">Fabrika/genel merkez ile franchise bayiler arasındaki sipariş, ödeme ve cari
-tahsilat süreçlerini yöneten çok markalı bayi portalı için mimari, veri
-modeli, iş akışı, teknoloji ve ekran planı.</w:t>
+tahsilat süreçlerini yöneten çok markalı bayi portalı. Bu doküman mimari,
+veri modeli, iş akışı, teknoloji ve ekran planını içerir.</w:t>
       </w:r>
     </w:p>
     <w:p>

</xml_diff>

<commit_message>
Roadmap: eksik kullanıcı hesabı ekranını ve Faz 3 UX kalemlerini ekle
- Faz 2'ye "bayi kullanıcı hesabı oluşturma" eklendi — şu an yalnızca
  seed script ile mümkün, bayi CRUD'una eklenmeden bir bayi gerçekte
  giriş yapamıyor
- Faz 3'e toast bildirim sistemi ve dark mode + erişilebilirlik
  (focus-visible, prefers-reduced-motion) eklendi
- roadmap.pdf/roadmap.docx yeniden üretildi

Co-Authored-By: Claude Sonnet 5 <noreply@anthropic.com>
</commit_message>
<xml_diff>
--- a/docs/output/roadmap.docx
+++ b/docs/output/roadmap.docx
@@ -535,56 +535,6 @@
     </w:p>
     <w:p>
       <w:pPr>
-        <w:spacing w:after="120"/>
-      </w:pPr>
-      <w:r>
-        <w:rPr>
-          <w:b/>
-          <w:bCs/>
-          <w:color w:val="1A2420"/>
-          <w:sz w:val="21"/>
-          <w:szCs w:val="21"/>
-        </w:rPr>
-        <w:t xml:space="preserve">Çıkış kriteri —</w:t>
-      </w:r>
-      <w:r>
-        <w:rPr>
-          <w:color w:val="1A2420"/>
-          <w:sz w:val="21"/>
-          <w:szCs w:val="21"/>
-        </w:rPr>
-        <w:t xml:space="preserve"> bir admin yeni bir bayiyi bir markaya bağlayıp, o bayinin
-sadece o markanın kataloğunu gördüğünü doğrulayabiliyor.</w:t>
-      </w:r>
-    </w:p>
-    <w:p>
-      <w:pPr>
-        <w:pStyle w:val="Heading2"/>
-        <w:spacing w:after="100" w:before="220"/>
-      </w:pPr>
-      <w:r>
-        <w:rPr>
-          <w:color w:val="1A2420"/>
-        </w:rPr>
-        <w:t xml:space="preserve">Faz 3 — Sipariş &amp;amp; Mock Ödeme Akışı</w:t>
-      </w:r>
-    </w:p>
-    <w:p>
-      <w:pPr>
-        <w:spacing w:after="120"/>
-      </w:pPr>
-      <w:r>
-        <w:rPr>
-          <w:color w:val="1A2420"/>
-          <w:sz w:val="21"/>
-          <w:szCs w:val="21"/>
-        </w:rPr>
-        <w:t xml:space="preserve">Hedef: Bayi tarafında sepetten siparişe; ödeme tipine göre dallanan checkout
-ve durum makinesi.</w:t>
-      </w:r>
-    </w:p>
-    <w:p>
-      <w:pPr>
         <w:pStyle w:val="ListParagraph"/>
         <w:numPr>
           <w:ilvl w:val="0"/>
@@ -594,10 +544,89 @@
       </w:pPr>
       <w:r>
         <w:rPr>
-          <w:sz w:val="21"/>
-          <w:szCs w:val="21"/>
-        </w:rPr>
-        <w:t xml:space="preserve">Sepet ve checkout ekranı (marka bazlı katalog)</w:t>
+          <w:b/>
+          <w:bCs/>
+          <w:sz w:val="21"/>
+          <w:szCs w:val="21"/>
+        </w:rPr>
+        <w:t xml:space="preserve">[Eksik — sonradan eklendi]</w:t>
+      </w:r>
+      <w:r>
+        <w:rPr>
+          <w:sz w:val="21"/>
+          <w:szCs w:val="21"/>
+        </w:rPr>
+        <w:t xml:space="preserve"> Bayi kullanıcı hesabı oluşturma ekranı:
+admin&amp;#39;in bir bayiye kullanıcı adı/e-posta + şifre tanımlayıp </w:t>
+      </w:r>
+      <w:r>
+        <w:rPr>
+          <w:rFonts w:ascii="Consolas" w:cs="Consolas" w:eastAsia="Consolas" w:hAnsi="Consolas"/>
+          <w:color w:val="1F5F56"/>
+          <w:sz w:val="21"/>
+          <w:szCs w:val="21"/>
+        </w:rPr>
+        <w:t xml:space="preserve">dealer_user</w:t>
+      </w:r>
+      <w:r>
+        <w:rPr>
+          <w:sz w:val="21"/>
+          <w:szCs w:val="21"/>
+        </w:rPr>
+        <w:t xml:space="preserve">
+rolüyle giriş yapabilecek bir hesap açması. Şu an bu yalnızca elle
+(seed script) yapılabiliyor — bayi CRUD&amp;#39;una eklenmeden bir bayi gerçekte
+panele giriş yapamaz.</w:t>
+      </w:r>
+    </w:p>
+    <w:p>
+      <w:pPr>
+        <w:spacing w:after="120"/>
+      </w:pPr>
+      <w:r>
+        <w:rPr>
+          <w:b/>
+          <w:bCs/>
+          <w:color w:val="1A2420"/>
+          <w:sz w:val="21"/>
+          <w:szCs w:val="21"/>
+        </w:rPr>
+        <w:t xml:space="preserve">Çıkış kriteri —</w:t>
+      </w:r>
+      <w:r>
+        <w:rPr>
+          <w:color w:val="1A2420"/>
+          <w:sz w:val="21"/>
+          <w:szCs w:val="21"/>
+        </w:rPr>
+        <w:t xml:space="preserve"> bir admin yeni bir bayiyi bir markaya bağlayıp, o bayinin
+sadece o markanın kataloğunu gördüğünü doğrulayabiliyor.</w:t>
+      </w:r>
+    </w:p>
+    <w:p>
+      <w:pPr>
+        <w:pStyle w:val="Heading2"/>
+        <w:spacing w:after="100" w:before="220"/>
+      </w:pPr>
+      <w:r>
+        <w:rPr>
+          <w:color w:val="1A2420"/>
+        </w:rPr>
+        <w:t xml:space="preserve">Faz 3 — Sipariş &amp;amp; Mock Ödeme Akışı</w:t>
+      </w:r>
+    </w:p>
+    <w:p>
+      <w:pPr>
+        <w:spacing w:after="120"/>
+      </w:pPr>
+      <w:r>
+        <w:rPr>
+          <w:color w:val="1A2420"/>
+          <w:sz w:val="21"/>
+          <w:szCs w:val="21"/>
+        </w:rPr>
+        <w:t xml:space="preserve">Hedef: Bayi tarafında sepetten siparişe; ödeme tipine göre dallanan checkout
+ve durum makinesi.</w:t>
       </w:r>
     </w:p>
     <w:p>
@@ -614,7 +643,7 @@
           <w:sz w:val="21"/>
           <w:szCs w:val="21"/>
         </w:rPr>
-        <w:t xml:space="preserve">Ödeme tipine göre dinamik checkout adımları</w:t>
+        <w:t xml:space="preserve">Sepet ve checkout ekranı (marka bazlı katalog)</w:t>
       </w:r>
     </w:p>
     <w:p>
@@ -628,35 +657,10 @@
       </w:pPr>
       <w:r>
         <w:rPr>
-          <w:rFonts w:ascii="Consolas" w:cs="Consolas" w:eastAsia="Consolas" w:hAnsi="Consolas"/>
-          <w:color w:val="1F5F56"/>
-          <w:sz w:val="21"/>
-          <w:szCs w:val="21"/>
-        </w:rPr>
-        <w:t xml:space="preserve">orders</w:t>
-      </w:r>
-      <w:r>
-        <w:rPr>
-          <w:sz w:val="21"/>
-          <w:szCs w:val="21"/>
-        </w:rPr>
-        <w:t xml:space="preserve"> / </w:t>
-      </w:r>
-      <w:r>
-        <w:rPr>
-          <w:rFonts w:ascii="Consolas" w:cs="Consolas" w:eastAsia="Consolas" w:hAnsi="Consolas"/>
-          <w:color w:val="1F5F56"/>
-          <w:sz w:val="21"/>
-          <w:szCs w:val="21"/>
-        </w:rPr>
-        <w:t xml:space="preserve">order_items</w:t>
-      </w:r>
-      <w:r>
-        <w:rPr>
-          <w:sz w:val="21"/>
-          <w:szCs w:val="21"/>
-        </w:rPr>
-        <w:t xml:space="preserve"> oluşturma, durum makinesi implementasyonu</w:t>
+          <w:sz w:val="21"/>
+          <w:szCs w:val="21"/>
+        </w:rPr>
+        <w:t xml:space="preserve">Ödeme tipine göre dinamik checkout adımları</w:t>
       </w:r>
     </w:p>
     <w:p>
@@ -675,14 +679,14 @@
           <w:sz w:val="21"/>
           <w:szCs w:val="21"/>
         </w:rPr>
-        <w:t xml:space="preserve">PaymentProvider</w:t>
-      </w:r>
-      <w:r>
-        <w:rPr>
-          <w:sz w:val="21"/>
-          <w:szCs w:val="21"/>
-        </w:rPr>
-        <w:t xml:space="preserve"> arayüzü + </w:t>
+        <w:t xml:space="preserve">orders</w:t>
+      </w:r>
+      <w:r>
+        <w:rPr>
+          <w:sz w:val="21"/>
+          <w:szCs w:val="21"/>
+        </w:rPr>
+        <w:t xml:space="preserve"> / </w:t>
       </w:r>
       <w:r>
         <w:rPr>
@@ -691,7 +695,14 @@
           <w:sz w:val="21"/>
           <w:szCs w:val="21"/>
         </w:rPr>
-        <w:t xml:space="preserve">MockPosProvider</w:t>
+        <w:t xml:space="preserve">order_items</w:t>
+      </w:r>
+      <w:r>
+        <w:rPr>
+          <w:sz w:val="21"/>
+          <w:szCs w:val="21"/>
+        </w:rPr>
+        <w:t xml:space="preserve"> oluşturma, durum makinesi implementasyonu</w:t>
       </w:r>
     </w:p>
     <w:p>
@@ -710,6 +721,41 @@
           <w:sz w:val="21"/>
           <w:szCs w:val="21"/>
         </w:rPr>
+        <w:t xml:space="preserve">PaymentProvider</w:t>
+      </w:r>
+      <w:r>
+        <w:rPr>
+          <w:sz w:val="21"/>
+          <w:szCs w:val="21"/>
+        </w:rPr>
+        <w:t xml:space="preserve"> arayüzü + </w:t>
+      </w:r>
+      <w:r>
+        <w:rPr>
+          <w:rFonts w:ascii="Consolas" w:cs="Consolas" w:eastAsia="Consolas" w:hAnsi="Consolas"/>
+          <w:color w:val="1F5F56"/>
+          <w:sz w:val="21"/>
+          <w:szCs w:val="21"/>
+        </w:rPr>
+        <w:t xml:space="preserve">MockPosProvider</w:t>
+      </w:r>
+    </w:p>
+    <w:p>
+      <w:pPr>
+        <w:pStyle w:val="ListParagraph"/>
+        <w:numPr>
+          <w:ilvl w:val="0"/>
+          <w:numId w:val="1"/>
+        </w:numPr>
+        <w:spacing w:after="60"/>
+      </w:pPr>
+      <w:r>
+        <w:rPr>
+          <w:rFonts w:ascii="Consolas" w:cs="Consolas" w:eastAsia="Consolas" w:hAnsi="Consolas"/>
+          <w:color w:val="1F5F56"/>
+          <w:sz w:val="21"/>
+          <w:szCs w:val="21"/>
+        </w:rPr>
         <w:t xml:space="preserve">order_status_history</w:t>
       </w:r>
       <w:r>
@@ -718,6 +764,106 @@
           <w:szCs w:val="21"/>
         </w:rPr>
         <w:t xml:space="preserve"> ile denetim izi</w:t>
+      </w:r>
+    </w:p>
+    <w:p>
+      <w:pPr>
+        <w:pStyle w:val="ListParagraph"/>
+        <w:numPr>
+          <w:ilvl w:val="0"/>
+          <w:numId w:val="1"/>
+        </w:numPr>
+        <w:spacing w:after="60"/>
+      </w:pPr>
+      <w:r>
+        <w:rPr>
+          <w:sz w:val="21"/>
+          <w:szCs w:val="21"/>
+        </w:rPr>
+        <w:t xml:space="preserve">Toast bildirim sistemi (sipariş oluşturuldu / ödeme başarısız gibi
+başarı-hata mesajları için — </w:t>
+      </w:r>
+      <w:r>
+        <w:rPr>
+          <w:rFonts w:ascii="Consolas" w:cs="Consolas" w:eastAsia="Consolas" w:hAnsi="Consolas"/>
+          <w:color w:val="1F5F56"/>
+          <w:sz w:val="21"/>
+          <w:szCs w:val="21"/>
+        </w:rPr>
+        <w:t xml:space="preserve">alert()</w:t>
+      </w:r>
+      <w:r>
+        <w:rPr>
+          <w:sz w:val="21"/>
+          <w:szCs w:val="21"/>
+        </w:rPr>
+        <w:t xml:space="preserve">/</w:t>
+      </w:r>
+      <w:r>
+        <w:rPr>
+          <w:rFonts w:ascii="Consolas" w:cs="Consolas" w:eastAsia="Consolas" w:hAnsi="Consolas"/>
+          <w:color w:val="1F5F56"/>
+          <w:sz w:val="21"/>
+          <w:szCs w:val="21"/>
+        </w:rPr>
+        <w:t xml:space="preserve">confirm()</w:t>
+      </w:r>
+      <w:r>
+        <w:rPr>
+          <w:sz w:val="21"/>
+          <w:szCs w:val="21"/>
+        </w:rPr>
+        <w:t xml:space="preserve"> yerine)</w:t>
+      </w:r>
+    </w:p>
+    <w:p>
+      <w:pPr>
+        <w:pStyle w:val="ListParagraph"/>
+        <w:numPr>
+          <w:ilvl w:val="0"/>
+          <w:numId w:val="1"/>
+        </w:numPr>
+        <w:spacing w:after="60"/>
+      </w:pPr>
+      <w:r>
+        <w:rPr>
+          <w:sz w:val="21"/>
+          <w:szCs w:val="21"/>
+        </w:rPr>
+        <w:t xml:space="preserve">Dark mode toggle + erişilebilirlik dokunuşları (</w:t>
+      </w:r>
+      <w:r>
+        <w:rPr>
+          <w:rFonts w:ascii="Consolas" w:cs="Consolas" w:eastAsia="Consolas" w:hAnsi="Consolas"/>
+          <w:color w:val="1F5F56"/>
+          <w:sz w:val="21"/>
+          <w:szCs w:val="21"/>
+        </w:rPr>
+        <w:t xml:space="preserve">focus-visible</w:t>
+      </w:r>
+      <w:r>
+        <w:rPr>
+          <w:sz w:val="21"/>
+          <w:szCs w:val="21"/>
+        </w:rPr>
+        <w:t xml:space="preserve"> odak
+halkası, </w:t>
+      </w:r>
+      <w:r>
+        <w:rPr>
+          <w:rFonts w:ascii="Consolas" w:cs="Consolas" w:eastAsia="Consolas" w:hAnsi="Consolas"/>
+          <w:color w:val="1F5F56"/>
+          <w:sz w:val="21"/>
+          <w:szCs w:val="21"/>
+        </w:rPr>
+        <w:t xml:space="preserve">prefers-reduced-motion</w:t>
+      </w:r>
+      <w:r>
+        <w:rPr>
+          <w:sz w:val="21"/>
+          <w:szCs w:val="21"/>
+        </w:rPr>
+        <w:t xml:space="preserve"> desteği)</w:t>
       </w:r>
     </w:p>
     <w:p>

</xml_diff>

<commit_message>
Roadmap: dark mode kalemini kaldır, sidebar daraltma ekle
Site zaten koyu temalı olduğu için ayrı bir dark-mode toggle'a gerek
yok. Faz 3'e sidebar'ı açılır/kapanır yapma eklendi.

Co-Authored-By: Claude Sonnet 5 <noreply@anthropic.com>
</commit_message>
<xml_diff>
--- a/docs/output/roadmap.docx
+++ b/docs/output/roadmap.docx
@@ -830,7 +830,7 @@
           <w:sz w:val="21"/>
           <w:szCs w:val="21"/>
         </w:rPr>
-        <w:t xml:space="preserve">Dark mode toggle + erişilebilirlik dokunuşları (</w:t>
+        <w:t xml:space="preserve">Erişilebilirlik dokunuşları (</w:t>
       </w:r>
       <w:r>
         <w:rPr>
@@ -846,8 +846,8 @@
           <w:sz w:val="21"/>
           <w:szCs w:val="21"/>
         </w:rPr>
-        <w:t xml:space="preserve"> odak
-halkası, </w:t>
+        <w:t xml:space="preserve"> odak halkası,
+</w:t>
       </w:r>
       <w:r>
         <w:rPr>
@@ -864,6 +864,23 @@
           <w:szCs w:val="21"/>
         </w:rPr>
         <w:t xml:space="preserve"> desteği)</w:t>
+      </w:r>
+    </w:p>
+    <w:p>
+      <w:pPr>
+        <w:pStyle w:val="ListParagraph"/>
+        <w:numPr>
+          <w:ilvl w:val="0"/>
+          <w:numId w:val="1"/>
+        </w:numPr>
+        <w:spacing w:after="60"/>
+      </w:pPr>
+      <w:r>
+        <w:rPr>
+          <w:sz w:val="21"/>
+          <w:szCs w:val="21"/>
+        </w:rPr>
+        <w:t xml:space="preserve">Sidebar menüsünü açılır/kapanır (daraltılabilir) yapma</w:t>
       </w:r>
     </w:p>
     <w:p>

</xml_diff>

<commit_message>
Roadmap: bayi kullanıcı hesabı oluşturmayı Faz 2'den Faz 3'e taşı
Faz 2'nin çıkış kriterini etkilemiyordu. Faz 3'te checkout akışını
test edebilmek için önce bayi girişi gerektiğinden ilk madde yapıldı.

Co-Authored-By: Claude Sonnet 5 <noreply@anthropic.com>
</commit_message>
<xml_diff>
--- a/docs/output/roadmap.docx
+++ b/docs/output/roadmap.docx
@@ -535,6 +535,56 @@
     </w:p>
     <w:p>
       <w:pPr>
+        <w:spacing w:after="120"/>
+      </w:pPr>
+      <w:r>
+        <w:rPr>
+          <w:b/>
+          <w:bCs/>
+          <w:color w:val="1A2420"/>
+          <w:sz w:val="21"/>
+          <w:szCs w:val="21"/>
+        </w:rPr>
+        <w:t xml:space="preserve">Çıkış kriteri —</w:t>
+      </w:r>
+      <w:r>
+        <w:rPr>
+          <w:color w:val="1A2420"/>
+          <w:sz w:val="21"/>
+          <w:szCs w:val="21"/>
+        </w:rPr>
+        <w:t xml:space="preserve"> bir admin yeni bir bayiyi bir markaya bağlayıp, o bayinin
+sadece o markanın kataloğunu gördüğünü doğrulayabiliyor.</w:t>
+      </w:r>
+    </w:p>
+    <w:p>
+      <w:pPr>
+        <w:pStyle w:val="Heading2"/>
+        <w:spacing w:after="100" w:before="220"/>
+      </w:pPr>
+      <w:r>
+        <w:rPr>
+          <w:color w:val="1A2420"/>
+        </w:rPr>
+        <w:t xml:space="preserve">Faz 3 — Sipariş &amp;amp; Mock Ödeme Akışı</w:t>
+      </w:r>
+    </w:p>
+    <w:p>
+      <w:pPr>
+        <w:spacing w:after="120"/>
+      </w:pPr>
+      <w:r>
+        <w:rPr>
+          <w:color w:val="1A2420"/>
+          <w:sz w:val="21"/>
+          <w:szCs w:val="21"/>
+        </w:rPr>
+        <w:t xml:space="preserve">Hedef: Bayi tarafında sepetten siparişe; ödeme tipine göre dallanan checkout
+ve durum makinesi.</w:t>
+      </w:r>
+    </w:p>
+    <w:p>
+      <w:pPr>
         <w:pStyle w:val="ListParagraph"/>
         <w:numPr>
           <w:ilvl w:val="0"/>
@@ -544,20 +594,11 @@
       </w:pPr>
       <w:r>
         <w:rPr>
-          <w:b/>
-          <w:bCs/>
-          <w:sz w:val="21"/>
-          <w:szCs w:val="21"/>
-        </w:rPr>
-        <w:t xml:space="preserve">[Eksik — sonradan eklendi]</w:t>
-      </w:r>
-      <w:r>
-        <w:rPr>
-          <w:sz w:val="21"/>
-          <w:szCs w:val="21"/>
-        </w:rPr>
-        <w:t xml:space="preserve"> Bayi kullanıcı hesabı oluşturma ekranı:
-admin&amp;#39;in bir bayiye kullanıcı adı/e-posta + şifre tanımlayıp </w:t>
+          <w:sz w:val="21"/>
+          <w:szCs w:val="21"/>
+        </w:rPr>
+        <w:t xml:space="preserve">Bayi kullanıcı hesabı oluşturma ekranı: admin&amp;#39;in bir bayiye kullanıcı
+adı/e-posta + şifre tanımlayıp </w:t>
       </w:r>
       <w:r>
         <w:rPr>
@@ -573,60 +614,10 @@
           <w:sz w:val="21"/>
           <w:szCs w:val="21"/>
         </w:rPr>
-        <w:t xml:space="preserve">
-rolüyle giriş yapabilecek bir hesap açması. Şu an bu yalnızca elle
-(seed script) yapılabiliyor — bayi CRUD&amp;#39;una eklenmeden bir bayi gerçekte
-panele giriş yapamaz.</w:t>
-      </w:r>
-    </w:p>
-    <w:p>
-      <w:pPr>
-        <w:spacing w:after="120"/>
-      </w:pPr>
-      <w:r>
-        <w:rPr>
-          <w:b/>
-          <w:bCs/>
-          <w:color w:val="1A2420"/>
-          <w:sz w:val="21"/>
-          <w:szCs w:val="21"/>
-        </w:rPr>
-        <w:t xml:space="preserve">Çıkış kriteri —</w:t>
-      </w:r>
-      <w:r>
-        <w:rPr>
-          <w:color w:val="1A2420"/>
-          <w:sz w:val="21"/>
-          <w:szCs w:val="21"/>
-        </w:rPr>
-        <w:t xml:space="preserve"> bir admin yeni bir bayiyi bir markaya bağlayıp, o bayinin
-sadece o markanın kataloğunu gördüğünü doğrulayabiliyor.</w:t>
-      </w:r>
-    </w:p>
-    <w:p>
-      <w:pPr>
-        <w:pStyle w:val="Heading2"/>
-        <w:spacing w:after="100" w:before="220"/>
-      </w:pPr>
-      <w:r>
-        <w:rPr>
-          <w:color w:val="1A2420"/>
-        </w:rPr>
-        <w:t xml:space="preserve">Faz 3 — Sipariş &amp;amp; Mock Ödeme Akışı</w:t>
-      </w:r>
-    </w:p>
-    <w:p>
-      <w:pPr>
-        <w:spacing w:after="120"/>
-      </w:pPr>
-      <w:r>
-        <w:rPr>
-          <w:color w:val="1A2420"/>
-          <w:sz w:val="21"/>
-          <w:szCs w:val="21"/>
-        </w:rPr>
-        <w:t xml:space="preserve">Hedef: Bayi tarafında sepetten siparişe; ödeme tipine göre dallanan checkout
-ve durum makinesi.</w:t>
+        <w:t xml:space="preserve"> rolüyle giriş yapabilecek
+bir hesap açması. Şu an bu yalnızca elle (seed script) yapılabiliyor —
+eklenmeden bir bayi gerçekte panele giriş yapamaz; checkout akışının
+test edilebilmesi için bu fazın ilk adımı olmalı.</w:t>
       </w:r>
     </w:p>
     <w:p>

</xml_diff>

<commit_message>
Roadmap: Faz 3'e sticky sidebar, bayi düzenleme modalı, currency input ekle
Bugünkü oturumda konuşulan ama ertelenen üç iyileştirme kayıt altına
alındı: sidebar'ın sayfa kaydırmasında sabit kalması, bayi listesinde
Ekle ile aynı modalı kullanan bir Düzenle butonu, ve maksimum bakiye
limiti alanının otomatik binlik ayraç + ₺ ile formatlanması.

Co-Authored-By: Claude Sonnet 5 <noreply@anthropic.com>
</commit_message>
<xml_diff>
--- a/docs/output/roadmap.docx
+++ b/docs/output/roadmap.docx
@@ -872,6 +872,111 @@
           <w:szCs w:val="21"/>
         </w:rPr>
         <w:t xml:space="preserve">Sidebar menüsünü açılır/kapanır (daraltılabilir) yapma</w:t>
+      </w:r>
+    </w:p>
+    <w:p>
+      <w:pPr>
+        <w:pStyle w:val="ListParagraph"/>
+        <w:numPr>
+          <w:ilvl w:val="0"/>
+          <w:numId w:val="1"/>
+        </w:numPr>
+        <w:spacing w:after="60"/>
+      </w:pPr>
+      <w:r>
+        <w:rPr>
+          <w:sz w:val="21"/>
+          <w:szCs w:val="21"/>
+        </w:rPr>
+        <w:t xml:space="preserve">Sidebar&amp;#39;ı sticky yapma — sayfa aşağı kaydırılsa bile kenar çubuğundaki
+öğeler sabit kalsın, içerikle birlikte yukarı/aşağı kaymasın</w:t>
+      </w:r>
+    </w:p>
+    <w:p>
+      <w:pPr>
+        <w:pStyle w:val="ListParagraph"/>
+        <w:numPr>
+          <w:ilvl w:val="0"/>
+          <w:numId w:val="1"/>
+        </w:numPr>
+        <w:spacing w:after="60"/>
+      </w:pPr>
+      <w:r>
+        <w:rPr>
+          <w:sz w:val="21"/>
+          <w:szCs w:val="21"/>
+        </w:rPr>
+        <w:t xml:space="preserve">Bayi listesinde &amp;quot;Düzenle&amp;quot; butonu — şu an düzenleme ayrı bir sayfada
+(</w:t>
+      </w:r>
+      <w:r>
+        <w:rPr>
+          <w:rFonts w:ascii="Consolas" w:cs="Consolas" w:eastAsia="Consolas" w:hAnsi="Consolas"/>
+          <w:color w:val="1F5F56"/>
+          <w:sz w:val="21"/>
+          <w:szCs w:val="21"/>
+        </w:rPr>
+        <w:t xml:space="preserve">/admin/dealers/[id]</w:t>
+      </w:r>
+      <w:r>
+        <w:rPr>
+          <w:sz w:val="21"/>
+          <w:szCs w:val="21"/>
+        </w:rPr>
+        <w:t xml:space="preserve">) yapılıyor; &amp;quot;Ekle&amp;quot; ile aynı 3 sekmeli modal
+açılıp mevcut bayinin ayarlarının (bir kısmının veya tamamının)
+aynı yerden değiştirilebilmesi</w:t>
+      </w:r>
+    </w:p>
+    <w:p>
+      <w:pPr>
+        <w:pStyle w:val="ListParagraph"/>
+        <w:numPr>
+          <w:ilvl w:val="0"/>
+          <w:numId w:val="1"/>
+        </w:numPr>
+        <w:spacing w:after="60"/>
+      </w:pPr>
+      <w:r>
+        <w:rPr>
+          <w:sz w:val="21"/>
+          <w:szCs w:val="21"/>
+        </w:rPr>
+        <w:t xml:space="preserve">&amp;quot;Ekle&amp;quot; modalındaki maksimum bakiye limiti alanını para birimi
+formatlı yapma — düz sayı (</w:t>
+      </w:r>
+      <w:r>
+        <w:rPr>
+          <w:rFonts w:ascii="Consolas" w:cs="Consolas" w:eastAsia="Consolas" w:hAnsi="Consolas"/>
+          <w:color w:val="1F5F56"/>
+          <w:sz w:val="21"/>
+          <w:szCs w:val="21"/>
+        </w:rPr>
+        <w:t xml:space="preserve">200000</w:t>
+      </w:r>
+      <w:r>
+        <w:rPr>
+          <w:sz w:val="21"/>
+          <w:szCs w:val="21"/>
+        </w:rPr>
+        <w:t xml:space="preserve">) yerine otomatik binlik ayraç ve
+₺ sembolüyle (</w:t>
+      </w:r>
+      <w:r>
+        <w:rPr>
+          <w:rFonts w:ascii="Consolas" w:cs="Consolas" w:eastAsia="Consolas" w:hAnsi="Consolas"/>
+          <w:color w:val="1F5F56"/>
+          <w:sz w:val="21"/>
+          <w:szCs w:val="21"/>
+        </w:rPr>
+        <w:t xml:space="preserve">200.000₺</w:t>
+      </w:r>
+      <w:r>
+        <w:rPr>
+          <w:sz w:val="21"/>
+          <w:szCs w:val="21"/>
+        </w:rPr>
+        <w:t xml:space="preserve">) gösterilsin</w:t>
       </w:r>
     </w:p>
     <w:p>

</xml_diff>

<commit_message>
Faz 3'ü tamamla: sticky/daraltılabilir sidebar, bayi düzenleme modalı, para birimi girişi, impersonation
- Admin ve bayi sidebar'ları sticky + daraltılabilir (localStorage'da kalıcı)
- Bayi "Düzenle" artık ayrı sayfa yerine "Ekle" ile aynı 3 sekmeli modalda
- Maksimum bakiye limiti alanı CurrencyInput ile binlik ayraç + ₺ formatlı
- Bayi listesinde marka/durum filtre formu
- Admin → bayi kullanıcısı olarak giriş (impersonation): NextAuth JWT
  update trigger'ı ile sunucu tarafında doğrulanan kimlik değişimi,
  bayi panelinde "orijinal hesaba dön" ile geri dönüş
- roadmap.md: Faz 1-3 tamamlandı olarak işaretlendi, impersonation
  dokümante edildi; PDF/DOCX çıktıları yeniden üretildi

Co-Authored-By: Claude Sonnet 5 <noreply@anthropic.com>
</commit_message>
<xml_diff>
--- a/docs/output/roadmap.docx
+++ b/docs/output/roadmap.docx
@@ -59,7 +59,7 @@
           <w:sz w:val="17"/>
           <w:szCs w:val="17"/>
         </w:rPr>
-        <w:t xml:space="preserve">Oluşturulma tarihi: 8 Ağustos 2026</w:t>
+        <w:t xml:space="preserve">Oluşturulma tarihi: 9 Ağustos 2026</w:t>
       </w:r>
     </w:p>
     <w:p>
@@ -231,7 +231,7 @@
         <w:rPr>
           <w:color w:val="1A2420"/>
         </w:rPr>
-        <w:t xml:space="preserve">Faz 1 — Temel Altyapı &amp;amp; Veri Modeli Kurulumu</w:t>
+        <w:t xml:space="preserve">Faz 1 — Temel Altyapı &amp;amp; Veri Modeli Kurulumu ✅ Tamamlandı</w:t>
       </w:r>
     </w:p>
     <w:p>
@@ -423,7 +423,7 @@
         <w:rPr>
           <w:color w:val="1A2420"/>
         </w:rPr>
-        <w:t xml:space="preserve">Faz 2 — Marka, Bayi ve Ürün Yönetimi</w:t>
+        <w:t xml:space="preserve">Faz 2 — Marka, Bayi ve Ürün Yönetimi ✅ Tamamlandı</w:t>
       </w:r>
     </w:p>
     <w:p>
@@ -566,7 +566,7 @@
         <w:rPr>
           <w:color w:val="1A2420"/>
         </w:rPr>
-        <w:t xml:space="preserve">Faz 3 — Sipariş &amp;amp; Mock Ödeme Akışı</w:t>
+        <w:t xml:space="preserve">Faz 3 — Sipariş &amp;amp; Mock Ödeme Akışı ✅ Tamamlandı</w:t>
       </w:r>
     </w:p>
     <w:p>
@@ -597,7 +597,7 @@
           <w:sz w:val="21"/>
           <w:szCs w:val="21"/>
         </w:rPr>
-        <w:t xml:space="preserve">Bayi kullanıcı hesabı oluşturma ekranı: admin&amp;#39;in bir bayiye kullanıcı
+        <w:t xml:space="preserve">Bayi kullanıcı hesabı oluşturma ekranı: admin bir bayiye kullanıcı
 adı/e-posta + şifre tanımlayıp </w:t>
       </w:r>
       <w:r>
@@ -615,9 +615,24 @@
           <w:szCs w:val="21"/>
         </w:rPr>
         <w:t xml:space="preserve"> rolüyle giriş yapabilecek
-bir hesap açması. Şu an bu yalnızca elle (seed script) yapılabiliyor —
-eklenmeden bir bayi gerçekte panele giriş yapamaz; checkout akışının
-test edilebilmesi için bu fazın ilk adımı olmalı.</w:t>
+bir hesap açıyor (</w:t>
+      </w:r>
+      <w:r>
+        <w:rPr>
+          <w:rFonts w:ascii="Consolas" w:cs="Consolas" w:eastAsia="Consolas" w:hAnsi="Consolas"/>
+          <w:color w:val="1F5F56"/>
+          <w:sz w:val="21"/>
+          <w:szCs w:val="21"/>
+        </w:rPr>
+        <w:t xml:space="preserve">/admin/dealers/[id]</w:t>
+      </w:r>
+      <w:r>
+        <w:rPr>
+          <w:sz w:val="21"/>
+          <w:szCs w:val="21"/>
+        </w:rPr>
+        <w:t xml:space="preserve">) — önceden yalnızca elle
+(seed script) yapılabiliyordu.</w:t>
       </w:r>
     </w:p>
     <w:p>
@@ -871,7 +886,24 @@
           <w:sz w:val="21"/>
           <w:szCs w:val="21"/>
         </w:rPr>
-        <w:t xml:space="preserve">Sidebar menüsünü açılır/kapanır (daraltılabilir) yapma</w:t>
+        <w:t xml:space="preserve">Sidebar menüsünü açılır/kapanır (daraltılabilir) yapma — admin ve bayi
+panelinde, tercih </w:t>
+      </w:r>
+      <w:r>
+        <w:rPr>
+          <w:rFonts w:ascii="Consolas" w:cs="Consolas" w:eastAsia="Consolas" w:hAnsi="Consolas"/>
+          <w:color w:val="1F5F56"/>
+          <w:sz w:val="21"/>
+          <w:szCs w:val="21"/>
+        </w:rPr>
+        <w:t xml:space="preserve">localStorage</w:t>
+      </w:r>
+      <w:r>
+        <w:rPr>
+          <w:sz w:val="21"/>
+          <w:szCs w:val="21"/>
+        </w:rPr>
+        <w:t xml:space="preserve">&amp;#39;da kalıcı</w:t>
       </w:r>
     </w:p>
     <w:p>
@@ -889,7 +921,7 @@
           <w:szCs w:val="21"/>
         </w:rPr>
         <w:t xml:space="preserve">Sidebar&amp;#39;ı sticky yapma — sayfa aşağı kaydırılsa bile kenar çubuğundaki
-öğeler sabit kalsın, içerikle birlikte yukarı/aşağı kaymasın</w:t>
+öğeler sabit kalıyor, içerikle birlikte yukarı/aşağı kaymıyor</w:t>
       </w:r>
     </w:p>
     <w:p>
@@ -906,26 +938,9 @@
           <w:sz w:val="21"/>
           <w:szCs w:val="21"/>
         </w:rPr>
-        <w:t xml:space="preserve">Bayi listesinde &amp;quot;Düzenle&amp;quot; butonu — şu an düzenleme ayrı bir sayfada
-(</w:t>
-      </w:r>
-      <w:r>
-        <w:rPr>
-          <w:rFonts w:ascii="Consolas" w:cs="Consolas" w:eastAsia="Consolas" w:hAnsi="Consolas"/>
-          <w:color w:val="1F5F56"/>
-          <w:sz w:val="21"/>
-          <w:szCs w:val="21"/>
-        </w:rPr>
-        <w:t xml:space="preserve">/admin/dealers/[id]</w:t>
-      </w:r>
-      <w:r>
-        <w:rPr>
-          <w:sz w:val="21"/>
-          <w:szCs w:val="21"/>
-        </w:rPr>
-        <w:t xml:space="preserve">) yapılıyor; &amp;quot;Ekle&amp;quot; ile aynı 3 sekmeli modal
-açılıp mevcut bayinin ayarlarının (bir kısmının veya tamamının)
-aynı yerden değiştirilebilmesi</w:t>
+        <w:t xml:space="preserve">Bayi listesinde &amp;quot;Düzenle&amp;quot; butonu — düzenleme artık ayrı bir sayfada
+değil, &amp;quot;Ekle&amp;quot; ile aynı 3 sekmeli modal üzerinden mevcut bayinin
+ayarları aynı yerden değiştirilebiliyor</w:t>
       </w:r>
     </w:p>
     <w:p>
@@ -942,8 +957,8 @@
           <w:sz w:val="21"/>
           <w:szCs w:val="21"/>
         </w:rPr>
-        <w:t xml:space="preserve">&amp;quot;Ekle&amp;quot; modalındaki maksimum bakiye limiti alanını para birimi
-formatlı yapma — düz sayı (</w:t>
+        <w:t xml:space="preserve">&amp;quot;Ekle/Düzenle&amp;quot; modalındaki maksimum bakiye limiti alanı para birimi
+formatlı (</w:t>
       </w:r>
       <w:r>
         <w:rPr>
@@ -952,14 +967,14 @@
           <w:sz w:val="21"/>
           <w:szCs w:val="21"/>
         </w:rPr>
-        <w:t xml:space="preserve">200000</w:t>
-      </w:r>
-      <w:r>
-        <w:rPr>
-          <w:sz w:val="21"/>
-          <w:szCs w:val="21"/>
-        </w:rPr>
-        <w:t xml:space="preserve">) yerine otomatik binlik ayraç ve
+        <w:t xml:space="preserve">CurrencyInput</w:t>
+      </w:r>
+      <w:r>
+        <w:rPr>
+          <w:sz w:val="21"/>
+          <w:szCs w:val="21"/>
+        </w:rPr>
+        <w:t xml:space="preserve">) — düz sayı yerine otomatik binlik ayraç ve
 ₺ sembolüyle (</w:t>
       </w:r>
       <w:r>
@@ -976,7 +991,95 @@
           <w:sz w:val="21"/>
           <w:szCs w:val="21"/>
         </w:rPr>
-        <w:t xml:space="preserve">) gösterilsin</w:t>
+        <w:t xml:space="preserve">) gösteriliyor</w:t>
+      </w:r>
+    </w:p>
+    <w:p>
+      <w:pPr>
+        <w:pStyle w:val="ListParagraph"/>
+        <w:numPr>
+          <w:ilvl w:val="0"/>
+          <w:numId w:val="1"/>
+        </w:numPr>
+        <w:spacing w:after="60"/>
+      </w:pPr>
+      <w:r>
+        <w:rPr>
+          <w:sz w:val="21"/>
+          <w:szCs w:val="21"/>
+        </w:rPr>
+        <w:t xml:space="preserve">Bayi listesinde marka/durum filtre formu (</w:t>
+      </w:r>
+      <w:r>
+        <w:rPr>
+          <w:rFonts w:ascii="Consolas" w:cs="Consolas" w:eastAsia="Consolas" w:hAnsi="Consolas"/>
+          <w:color w:val="1F5F56"/>
+          <w:sz w:val="21"/>
+          <w:szCs w:val="21"/>
+        </w:rPr>
+        <w:t xml:space="preserve">dealer-filter-form.tsx</w:t>
+      </w:r>
+      <w:r>
+        <w:rPr>
+          <w:sz w:val="21"/>
+          <w:szCs w:val="21"/>
+        </w:rPr>
+        <w:t xml:space="preserve">)</w:t>
+      </w:r>
+    </w:p>
+    <w:p>
+      <w:pPr>
+        <w:pStyle w:val="ListParagraph"/>
+        <w:numPr>
+          <w:ilvl w:val="0"/>
+          <w:numId w:val="1"/>
+        </w:numPr>
+        <w:spacing w:after="60"/>
+      </w:pPr>
+      <w:r>
+        <w:rPr>
+          <w:sz w:val="21"/>
+          <w:szCs w:val="21"/>
+        </w:rPr>
+        <w:t xml:space="preserve">Admin → bayi kullanıcısı olarak giriş (impersonation): admin, bir
+bayinin panelini o bayi kullanıcısı kimliğiyle görüntüleyebiliyor
+(checkout/sipariş akışlarını bayi gözünden test etmek için). Kimlik
+değişimi NextAuth JWT </w:t>
+      </w:r>
+      <w:r>
+        <w:rPr>
+          <w:rFonts w:ascii="Consolas" w:cs="Consolas" w:eastAsia="Consolas" w:hAnsi="Consolas"/>
+          <w:color w:val="1F5F56"/>
+          <w:sz w:val="21"/>
+          <w:szCs w:val="21"/>
+        </w:rPr>
+        <w:t xml:space="preserve">update</w:t>
+      </w:r>
+      <w:r>
+        <w:rPr>
+          <w:sz w:val="21"/>
+          <w:szCs w:val="21"/>
+        </w:rPr>
+        <w:t xml:space="preserve"> trigger&amp;#39;ı ile sunucu tarafında
+doğrulanıyor (</w:t>
+      </w:r>
+      <w:r>
+        <w:rPr>
+          <w:rFonts w:ascii="Consolas" w:cs="Consolas" w:eastAsia="Consolas" w:hAnsi="Consolas"/>
+          <w:color w:val="1F5F56"/>
+          <w:sz w:val="21"/>
+          <w:szCs w:val="21"/>
+        </w:rPr>
+        <w:t xml:space="preserve">src/auth.ts</w:t>
+      </w:r>
+      <w:r>
+        <w:rPr>
+          <w:sz w:val="21"/>
+          <w:szCs w:val="21"/>
+        </w:rPr>
+        <w:t xml:space="preserve">); bayi panelinde &amp;quot;orijinal hesaba dön&amp;quot;
+butonu ile geri dönülüyor. Roadmap&amp;#39;te öngörülmemiş, iş ihtiyacından
+doğan bir ek kapsamdı.</w:t>
       </w:r>
     </w:p>
     <w:p>
@@ -999,8 +1102,9 @@
           <w:sz w:val="21"/>
           <w:szCs w:val="21"/>
         </w:rPr>
-        <w:t xml:space="preserve"> üç ödeme tipiyle de uçtan uca sipariş oluşturulabiliyor;
-admin panelde durum geçişleri izlenebiliyor.</w:t>
+        <w:t xml:space="preserve"> üç ödeme tipiyle de (cari, kapıda ödeme, sanal POS
+başarılı/başarısız) uçtan uca sipariş oluşturulabiliyor; admin panelde durum
+geçişleri izlenebiliyor. Tarayıcıda doğrulandı.</w:t>
       </w:r>
     </w:p>
     <w:p>

</xml_diff>

<commit_message>
Ödeme yöntemi aktivasyonunu kaldır, bakiye limitiyle otomatik cari kısıtlamasına geç
Bayi/marka bazlı manuel ödeme yöntemi eşleştirmesi (payment_methods,
dealer_payment_methods) kaldırıldı — siparis.paynagrup.com'un aksine
HarmonyBlend'in ERP entegrasyonu olmadığından bu ayrım gereksizdi.
Artık her bayi cari/nakit/sanal POS'un hepsini kullanabiliyor; cari
yalnızca mevcut bakiye + sipariş tutarı maksimum limiti aşarsa
otomatik kapanıyor. orders.payment_method_id (FK) yerine sabit bir
enum sütun (orders.payment_method) kullanılıyor.

Roadmap'e Faz 4 kapsamına katalog/kimlik UX iyileştirmeleri (toplu
seçim, KDV satırı, şifremi unuttum, sepet drawer, ürün düzenleme
modalı) ve Faz 5'e pasif bayi raporu eklendi.

Co-Authored-By: Claude Sonnet 5 <noreply@anthropic.com>
</commit_message>
<xml_diff>
--- a/docs/output/roadmap.docx
+++ b/docs/output/roadmap.docx
@@ -1236,55 +1236,6 @@
     </w:p>
     <w:p>
       <w:pPr>
-        <w:spacing w:after="120"/>
-      </w:pPr>
-      <w:r>
-        <w:rPr>
-          <w:b/>
-          <w:bCs/>
-          <w:color w:val="1A2420"/>
-          <w:sz w:val="21"/>
-          <w:szCs w:val="21"/>
-        </w:rPr>
-        <w:t xml:space="preserve">Çıkış kriteri —</w:t>
-      </w:r>
-      <w:r>
-        <w:rPr>
-          <w:color w:val="1A2420"/>
-          <w:sz w:val="21"/>
-          <w:szCs w:val="21"/>
-        </w:rPr>
-        <w:t xml:space="preserve"> bir bayi siparişsiz şekilde mock POS ile ödeme yapıyor ve
-cari bakiyesinin anında güncellendiğini görüyor.</w:t>
-      </w:r>
-    </w:p>
-    <w:p>
-      <w:pPr>
-        <w:pStyle w:val="Heading2"/>
-        <w:spacing w:after="100" w:before="220"/>
-      </w:pPr>
-      <w:r>
-        <w:rPr>
-          <w:color w:val="1A2420"/>
-        </w:rPr>
-        <w:t xml:space="preserve">Faz 5 — Raporlama &amp;amp; Analitik</w:t>
-      </w:r>
-    </w:p>
-    <w:p>
-      <w:pPr>
-        <w:spacing w:after="120"/>
-      </w:pPr>
-      <w:r>
-        <w:rPr>
-          <w:color w:val="1A2420"/>
-          <w:sz w:val="21"/>
-          <w:szCs w:val="21"/>
-        </w:rPr>
-        <w:t xml:space="preserve">Hedef: Filtrelenebilir, dışa aktarılabilir raporlama motoru.</w:t>
-      </w:r>
-    </w:p>
-    <w:p>
-      <w:pPr>
         <w:pStyle w:val="ListParagraph"/>
         <w:numPr>
           <w:ilvl w:val="0"/>
@@ -1297,7 +1248,9 @@
           <w:sz w:val="21"/>
           <w:szCs w:val="21"/>
         </w:rPr>
-        <w:t xml:space="preserve">Marka / bayi / ürün / tarih aralığı filtreleriyle dinamik tablo ve grafikler</w:t>
+        <w:t xml:space="preserve">Bayi kataloğunda toplu ürün seçimi + tek işlemle sepete ekleme — Payna
+Grup Portal karşılaştırmasından gelen ek kapsam, katalog tarafında
+sipariş verme hızını artırır</w:t>
       </w:r>
     </w:p>
     <w:p>
@@ -1314,7 +1267,8 @@
           <w:sz w:val="21"/>
           <w:szCs w:val="21"/>
         </w:rPr>
-        <w:t xml:space="preserve">Excel (.xlsx), CSV ve PDF export</w:t>
+        <w:t xml:space="preserve">Sepette KDV tutarının ayrı bir satırda gösterilmesi — checkout toplamı
+şu an tek kalem, kırılım yok</w:t>
       </w:r>
     </w:p>
     <w:p>
@@ -1331,7 +1285,184 @@
           <w:sz w:val="21"/>
           <w:szCs w:val="21"/>
         </w:rPr>
+        <w:t xml:space="preserve">Şifremi unuttum akışı — e-posta ile şifre sıfırlama; bir e-posta
+gönderim servisi (ör. Resend) entegrasyonu gerektirir, teknoloji
+yığınına yeni eklenecek</w:t>
+      </w:r>
+    </w:p>
+    <w:p>
+      <w:pPr>
+        <w:pStyle w:val="ListParagraph"/>
+        <w:numPr>
+          <w:ilvl w:val="0"/>
+          <w:numId w:val="1"/>
+        </w:numPr>
+        <w:spacing w:after="60"/>
+      </w:pPr>
+      <w:r>
+        <w:rPr>
+          <w:sz w:val="21"/>
+          <w:szCs w:val="21"/>
+        </w:rPr>
+        <w:t xml:space="preserve">Sepet ekranının sağdan açılan bir panel (drawer) olarak yeniden
+tasarlanması — siparis.paynagrup.com&amp;#39;daki sepet deneyiminin karşılığı,
+roadmap dışı bir ek kapsam</w:t>
+      </w:r>
+    </w:p>
+    <w:p>
+      <w:pPr>
+        <w:pStyle w:val="ListParagraph"/>
+        <w:numPr>
+          <w:ilvl w:val="0"/>
+          <w:numId w:val="1"/>
+        </w:numPr>
+        <w:spacing w:after="60"/>
+      </w:pPr>
+      <w:r>
+        <w:rPr>
+          <w:sz w:val="21"/>
+          <w:szCs w:val="21"/>
+        </w:rPr>
+        <w:t xml:space="preserve">Admin ürün sayfasında &amp;quot;Ürünler&amp;quot; bölümünün &amp;quot;Kategoriler&amp;quot; bölümünün
+üstüne taşınması</w:t>
+      </w:r>
+    </w:p>
+    <w:p>
+      <w:pPr>
+        <w:pStyle w:val="ListParagraph"/>
+        <w:numPr>
+          <w:ilvl w:val="0"/>
+          <w:numId w:val="1"/>
+        </w:numPr>
+        <w:spacing w:after="60"/>
+      </w:pPr>
+      <w:r>
+        <w:rPr>
+          <w:sz w:val="21"/>
+          <w:szCs w:val="21"/>
+        </w:rPr>
+        <w:t xml:space="preserve">Ürün tablosunda &amp;quot;Durum&amp;quot; ve &amp;quot;Sil&amp;quot; arasına bir &amp;quot;Düzenle&amp;quot; butonu — SKU,
+kategori, fiyat, isim, birim ve aktif/pasif dahil tüm alanların tek
+formdan güncellenebilmesi (şu an yalnızca durum değiştirme ve silme var,
+diğer alanlar için düzenleme yok)</w:t>
+      </w:r>
+    </w:p>
+    <w:p>
+      <w:pPr>
+        <w:spacing w:after="120"/>
+      </w:pPr>
+      <w:r>
+        <w:rPr>
+          <w:b/>
+          <w:bCs/>
+          <w:color w:val="1A2420"/>
+          <w:sz w:val="21"/>
+          <w:szCs w:val="21"/>
+        </w:rPr>
+        <w:t xml:space="preserve">Çıkış kriteri —</w:t>
+      </w:r>
+      <w:r>
+        <w:rPr>
+          <w:color w:val="1A2420"/>
+          <w:sz w:val="21"/>
+          <w:szCs w:val="21"/>
+        </w:rPr>
+        <w:t xml:space="preserve"> bir bayi siparişsiz şekilde mock POS ile ödeme yapıyor ve
+cari bakiyesinin anında güncellendiğini görüyor.</w:t>
+      </w:r>
+    </w:p>
+    <w:p>
+      <w:pPr>
+        <w:pStyle w:val="Heading2"/>
+        <w:spacing w:after="100" w:before="220"/>
+      </w:pPr>
+      <w:r>
+        <w:rPr>
+          <w:color w:val="1A2420"/>
+        </w:rPr>
+        <w:t xml:space="preserve">Faz 5 — Raporlama &amp;amp; Analitik</w:t>
+      </w:r>
+    </w:p>
+    <w:p>
+      <w:pPr>
+        <w:spacing w:after="120"/>
+      </w:pPr>
+      <w:r>
+        <w:rPr>
+          <w:color w:val="1A2420"/>
+          <w:sz w:val="21"/>
+          <w:szCs w:val="21"/>
+        </w:rPr>
+        <w:t xml:space="preserve">Hedef: Filtrelenebilir, dışa aktarılabilir raporlama motoru.</w:t>
+      </w:r>
+    </w:p>
+    <w:p>
+      <w:pPr>
+        <w:pStyle w:val="ListParagraph"/>
+        <w:numPr>
+          <w:ilvl w:val="0"/>
+          <w:numId w:val="1"/>
+        </w:numPr>
+        <w:spacing w:after="60"/>
+      </w:pPr>
+      <w:r>
+        <w:rPr>
+          <w:sz w:val="21"/>
+          <w:szCs w:val="21"/>
+        </w:rPr>
+        <w:t xml:space="preserve">Marka / bayi / ürün / tarih aralığı filtreleriyle dinamik tablo ve grafikler</w:t>
+      </w:r>
+    </w:p>
+    <w:p>
+      <w:pPr>
+        <w:pStyle w:val="ListParagraph"/>
+        <w:numPr>
+          <w:ilvl w:val="0"/>
+          <w:numId w:val="1"/>
+        </w:numPr>
+        <w:spacing w:after="60"/>
+      </w:pPr>
+      <w:r>
+        <w:rPr>
+          <w:sz w:val="21"/>
+          <w:szCs w:val="21"/>
+        </w:rPr>
+        <w:t xml:space="preserve">Excel (.xlsx), CSV ve PDF export</w:t>
+      </w:r>
+    </w:p>
+    <w:p>
+      <w:pPr>
+        <w:pStyle w:val="ListParagraph"/>
+        <w:numPr>
+          <w:ilvl w:val="0"/>
+          <w:numId w:val="1"/>
+        </w:numPr>
+        <w:spacing w:after="60"/>
+      </w:pPr>
+      <w:r>
+        <w:rPr>
+          <w:sz w:val="21"/>
+          <w:szCs w:val="21"/>
+        </w:rPr>
         <w:t xml:space="preserve">Büyüyen veri hacmi için özet tablo / materialized view stratejisi</w:t>
+      </w:r>
+    </w:p>
+    <w:p>
+      <w:pPr>
+        <w:pStyle w:val="ListParagraph"/>
+        <w:numPr>
+          <w:ilvl w:val="0"/>
+          <w:numId w:val="1"/>
+        </w:numPr>
+        <w:spacing w:after="60"/>
+      </w:pPr>
+      <w:r>
+        <w:rPr>
+          <w:sz w:val="21"/>
+          <w:szCs w:val="21"/>
+        </w:rPr>
+        <w:t xml:space="preserve">Sipariş vermeyen bayi raporu — pasif bayi takibi için Payna Grup Portal
+karşılaştırmasından gelen ek kapsam</w:t>
       </w:r>
     </w:p>
     <w:p>

</xml_diff>

<commit_message>
Roadmap'i kod ile senkronla: ödeme yöntemi kaldırma ve toast genişletmesi belgele
Kod tarafında yapılan iki değişiklik hiçbir fazda kayıtlı değildi:
ödeme yöntemi aktivasyon sisteminin kaldırılması ve toast bildirimlerinin
admin paneline genişletilmesi. İkisi de Faz 3'e retroaktif not olarak
eklendi. Veri Modeli bölümündeki ER diyagramı ve tablo tanımları da
artık var olmayan payment_methods/dealer_payment_methods tablolarını
hâlâ gösteriyordu — kaldırıldı, orders.payment_method_id yerine
orders.payment_method (enum) yazıldı, dealers.max_balance_limit
(zaten koddaydı ama hiç belgelenmemişti) eklendi.

Co-Authored-By: Claude Sonnet 5 <noreply@anthropic.com>
</commit_message>
<xml_diff>
--- a/docs/output/roadmap.docx
+++ b/docs/output/roadmap.docx
@@ -518,19 +518,18 @@
       </w:pPr>
       <w:r>
         <w:rPr>
-          <w:rFonts w:ascii="Consolas" w:cs="Consolas" w:eastAsia="Consolas" w:hAnsi="Consolas"/>
-          <w:color w:val="1F5F56"/>
-          <w:sz w:val="21"/>
-          <w:szCs w:val="21"/>
-        </w:rPr>
-        <w:t xml:space="preserve">payment_methods</w:t>
-      </w:r>
-      <w:r>
-        <w:rPr>
-          <w:sz w:val="21"/>
-          <w:szCs w:val="21"/>
-        </w:rPr>
-        <w:t xml:space="preserve"> tanımları ve bayi/marka bazlı aktivasyon</w:t>
+          <w:sz w:val="21"/>
+          <w:szCs w:val="21"/>
+        </w:rPr>
+        <w:t xml:space="preserve">`payment_methods` tanımları ve bayi/marka bazlı aktivasyon</w:t>
+      </w:r>
+      <w:r>
+        <w:rPr>
+          <w:sz w:val="21"/>
+          <w:szCs w:val="21"/>
+        </w:rPr>
+        <w:t xml:space="preserve"> — bu
+yaklaşım daha sonra tamamen kaldırıldı, bkz. Faz 3 sonundaki not</w:t>
       </w:r>
     </w:p>
     <w:p>
@@ -1080,6 +1079,162 @@
         <w:t xml:space="preserve">); bayi panelinde &amp;quot;orijinal hesaba dön&amp;quot;
 butonu ile geri dönülüyor. Roadmap&amp;#39;te öngörülmemiş, iş ihtiyacından
 doğan bir ek kapsamdı.</w:t>
+      </w:r>
+    </w:p>
+    <w:p>
+      <w:pPr>
+        <w:pStyle w:val="ListParagraph"/>
+        <w:numPr>
+          <w:ilvl w:val="0"/>
+          <w:numId w:val="1"/>
+        </w:numPr>
+        <w:spacing w:after="60"/>
+      </w:pPr>
+      <w:r>
+        <w:rPr>
+          <w:sz w:val="21"/>
+          <w:szCs w:val="21"/>
+        </w:rPr>
+        <w:t xml:space="preserve">Ödeme yöntemi aktivasyon sistemi (</w:t>
+      </w:r>
+      <w:r>
+        <w:rPr>
+          <w:rFonts w:ascii="Consolas" w:cs="Consolas" w:eastAsia="Consolas" w:hAnsi="Consolas"/>
+          <w:color w:val="1F5F56"/>
+          <w:sz w:val="21"/>
+          <w:szCs w:val="21"/>
+        </w:rPr>
+        <w:t xml:space="preserve">payment_methods</w:t>
+      </w:r>
+      <w:r>
+        <w:rPr>
+          <w:sz w:val="21"/>
+          <w:szCs w:val="21"/>
+        </w:rPr>
+        <w:t xml:space="preserve"> /
+</w:t>
+      </w:r>
+      <w:r>
+        <w:rPr>
+          <w:rFonts w:ascii="Consolas" w:cs="Consolas" w:eastAsia="Consolas" w:hAnsi="Consolas"/>
+          <w:color w:val="1F5F56"/>
+          <w:sz w:val="21"/>
+          <w:szCs w:val="21"/>
+        </w:rPr>
+        <w:t xml:space="preserve">dealer_payment_methods</w:t>
+      </w:r>
+      <w:r>
+        <w:rPr>
+          <w:sz w:val="21"/>
+          <w:szCs w:val="21"/>
+        </w:rPr>
+        <w:t xml:space="preserve"> tabloları, bayi/marka bazlı manuel açma-kapama)
+Faz 3 sonrasında tamamen kaldırıldı — Payna Grup Portal&amp;#39;ın aksine
+HarmonyBlend&amp;#39;in ERP entegrasyonu olmadığından bu ayrım gereksizdi. Artık
+her bayi cari/nakit/sanal POS&amp;#39;un hepsini kullanabiliyor; cari yalnızca
+mevcut bakiye + sipariş tutarı </w:t>
+      </w:r>
+      <w:r>
+        <w:rPr>
+          <w:rFonts w:ascii="Consolas" w:cs="Consolas" w:eastAsia="Consolas" w:hAnsi="Consolas"/>
+          <w:color w:val="1F5F56"/>
+          <w:sz w:val="21"/>
+          <w:szCs w:val="21"/>
+        </w:rPr>
+        <w:t xml:space="preserve">maxBalanceLimit</w:t>
+      </w:r>
+      <w:r>
+        <w:rPr>
+          <w:sz w:val="21"/>
+          <w:szCs w:val="21"/>
+        </w:rPr>
+        <w:t xml:space="preserve">&amp;#39;i aşarsa otomatik
+kapanıyor. </w:t>
+      </w:r>
+      <w:r>
+        <w:rPr>
+          <w:rFonts w:ascii="Consolas" w:cs="Consolas" w:eastAsia="Consolas" w:hAnsi="Consolas"/>
+          <w:color w:val="1F5F56"/>
+          <w:sz w:val="21"/>
+          <w:szCs w:val="21"/>
+        </w:rPr>
+        <w:t xml:space="preserve">orders.payment_method_id</w:t>
+      </w:r>
+      <w:r>
+        <w:rPr>
+          <w:sz w:val="21"/>
+          <w:szCs w:val="21"/>
+        </w:rPr>
+        <w:t xml:space="preserve"> (FK) yerine sabit bir enum sütun
+(</w:t>
+      </w:r>
+      <w:r>
+        <w:rPr>
+          <w:rFonts w:ascii="Consolas" w:cs="Consolas" w:eastAsia="Consolas" w:hAnsi="Consolas"/>
+          <w:color w:val="1F5F56"/>
+          <w:sz w:val="21"/>
+          <w:szCs w:val="21"/>
+        </w:rPr>
+        <w:t xml:space="preserve">orders.payment_method</w:t>
+      </w:r>
+      <w:r>
+        <w:rPr>
+          <w:sz w:val="21"/>
+          <w:szCs w:val="21"/>
+        </w:rPr>
+        <w:t xml:space="preserve">) kullanılıyor.</w:t>
+      </w:r>
+    </w:p>
+    <w:p>
+      <w:pPr>
+        <w:pStyle w:val="ListParagraph"/>
+        <w:numPr>
+          <w:ilvl w:val="0"/>
+          <w:numId w:val="1"/>
+        </w:numPr>
+        <w:spacing w:after="60"/>
+      </w:pPr>
+      <w:r>
+        <w:rPr>
+          <w:sz w:val="21"/>
+          <w:szCs w:val="21"/>
+        </w:rPr>
+        <w:t xml:space="preserve">Toast bildirim sistemi admin paneline de genişletildi — marka/bayi/
+ürün/kategori/kullanıcı CRUD işlemleri ve sipariş durum geçişleri artık
+başarı/hata toast&amp;#39;ı gösteriyor (önceden yalnızca bayi tarafında vardı).
+Yeniden kullanılabilir </w:t>
+      </w:r>
+      <w:r>
+        <w:rPr>
+          <w:rFonts w:ascii="Consolas" w:cs="Consolas" w:eastAsia="Consolas" w:hAnsi="Consolas"/>
+          <w:color w:val="1F5F56"/>
+          <w:sz w:val="21"/>
+          <w:szCs w:val="21"/>
+        </w:rPr>
+        <w:t xml:space="preserve">ToastForm</w:t>
+      </w:r>
+      <w:r>
+        <w:rPr>
+          <w:sz w:val="21"/>
+          <w:szCs w:val="21"/>
+        </w:rPr>
+        <w:t xml:space="preserve"> bileşeni (</w:t>
+      </w:r>
+      <w:r>
+        <w:rPr>
+          <w:rFonts w:ascii="Consolas" w:cs="Consolas" w:eastAsia="Consolas" w:hAnsi="Consolas"/>
+          <w:color w:val="1F5F56"/>
+          <w:sz w:val="21"/>
+          <w:szCs w:val="21"/>
+        </w:rPr>
+        <w:t xml:space="preserve">src/components/ toast-form.tsx</w:t>
+      </w:r>
+      <w:r>
+        <w:rPr>
+          <w:sz w:val="21"/>
+          <w:szCs w:val="21"/>
+        </w:rPr>
+        <w:t xml:space="preserve">) ile server action&amp;#39;lar client tarafında çağrılıyor.</w:t>
       </w:r>
     </w:p>
     <w:p>
@@ -1688,7 +1843,7 @@
       <w:r>
         <w:drawing>
           <wp:inline distT="0" distB="0" distL="0" distR="0">
-            <wp:extent cx="4953000" cy="2476500"/>
+            <wp:extent cx="4953000" cy="3333750"/>
             <wp:effectExtent t="0" r="0" b="0" l="0"/>
             <wp:docPr id="1" name="" descr="" title=""/>
             <wp:cNvGraphicFramePr>
@@ -1713,7 +1868,7 @@
                   <pic:spPr bwMode="auto">
                     <a:xfrm>
                       <a:off x="0" y="0"/>
-                      <a:ext cx="4953000" cy="2476500"/>
+                      <a:ext cx="4953000" cy="3333750"/>
                     </a:xfrm>
                     <a:prstGeom prst="rect">
                       <a:avLst/>
@@ -1945,97 +2100,112 @@
           <w:sz w:val="16"/>
           <w:szCs w:val="16"/>
         </w:rPr>
-        <w:t xml:space="preserve">  id                uuid        PK</w:t>
-      </w:r>
-    </w:p>
-    <w:p>
-      <w:pPr>
-        <w:shd w:fill="182420" w:val="clear"/>
-        <w:spacing w:after="0" w:before="0" w:line="260"/>
-      </w:pPr>
-      <w:r>
-        <w:rPr>
-          <w:rFonts w:ascii="Consolas" w:cs="Consolas" w:eastAsia="Consolas" w:hAnsi="Consolas"/>
-          <w:color w:val="DCE8E1"/>
-          <w:sz w:val="16"/>
-          <w:szCs w:val="16"/>
-        </w:rPr>
-        <w:t xml:space="preserve">  company_id        uuid        FK -&gt; companies.id</w:t>
-      </w:r>
-    </w:p>
-    <w:p>
-      <w:pPr>
-        <w:shd w:fill="182420" w:val="clear"/>
-        <w:spacing w:after="0" w:before="0" w:line="260"/>
-      </w:pPr>
-      <w:r>
-        <w:rPr>
-          <w:rFonts w:ascii="Consolas" w:cs="Consolas" w:eastAsia="Consolas" w:hAnsi="Consolas"/>
-          <w:color w:val="DCE8E1"/>
-          <w:sz w:val="16"/>
-          <w:szCs w:val="16"/>
-        </w:rPr>
-        <w:t xml:space="preserve">  name              text</w:t>
-      </w:r>
-    </w:p>
-    <w:p>
-      <w:pPr>
-        <w:shd w:fill="182420" w:val="clear"/>
-        <w:spacing w:after="0" w:before="0" w:line="260"/>
-      </w:pPr>
-      <w:r>
-        <w:rPr>
-          <w:rFonts w:ascii="Consolas" w:cs="Consolas" w:eastAsia="Consolas" w:hAnsi="Consolas"/>
-          <w:color w:val="DCE8E1"/>
-          <w:sz w:val="16"/>
-          <w:szCs w:val="16"/>
-        </w:rPr>
-        <w:t xml:space="preserve">  tax_no            text</w:t>
-      </w:r>
-    </w:p>
-    <w:p>
-      <w:pPr>
-        <w:shd w:fill="182420" w:val="clear"/>
-        <w:spacing w:after="0" w:before="0" w:line="260"/>
-      </w:pPr>
-      <w:r>
-        <w:rPr>
-          <w:rFonts w:ascii="Consolas" w:cs="Consolas" w:eastAsia="Consolas" w:hAnsi="Consolas"/>
-          <w:color w:val="DCE8E1"/>
-          <w:sz w:val="16"/>
-          <w:szCs w:val="16"/>
-        </w:rPr>
-        <w:t xml:space="preserve">  address           text</w:t>
-      </w:r>
-    </w:p>
-    <w:p>
-      <w:pPr>
-        <w:shd w:fill="182420" w:val="clear"/>
-        <w:spacing w:after="0" w:before="0" w:line="260"/>
-      </w:pPr>
-      <w:r>
-        <w:rPr>
-          <w:rFonts w:ascii="Consolas" w:cs="Consolas" w:eastAsia="Consolas" w:hAnsi="Consolas"/>
-          <w:color w:val="DCE8E1"/>
-          <w:sz w:val="16"/>
-          <w:szCs w:val="16"/>
-        </w:rPr>
-        <w:t xml:space="preserve">  current_balance   numeric(14,2)  DEFAULT 0   -- ledger_entries'ten türeyen önbellek</w:t>
-      </w:r>
-    </w:p>
-    <w:p>
-      <w:pPr>
-        <w:shd w:fill="182420" w:val="clear"/>
-        <w:spacing w:after="0" w:before="0" w:line="260"/>
-      </w:pPr>
-      <w:r>
-        <w:rPr>
-          <w:rFonts w:ascii="Consolas" w:cs="Consolas" w:eastAsia="Consolas" w:hAnsi="Consolas"/>
-          <w:color w:val="DCE8E1"/>
-          <w:sz w:val="16"/>
-          <w:szCs w:val="16"/>
-        </w:rPr>
-        <w:t xml:space="preserve">  created_at        timestamptz</w:t>
+        <w:t xml:space="preserve">  id                  uuid        PK</w:t>
+      </w:r>
+    </w:p>
+    <w:p>
+      <w:pPr>
+        <w:shd w:fill="182420" w:val="clear"/>
+        <w:spacing w:after="0" w:before="0" w:line="260"/>
+      </w:pPr>
+      <w:r>
+        <w:rPr>
+          <w:rFonts w:ascii="Consolas" w:cs="Consolas" w:eastAsia="Consolas" w:hAnsi="Consolas"/>
+          <w:color w:val="DCE8E1"/>
+          <w:sz w:val="16"/>
+          <w:szCs w:val="16"/>
+        </w:rPr>
+        <w:t xml:space="preserve">  company_id          uuid        FK -&gt; companies.id</w:t>
+      </w:r>
+    </w:p>
+    <w:p>
+      <w:pPr>
+        <w:shd w:fill="182420" w:val="clear"/>
+        <w:spacing w:after="0" w:before="0" w:line="260"/>
+      </w:pPr>
+      <w:r>
+        <w:rPr>
+          <w:rFonts w:ascii="Consolas" w:cs="Consolas" w:eastAsia="Consolas" w:hAnsi="Consolas"/>
+          <w:color w:val="DCE8E1"/>
+          <w:sz w:val="16"/>
+          <w:szCs w:val="16"/>
+        </w:rPr>
+        <w:t xml:space="preserve">  name                text</w:t>
+      </w:r>
+    </w:p>
+    <w:p>
+      <w:pPr>
+        <w:shd w:fill="182420" w:val="clear"/>
+        <w:spacing w:after="0" w:before="0" w:line="260"/>
+      </w:pPr>
+      <w:r>
+        <w:rPr>
+          <w:rFonts w:ascii="Consolas" w:cs="Consolas" w:eastAsia="Consolas" w:hAnsi="Consolas"/>
+          <w:color w:val="DCE8E1"/>
+          <w:sz w:val="16"/>
+          <w:szCs w:val="16"/>
+        </w:rPr>
+        <w:t xml:space="preserve">  tax_no              text</w:t>
+      </w:r>
+    </w:p>
+    <w:p>
+      <w:pPr>
+        <w:shd w:fill="182420" w:val="clear"/>
+        <w:spacing w:after="0" w:before="0" w:line="260"/>
+      </w:pPr>
+      <w:r>
+        <w:rPr>
+          <w:rFonts w:ascii="Consolas" w:cs="Consolas" w:eastAsia="Consolas" w:hAnsi="Consolas"/>
+          <w:color w:val="DCE8E1"/>
+          <w:sz w:val="16"/>
+          <w:szCs w:val="16"/>
+        </w:rPr>
+        <w:t xml:space="preserve">  address             text</w:t>
+      </w:r>
+    </w:p>
+    <w:p>
+      <w:pPr>
+        <w:shd w:fill="182420" w:val="clear"/>
+        <w:spacing w:after="0" w:before="0" w:line="260"/>
+      </w:pPr>
+      <w:r>
+        <w:rPr>
+          <w:rFonts w:ascii="Consolas" w:cs="Consolas" w:eastAsia="Consolas" w:hAnsi="Consolas"/>
+          <w:color w:val="DCE8E1"/>
+          <w:sz w:val="16"/>
+          <w:szCs w:val="16"/>
+        </w:rPr>
+        <w:t xml:space="preserve">  max_balance_limit    numeric(14,2)  NULL   -- NULL = limitsiz; aşılırsa cari kapanır</w:t>
+      </w:r>
+    </w:p>
+    <w:p>
+      <w:pPr>
+        <w:shd w:fill="182420" w:val="clear"/>
+        <w:spacing w:after="0" w:before="0" w:line="260"/>
+      </w:pPr>
+      <w:r>
+        <w:rPr>
+          <w:rFonts w:ascii="Consolas" w:cs="Consolas" w:eastAsia="Consolas" w:hAnsi="Consolas"/>
+          <w:color w:val="DCE8E1"/>
+          <w:sz w:val="16"/>
+          <w:szCs w:val="16"/>
+        </w:rPr>
+        <w:t xml:space="preserve">  current_balance     numeric(14,2)  DEFAULT 0   -- ledger_entries'ten türeyen önbellek</w:t>
+      </w:r>
+    </w:p>
+    <w:p>
+      <w:pPr>
+        <w:shd w:fill="182420" w:val="clear"/>
+        <w:spacing w:after="0" w:before="0" w:line="260"/>
+      </w:pPr>
+      <w:r>
+        <w:rPr>
+          <w:rFonts w:ascii="Consolas" w:cs="Consolas" w:eastAsia="Consolas" w:hAnsi="Consolas"/>
+          <w:color w:val="DCE8E1"/>
+          <w:sz w:val="16"/>
+          <w:szCs w:val="16"/>
+        </w:rPr>
+        <w:t xml:space="preserve">  created_at          timestamptz</w:t>
       </w:r>
     </w:p>
     <w:p>
@@ -2549,233 +2719,6 @@
         <w:rPr>
           <w:color w:val="1A2420"/>
         </w:rPr>
-        <w:t xml:space="preserve">Ödeme kuralları</w:t>
-      </w:r>
-    </w:p>
-    <w:p>
-      <w:pPr>
-        <w:shd w:fill="182420" w:val="clear"/>
-        <w:spacing w:after="0" w:before="0" w:line="260"/>
-      </w:pPr>
-      <w:r>
-        <w:rPr>
-          <w:rFonts w:ascii="Consolas" w:cs="Consolas" w:eastAsia="Consolas" w:hAnsi="Consolas"/>
-          <w:color w:val="DCE8E1"/>
-          <w:sz w:val="16"/>
-          <w:szCs w:val="16"/>
-        </w:rPr>
-        <w:t xml:space="preserve">payment_methods</w:t>
-      </w:r>
-    </w:p>
-    <w:p>
-      <w:pPr>
-        <w:shd w:fill="182420" w:val="clear"/>
-        <w:spacing w:after="0" w:before="0" w:line="260"/>
-      </w:pPr>
-      <w:r>
-        <w:rPr>
-          <w:rFonts w:ascii="Consolas" w:cs="Consolas" w:eastAsia="Consolas" w:hAnsi="Consolas"/>
-          <w:color w:val="DCE8E1"/>
-          <w:sz w:val="16"/>
-          <w:szCs w:val="16"/>
-        </w:rPr>
-        <w:t xml:space="preserve">  id            uuid        PK</w:t>
-      </w:r>
-    </w:p>
-    <w:p>
-      <w:pPr>
-        <w:shd w:fill="182420" w:val="clear"/>
-        <w:spacing w:after="0" w:before="0" w:line="260"/>
-      </w:pPr>
-      <w:r>
-        <w:rPr>
-          <w:rFonts w:ascii="Consolas" w:cs="Consolas" w:eastAsia="Consolas" w:hAnsi="Consolas"/>
-          <w:color w:val="DCE8E1"/>
-          <w:sz w:val="16"/>
-          <w:szCs w:val="16"/>
-        </w:rPr>
-        <w:t xml:space="preserve">  company_id    uuid        FK -&gt; companies.id</w:t>
-      </w:r>
-    </w:p>
-    <w:p>
-      <w:pPr>
-        <w:shd w:fill="182420" w:val="clear"/>
-        <w:spacing w:after="0" w:before="0" w:line="260"/>
-      </w:pPr>
-      <w:r>
-        <w:rPr>
-          <w:rFonts w:ascii="Consolas" w:cs="Consolas" w:eastAsia="Consolas" w:hAnsi="Consolas"/>
-          <w:color w:val="DCE8E1"/>
-          <w:sz w:val="16"/>
-          <w:szCs w:val="16"/>
-        </w:rPr>
-        <w:t xml:space="preserve">  code          enum(cari, cash_on_delivery, virtual_pos)</w:t>
-      </w:r>
-    </w:p>
-    <w:p>
-      <w:pPr>
-        <w:shd w:fill="182420" w:val="clear"/>
-        <w:spacing w:after="0" w:before="0" w:line="260"/>
-      </w:pPr>
-      <w:r>
-        <w:rPr>
-          <w:rFonts w:ascii="Consolas" w:cs="Consolas" w:eastAsia="Consolas" w:hAnsi="Consolas"/>
-          <w:color w:val="DCE8E1"/>
-          <w:sz w:val="16"/>
-          <w:szCs w:val="16"/>
-        </w:rPr>
-        <w:t xml:space="preserve">  label         text</w:t>
-      </w:r>
-    </w:p>
-    <w:p>
-      <w:pPr>
-        <w:shd w:fill="182420" w:val="clear"/>
-        <w:spacing w:after="0" w:before="0" w:line="260"/>
-      </w:pPr>
-      <w:r>
-        <w:rPr>
-          <w:rFonts w:ascii="Consolas" w:cs="Consolas" w:eastAsia="Consolas" w:hAnsi="Consolas"/>
-          <w:color w:val="DCE8E1"/>
-          <w:sz w:val="16"/>
-          <w:szCs w:val="16"/>
-        </w:rPr>
-        <w:t xml:space="preserve">  config        jsonb       -- limit, gecikme kuralı vb. parametreler</w:t>
-      </w:r>
-    </w:p>
-    <w:p>
-      <w:pPr>
-        <w:shd w:fill="182420" w:val="clear"/>
-        <w:spacing w:after="0" w:before="0" w:line="260"/>
-      </w:pPr>
-      <w:r>
-        <w:rPr>
-          <w:rFonts w:ascii="Consolas" w:cs="Consolas" w:eastAsia="Consolas" w:hAnsi="Consolas"/>
-          <w:color w:val="DCE8E1"/>
-          <w:sz w:val="16"/>
-          <w:szCs w:val="16"/>
-        </w:rPr>
-        <w:t xml:space="preserve"> </w:t>
-      </w:r>
-    </w:p>
-    <w:p>
-      <w:pPr>
-        <w:shd w:fill="182420" w:val="clear"/>
-        <w:spacing w:after="0" w:before="0" w:line="260"/>
-      </w:pPr>
-      <w:r>
-        <w:rPr>
-          <w:rFonts w:ascii="Consolas" w:cs="Consolas" w:eastAsia="Consolas" w:hAnsi="Consolas"/>
-          <w:color w:val="DCE8E1"/>
-          <w:sz w:val="16"/>
-          <w:szCs w:val="16"/>
-        </w:rPr>
-        <w:t xml:space="preserve">dealer_payment_methods</w:t>
-      </w:r>
-    </w:p>
-    <w:p>
-      <w:pPr>
-        <w:shd w:fill="182420" w:val="clear"/>
-        <w:spacing w:after="0" w:before="0" w:line="260"/>
-      </w:pPr>
-      <w:r>
-        <w:rPr>
-          <w:rFonts w:ascii="Consolas" w:cs="Consolas" w:eastAsia="Consolas" w:hAnsi="Consolas"/>
-          <w:color w:val="DCE8E1"/>
-          <w:sz w:val="16"/>
-          <w:szCs w:val="16"/>
-        </w:rPr>
-        <w:t xml:space="preserve">  id                  uuid    PK</w:t>
-      </w:r>
-    </w:p>
-    <w:p>
-      <w:pPr>
-        <w:shd w:fill="182420" w:val="clear"/>
-        <w:spacing w:after="0" w:before="0" w:line="260"/>
-      </w:pPr>
-      <w:r>
-        <w:rPr>
-          <w:rFonts w:ascii="Consolas" w:cs="Consolas" w:eastAsia="Consolas" w:hAnsi="Consolas"/>
-          <w:color w:val="DCE8E1"/>
-          <w:sz w:val="16"/>
-          <w:szCs w:val="16"/>
-        </w:rPr>
-        <w:t xml:space="preserve">  dealer_id           uuid    FK -&gt; dealers.id</w:t>
-      </w:r>
-    </w:p>
-    <w:p>
-      <w:pPr>
-        <w:shd w:fill="182420" w:val="clear"/>
-        <w:spacing w:after="0" w:before="0" w:line="260"/>
-      </w:pPr>
-      <w:r>
-        <w:rPr>
-          <w:rFonts w:ascii="Consolas" w:cs="Consolas" w:eastAsia="Consolas" w:hAnsi="Consolas"/>
-          <w:color w:val="DCE8E1"/>
-          <w:sz w:val="16"/>
-          <w:szCs w:val="16"/>
-        </w:rPr>
-        <w:t xml:space="preserve">  brand_id            uuid    FK -&gt; brands.id</w:t>
-      </w:r>
-    </w:p>
-    <w:p>
-      <w:pPr>
-        <w:shd w:fill="182420" w:val="clear"/>
-        <w:spacing w:after="0" w:before="0" w:line="260"/>
-      </w:pPr>
-      <w:r>
-        <w:rPr>
-          <w:rFonts w:ascii="Consolas" w:cs="Consolas" w:eastAsia="Consolas" w:hAnsi="Consolas"/>
-          <w:color w:val="DCE8E1"/>
-          <w:sz w:val="16"/>
-          <w:szCs w:val="16"/>
-        </w:rPr>
-        <w:t xml:space="preserve">  payment_method_id   uuid    FK -&gt; payment_methods.id</w:t>
-      </w:r>
-    </w:p>
-    <w:p>
-      <w:pPr>
-        <w:shd w:fill="182420" w:val="clear"/>
-        <w:spacing w:after="0" w:before="0" w:line="260"/>
-      </w:pPr>
-      <w:r>
-        <w:rPr>
-          <w:rFonts w:ascii="Consolas" w:cs="Consolas" w:eastAsia="Consolas" w:hAnsi="Consolas"/>
-          <w:color w:val="DCE8E1"/>
-          <w:sz w:val="16"/>
-          <w:szCs w:val="16"/>
-        </w:rPr>
-        <w:t xml:space="preserve">  is_enabled          boolean DEFAULT true</w:t>
-      </w:r>
-    </w:p>
-    <w:p>
-      <w:pPr>
-        <w:shd w:fill="182420" w:val="clear"/>
-        <w:spacing w:after="0" w:before="0" w:line="260"/>
-      </w:pPr>
-      <w:r>
-        <w:rPr>
-          <w:rFonts w:ascii="Consolas" w:cs="Consolas" w:eastAsia="Consolas" w:hAnsi="Consolas"/>
-          <w:color w:val="DCE8E1"/>
-          <w:sz w:val="16"/>
-          <w:szCs w:val="16"/>
-        </w:rPr>
-        <w:t xml:space="preserve">  UNIQUE(dealer_id, brand_id, payment_method_id)</w:t>
-      </w:r>
-    </w:p>
-    <w:p>
-      <w:pPr>
-        <w:spacing w:after="160"/>
-      </w:pPr>
-    </w:p>
-    <w:p>
-      <w:pPr>
-        <w:pStyle w:val="Heading2"/>
-        <w:spacing w:after="100" w:before="220"/>
-      </w:pPr>
-      <w:r>
-        <w:rPr>
-          <w:color w:val="1A2420"/>
-        </w:rPr>
         <w:t xml:space="preserve">Sipariş</w:t>
       </w:r>
     </w:p>
@@ -2851,7 +2794,7 @@
           <w:sz w:val="16"/>
           <w:szCs w:val="16"/>
         </w:rPr>
-        <w:t xml:space="preserve">  payment_method_id   uuid        FK -&gt; payment_methods.id</w:t>
+        <w:t xml:space="preserve">  payment_method      enum(cari, cash_on_delivery, virtual_pos)</w:t>
       </w:r>
     </w:p>
     <w:p>

</xml_diff>

<commit_message>
Admin: test verisi temizliği için sipariş silme ve zorla sil ekle
Ürün/marka siparişte kullanıldığında normal silme FK hatasıyla
reddediliyordu (bir önceki commit'te anlaşılır mesaja çevrilmişti).
Şimdi bunun yanına "zorla sil" eklendi: önce o ürünü/markayı içeren
siparişleri kaldırıp sonra normal silmeyi tekrar deniyor. Ayrıca admin
tarafında sipariş listesine ve detayına doğrudan sipariş silme
eklendi (orders zaten order_items/order_status_history/payments'a
cascade bağlı, engel yok).

İkisi de yalnızca test/hatalı veri temizliği için — gerçek sipariş
geçmişini silmek üzere değil. Native confirm()/alert() yerine iki
tıklamalı bir onay bileşeni (ConfirmDeleteButton) kullanıldı, projenin
toast-öncelikli UX kuralına uygun.

Roadmap'e bu özellik ve ayrıca gelecekte bayinin kendi siparişini
silip/düzenleyebilmesi (yeniden sipariş verebilmek için) ihtiyacı not
olarak eklendi.

Co-Authored-By: Claude Sonnet 5 <noreply@anthropic.com>
</commit_message>
<xml_diff>
--- a/docs/output/roadmap.docx
+++ b/docs/output/roadmap.docx
@@ -1239,56 +1239,6 @@
     </w:p>
     <w:p>
       <w:pPr>
-        <w:spacing w:after="120"/>
-      </w:pPr>
-      <w:r>
-        <w:rPr>
-          <w:b/>
-          <w:bCs/>
-          <w:color w:val="1A2420"/>
-          <w:sz w:val="21"/>
-          <w:szCs w:val="21"/>
-        </w:rPr>
-        <w:t xml:space="preserve">Çıkış kriteri —</w:t>
-      </w:r>
-      <w:r>
-        <w:rPr>
-          <w:color w:val="1A2420"/>
-          <w:sz w:val="21"/>
-          <w:szCs w:val="21"/>
-        </w:rPr>
-        <w:t xml:space="preserve"> üç ödeme tipiyle de (cari, kapıda ödeme, sanal POS
-başarılı/başarısız) uçtan uca sipariş oluşturulabiliyor; admin panelde durum
-geçişleri izlenebiliyor. Tarayıcıda doğrulandı.</w:t>
-      </w:r>
-    </w:p>
-    <w:p>
-      <w:pPr>
-        <w:pStyle w:val="Heading2"/>
-        <w:spacing w:after="100" w:before="220"/>
-      </w:pPr>
-      <w:r>
-        <w:rPr>
-          <w:color w:val="1A2420"/>
-        </w:rPr>
-        <w:t xml:space="preserve">Faz 4 — Cari Bakiye &amp;amp; Bağımsız Tahsilat Modülü</w:t>
-      </w:r>
-    </w:p>
-    <w:p>
-      <w:pPr>
-        <w:spacing w:after="120"/>
-      </w:pPr>
-      <w:r>
-        <w:rPr>
-          <w:color w:val="1A2420"/>
-          <w:sz w:val="21"/>
-          <w:szCs w:val="21"/>
-        </w:rPr>
-        <w:t xml:space="preserve">Hedef: Siparişten kopuk, serbest tutarlı ödeme ve cari hesap defteri.</w:t>
-      </w:r>
-    </w:p>
-    <w:p>
-      <w:pPr>
         <w:pStyle w:val="ListParagraph"/>
         <w:numPr>
           <w:ilvl w:val="0"/>
@@ -1301,7 +1251,111 @@
           <w:sz w:val="21"/>
           <w:szCs w:val="21"/>
         </w:rPr>
-        <w:t xml:space="preserve">Bayi panelinde &amp;quot;Bakiye Öde&amp;quot; ekranı</w:t>
+        <w:t xml:space="preserve">Sipariş silme (admin) ve ürün/marka için &amp;quot;zorla sil&amp;quot; — normal silme,
+sipariş geçmişinde kullanılan ürün/markayı </w:t>
+      </w:r>
+      <w:r>
+        <w:rPr>
+          <w:rFonts w:ascii="Consolas" w:cs="Consolas" w:eastAsia="Consolas" w:hAnsi="Consolas"/>
+          <w:color w:val="1F5F56"/>
+          <w:sz w:val="21"/>
+          <w:szCs w:val="21"/>
+        </w:rPr>
+        <w:t xml:space="preserve">order_items</w:t>
+      </w:r>
+      <w:r>
+        <w:rPr>
+          <w:sz w:val="21"/>
+          <w:szCs w:val="21"/>
+        </w:rPr>
+        <w:t xml:space="preserve"> FK&amp;#39;sinin
+engellemesiyle reddediyor (bkz. üstteki not); &amp;quot;zorla sil&amp;quot; önce o ürünü/
+markayı içeren siparişleri kaldırıp sonra siliyor. Yalnızca test/hatalı
+veri temizliği için düşünüldü — gerçek sipariş geçmişini silmek üzere
+kullanılmamalı. İki tıklamalı onay ile (</w:t>
+      </w:r>
+      <w:r>
+        <w:rPr>
+          <w:rFonts w:ascii="Consolas" w:cs="Consolas" w:eastAsia="Consolas" w:hAnsi="Consolas"/>
+          <w:color w:val="1F5F56"/>
+          <w:sz w:val="21"/>
+          <w:szCs w:val="21"/>
+        </w:rPr>
+        <w:t xml:space="preserve">ConfirmDeleteButton</w:t>
+      </w:r>
+      <w:r>
+        <w:rPr>
+          <w:sz w:val="21"/>
+          <w:szCs w:val="21"/>
+        </w:rPr>
+        <w:t xml:space="preserve">,
+native </w:t>
+      </w:r>
+      <w:r>
+        <w:rPr>
+          <w:rFonts w:ascii="Consolas" w:cs="Consolas" w:eastAsia="Consolas" w:hAnsi="Consolas"/>
+          <w:color w:val="1F5F56"/>
+          <w:sz w:val="21"/>
+          <w:szCs w:val="21"/>
+        </w:rPr>
+        <w:t xml:space="preserve">confirm()</w:t>
+      </w:r>
+      <w:r>
+        <w:rPr>
+          <w:sz w:val="21"/>
+          <w:szCs w:val="21"/>
+        </w:rPr>
+        <w:t xml:space="preserve"> yerine).</w:t>
+      </w:r>
+    </w:p>
+    <w:p>
+      <w:pPr>
+        <w:spacing w:after="120"/>
+      </w:pPr>
+      <w:r>
+        <w:rPr>
+          <w:b/>
+          <w:bCs/>
+          <w:color w:val="1A2420"/>
+          <w:sz w:val="21"/>
+          <w:szCs w:val="21"/>
+        </w:rPr>
+        <w:t xml:space="preserve">Çıkış kriteri —</w:t>
+      </w:r>
+      <w:r>
+        <w:rPr>
+          <w:color w:val="1A2420"/>
+          <w:sz w:val="21"/>
+          <w:szCs w:val="21"/>
+        </w:rPr>
+        <w:t xml:space="preserve"> üç ödeme tipiyle de (cari, kapıda ödeme, sanal POS
+başarılı/başarısız) uçtan uca sipariş oluşturulabiliyor; admin panelde durum
+geçişleri izlenebiliyor. Tarayıcıda doğrulandı.</w:t>
+      </w:r>
+    </w:p>
+    <w:p>
+      <w:pPr>
+        <w:pStyle w:val="Heading2"/>
+        <w:spacing w:after="100" w:before="220"/>
+      </w:pPr>
+      <w:r>
+        <w:rPr>
+          <w:color w:val="1A2420"/>
+        </w:rPr>
+        <w:t xml:space="preserve">Faz 4 — Cari Bakiye &amp;amp; Bağımsız Tahsilat Modülü</w:t>
+      </w:r>
+    </w:p>
+    <w:p>
+      <w:pPr>
+        <w:spacing w:after="120"/>
+      </w:pPr>
+      <w:r>
+        <w:rPr>
+          <w:color w:val="1A2420"/>
+          <w:sz w:val="21"/>
+          <w:szCs w:val="21"/>
+        </w:rPr>
+        <w:t xml:space="preserve">Hedef: Siparişten kopuk, serbest tutarlı ödeme ve cari hesap defteri.</w:t>
       </w:r>
     </w:p>
     <w:p>
@@ -1315,35 +1369,10 @@
       </w:pPr>
       <w:r>
         <w:rPr>
-          <w:rFonts w:ascii="Consolas" w:cs="Consolas" w:eastAsia="Consolas" w:hAnsi="Consolas"/>
-          <w:color w:val="1F5F56"/>
-          <w:sz w:val="21"/>
-          <w:szCs w:val="21"/>
-        </w:rPr>
-        <w:t xml:space="preserve">payments</w:t>
-      </w:r>
-      <w:r>
-        <w:rPr>
-          <w:sz w:val="21"/>
-          <w:szCs w:val="21"/>
-        </w:rPr>
-        <w:t xml:space="preserve"> tablosunda </w:t>
-      </w:r>
-      <w:r>
-        <w:rPr>
-          <w:rFonts w:ascii="Consolas" w:cs="Consolas" w:eastAsia="Consolas" w:hAnsi="Consolas"/>
-          <w:color w:val="1F5F56"/>
-          <w:sz w:val="21"/>
-          <w:szCs w:val="21"/>
-        </w:rPr>
-        <w:t xml:space="preserve">type = standalone_collection</w:t>
-      </w:r>
-      <w:r>
-        <w:rPr>
-          <w:sz w:val="21"/>
-          <w:szCs w:val="21"/>
-        </w:rPr>
-        <w:t xml:space="preserve"> kaydı</w:t>
+          <w:sz w:val="21"/>
+          <w:szCs w:val="21"/>
+        </w:rPr>
+        <w:t xml:space="preserve">Bayi panelinde &amp;quot;Bakiye Öde&amp;quot; ekranı</w:t>
       </w:r>
     </w:p>
     <w:p>
@@ -1362,14 +1391,30 @@
           <w:sz w:val="21"/>
           <w:szCs w:val="21"/>
         </w:rPr>
-        <w:t xml:space="preserve">ledger_entries</w:t>
-      </w:r>
-      <w:r>
-        <w:rPr>
-          <w:sz w:val="21"/>
-          <w:szCs w:val="21"/>
-        </w:rPr>
-        <w:t xml:space="preserve"> defteri ve bakiye hesaplama</w:t>
+        <w:t xml:space="preserve">payments</w:t>
+      </w:r>
+      <w:r>
+        <w:rPr>
+          <w:sz w:val="21"/>
+          <w:szCs w:val="21"/>
+        </w:rPr>
+        <w:t xml:space="preserve"> tablosunda </w:t>
+      </w:r>
+      <w:r>
+        <w:rPr>
+          <w:rFonts w:ascii="Consolas" w:cs="Consolas" w:eastAsia="Consolas" w:hAnsi="Consolas"/>
+          <w:color w:val="1F5F56"/>
+          <w:sz w:val="21"/>
+          <w:szCs w:val="21"/>
+        </w:rPr>
+        <w:t xml:space="preserve">type = standalone_collection</w:t>
+      </w:r>
+      <w:r>
+        <w:rPr>
+          <w:sz w:val="21"/>
+          <w:szCs w:val="21"/>
+        </w:rPr>
+        <w:t xml:space="preserve"> kaydı</w:t>
       </w:r>
     </w:p>
     <w:p>
@@ -1383,10 +1428,19 @@
       </w:pPr>
       <w:r>
         <w:rPr>
-          <w:sz w:val="21"/>
-          <w:szCs w:val="21"/>
-        </w:rPr>
-        <w:t xml:space="preserve">Admin tarafında cari hesap ekstresi görünümü</w:t>
+          <w:rFonts w:ascii="Consolas" w:cs="Consolas" w:eastAsia="Consolas" w:hAnsi="Consolas"/>
+          <w:color w:val="1F5F56"/>
+          <w:sz w:val="21"/>
+          <w:szCs w:val="21"/>
+        </w:rPr>
+        <w:t xml:space="preserve">ledger_entries</w:t>
+      </w:r>
+      <w:r>
+        <w:rPr>
+          <w:sz w:val="21"/>
+          <w:szCs w:val="21"/>
+        </w:rPr>
+        <w:t xml:space="preserve"> defteri ve bakiye hesaplama</w:t>
       </w:r>
     </w:p>
     <w:p>
@@ -1403,9 +1457,7 @@
           <w:sz w:val="21"/>
           <w:szCs w:val="21"/>
         </w:rPr>
-        <w:t xml:space="preserve">Bayi kataloğunda toplu ürün seçimi + tek işlemle sepete ekleme — Payna
-Grup Portal karşılaştırmasından gelen ek kapsam, katalog tarafında
-sipariş verme hızını artırır</w:t>
+        <w:t xml:space="preserve">Admin tarafında cari hesap ekstresi görünümü</w:t>
       </w:r>
     </w:p>
     <w:p>
@@ -1422,8 +1474,9 @@
           <w:sz w:val="21"/>
           <w:szCs w:val="21"/>
         </w:rPr>
-        <w:t xml:space="preserve">Sepette KDV tutarının ayrı bir satırda gösterilmesi — checkout toplamı
-şu an tek kalem, kırılım yok</w:t>
+        <w:t xml:space="preserve">Bayi kataloğunda toplu ürün seçimi + tek işlemle sepete ekleme — Payna
+Grup Portal karşılaştırmasından gelen ek kapsam, katalog tarafında
+sipariş verme hızını artırır</w:t>
       </w:r>
     </w:p>
     <w:p>
@@ -1440,9 +1493,8 @@
           <w:sz w:val="21"/>
           <w:szCs w:val="21"/>
         </w:rPr>
-        <w:t xml:space="preserve">Şifremi unuttum akışı — e-posta ile şifre sıfırlama; bir e-posta
-gönderim servisi (ör. Resend) entegrasyonu gerektirir, teknoloji
-yığınına yeni eklenecek</w:t>
+        <w:t xml:space="preserve">Sepette KDV tutarının ayrı bir satırda gösterilmesi — checkout toplamı
+şu an tek kalem, kırılım yok</w:t>
       </w:r>
     </w:p>
     <w:p>
@@ -1459,9 +1511,9 @@
           <w:sz w:val="21"/>
           <w:szCs w:val="21"/>
         </w:rPr>
-        <w:t xml:space="preserve">Sepet ekranının sağdan açılan bir panel (drawer) olarak yeniden
-tasarlanması — siparis.paynagrup.com&amp;#39;daki sepet deneyiminin karşılığı,
-roadmap dışı bir ek kapsam</w:t>
+        <w:t xml:space="preserve">Şifremi unuttum akışı — e-posta ile şifre sıfırlama; bir e-posta
+gönderim servisi (ör. Resend) entegrasyonu gerektirir, teknoloji
+yığınına yeni eklenecek</w:t>
       </w:r>
     </w:p>
     <w:p>
@@ -1478,8 +1530,9 @@
           <w:sz w:val="21"/>
           <w:szCs w:val="21"/>
         </w:rPr>
-        <w:t xml:space="preserve">Admin ürün sayfasında &amp;quot;Ürünler&amp;quot; bölümünün &amp;quot;Kategoriler&amp;quot; bölümünün
-üstüne taşınması</w:t>
+        <w:t xml:space="preserve">Sepet ekranının sağdan açılan bir panel (drawer) olarak yeniden
+tasarlanması — siparis.paynagrup.com&amp;#39;daki sepet deneyiminin karşılığı,
+roadmap dışı bir ek kapsam</w:t>
       </w:r>
     </w:p>
     <w:p>
@@ -1496,10 +1549,50 @@
           <w:sz w:val="21"/>
           <w:szCs w:val="21"/>
         </w:rPr>
+        <w:t xml:space="preserve">Admin ürün sayfasında &amp;quot;Ürünler&amp;quot; bölümünün &amp;quot;Kategoriler&amp;quot; bölümünün
+üstüne taşınması</w:t>
+      </w:r>
+    </w:p>
+    <w:p>
+      <w:pPr>
+        <w:pStyle w:val="ListParagraph"/>
+        <w:numPr>
+          <w:ilvl w:val="0"/>
+          <w:numId w:val="1"/>
+        </w:numPr>
+        <w:spacing w:after="60"/>
+      </w:pPr>
+      <w:r>
+        <w:rPr>
+          <w:sz w:val="21"/>
+          <w:szCs w:val="21"/>
+        </w:rPr>
         <w:t xml:space="preserve">Ürün tablosunda &amp;quot;Durum&amp;quot; ve &amp;quot;Sil&amp;quot; arasına bir &amp;quot;Düzenle&amp;quot; butonu — SKU,
 kategori, fiyat, isim, birim ve aktif/pasif dahil tüm alanların tek
 formdan güncellenebilmesi (şu an yalnızca durum değiştirme ve silme var,
 diğer alanlar için düzenleme yok)</w:t>
+      </w:r>
+    </w:p>
+    <w:p>
+      <w:pPr>
+        <w:pStyle w:val="ListParagraph"/>
+        <w:numPr>
+          <w:ilvl w:val="0"/>
+          <w:numId w:val="1"/>
+        </w:numPr>
+        <w:spacing w:after="60"/>
+      </w:pPr>
+      <w:r>
+        <w:rPr>
+          <w:sz w:val="21"/>
+          <w:szCs w:val="21"/>
+        </w:rPr>
+        <w:t xml:space="preserve">Bayinin kendi siparişini silebilmesi ya da düzenleyebilmesi — amaç bir
+bayinin hatalı/yanlış girilmiş bir siparişi iptal edip tekrar sipariş
+geçebilmesi. Admin tarafındaki &amp;quot;zorla sil&amp;quot; (yukarıdaki not) yalnızca
+test verisi temizliği içindi, bu madde gerçek bayi iş akışı için ayrı
+bir tasarım gerektiriyor (ör. hangi durumdaki siparişler
+iptal/düzenlemeye açık olacak, cari bakiyeye etkisi ne olacak).</w:t>
       </w:r>
     </w:p>
     <w:p>

</xml_diff>

<commit_message>
Faz 4: Sepete KDV kırılımı ve sağdan açılan sepet drawer'ı ekle
Ürün bazında değişken KDV oranı eklendi (products.vat_rate); sipariş
kalemleri oranı sipariş anında snapshot'lıyor ki ürünün oranı sonradan
değişse geçmiş siparişler etkilenmesin. Sepet, checkout ve sipariş
detay ekranları artık Ara Toplam/KDV/Genel Toplam kırılımı gösteriyor;
orders.total_amount anlamı nettten brüte değişti. Sepet ayrıca bayi
panelinin her yerinden erişilebilen, marka bazlı gruplu bir sağ
drawer'a taşındı.

Co-Authored-By: Claude Sonnet 5 <noreply@anthropic.com>
</commit_message>
<xml_diff>
--- a/docs/output/roadmap.docx
+++ b/docs/output/roadmap.docx
@@ -59,7 +59,7 @@
           <w:sz w:val="17"/>
           <w:szCs w:val="17"/>
         </w:rPr>
-        <w:t xml:space="preserve">Oluşturulma tarihi: 9 Ağustos 2026</w:t>
+        <w:t xml:space="preserve">Oluşturulma tarihi: 13 Ağustos 2026</w:t>
       </w:r>
     </w:p>
     <w:p>
@@ -1493,8 +1493,85 @@
           <w:sz w:val="21"/>
           <w:szCs w:val="21"/>
         </w:rPr>
-        <w:t xml:space="preserve">Sepette KDV tutarının ayrı bir satırda gösterilmesi — checkout toplamı
-şu an tek kalem, kırılım yok</w:t>
+        <w:t xml:space="preserve">Sepette KDV tutarının ayrı bir satırda gösterilmesi</w:t>
+      </w:r>
+      <w:r>
+        <w:rPr>
+          <w:sz w:val="21"/>
+          <w:szCs w:val="21"/>
+        </w:rPr>
+        <w:t xml:space="preserve"> — ✅ Tamamlandı.
+KDV oranı ürün bazında değişken (</w:t>
+      </w:r>
+      <w:r>
+        <w:rPr>
+          <w:rFonts w:ascii="Consolas" w:cs="Consolas" w:eastAsia="Consolas" w:hAnsi="Consolas"/>
+          <w:color w:val="1F5F56"/>
+          <w:sz w:val="21"/>
+          <w:szCs w:val="21"/>
+        </w:rPr>
+        <w:t xml:space="preserve">products.vat_rate</w:t>
+      </w:r>
+      <w:r>
+        <w:rPr>
+          <w:sz w:val="21"/>
+          <w:szCs w:val="21"/>
+        </w:rPr>
+        <w:t xml:space="preserve">); sipariş kalemi
+oranı sipariş anında snapshot&amp;#39;lanıyor (</w:t>
+      </w:r>
+      <w:r>
+        <w:rPr>
+          <w:rFonts w:ascii="Consolas" w:cs="Consolas" w:eastAsia="Consolas" w:hAnsi="Consolas"/>
+          <w:color w:val="1F5F56"/>
+          <w:sz w:val="21"/>
+          <w:szCs w:val="21"/>
+        </w:rPr>
+        <w:t xml:space="preserve">order_items.vat_rate</w:t>
+      </w:r>
+      <w:r>
+        <w:rPr>
+          <w:sz w:val="21"/>
+          <w:szCs w:val="21"/>
+        </w:rPr>
+        <w:t xml:space="preserve">/
+</w:t>
+      </w:r>
+      <w:r>
+        <w:rPr>
+          <w:rFonts w:ascii="Consolas" w:cs="Consolas" w:eastAsia="Consolas" w:hAnsi="Consolas"/>
+          <w:color w:val="1F5F56"/>
+          <w:sz w:val="21"/>
+          <w:szCs w:val="21"/>
+        </w:rPr>
+        <w:t xml:space="preserve">vat_amount</w:t>
+      </w:r>
+      <w:r>
+        <w:rPr>
+          <w:sz w:val="21"/>
+          <w:szCs w:val="21"/>
+        </w:rPr>
+        <w:t xml:space="preserve">) ki ürünün oranı sonradan değişse geçmiş siparişler
+etkilenmesin. Sepet, checkout ve sipariş detay ekranlarında Ara Toplam/
+KDV/Genel Toplam kırılımı gösteriliyor; </w:t>
+      </w:r>
+      <w:r>
+        <w:rPr>
+          <w:rFonts w:ascii="Consolas" w:cs="Consolas" w:eastAsia="Consolas" w:hAnsi="Consolas"/>
+          <w:color w:val="1F5F56"/>
+          <w:sz w:val="21"/>
+          <w:szCs w:val="21"/>
+        </w:rPr>
+        <w:t xml:space="preserve">orders.total_amount</w:t>
+      </w:r>
+      <w:r>
+        <w:rPr>
+          <w:sz w:val="21"/>
+          <w:szCs w:val="21"/>
+        </w:rPr>
+        <w:t xml:space="preserve"> artık net
+değil brüt (KDV dahil) tutar — cari limit kontrolü ve mock POS tutarı da
+buna göre brüt üzerinden çalışıyor.</w:t>
       </w:r>
     </w:p>
     <w:p>
@@ -1531,8 +1608,33 @@
           <w:szCs w:val="21"/>
         </w:rPr>
         <w:t xml:space="preserve">Sepet ekranının sağdan açılan bir panel (drawer) olarak yeniden
-tasarlanması — siparis.paynagrup.com&amp;#39;daki sepet deneyiminin karşılığı,
-roadmap dışı bir ek kapsam</w:t>
+tasarlanması</w:t>
+      </w:r>
+      <w:r>
+        <w:rPr>
+          <w:sz w:val="21"/>
+          <w:szCs w:val="21"/>
+        </w:rPr>
+        <w:t xml:space="preserve"> — ✅ Tamamlandı. Sepet artık bayi panelinin her
+ekranından header&amp;#39;daki sepet ikonuyla erişilebilen, marka bazlı gruplu
+bir drawer (</w:t>
+      </w:r>
+      <w:r>
+        <w:rPr>
+          <w:rFonts w:ascii="Consolas" w:cs="Consolas" w:eastAsia="Consolas" w:hAnsi="Consolas"/>
+          <w:color w:val="1F5F56"/>
+          <w:sz w:val="21"/>
+          <w:szCs w:val="21"/>
+        </w:rPr>
+        <w:t xml:space="preserve">src/app/dealer/cart-drawer.tsx</w:t>
+      </w:r>
+      <w:r>
+        <w:rPr>
+          <w:sz w:val="21"/>
+          <w:szCs w:val="21"/>
+        </w:rPr>
+        <w:t xml:space="preserve">) — siparis.paynagrup.com&amp;#39;daki
+sepet deneyiminin karşılığı, roadmap dışı bir ek kapsamdı.</w:t>
       </w:r>
     </w:p>
     <w:p>

</xml_diff>

<commit_message>
Faz 4: Şifremi unuttum akışı (mock e-posta sağlayıcısı) ekle
Ödeme tarafındaki PaymentProvider/MockPosProvider deseni e-posta için
de tekrarlandı: EmailProvider arayüzü + MockEmailProvider, gerçek mail
göndermeden linki dev konsoluna yazıyor. Tek kullanımlık, 1 saatlik
password_reset_tokens tablosu ham token yerine SHA-256 hash'i saklıyor.
Login sayfasına "Şifremi unuttum?" linki eklendi.

Co-Authored-By: Claude Sonnet 5 <noreply@anthropic.com>
</commit_message>
<xml_diff>
--- a/docs/output/roadmap.docx
+++ b/docs/output/roadmap.docx
@@ -1588,9 +1588,118 @@
           <w:sz w:val="21"/>
           <w:szCs w:val="21"/>
         </w:rPr>
-        <w:t xml:space="preserve">Şifremi unuttum akışı — e-posta ile şifre sıfırlama; bir e-posta
-gönderim servisi (ör. Resend) entegrasyonu gerektirir, teknoloji
-yığınına yeni eklenecek</w:t>
+        <w:t xml:space="preserve">Şifremi unuttum akışı</w:t>
+      </w:r>
+      <w:r>
+        <w:rPr>
+          <w:sz w:val="21"/>
+          <w:szCs w:val="21"/>
+        </w:rPr>
+        <w:t xml:space="preserve"> — ✅ Tamamlandı (mock-first). </w:t>
+      </w:r>
+      <w:r>
+        <w:rPr>
+          <w:rFonts w:ascii="Consolas" w:cs="Consolas" w:eastAsia="Consolas" w:hAnsi="Consolas"/>
+          <w:color w:val="1F5F56"/>
+          <w:sz w:val="21"/>
+          <w:szCs w:val="21"/>
+        </w:rPr>
+        <w:t xml:space="preserve">EmailProvider</w:t>
+      </w:r>
+      <w:r>
+        <w:rPr>
+          <w:sz w:val="21"/>
+          <w:szCs w:val="21"/>
+        </w:rPr>
+        <w:t xml:space="preserve">
+arayüzü + </w:t>
+      </w:r>
+      <w:r>
+        <w:rPr>
+          <w:rFonts w:ascii="Consolas" w:cs="Consolas" w:eastAsia="Consolas" w:hAnsi="Consolas"/>
+          <w:color w:val="1F5F56"/>
+          <w:sz w:val="21"/>
+          <w:szCs w:val="21"/>
+        </w:rPr>
+        <w:t xml:space="preserve">MockEmailProvider</w:t>
+      </w:r>
+      <w:r>
+        <w:rPr>
+          <w:sz w:val="21"/>
+          <w:szCs w:val="21"/>
+        </w:rPr>
+        <w:t xml:space="preserve"> (</w:t>
+      </w:r>
+      <w:r>
+        <w:rPr>
+          <w:rFonts w:ascii="Consolas" w:cs="Consolas" w:eastAsia="Consolas" w:hAnsi="Consolas"/>
+          <w:color w:val="1F5F56"/>
+          <w:sz w:val="21"/>
+          <w:szCs w:val="21"/>
+        </w:rPr>
+        <w:t xml:space="preserve">src/lib/email/</w:t>
+      </w:r>
+      <w:r>
+        <w:rPr>
+          <w:sz w:val="21"/>
+          <w:szCs w:val="21"/>
+        </w:rPr>
+        <w:t xml:space="preserve">) — ödeme tarafındaki
+</w:t>
+      </w:r>
+      <w:r>
+        <w:rPr>
+          <w:rFonts w:ascii="Consolas" w:cs="Consolas" w:eastAsia="Consolas" w:hAnsi="Consolas"/>
+          <w:color w:val="1F5F56"/>
+          <w:sz w:val="21"/>
+          <w:szCs w:val="21"/>
+        </w:rPr>
+        <w:t xml:space="preserve">PaymentProvider</w:t>
+      </w:r>
+      <w:r>
+        <w:rPr>
+          <w:sz w:val="21"/>
+          <w:szCs w:val="21"/>
+        </w:rPr>
+        <w:t xml:space="preserve">/</w:t>
+      </w:r>
+      <w:r>
+        <w:rPr>
+          <w:rFonts w:ascii="Consolas" w:cs="Consolas" w:eastAsia="Consolas" w:hAnsi="Consolas"/>
+          <w:color w:val="1F5F56"/>
+          <w:sz w:val="21"/>
+          <w:szCs w:val="21"/>
+        </w:rPr>
+        <w:t xml:space="preserve">MockPosProvider</w:t>
+      </w:r>
+      <w:r>
+        <w:rPr>
+          <w:sz w:val="21"/>
+          <w:szCs w:val="21"/>
+        </w:rPr>
+        <w:t xml:space="preserve"> deseniyle birebir aynı; gerçek mail
+gönderilmiyor, link geliştirici konsoluna yazılıyor. Tek kullanımlık,
+1 saatlik </w:t>
+      </w:r>
+      <w:r>
+        <w:rPr>
+          <w:rFonts w:ascii="Consolas" w:cs="Consolas" w:eastAsia="Consolas" w:hAnsi="Consolas"/>
+          <w:color w:val="1F5F56"/>
+          <w:sz w:val="21"/>
+          <w:szCs w:val="21"/>
+        </w:rPr>
+        <w:t xml:space="preserve">password_reset_tokens</w:t>
+      </w:r>
+      <w:r>
+        <w:rPr>
+          <w:sz w:val="21"/>
+          <w:szCs w:val="21"/>
+        </w:rPr>
+        <w:t xml:space="preserve"> tablosu (ham token yerine SHA-256
+hash&amp;#39;i saklanıyor). Gerçek bir sağlayıcıya (ör. Resend) geçiş, Faz 6&amp;#39;daki
+ödeme sağlayıcısı geçişiyle aynı şekilde tek bir implementasyon
+eklenerek yapılacak — teknoloji yığınına henüz yeni bir servis
+eklenmedi.</w:t>
       </w:r>
     </w:p>
     <w:p>

</xml_diff>

<commit_message>
Admin ürün sayfasında Ürünler bölümünü Kategoriler'in üstüne taşı
Co-Authored-By: Claude Sonnet 5 <noreply@anthropic.com>
</commit_message>
<xml_diff>
--- a/docs/output/roadmap.docx
+++ b/docs/output/roadmap.docx
@@ -1760,8 +1760,15 @@
           <w:sz w:val="21"/>
           <w:szCs w:val="21"/>
         </w:rPr>
-        <w:t xml:space="preserve">Admin ürün sayfasında &amp;quot;Ürünler&amp;quot; bölümünün &amp;quot;Kategoriler&amp;quot; bölümünün
+        <w:t xml:space="preserve">Admin ürün sayfasında "Ürünler" bölümünün "Kategoriler" bölümünün
 üstüne taşınması</w:t>
+      </w:r>
+      <w:r>
+        <w:rPr>
+          <w:sz w:val="21"/>
+          <w:szCs w:val="21"/>
+        </w:rPr>
+        <w:t xml:space="preserve"> — ✅ Tamamlandı.</w:t>
       </w:r>
     </w:p>
     <w:p>

</xml_diff>

<commit_message>
Admin ürün tablosuna Düzenle butonu ekle (bayi deseniyle aynı)
EditDealerModal ile aynı desen: EditProductModal tek formdan ad, SKU,
birim, fiyat, KDV %, kategori ve aktif/pasif durumunu günceller. Ayrı
duran satır-içi KDV düzenleyici bu modala taşındığı için kaldırıldı.

Co-Authored-By: Claude Sonnet 5 <noreply@anthropic.com>
</commit_message>
<xml_diff>
--- a/docs/output/roadmap.docx
+++ b/docs/output/roadmap.docx
@@ -1785,10 +1785,67 @@
           <w:sz w:val="21"/>
           <w:szCs w:val="21"/>
         </w:rPr>
-        <w:t xml:space="preserve">Ürün tablosunda &amp;quot;Durum&amp;quot; ve &amp;quot;Sil&amp;quot; arasına bir &amp;quot;Düzenle&amp;quot; butonu — SKU,
-kategori, fiyat, isim, birim ve aktif/pasif dahil tüm alanların tek
-formdan güncellenebilmesi (şu an yalnızca durum değiştirme ve silme var,
-diğer alanlar için düzenleme yok)</w:t>
+        <w:t xml:space="preserve">Ürün tablosunda "Durum" ve "Sil" arasına bir "Düzenle" butonu</w:t>
+      </w:r>
+      <w:r>
+        <w:rPr>
+          <w:sz w:val="21"/>
+          <w:szCs w:val="21"/>
+        </w:rPr>
+        <w:t xml:space="preserve"> — ✅
+Tamamlandı. Bayi düzenleme modalıyla (</w:t>
+      </w:r>
+      <w:r>
+        <w:rPr>
+          <w:rFonts w:ascii="Consolas" w:cs="Consolas" w:eastAsia="Consolas" w:hAnsi="Consolas"/>
+          <w:color w:val="1F5F56"/>
+          <w:sz w:val="21"/>
+          <w:szCs w:val="21"/>
+        </w:rPr>
+        <w:t xml:space="preserve">EditDealerModal</w:t>
+      </w:r>
+      <w:r>
+        <w:rPr>
+          <w:sz w:val="21"/>
+          <w:szCs w:val="21"/>
+        </w:rPr>
+        <w:t xml:space="preserve">) aynı desen:
+</w:t>
+      </w:r>
+      <w:r>
+        <w:rPr>
+          <w:rFonts w:ascii="Consolas" w:cs="Consolas" w:eastAsia="Consolas" w:hAnsi="Consolas"/>
+          <w:color w:val="1F5F56"/>
+          <w:sz w:val="21"/>
+          <w:szCs w:val="21"/>
+        </w:rPr>
+        <w:t xml:space="preserve">EditProductModal</w:t>
+      </w:r>
+      <w:r>
+        <w:rPr>
+          <w:sz w:val="21"/>
+          <w:szCs w:val="21"/>
+        </w:rPr>
+        <w:t xml:space="preserve"> (</w:t>
+      </w:r>
+      <w:r>
+        <w:rPr>
+          <w:rFonts w:ascii="Consolas" w:cs="Consolas" w:eastAsia="Consolas" w:hAnsi="Consolas"/>
+          <w:color w:val="1F5F56"/>
+          <w:sz w:val="21"/>
+          <w:szCs w:val="21"/>
+        </w:rPr>
+        <w:t xml:space="preserve">src/app/admin/products/edit-product-modal.tsx</w:t>
+      </w:r>
+      <w:r>
+        <w:rPr>
+          <w:sz w:val="21"/>
+          <w:szCs w:val="21"/>
+        </w:rPr>
+        <w:t xml:space="preserve">) —
+ad, SKU, birim, fiyat, KDV %, kategori ve aktif/pasif tek formdan
+güncelleniyor. Eskiden ayrı duran satır-içi KDV düzenleyici bu modalın
+içine taşındığı için kaldırıldı.</w:t>
       </w:r>
     </w:p>
     <w:p>

</xml_diff>

<commit_message>
Bayi kataloğunda hiyerarşik kategori gruplaması ekle
Ürünler artık üst kategori başlığı altında, alt kategorileri girintili
alt başlıklar olarak gösterilerek rekürsif gruplanıyor (ör. "Börekler"
altında "Boşnak Börekleri"). Kategorisiz ürünler "Diğer" altında
toplanıyor. src/lib/category-tree.ts, categories.parentId'nin zaten
desteklediği keyfi derinlikte ağaç kurup product-catalog.tsx'te
rekürsif render ediyor.

Co-Authored-By: Claude Sonnet 5 <noreply@anthropic.com>
</commit_message>
<xml_diff>
--- a/docs/output/roadmap.docx
+++ b/docs/output/roadmap.docx
@@ -1868,6 +1868,103 @@
 test verisi temizliği içindi, bu madde gerçek bayi iş akışı için ayrı
 bir tasarım gerektiriyor (ör. hangi durumdaki siparişler
 iptal/düzenlemeye açık olacak, cari bakiyeye etkisi ne olacak).</w:t>
+      </w:r>
+    </w:p>
+    <w:p>
+      <w:pPr>
+        <w:pStyle w:val="ListParagraph"/>
+        <w:numPr>
+          <w:ilvl w:val="0"/>
+          <w:numId w:val="1"/>
+        </w:numPr>
+        <w:spacing w:after="60"/>
+      </w:pPr>
+      <w:r>
+        <w:rPr>
+          <w:sz w:val="21"/>
+          <w:szCs w:val="21"/>
+        </w:rPr>
+        <w:t xml:space="preserve">Bayi ürün kataloğunda hiyerarşik kategori gruplaması</w:t>
+      </w:r>
+      <w:r>
+        <w:rPr>
+          <w:sz w:val="21"/>
+          <w:szCs w:val="21"/>
+        </w:rPr>
+        <w:t xml:space="preserve"> — ✅ Tamamlandı,
+roadmap dışı bir ek kapsam. Kategoriler zaten kendine referans veren
+</w:t>
+      </w:r>
+      <w:r>
+        <w:rPr>
+          <w:rFonts w:ascii="Consolas" w:cs="Consolas" w:eastAsia="Consolas" w:hAnsi="Consolas"/>
+          <w:color w:val="1F5F56"/>
+          <w:sz w:val="21"/>
+          <w:szCs w:val="21"/>
+        </w:rPr>
+        <w:t xml:space="preserve">parentId</w:t>
+      </w:r>
+      <w:r>
+        <w:rPr>
+          <w:sz w:val="21"/>
+          <w:szCs w:val="21"/>
+        </w:rPr>
+        <w:t xml:space="preserve"> ile (Faz 2) keyfi derinlikte dallanabiliyordu; eksik olan
+bunu bayi kataloğunda görsel olarak yansıtmaktı. </w:t>
+      </w:r>
+      <w:r>
+        <w:rPr>
+          <w:rFonts w:ascii="Consolas" w:cs="Consolas" w:eastAsia="Consolas" w:hAnsi="Consolas"/>
+          <w:color w:val="1F5F56"/>
+          <w:sz w:val="21"/>
+          <w:szCs w:val="21"/>
+        </w:rPr>
+        <w:t xml:space="preserve">src/lib/ category-tree.ts</w:t>
+      </w:r>
+      <w:r>
+        <w:rPr>
+          <w:sz w:val="21"/>
+          <w:szCs w:val="21"/>
+        </w:rPr>
+        <w:t xml:space="preserve"> (</w:t>
+      </w:r>
+      <w:r>
+        <w:rPr>
+          <w:rFonts w:ascii="Consolas" w:cs="Consolas" w:eastAsia="Consolas" w:hAnsi="Consolas"/>
+          <w:color w:val="1F5F56"/>
+          <w:sz w:val="21"/>
+          <w:szCs w:val="21"/>
+        </w:rPr>
+        <w:t xml:space="preserve">buildCategoryTree</w:t>
+      </w:r>
+      <w:r>
+        <w:rPr>
+          <w:sz w:val="21"/>
+          <w:szCs w:val="21"/>
+        </w:rPr>
+        <w:t xml:space="preserve">) düz kategori listesini ağaca
+çevirir, </w:t>
+      </w:r>
+      <w:r>
+        <w:rPr>
+          <w:rFonts w:ascii="Consolas" w:cs="Consolas" w:eastAsia="Consolas" w:hAnsi="Consolas"/>
+          <w:color w:val="1F5F56"/>
+          <w:sz w:val="21"/>
+          <w:szCs w:val="21"/>
+        </w:rPr>
+        <w:t xml:space="preserve">src/app/dealer/product-catalog.tsx</w:t>
+      </w:r>
+      <w:r>
+        <w:rPr>
+          <w:sz w:val="21"/>
+          <w:szCs w:val="21"/>
+        </w:rPr>
+        <w:t xml:space="preserve"> bunu rekürsif render eder:
+bir ürün bir alt kategoriye atandığında (ör. &amp;quot;Boşnak Börekleri&amp;quot;), o ürün
+kataloğunda üst kategorinin (&amp;quot;Börekler&amp;quot;) başlığı altında, kendi alt
+kategori başlığıyla girintili gösterilir; aynı kategorideki ürünler alt
+alta bir tabloda listelenir. Kategorisiz ürünler &amp;quot;Diğer&amp;quot; başlığı altında
+toplanır.</w:t>
       </w:r>
     </w:p>
     <w:p>

</xml_diff>

<commit_message>
Admin ürün tablosuna kategori gruplamasını taşı, sepet miktarını 0'dan başlat
Admin → Ürünler tablosu artık dealer kataloğuyla aynı hiyerarşik kategori
gruplamasını kullanıyor (product-category-groups.tsx + product-table.tsx);
tekrar eden "boş kategori render etme" kontrolü (categoryHasItems)
category-tree.ts'e taşınıp iki taraf arasında paylaşıldı, ayrı "Kategori"
sütunu kaldırıldı.

Bayi kataloğunda "Ekle" satırındaki miktar alanı artık 1 değil 0'dan
başlıyor — yanlışlıkla tıklanıp 1 adet eklenmesini önlemek için; 0
miktarla eklemeye çalışınca uyarı toast'ı gösteriliyor.

Co-Authored-By: Claude Sonnet 5 <noreply@anthropic.com>
</commit_message>
<xml_diff>
--- a/docs/output/roadmap.docx
+++ b/docs/output/roadmap.docx
@@ -1964,7 +1964,96 @@
 kataloğunda üst kategorinin (&amp;quot;Börekler&amp;quot;) başlığı altında, kendi alt
 kategori başlığıyla girintili gösterilir; aynı kategorideki ürünler alt
 alta bir tabloda listelenir. Kategorisiz ürünler &amp;quot;Diğer&amp;quot; başlığı altında
-toplanır.</w:t>
+toplanır. Aynı gruplama admin → Ürünler tablosuna da uygulandı
+(</w:t>
+      </w:r>
+      <w:r>
+        <w:rPr>
+          <w:rFonts w:ascii="Consolas" w:cs="Consolas" w:eastAsia="Consolas" w:hAnsi="Consolas"/>
+          <w:color w:val="1F5F56"/>
+          <w:sz w:val="21"/>
+          <w:szCs w:val="21"/>
+        </w:rPr>
+        <w:t xml:space="preserve">src/app/admin/products/product-category-groups.tsx</w:t>
+      </w:r>
+      <w:r>
+        <w:rPr>
+          <w:sz w:val="21"/>
+          <w:szCs w:val="21"/>
+        </w:rPr>
+        <w:t xml:space="preserve"> +
+</w:t>
+      </w:r>
+      <w:r>
+        <w:rPr>
+          <w:rFonts w:ascii="Consolas" w:cs="Consolas" w:eastAsia="Consolas" w:hAnsi="Consolas"/>
+          <w:color w:val="1F5F56"/>
+          <w:sz w:val="21"/>
+          <w:szCs w:val="21"/>
+        </w:rPr>
+        <w:t xml:space="preserve">product-table.tsx</w:t>
+      </w:r>
+      <w:r>
+        <w:rPr>
+          <w:sz w:val="21"/>
+          <w:szCs w:val="21"/>
+        </w:rPr>
+        <w:t xml:space="preserve">) — tekrarlanan &amp;quot;boş kategori render etme&amp;quot; mantığı
+(</w:t>
+      </w:r>
+      <w:r>
+        <w:rPr>
+          <w:rFonts w:ascii="Consolas" w:cs="Consolas" w:eastAsia="Consolas" w:hAnsi="Consolas"/>
+          <w:color w:val="1F5F56"/>
+          <w:sz w:val="21"/>
+          <w:szCs w:val="21"/>
+        </w:rPr>
+        <w:t xml:space="preserve">categoryHasItems</w:t>
+      </w:r>
+      <w:r>
+        <w:rPr>
+          <w:sz w:val="21"/>
+          <w:szCs w:val="21"/>
+        </w:rPr>
+        <w:t xml:space="preserve">) </w:t>
+      </w:r>
+      <w:r>
+        <w:rPr>
+          <w:rFonts w:ascii="Consolas" w:cs="Consolas" w:eastAsia="Consolas" w:hAnsi="Consolas"/>
+          <w:color w:val="1F5F56"/>
+          <w:sz w:val="21"/>
+          <w:szCs w:val="21"/>
+        </w:rPr>
+        <w:t xml:space="preserve">category-tree.ts</w:t>
+      </w:r>
+      <w:r>
+        <w:rPr>
+          <w:sz w:val="21"/>
+          <w:szCs w:val="21"/>
+        </w:rPr>
+        <w:t xml:space="preserve">&amp;#39;e taşınıp iki taraf arasında
+paylaşıldı; artık tekrar eden &amp;quot;Kategori&amp;quot; sütunu yerine gruplama
+kullanılıyor.</w:t>
+      </w:r>
+    </w:p>
+    <w:p>
+      <w:pPr>
+        <w:pStyle w:val="ListParagraph"/>
+        <w:numPr>
+          <w:ilvl w:val="0"/>
+          <w:numId w:val="1"/>
+        </w:numPr>
+        <w:spacing w:after="60"/>
+      </w:pPr>
+      <w:r>
+        <w:rPr>
+          <w:sz w:val="21"/>
+          <w:szCs w:val="21"/>
+        </w:rPr>
+        <w:t xml:space="preserve">Bayi kataloğunda &amp;quot;Ekle&amp;quot; satırındaki miktar alanının varsayılanı 1 yerine
+0 yapıldı — yanlışlıkla &amp;quot;Ekle&amp;quot;ye basılıp 1 adet eklenmesini önlemek
+için; miktar 0 iken &amp;quot;Ekle&amp;quot;ye basılırsa &amp;quot;Lütfen bir miktar girin&amp;quot; hatası
+gösterilir.</w:t>
       </w:r>
     </w:p>
     <w:p>

</xml_diff>

<commit_message>
Bayi kataloğuna miktarları temizle ve sepeti boşalt ekle
Ürün listesinin üstüne "Tüm miktarları temizle" eklendi — sepete
eklenmemiş, o an girilmiş miktar alanlarını sıfırlar (ProductRow'ları
bir resetSignal key değişimiyle yeniden mount ederek). Header'daki sepet
ikonunun yanına "Sepeti boşalt" eklendi (CartContext.clearCart, tüm
markalar); sepet boşken buton pasif/tıklanamaz.

Co-Authored-By: Claude Sonnet 5 <noreply@anthropic.com>
</commit_message>
<xml_diff>
--- a/docs/output/roadmap.docx
+++ b/docs/output/roadmap.docx
@@ -2054,6 +2054,60 @@
 0 yapıldı — yanlışlıkla &amp;quot;Ekle&amp;quot;ye basılıp 1 adet eklenmesini önlemek
 için; miktar 0 iken &amp;quot;Ekle&amp;quot;ye basılırsa &amp;quot;Lütfen bir miktar girin&amp;quot; hatası
 gösterilir.</w:t>
+      </w:r>
+    </w:p>
+    <w:p>
+      <w:pPr>
+        <w:pStyle w:val="ListParagraph"/>
+        <w:numPr>
+          <w:ilvl w:val="0"/>
+          <w:numId w:val="1"/>
+        </w:numPr>
+        <w:spacing w:after="60"/>
+      </w:pPr>
+      <w:r>
+        <w:rPr>
+          <w:sz w:val="21"/>
+          <w:szCs w:val="21"/>
+        </w:rPr>
+        <w:t xml:space="preserve">Bayi kataloğuna &amp;quot;Tüm miktarları temizle&amp;quot; butonu eklendi (ürün
+listesinin sağ üstünde) — henüz sepete eklenmemiş, sadece o an girilmiş
+miktar alanlarını sıfırlar.</w:t>
+      </w:r>
+    </w:p>
+    <w:p>
+      <w:pPr>
+        <w:pStyle w:val="ListParagraph"/>
+        <w:numPr>
+          <w:ilvl w:val="0"/>
+          <w:numId w:val="1"/>
+        </w:numPr>
+        <w:spacing w:after="60"/>
+      </w:pPr>
+      <w:r>
+        <w:rPr>
+          <w:sz w:val="21"/>
+          <w:szCs w:val="21"/>
+        </w:rPr>
+        <w:t xml:space="preserve">Header&amp;#39;daki sepet ikonunun yanına &amp;quot;Sepeti boşalt&amp;quot; eklendi — tüm
+markalardaki sepeti tek seferde boşaltır (</w:t>
+      </w:r>
+      <w:r>
+        <w:rPr>
+          <w:rFonts w:ascii="Consolas" w:cs="Consolas" w:eastAsia="Consolas" w:hAnsi="Consolas"/>
+          <w:color w:val="1F5F56"/>
+          <w:sz w:val="21"/>
+          <w:szCs w:val="21"/>
+        </w:rPr>
+        <w:t xml:space="preserve">CartContext.clearCart</w:t>
+      </w:r>
+      <w:r>
+        <w:rPr>
+          <w:sz w:val="21"/>
+          <w:szCs w:val="21"/>
+        </w:rPr>
+        <w:t xml:space="preserve">);
+sepet boşken tıklanamaz durumda (soluk/pasif).</w:t>
       </w:r>
     </w:p>
     <w:p>

</xml_diff>

<commit_message>
Kategori gruplamasını ürün/sipariş kalemi olan her ekrana genişlet
Paylaşılan CategoryGroupList bileşeni (src/components/category-group-list.tsx)
ile üst/alt kategori gruplaması artık admin ürünler tablosunun yanı sıra
sepet çekmecesi, checkout "Sepet Özeti", bayi "Siparişlerim" detayı ve
admin sipariş detayında da çalışıyor. Ağaç kurma + boş kategori dalını
atlama mantığı tek yerde; her ekran yalnızca kendi satır görünümünü
sağlıyor. Sipariş kalemlerinin kategorisi ürünün güncel kategorisi
üzerinden gösteriliyor (parasal etkisi olmadığından snapshot'lanmıyor).

Co-Authored-By: Claude Sonnet 5 <noreply@anthropic.com>
</commit_message>
<xml_diff>
--- a/docs/output/roadmap.docx
+++ b/docs/output/roadmap.docx
@@ -1964,7 +1964,60 @@
 kataloğunda üst kategorinin (&amp;quot;Börekler&amp;quot;) başlığı altında, kendi alt
 kategori başlığıyla girintili gösterilir; aynı kategorideki ürünler alt
 alta bir tabloda listelenir. Kategorisiz ürünler &amp;quot;Diğer&amp;quot; başlığı altında
-toplanır. Aynı gruplama admin → Ürünler tablosuna da uygulandı
+toplanır. Aynı gruplama; admin → Ürünler tablosu, sepet çekmecesi,
+checkout &amp;quot;Sepet Özeti&amp;quot;, bayi &amp;quot;Siparişlerim&amp;quot; detayı ve admin sipariş
+detayı dahil ürün/sipariş kalemi listelenen </w:t>
+      </w:r>
+      <w:r>
+        <w:rPr>
+          <w:b/>
+          <w:bCs/>
+          <w:sz w:val="21"/>
+          <w:szCs w:val="21"/>
+        </w:rPr>
+        <w:t xml:space="preserve">her</w:t>
+      </w:r>
+      <w:r>
+        <w:rPr>
+          <w:sz w:val="21"/>
+          <w:szCs w:val="21"/>
+        </w:rPr>
+        <w:t xml:space="preserve"> ekrana uygulandı —
+paylaşılan </w:t>
+      </w:r>
+      <w:r>
+        <w:rPr>
+          <w:rFonts w:ascii="Consolas" w:cs="Consolas" w:eastAsia="Consolas" w:hAnsi="Consolas"/>
+          <w:color w:val="1F5F56"/>
+          <w:sz w:val="21"/>
+          <w:szCs w:val="21"/>
+        </w:rPr>
+        <w:t xml:space="preserve">src/components/category-group-list.tsx</w:t>
+      </w:r>
+      <w:r>
+        <w:rPr>
+          <w:sz w:val="21"/>
+          <w:szCs w:val="21"/>
+        </w:rPr>
+        <w:t xml:space="preserve"> (</w:t>
+      </w:r>
+      <w:r>
+        <w:rPr>
+          <w:rFonts w:ascii="Consolas" w:cs="Consolas" w:eastAsia="Consolas" w:hAnsi="Consolas"/>
+          <w:color w:val="1F5F56"/>
+          <w:sz w:val="21"/>
+          <w:szCs w:val="21"/>
+        </w:rPr>
+        <w:t xml:space="preserve">CategoryGroupList</w:t>
+      </w:r>
+      <w:r>
+        <w:rPr>
+          <w:sz w:val="21"/>
+          <w:szCs w:val="21"/>
+        </w:rPr>
+        <w:t xml:space="preserve">)
+bileşeni ağaç kurma + boş kategori dalını atlama mantığını tek yerde
+tutuyor, her ekran yalnızca kendi satır/tablo görünümünü
 (</w:t>
       </w:r>
       <w:r>
@@ -1974,66 +2027,35 @@
           <w:sz w:val="21"/>
           <w:szCs w:val="21"/>
         </w:rPr>
-        <w:t xml:space="preserve">src/app/admin/products/product-category-groups.tsx</w:t>
-      </w:r>
-      <w:r>
-        <w:rPr>
-          <w:sz w:val="21"/>
-          <w:szCs w:val="21"/>
-        </w:rPr>
-        <w:t xml:space="preserve"> +
-</w:t>
-      </w:r>
-      <w:r>
-        <w:rPr>
-          <w:rFonts w:ascii="Consolas" w:cs="Consolas" w:eastAsia="Consolas" w:hAnsi="Consolas"/>
-          <w:color w:val="1F5F56"/>
-          <w:sz w:val="21"/>
-          <w:szCs w:val="21"/>
-        </w:rPr>
-        <w:t xml:space="preserve">product-table.tsx</w:t>
-      </w:r>
-      <w:r>
-        <w:rPr>
-          <w:sz w:val="21"/>
-          <w:szCs w:val="21"/>
-        </w:rPr>
-        <w:t xml:space="preserve">) — tekrarlanan &amp;quot;boş kategori render etme&amp;quot; mantığı
-(</w:t>
-      </w:r>
-      <w:r>
-        <w:rPr>
-          <w:rFonts w:ascii="Consolas" w:cs="Consolas" w:eastAsia="Consolas" w:hAnsi="Consolas"/>
-          <w:color w:val="1F5F56"/>
-          <w:sz w:val="21"/>
-          <w:szCs w:val="21"/>
-        </w:rPr>
-        <w:t xml:space="preserve">categoryHasItems</w:t>
-      </w:r>
-      <w:r>
-        <w:rPr>
-          <w:sz w:val="21"/>
-          <w:szCs w:val="21"/>
-        </w:rPr>
-        <w:t xml:space="preserve">) </w:t>
-      </w:r>
-      <w:r>
-        <w:rPr>
-          <w:rFonts w:ascii="Consolas" w:cs="Consolas" w:eastAsia="Consolas" w:hAnsi="Consolas"/>
-          <w:color w:val="1F5F56"/>
-          <w:sz w:val="21"/>
-          <w:szCs w:val="21"/>
-        </w:rPr>
-        <w:t xml:space="preserve">category-tree.ts</w:t>
-      </w:r>
-      <w:r>
-        <w:rPr>
-          <w:sz w:val="21"/>
-          <w:szCs w:val="21"/>
-        </w:rPr>
-        <w:t xml:space="preserve">&amp;#39;e taşınıp iki taraf arasında
-paylaşıldı; artık tekrar eden &amp;quot;Kategori&amp;quot; sütunu yerine gruplama
-kullanılıyor.</w:t>
+        <w:t xml:space="preserve">renderItems</w:t>
+      </w:r>
+      <w:r>
+        <w:rPr>
+          <w:sz w:val="21"/>
+          <w:szCs w:val="21"/>
+        </w:rPr>
+        <w:t xml:space="preserve">) sağlıyor. Sipariş kalemlerinin kategorisi, sipariş
+anında snapshot&amp;#39;lanmıyor — ürünün </w:t>
+      </w:r>
+      <w:r>
+        <w:rPr>
+          <w:i/>
+          <w:iCs/>
+          <w:sz w:val="21"/>
+          <w:szCs w:val="21"/>
+        </w:rPr>
+        <w:t xml:space="preserve">o anki</w:t>
+      </w:r>
+      <w:r>
+        <w:rPr>
+          <w:sz w:val="21"/>
+          <w:szCs w:val="21"/>
+        </w:rPr>
+        <w:t xml:space="preserve"> kategorisi üzerinden
+gösteriliyor (fiyat/KDV&amp;#39;nin aksine, kategorizasyon parasal bir etkisi
+olmayan, salt görsel/organizasyonel bir alan olduğundan kasıtlı bir
+tercih). &amp;quot;Kategori&amp;quot; sütunu artık tekrar etmiyor, yerini gruplama
+alıyor.</w:t>
       </w:r>
     </w:p>
     <w:p>
@@ -2108,6 +2130,25 @@
         </w:rPr>
         <w:t xml:space="preserve">);
 sepet boşken tıklanamaz durumda (soluk/pasif).</w:t>
+      </w:r>
+    </w:p>
+    <w:p>
+      <w:pPr>
+        <w:pStyle w:val="ListParagraph"/>
+        <w:numPr>
+          <w:ilvl w:val="0"/>
+          <w:numId w:val="1"/>
+        </w:numPr>
+        <w:spacing w:after="60"/>
+      </w:pPr>
+      <w:r>
+        <w:rPr>
+          <w:sz w:val="21"/>
+          <w:szCs w:val="21"/>
+        </w:rPr>
+        <w:t xml:space="preserve">Bayi paneli menüsüne bir &amp;quot;Ayarlar&amp;quot; sayfası — henüz yapılmadı, roadmap
+dışı bir ek kapsam. İlk ayar: sepete ekleme davranışını iki mod
+arasında seçtiren bir checkbox.</w:t>
       </w:r>
     </w:p>
     <w:p>

</xml_diff>

<commit_message>
Roadmap'e Faz 7 (ERP Entegrasyonu) ekle, Faz 4'e çakışma notu düş
Sipariş düzenleme/silme (Faz 4) ile gelecekteki ERP entegrasyonu
arasındaki çakışma ihtimali belgelendi: bir sipariş ERP'ye aktarıldıktan
sonra (orders.erp_synced_at) yerelde salt-okunur olmalı, düzeltme iptal +
yeni sipariş ile çözülmeli. Faz 7, ödeme/e-posta sağlayıcılarıyla aynı
arayüz+mock desenini (ErpSyncProvider) kullanacak, tek yönlü aktarım.

Co-Authored-By: Claude Sonnet 5 <noreply@anthropic.com>
</commit_message>
<xml_diff>
--- a/docs/output/roadmap.docx
+++ b/docs/output/roadmap.docx
@@ -216,10 +216,12 @@
           <w:sz w:val="21"/>
           <w:szCs w:val="21"/>
         </w:rPr>
-        <w:t xml:space="preserve">Altı faz; her biri bir öncekinin üstüne çalışır durumda kalacak şekilde
+        <w:t xml:space="preserve">Yedi faz; her biri bir öncekinin üstüne çalışır durumda kalacak şekilde
 kurgulandı. Sanal POS entegrasyonu bilerek en sona bırakıldı — mock sağlayıcı
 arayüzü Faz 3&amp;#39;te kurulduğu için Faz 6 bir &amp;quot;değiştirme&amp;quot; işlemi, yeniden yazma
-değil.</w:t>
+değil. Aynı gerekçeyle bir ERP entegrasyonu ihtimali de en sona (Faz 7)
+bırakıldı; Faz 4&amp;#39;teki sipariş düzenleme/silme özelliği bu ihtimali gözeterek
+tasarlanacak (bkz. Faz 4 ve Faz 7 notları) ki ileride yeniden tasarlanmasın.</w:t>
       </w:r>
     </w:p>
     <w:p>
@@ -1867,7 +1869,48 @@
 geçebilmesi. Admin tarafındaki &amp;quot;zorla sil&amp;quot; (yukarıdaki not) yalnızca
 test verisi temizliği içindi, bu madde gerçek bayi iş akışı için ayrı
 bir tasarım gerektiriyor (ör. hangi durumdaki siparişler
-iptal/düzenlemeye açık olacak, cari bakiyeye etkisi ne olacak).</w:t>
+iptal/düzenlemeye açık olacak, cari bakiyeye etkisi ne olacak).
+</w:t>
+      </w:r>
+      <w:r>
+        <w:rPr>
+          <w:b/>
+          <w:bCs/>
+          <w:sz w:val="21"/>
+          <w:szCs w:val="21"/>
+        </w:rPr>
+        <w:t xml:space="preserve">Faz 7 (ERP entegrasyonu) ile çakışma notu:</w:t>
+      </w:r>
+      <w:r>
+        <w:rPr>
+          <w:sz w:val="21"/>
+          <w:szCs w:val="21"/>
+        </w:rPr>
+        <w:t xml:space="preserve"> bu özelliğin durum
+makinesi, ileride eklenecek </w:t>
+      </w:r>
+      <w:r>
+        <w:rPr>
+          <w:rFonts w:ascii="Consolas" w:cs="Consolas" w:eastAsia="Consolas" w:hAnsi="Consolas"/>
+          <w:color w:val="1F5F56"/>
+          <w:sz w:val="21"/>
+          <w:szCs w:val="21"/>
+        </w:rPr>
+        <w:t xml:space="preserve">orders.erp_synced_at</w:t>
+      </w:r>
+      <w:r>
+        <w:rPr>
+          <w:sz w:val="21"/>
+          <w:szCs w:val="21"/>
+        </w:rPr>
+        <w:t xml:space="preserve"> alanını üçüncü bir
+kilit koşulu olarak kabul edecek şekilde tasarlanmalı — bir sipariş
+ERP&amp;#39;ye aktarıldıktan sonra (bu alan dolduktan sonra) yerelde artık ne
+düzenlenebilir ne silinebilir olmalı; düzeltme ihtiyacı iptal + yeni
+sipariş şeklinde çözülür (muhasebedeki &amp;quot;credit note&amp;quot; mantığı, ERP
+tarafıyla senkron kalır). Bu notu şimdiden düşmemizin nedeni, bugün
+yazılacak düzenleme/silme yetki kontrolünün Faz 7 geldiğinde yeniden
+tasarlanmak zorunda kalmaması.</w:t>
       </w:r>
     </w:p>
     <w:p>
@@ -2403,6 +2446,332 @@
         <w:t xml:space="preserve"> canlı ortamda gerçek bir kartla uçtan uca ödeme
 tamamlanabiliyor; mock sağlayıcı hiçbir çağıran kodu değiştirmeden devre dışı
 kalabiliyor.</w:t>
+      </w:r>
+    </w:p>
+    <w:p>
+      <w:pPr>
+        <w:pStyle w:val="Heading2"/>
+        <w:spacing w:after="100" w:before="220"/>
+      </w:pPr>
+      <w:r>
+        <w:rPr>
+          <w:color w:val="1A2420"/>
+        </w:rPr>
+        <w:t xml:space="preserve">Faz 7 — ERP Entegrasyonu</w:t>
+      </w:r>
+    </w:p>
+    <w:p>
+      <w:pPr>
+        <w:spacing w:after="120"/>
+      </w:pPr>
+      <w:r>
+        <w:rPr>
+          <w:color w:val="1A2420"/>
+          <w:sz w:val="21"/>
+          <w:szCs w:val="21"/>
+        </w:rPr>
+        <w:t xml:space="preserve">Hedef: Onaylanan siparişlerin şirketin ERP sistemine tek yönlü aktarımı;
+hangi ERP&amp;#39;ye bağlanılacağı henüz belli olmadığından </w:t>
+      </w:r>
+      <w:r>
+        <w:rPr>
+          <w:rFonts w:ascii="Consolas" w:cs="Consolas" w:eastAsia="Consolas" w:hAnsi="Consolas"/>
+          <w:color w:val="1A2420"/>
+          <w:sz w:val="21"/>
+          <w:szCs w:val="21"/>
+        </w:rPr>
+        <w:t xml:space="preserve">PaymentProvider</w:t>
+      </w:r>
+      <w:r>
+        <w:rPr>
+          <w:color w:val="1A2420"/>
+          <w:sz w:val="21"/>
+          <w:szCs w:val="21"/>
+        </w:rPr>
+        <w:t xml:space="preserve">/
+</w:t>
+      </w:r>
+      <w:r>
+        <w:rPr>
+          <w:rFonts w:ascii="Consolas" w:cs="Consolas" w:eastAsia="Consolas" w:hAnsi="Consolas"/>
+          <w:color w:val="1A2420"/>
+          <w:sz w:val="21"/>
+          <w:szCs w:val="21"/>
+        </w:rPr>
+        <w:t xml:space="preserve">EmailProvider</w:t>
+      </w:r>
+      <w:r>
+        <w:rPr>
+          <w:color w:val="1A2420"/>
+          <w:sz w:val="21"/>
+          <w:szCs w:val="21"/>
+        </w:rPr>
+        <w:t xml:space="preserve"> ile aynı desende bir soyutlama kurulup gerçek bağlayıcı
+sonradan eklenecek.</w:t>
+      </w:r>
+    </w:p>
+    <w:p>
+      <w:pPr>
+        <w:pStyle w:val="ListParagraph"/>
+        <w:numPr>
+          <w:ilvl w:val="0"/>
+          <w:numId w:val="1"/>
+        </w:numPr>
+        <w:spacing w:after="60"/>
+      </w:pPr>
+      <w:r>
+        <w:rPr>
+          <w:rFonts w:ascii="Consolas" w:cs="Consolas" w:eastAsia="Consolas" w:hAnsi="Consolas"/>
+          <w:color w:val="1F5F56"/>
+          <w:sz w:val="21"/>
+          <w:szCs w:val="21"/>
+        </w:rPr>
+        <w:t xml:space="preserve">ErpSyncProvider</w:t>
+      </w:r>
+      <w:r>
+        <w:rPr>
+          <w:sz w:val="21"/>
+          <w:szCs w:val="21"/>
+        </w:rPr>
+        <w:t xml:space="preserve"> arayüzü + </w:t>
+      </w:r>
+      <w:r>
+        <w:rPr>
+          <w:rFonts w:ascii="Consolas" w:cs="Consolas" w:eastAsia="Consolas" w:hAnsi="Consolas"/>
+          <w:color w:val="1F5F56"/>
+          <w:sz w:val="21"/>
+          <w:szCs w:val="21"/>
+        </w:rPr>
+        <w:t xml:space="preserve">MockErpSyncProvider</w:t>
+      </w:r>
+      <w:r>
+        <w:rPr>
+          <w:sz w:val="21"/>
+          <w:szCs w:val="21"/>
+        </w:rPr>
+        <w:t xml:space="preserve"> (gerçek ERP
+seçilene kadar konsola/loglara yazan sahte implementasyon) —
+</w:t>
+      </w:r>
+      <w:r>
+        <w:rPr>
+          <w:rFonts w:ascii="Consolas" w:cs="Consolas" w:eastAsia="Consolas" w:hAnsi="Consolas"/>
+          <w:color w:val="1F5F56"/>
+          <w:sz w:val="21"/>
+          <w:szCs w:val="21"/>
+        </w:rPr>
+        <w:t xml:space="preserve">src/lib/payments/</w:t>
+      </w:r>
+      <w:r>
+        <w:rPr>
+          <w:sz w:val="21"/>
+          <w:szCs w:val="21"/>
+        </w:rPr>
+        <w:t xml:space="preserve">, </w:t>
+      </w:r>
+      <w:r>
+        <w:rPr>
+          <w:rFonts w:ascii="Consolas" w:cs="Consolas" w:eastAsia="Consolas" w:hAnsi="Consolas"/>
+          <w:color w:val="1F5F56"/>
+          <w:sz w:val="21"/>
+          <w:szCs w:val="21"/>
+        </w:rPr>
+        <w:t xml:space="preserve">src/lib/email/</w:t>
+      </w:r>
+      <w:r>
+        <w:rPr>
+          <w:sz w:val="21"/>
+          <w:szCs w:val="21"/>
+        </w:rPr>
+        <w:t xml:space="preserve"> ile aynı desen</w:t>
+      </w:r>
+    </w:p>
+    <w:p>
+      <w:pPr>
+        <w:pStyle w:val="ListParagraph"/>
+        <w:numPr>
+          <w:ilvl w:val="0"/>
+          <w:numId w:val="1"/>
+        </w:numPr>
+        <w:spacing w:after="60"/>
+      </w:pPr>
+      <w:r>
+        <w:rPr>
+          <w:rFonts w:ascii="Consolas" w:cs="Consolas" w:eastAsia="Consolas" w:hAnsi="Consolas"/>
+          <w:color w:val="1F5F56"/>
+          <w:sz w:val="21"/>
+          <w:szCs w:val="21"/>
+        </w:rPr>
+        <w:t xml:space="preserve">orders.erp_synced_at</w:t>
+      </w:r>
+      <w:r>
+        <w:rPr>
+          <w:sz w:val="21"/>
+          <w:szCs w:val="21"/>
+        </w:rPr>
+        <w:t xml:space="preserve"> (nullable timestamp) ve </w:t>
+      </w:r>
+      <w:r>
+        <w:rPr>
+          <w:rFonts w:ascii="Consolas" w:cs="Consolas" w:eastAsia="Consolas" w:hAnsi="Consolas"/>
+          <w:color w:val="1F5F56"/>
+          <w:sz w:val="21"/>
+          <w:szCs w:val="21"/>
+        </w:rPr>
+        <w:t xml:space="preserve">orders.erp_reference</w:t>
+      </w:r>
+      <w:r>
+        <w:rPr>
+          <w:sz w:val="21"/>
+          <w:szCs w:val="21"/>
+        </w:rPr>
+        <w:t xml:space="preserve">
+(ERP tarafındaki kayıt kimliği) alanları</w:t>
+      </w:r>
+    </w:p>
+    <w:p>
+      <w:pPr>
+        <w:pStyle w:val="ListParagraph"/>
+        <w:numPr>
+          <w:ilvl w:val="0"/>
+          <w:numId w:val="1"/>
+        </w:numPr>
+        <w:spacing w:after="60"/>
+      </w:pPr>
+      <w:r>
+        <w:rPr>
+          <w:b/>
+          <w:bCs/>
+          <w:sz w:val="21"/>
+          <w:szCs w:val="21"/>
+        </w:rPr>
+        <w:t xml:space="preserve">Tek yönlü</w:t>
+      </w:r>
+      <w:r>
+        <w:rPr>
+          <w:sz w:val="21"/>
+          <w:szCs w:val="21"/>
+        </w:rPr>
+        <w:t xml:space="preserve"> aktarım (yerel → ERP); ERP&amp;#39;nin siparişi kendi tarafında
+değiştirip bunu geri yansıtması (webhook/pull + çakışma çözümü)
+kapsam dışı — hangi ERP&amp;#39;ye bağlanılacağı bilinmeden bu yönde tasarım
+yapmak erken olur</w:t>
+      </w:r>
+    </w:p>
+    <w:p>
+      <w:pPr>
+        <w:pStyle w:val="ListParagraph"/>
+        <w:numPr>
+          <w:ilvl w:val="0"/>
+          <w:numId w:val="1"/>
+        </w:numPr>
+        <w:spacing w:after="60"/>
+      </w:pPr>
+      <w:r>
+        <w:rPr>
+          <w:sz w:val="21"/>
+          <w:szCs w:val="21"/>
+        </w:rPr>
+        <w:t xml:space="preserve">Sipariş, </w:t>
+      </w:r>
+      <w:r>
+        <w:rPr>
+          <w:rFonts w:ascii="Consolas" w:cs="Consolas" w:eastAsia="Consolas" w:hAnsi="Consolas"/>
+          <w:color w:val="1F5F56"/>
+          <w:sz w:val="21"/>
+          <w:szCs w:val="21"/>
+        </w:rPr>
+        <w:t xml:space="preserve">erp_synced_at</w:t>
+      </w:r>
+      <w:r>
+        <w:rPr>
+          <w:sz w:val="21"/>
+          <w:szCs w:val="21"/>
+        </w:rPr>
+        <w:t xml:space="preserve"> dolduktan sonra yerelde salt-okunur olur: ne
+Faz 4&amp;#39;teki bayi düzenleme/silme özelliği ne admin&amp;#39;in normal silmesi
+bu siparişe dokunabilir (yalnızca test verisi temizliği amaçlı
+&amp;quot;zorla sil&amp;quot; dahi ERP&amp;#39;ye aktarılmış gerçek siparişlerde
+kullanılmamalı — bkz. Faz 4 notu). Düzeltme ihtiyacı iptal + yeni
+sipariş ile çözülür</w:t>
+      </w:r>
+    </w:p>
+    <w:p>
+      <w:pPr>
+        <w:pStyle w:val="ListParagraph"/>
+        <w:numPr>
+          <w:ilvl w:val="0"/>
+          <w:numId w:val="1"/>
+        </w:numPr>
+        <w:spacing w:after="60"/>
+      </w:pPr>
+      <w:r>
+        <w:rPr>
+          <w:sz w:val="21"/>
+          <w:szCs w:val="21"/>
+        </w:rPr>
+        <w:t xml:space="preserve">Hangi durumdaki siparişlerin otomatik/manuel aktarılacağı (ör.
+yalnızca </w:t>
+      </w:r>
+      <w:r>
+        <w:rPr>
+          <w:rFonts w:ascii="Consolas" w:cs="Consolas" w:eastAsia="Consolas" w:hAnsi="Consolas"/>
+          <w:color w:val="1F5F56"/>
+          <w:sz w:val="21"/>
+          <w:szCs w:val="21"/>
+        </w:rPr>
+        <w:t xml:space="preserve">approved</w:t>
+      </w:r>
+      <w:r>
+        <w:rPr>
+          <w:sz w:val="21"/>
+          <w:szCs w:val="21"/>
+        </w:rPr>
+        <w:t xml:space="preserve">/</w:t>
+      </w:r>
+      <w:r>
+        <w:rPr>
+          <w:rFonts w:ascii="Consolas" w:cs="Consolas" w:eastAsia="Consolas" w:hAnsi="Consolas"/>
+          <w:color w:val="1F5F56"/>
+          <w:sz w:val="21"/>
+          <w:szCs w:val="21"/>
+        </w:rPr>
+        <w:t xml:space="preserve">paid</w:t>
+      </w:r>
+      <w:r>
+        <w:rPr>
+          <w:sz w:val="21"/>
+          <w:szCs w:val="21"/>
+        </w:rPr>
+        <w:t xml:space="preserve"> sonrası) ve aktarım tetikleyicisi
+(durum geçişinde otomatik mi, admin panelden manuel &amp;quot;ERP&amp;#39;ye
+Aktar&amp;quot; butonuyla mı) uygulama aşamasında netleştirilecek</w:t>
+      </w:r>
+    </w:p>
+    <w:p>
+      <w:pPr>
+        <w:spacing w:after="120"/>
+      </w:pPr>
+      <w:r>
+        <w:rPr>
+          <w:b/>
+          <w:bCs/>
+          <w:color w:val="1A2420"/>
+          <w:sz w:val="21"/>
+          <w:szCs w:val="21"/>
+        </w:rPr>
+        <w:t xml:space="preserve">Çıkış kriteri —</w:t>
+      </w:r>
+      <w:r>
+        <w:rPr>
+          <w:color w:val="1A2420"/>
+          <w:sz w:val="21"/>
+          <w:szCs w:val="21"/>
+        </w:rPr>
+        <w:t xml:space="preserve"> onaylanan bir sipariş (mock) ERP&amp;#39;ye aktarılıyor,
+aktarılan sipariş yerelde düzenleme/silme denemesinde reddediliyor; mock
+sağlayıcı hiçbir çağıran kodu değiştirmeden gerçek ERP bağlayıcısıyla
+değiştirilebiliyor.</w:t>
       </w:r>
     </w:p>
     <w:p>

</xml_diff>

<commit_message>
Roadmap Faz 4'e tekrar sipariş ver ve ürün bazlı sipariş katı ekle
İki yeni ek kapsam maddesi belgelendi (henüz kod yazılmadı):
"Tekrar sipariş ver" (geçmiş siparişi güncel fiyat/KDV ile sepete
kopyalama) ve ürün bazında sipariş katı zorunluluğu
(products.order_multiple, ör. 5'in katları).

Co-Authored-By: Claude Sonnet 5 <noreply@anthropic.com>
</commit_message>
<xml_diff>
--- a/docs/output/roadmap.docx
+++ b/docs/output/roadmap.docx
@@ -1479,6 +1479,156 @@
         <w:t xml:space="preserve">Bayi kataloğunda toplu ürün seçimi + tek işlemle sepete ekleme — Payna
 Grup Portal karşılaştırmasından gelen ek kapsam, katalog tarafında
 sipariş verme hızını artırır</w:t>
+      </w:r>
+    </w:p>
+    <w:p>
+      <w:pPr>
+        <w:pStyle w:val="ListParagraph"/>
+        <w:numPr>
+          <w:ilvl w:val="0"/>
+          <w:numId w:val="1"/>
+        </w:numPr>
+        <w:spacing w:after="60"/>
+      </w:pPr>
+      <w:r>
+        <w:rPr>
+          <w:sz w:val="21"/>
+          <w:szCs w:val="21"/>
+        </w:rPr>
+        <w:t xml:space="preserve">&amp;quot;Tekrar sipariş ver&amp;quot; — henüz yapılmadı, roadmap dışı bir ek kapsam.
+&amp;quot;Siparişlerim&amp;quot; listesinde/detayında bir buton, geçmiş bir siparişin
+kalemlerini o markanın sepetine kopyalar. Fiyat/KDV geçmiş siparişteki
+değerle değil, ürünün </w:t>
+      </w:r>
+      <w:r>
+        <w:rPr>
+          <w:i/>
+          <w:iCs/>
+          <w:sz w:val="21"/>
+          <w:szCs w:val="21"/>
+        </w:rPr>
+        <w:t xml:space="preserve">güncel</w:t>
+      </w:r>
+      <w:r>
+        <w:rPr>
+          <w:sz w:val="21"/>
+          <w:szCs w:val="21"/>
+        </w:rPr>
+        <w:t xml:space="preserve"> değerleriyle kopyalanır (tıpkı
+</w:t>
+      </w:r>
+      <w:r>
+        <w:rPr>
+          <w:rFonts w:ascii="Consolas" w:cs="Consolas" w:eastAsia="Consolas" w:hAnsi="Consolas"/>
+          <w:color w:val="1F5F56"/>
+          <w:sz w:val="21"/>
+          <w:szCs w:val="21"/>
+        </w:rPr>
+        <w:t xml:space="preserve">createOrder</w:t>
+      </w:r>
+      <w:r>
+        <w:rPr>
+          <w:sz w:val="21"/>
+          <w:szCs w:val="21"/>
+        </w:rPr>
+        <w:t xml:space="preserve">&amp;#39;ın client fiyatına güvenmeyip sunucuda yeniden okuması
+gibi); artık pasif/silinmiş bir ürün varsa o kalem atlanır ve
+kullanıcıya &amp;quot;X ürünü artık satışta değil, sepete eklenmedi&amp;quot; gibi bir
+toast ile bildirilir. Sepete eklendikten sonra dealer normal akışta
+(drawer&amp;#39;dan) miktarları gözden geçirip checkout&amp;#39;a geçer.</w:t>
+      </w:r>
+    </w:p>
+    <w:p>
+      <w:pPr>
+        <w:pStyle w:val="ListParagraph"/>
+        <w:numPr>
+          <w:ilvl w:val="0"/>
+          <w:numId w:val="1"/>
+        </w:numPr>
+        <w:spacing w:after="60"/>
+      </w:pPr>
+      <w:r>
+        <w:rPr>
+          <w:sz w:val="21"/>
+          <w:szCs w:val="21"/>
+        </w:rPr>
+        <w:t xml:space="preserve">Ürün bazında sipariş katı (adet zorunluluğu) — henüz yapılmadı,
+roadmap dışı bir ek kapsam. Örnek: Dilim Börek ve Erciyes Börek
+markalarında &amp;quot;Su Böreği Peynirli&amp;quot; ve &amp;quot;Kol Börekleri&amp;quot; grubundaki
+ürünler yalnızca 5 ve 5&amp;#39;in katları şeklinde sipariş edilebilmeli.
+</w:t>
+      </w:r>
+      <w:r>
+        <w:rPr>
+          <w:rFonts w:ascii="Consolas" w:cs="Consolas" w:eastAsia="Consolas" w:hAnsi="Consolas"/>
+          <w:color w:val="1F5F56"/>
+          <w:sz w:val="21"/>
+          <w:szCs w:val="21"/>
+        </w:rPr>
+        <w:t xml:space="preserve">products.order_multiple</w:t>
+      </w:r>
+      <w:r>
+        <w:rPr>
+          <w:sz w:val="21"/>
+          <w:szCs w:val="21"/>
+        </w:rPr>
+        <w:t xml:space="preserve"> (integer, </w:t>
+      </w:r>
+      <w:r>
+        <w:rPr>
+          <w:rFonts w:ascii="Consolas" w:cs="Consolas" w:eastAsia="Consolas" w:hAnsi="Consolas"/>
+          <w:color w:val="1F5F56"/>
+          <w:sz w:val="21"/>
+          <w:szCs w:val="21"/>
+        </w:rPr>
+        <w:t xml:space="preserve">NOT NULL DEFAULT 1</w:t>
+      </w:r>
+      <w:r>
+        <w:rPr>
+          <w:sz w:val="21"/>
+          <w:szCs w:val="21"/>
+        </w:rPr>
+        <w:t xml:space="preserve"> — 1 =
+kısıtlama yok) alanı eklenecek; bir &amp;quot;grup&amp;quot; için aynı katın her ürüne
+tek tek uygulanması yeterli, ayrı bir kategori-bazlı kural alanına
+gerek yok (admin zaten </w:t>
+      </w:r>
+      <w:r>
+        <w:rPr>
+          <w:rFonts w:ascii="Consolas" w:cs="Consolas" w:eastAsia="Consolas" w:hAnsi="Consolas"/>
+          <w:color w:val="1F5F56"/>
+          <w:sz w:val="21"/>
+          <w:szCs w:val="21"/>
+        </w:rPr>
+        <w:t xml:space="preserve">EditProductModal</w:t>
+      </w:r>
+      <w:r>
+        <w:rPr>
+          <w:sz w:val="21"/>
+          <w:szCs w:val="21"/>
+        </w:rPr>
+        <w:t xml:space="preserve">&amp;#39;dan ürün ürün
+düzenleyebiliyor). Miktar bu değerin katı değilse hem bayi
+kataloğunda/sepet çekmecesinde anlık uyarı gösterilir hem de
+</w:t>
+      </w:r>
+      <w:r>
+        <w:rPr>
+          <w:rFonts w:ascii="Consolas" w:cs="Consolas" w:eastAsia="Consolas" w:hAnsi="Consolas"/>
+          <w:color w:val="1F5F56"/>
+          <w:sz w:val="21"/>
+          <w:szCs w:val="21"/>
+        </w:rPr>
+        <w:t xml:space="preserve">createOrder</w:t>
+      </w:r>
+      <w:r>
+        <w:rPr>
+          <w:sz w:val="21"/>
+          <w:szCs w:val="21"/>
+        </w:rPr>
+        <w:t xml:space="preserve"> sunucu tarafında aynı kontrolü tekrarlayıp reddeder
+(client&amp;#39;a güvenilmez — mevcut fiyat/KDV doğrulama deseniyle aynı
+ilke).</w:t>
       </w:r>
     </w:p>
     <w:p>

</xml_diff>

<commit_message>
Ürün bazlı sipariş katı ve tekrar sipariş ver özelliklerini ekle
Ürün bazlı sipariş katı: products.order_multiple (varsayılan 1).
Admin ürün ekleme/düzenleme formlarında ayarlanabiliyor. Bayi
kataloğunda ve sepet çekmecesinde miktar bu katın katı değilse anlık
uyarı gösteriliyor; createOrder sunucu tarafında aynı kontrolü
client'a güvenmeden tekrarlıyor (fiyat/KDV doğrulama deseniyle aynı
ilke). "Kol Börekleri" grubundaki ürünlere örnek olarak 5 katı
atandı.

Tekrar sipariş ver: "Siparişlerim" listesi ve detayında bir buton,
getReorderItems server action'ı geçmiş sipariş kalemlerini ürünün
güncel fiyat/KDV/kat değerleriyle o markanın sepetine kopyalıyor;
artık pasif ürünler atlanıp kullanıcıya bildiriliyor.

Co-Authored-By: Claude Sonnet 5 <noreply@anthropic.com>
</commit_message>
<xml_diff>
--- a/docs/output/roadmap.docx
+++ b/docs/output/roadmap.docx
@@ -1495,9 +1495,33 @@
           <w:sz w:val="21"/>
           <w:szCs w:val="21"/>
         </w:rPr>
-        <w:t xml:space="preserve">&amp;quot;Tekrar sipariş ver&amp;quot; — henüz yapılmadı, roadmap dışı bir ek kapsam.
-&amp;quot;Siparişlerim&amp;quot; listesinde/detayında bir buton, geçmiş bir siparişin
-kalemlerini o markanın sepetine kopyalar. Fiyat/KDV geçmiş siparişteki
+        <w:t xml:space="preserve">"Tekrar sipariş ver"</w:t>
+      </w:r>
+      <w:r>
+        <w:rPr>
+          <w:sz w:val="21"/>
+          <w:szCs w:val="21"/>
+        </w:rPr>
+        <w:t xml:space="preserve"> — ✅ Tamamlandı, roadmap dışı bir ek kapsam.
+&amp;quot;Siparişlerim&amp;quot; listesinde ve sipariş detayında bir buton
+(</w:t>
+      </w:r>
+      <w:r>
+        <w:rPr>
+          <w:rFonts w:ascii="Consolas" w:cs="Consolas" w:eastAsia="Consolas" w:hAnsi="Consolas"/>
+          <w:color w:val="1F5F56"/>
+          <w:sz w:val="21"/>
+          <w:szCs w:val="21"/>
+        </w:rPr>
+        <w:t xml:space="preserve">ReorderButton</w:t>
+      </w:r>
+      <w:r>
+        <w:rPr>
+          <w:sz w:val="21"/>
+          <w:szCs w:val="21"/>
+        </w:rPr>
+        <w:t xml:space="preserve">), geçmiş bir siparişin kalemlerini o markanın
+sepetine kopyalar. Fiyat/KDV/kat gibi alanlar geçmiş siparişteki
 değerle değil, ürünün </w:t>
       </w:r>
       <w:r>
@@ -1514,8 +1538,24 @@
           <w:sz w:val="21"/>
           <w:szCs w:val="21"/>
         </w:rPr>
-        <w:t xml:space="preserve"> değerleriyle kopyalanır (tıpkı
-</w:t>
+        <w:t xml:space="preserve"> değerleriyle kopyalanır
+(</w:t>
+      </w:r>
+      <w:r>
+        <w:rPr>
+          <w:rFonts w:ascii="Consolas" w:cs="Consolas" w:eastAsia="Consolas" w:hAnsi="Consolas"/>
+          <w:color w:val="1F5F56"/>
+          <w:sz w:val="21"/>
+          <w:szCs w:val="21"/>
+        </w:rPr>
+        <w:t xml:space="preserve">getReorderItems</w:t>
+      </w:r>
+      <w:r>
+        <w:rPr>
+          <w:sz w:val="21"/>
+          <w:szCs w:val="21"/>
+        </w:rPr>
+        <w:t xml:space="preserve">, </w:t>
       </w:r>
       <w:r>
         <w:rPr>
@@ -1531,11 +1571,11 @@
           <w:sz w:val="21"/>
           <w:szCs w:val="21"/>
         </w:rPr>
-        <w:t xml:space="preserve">&amp;#39;ın client fiyatına güvenmeyip sunucuda yeniden okuması
-gibi); artık pasif/silinmiş bir ürün varsa o kalem atlanır ve
-kullanıcıya &amp;quot;X ürünü artık satışta değil, sepete eklenmedi&amp;quot; gibi bir
-toast ile bildirilir. Sepete eklendikten sonra dealer normal akışta
-(drawer&amp;#39;dan) miktarları gözden geçirip checkout&amp;#39;a geçer.</w:t>
+        <w:t xml:space="preserve">&amp;#39;ın client fiyatına güvenmeyip
+sunucuda yeniden okuduğu aynı ilke); artık pasif bir ürün varsa o
+kalem atlanır ve kullanıcıya adıyla bildirilir (toast). Sepete
+eklendikten sonra drawer otomatik açılır, dealer miktarları gözden
+geçirip checkout&amp;#39;a geçer.</w:t>
       </w:r>
     </w:p>
     <w:p>
@@ -1552,10 +1592,31 @@
           <w:sz w:val="21"/>
           <w:szCs w:val="21"/>
         </w:rPr>
-        <w:t xml:space="preserve">Ürün bazında sipariş katı (adet zorunluluğu) — henüz yapılmadı,
-roadmap dışı bir ek kapsam. Örnek: Dilim Börek ve Erciyes Börek
-markalarında &amp;quot;Su Böreği Peynirli&amp;quot; ve &amp;quot;Kol Börekleri&amp;quot; grubundaki
-ürünler yalnızca 5 ve 5&amp;#39;in katları şeklinde sipariş edilebilmeli.
+        <w:t xml:space="preserve">Ürün bazında sipariş katı (adet zorunluluğu)</w:t>
+      </w:r>
+      <w:r>
+        <w:rPr>
+          <w:sz w:val="21"/>
+          <w:szCs w:val="21"/>
+        </w:rPr>
+        <w:t xml:space="preserve"> — ✅ Tamamlandı,
+roadmap dışı bir ek kapsam. </w:t>
+      </w:r>
+      <w:r>
+        <w:rPr>
+          <w:rFonts w:ascii="Consolas" w:cs="Consolas" w:eastAsia="Consolas" w:hAnsi="Consolas"/>
+          <w:color w:val="1F5F56"/>
+          <w:sz w:val="21"/>
+          <w:szCs w:val="21"/>
+        </w:rPr>
+        <w:t xml:space="preserve">products.order_multiple</w:t>
+      </w:r>
+      <w:r>
+        <w:rPr>
+          <w:sz w:val="21"/>
+          <w:szCs w:val="21"/>
+        </w:rPr>
+        <w:t xml:space="preserve"> (integer,
 </w:t>
       </w:r>
       <w:r>
@@ -1565,22 +1626,6 @@
           <w:sz w:val="21"/>
           <w:szCs w:val="21"/>
         </w:rPr>
-        <w:t xml:space="preserve">products.order_multiple</w:t>
-      </w:r>
-      <w:r>
-        <w:rPr>
-          <w:sz w:val="21"/>
-          <w:szCs w:val="21"/>
-        </w:rPr>
-        <w:t xml:space="preserve"> (integer, </w:t>
-      </w:r>
-      <w:r>
-        <w:rPr>
-          <w:rFonts w:ascii="Consolas" w:cs="Consolas" w:eastAsia="Consolas" w:hAnsi="Consolas"/>
-          <w:color w:val="1F5F56"/>
-          <w:sz w:val="21"/>
-          <w:szCs w:val="21"/>
-        </w:rPr>
         <w:t xml:space="preserve">NOT NULL DEFAULT 1</w:t>
       </w:r>
       <w:r>
@@ -1588,10 +1633,8 @@
           <w:sz w:val="21"/>
           <w:szCs w:val="21"/>
         </w:rPr>
-        <w:t xml:space="preserve"> — 1 =
-kısıtlama yok) alanı eklenecek; bir &amp;quot;grup&amp;quot; için aynı katın her ürüne
-tek tek uygulanması yeterli, ayrı bir kategori-bazlı kural alanına
-gerek yok (admin zaten </w:t>
+        <w:t xml:space="preserve"> — 1 = kısıtlama yok); admin
+ürün ekleme formunda ve </w:t>
       </w:r>
       <w:r>
         <w:rPr>
@@ -1607,10 +1650,28 @@
           <w:sz w:val="21"/>
           <w:szCs w:val="21"/>
         </w:rPr>
-        <w:t xml:space="preserve">&amp;#39;dan ürün ürün
-düzenleyebiliyor). Miktar bu değerin katı değilse hem bayi
-kataloğunda/sepet çekmecesinde anlık uyarı gösterilir hem de
-</w:t>
+        <w:t xml:space="preserve">&amp;#39;da düzenlenebiliyor, bir
+&amp;quot;grup&amp;quot; için aynı katın gruptaki her ürüne tek tek uygulanması yeterli
+(ör. &amp;quot;Kol Börekleri&amp;quot; kategorisindeki ürünlere tek tek 5 atanarak).
+Bayi kataloğunda ve sepet çekmecesinde miktar bu değerin katı değilse
+toast ile anlık uyarı gösterilir (input </w:t>
+      </w:r>
+      <w:r>
+        <w:rPr>
+          <w:rFonts w:ascii="Consolas" w:cs="Consolas" w:eastAsia="Consolas" w:hAnsi="Consolas"/>
+          <w:color w:val="1F5F56"/>
+          <w:sz w:val="21"/>
+          <w:szCs w:val="21"/>
+        </w:rPr>
+        <w:t xml:space="preserve">step</w:t>
+      </w:r>
+      <w:r>
+        <w:rPr>
+          <w:sz w:val="21"/>
+          <w:szCs w:val="21"/>
+        </w:rPr>
+        <w:t xml:space="preserve"> değeri de kata göre
+ayarlanır); </w:t>
       </w:r>
       <w:r>
         <w:rPr>
@@ -1626,9 +1687,9 @@
           <w:sz w:val="21"/>
           <w:szCs w:val="21"/>
         </w:rPr>
-        <w:t xml:space="preserve"> sunucu tarafında aynı kontrolü tekrarlayıp reddeder
-(client&amp;#39;a güvenilmez — mevcut fiyat/KDV doğrulama deseniyle aynı
-ilke).</w:t>
+        <w:t xml:space="preserve"> sunucu tarafında aynı kontrolü tekrarlayıp
+client&amp;#39;a güvenmeden reddeder — mevcut fiyat/KDV doğrulama deseniyle
+aynı ilke.</w:t>
       </w:r>
     </w:p>
     <w:p>

</xml_diff>

<commit_message>
Roadmap'i çoklu firma girişi, cari bakiye/ledger, Genel Bakış ve toplu ekleme özellikleriyle güncelle
Faz 3'e giriş öncesi firma seçimi ve red/iptalde not zorunluluğu maddeleri,
Faz 4'e ledger, bağımsız tahsilat, cari ekstre, toplu ürün ekleme, Genel
Bakış KPI/grafik ekranları ve önceden tamamlanmış ama işlenmemiş diğer
maddeler eklendi. docs/output PDF/DOCX çıktıları npm run build ile
yeniden üretildi.
</commit_message>
<xml_diff>
--- a/docs/output/roadmap.docx
+++ b/docs/output/roadmap.docx
@@ -59,7 +59,7 @@
           <w:sz w:val="17"/>
           <w:szCs w:val="17"/>
         </w:rPr>
-        <w:t xml:space="preserve">Oluşturulma tarihi: 13 Ağustos 2026</w:t>
+        <w:t xml:space="preserve">Oluşturulma tarihi: 17 Ağustos 2026</w:t>
       </w:r>
     </w:p>
     <w:p>
@@ -1312,56 +1312,6 @@
     </w:p>
     <w:p>
       <w:pPr>
-        <w:spacing w:after="120"/>
-      </w:pPr>
-      <w:r>
-        <w:rPr>
-          <w:b/>
-          <w:bCs/>
-          <w:color w:val="1A2420"/>
-          <w:sz w:val="21"/>
-          <w:szCs w:val="21"/>
-        </w:rPr>
-        <w:t xml:space="preserve">Çıkış kriteri —</w:t>
-      </w:r>
-      <w:r>
-        <w:rPr>
-          <w:color w:val="1A2420"/>
-          <w:sz w:val="21"/>
-          <w:szCs w:val="21"/>
-        </w:rPr>
-        <w:t xml:space="preserve"> üç ödeme tipiyle de (cari, kapıda ödeme, sanal POS
-başarılı/başarısız) uçtan uca sipariş oluşturulabiliyor; admin panelde durum
-geçişleri izlenebiliyor. Tarayıcıda doğrulandı.</w:t>
-      </w:r>
-    </w:p>
-    <w:p>
-      <w:pPr>
-        <w:pStyle w:val="Heading2"/>
-        <w:spacing w:after="100" w:before="220"/>
-      </w:pPr>
-      <w:r>
-        <w:rPr>
-          <w:color w:val="1A2420"/>
-        </w:rPr>
-        <w:t xml:space="preserve">Faz 4 — Cari Bakiye &amp;amp; Bağımsız Tahsilat Modülü</w:t>
-      </w:r>
-    </w:p>
-    <w:p>
-      <w:pPr>
-        <w:spacing w:after="120"/>
-      </w:pPr>
-      <w:r>
-        <w:rPr>
-          <w:color w:val="1A2420"/>
-          <w:sz w:val="21"/>
-          <w:szCs w:val="21"/>
-        </w:rPr>
-        <w:t xml:space="preserve">Hedef: Siparişten kopuk, serbest tutarlı ödeme ve cari hesap defteri.</w:t>
-      </w:r>
-    </w:p>
-    <w:p>
-      <w:pPr>
         <w:pStyle w:val="ListParagraph"/>
         <w:numPr>
           <w:ilvl w:val="0"/>
@@ -1374,7 +1324,52 @@
           <w:sz w:val="21"/>
           <w:szCs w:val="21"/>
         </w:rPr>
-        <w:t xml:space="preserve">Bayi panelinde &amp;quot;Bakiye Öde&amp;quot; ekranı</w:t>
+        <w:t xml:space="preserve">Sipariş listesinden, detaya girmeden hızlı onay/red/iptal</w:t>
+      </w:r>
+      <w:r>
+        <w:rPr>
+          <w:sz w:val="21"/>
+          <w:szCs w:val="21"/>
+        </w:rPr>
+        <w:t xml:space="preserve"> — ✅
+Tamamlandı, roadmap dışı bir ek kapsam. Admin sipariş listesindeki her
+satıra durum makinesinin izin verdiği geçişlere göre ikon butonlar
+eklendi (</w:t>
+      </w:r>
+      <w:r>
+        <w:rPr>
+          <w:rFonts w:ascii="Consolas" w:cs="Consolas" w:eastAsia="Consolas" w:hAnsi="Consolas"/>
+          <w:color w:val="1F5F56"/>
+          <w:sz w:val="21"/>
+          <w:szCs w:val="21"/>
+        </w:rPr>
+        <w:t xml:space="preserve">src/app/admin/orders/order-quick-actions.tsx</w:t>
+      </w:r>
+      <w:r>
+        <w:rPr>
+          <w:sz w:val="21"/>
+          <w:szCs w:val="21"/>
+        </w:rPr>
+        <w:t xml:space="preserve">): onay tek
+tıkla (not gerekmiyor), red/iptal iki tıkla — ilk tık küçük bir sebep
+kutusu açar (sunucu tarafı bu durumlarda notu zorunlu tutuyor), ikinci
+tık (yeşil onay ikonu) o notla </w:t>
+      </w:r>
+      <w:r>
+        <w:rPr>
+          <w:rFonts w:ascii="Consolas" w:cs="Consolas" w:eastAsia="Consolas" w:hAnsi="Consolas"/>
+          <w:color w:val="1F5F56"/>
+          <w:sz w:val="21"/>
+          <w:szCs w:val="21"/>
+        </w:rPr>
+        <w:t xml:space="preserve">transitionOrderStatus</w:t>
+      </w:r>
+      <w:r>
+        <w:rPr>
+          <w:sz w:val="21"/>
+          <w:szCs w:val="21"/>
+        </w:rPr>
+        <w:t xml:space="preserve">&amp;#39;u çağırır.</w:t>
       </w:r>
     </w:p>
     <w:p>
@@ -1388,35 +1383,172 @@
       </w:pPr>
       <w:r>
         <w:rPr>
-          <w:rFonts w:ascii="Consolas" w:cs="Consolas" w:eastAsia="Consolas" w:hAnsi="Consolas"/>
-          <w:color w:val="1F5F56"/>
-          <w:sz w:val="21"/>
-          <w:szCs w:val="21"/>
-        </w:rPr>
-        <w:t xml:space="preserve">payments</w:t>
-      </w:r>
-      <w:r>
-        <w:rPr>
-          <w:sz w:val="21"/>
-          <w:szCs w:val="21"/>
-        </w:rPr>
-        <w:t xml:space="preserve"> tablosunda </w:t>
-      </w:r>
-      <w:r>
-        <w:rPr>
-          <w:rFonts w:ascii="Consolas" w:cs="Consolas" w:eastAsia="Consolas" w:hAnsi="Consolas"/>
-          <w:color w:val="1F5F56"/>
-          <w:sz w:val="21"/>
-          <w:szCs w:val="21"/>
-        </w:rPr>
-        <w:t xml:space="preserve">type = standalone_collection</w:t>
-      </w:r>
-      <w:r>
-        <w:rPr>
-          <w:sz w:val="21"/>
-          <w:szCs w:val="21"/>
-        </w:rPr>
-        <w:t xml:space="preserve"> kaydı</w:t>
+          <w:sz w:val="21"/>
+          <w:szCs w:val="21"/>
+        </w:rPr>
+        <w:t xml:space="preserve">Firma çapında "bayi siparişleri onay gerektirsin" ayarı</w:t>
+      </w:r>
+      <w:r>
+        <w:rPr>
+          <w:sz w:val="21"/>
+          <w:szCs w:val="21"/>
+        </w:rPr>
+        <w:t xml:space="preserve"> — ✅
+Tamamlandı, roadmap dışı bir ek kapsam. Yeni admin </w:t>
+      </w:r>
+      <w:r>
+        <w:rPr>
+          <w:rFonts w:ascii="Consolas" w:cs="Consolas" w:eastAsia="Consolas" w:hAnsi="Consolas"/>
+          <w:color w:val="1F5F56"/>
+          <w:sz w:val="21"/>
+          <w:szCs w:val="21"/>
+        </w:rPr>
+        <w:t xml:space="preserve">/admin/settings</w:t>
+      </w:r>
+      <w:r>
+        <w:rPr>
+          <w:sz w:val="21"/>
+          <w:szCs w:val="21"/>
+        </w:rPr>
+        <w:t xml:space="preserve">
+sayfası (yalnızca </w:t>
+      </w:r>
+      <w:r>
+        <w:rPr>
+          <w:rFonts w:ascii="Consolas" w:cs="Consolas" w:eastAsia="Consolas" w:hAnsi="Consolas"/>
+          <w:color w:val="1F5F56"/>
+          <w:sz w:val="21"/>
+          <w:szCs w:val="21"/>
+        </w:rPr>
+        <w:t xml:space="preserve">company_admin</w:t>
+      </w:r>
+      <w:r>
+        <w:rPr>
+          <w:sz w:val="21"/>
+          <w:szCs w:val="21"/>
+        </w:rPr>
+        <w:t xml:space="preserve"> rolü değiştirebiliyor) ve
+</w:t>
+      </w:r>
+      <w:r>
+        <w:rPr>
+          <w:rFonts w:ascii="Consolas" w:cs="Consolas" w:eastAsia="Consolas" w:hAnsi="Consolas"/>
+          <w:color w:val="1F5F56"/>
+          <w:sz w:val="21"/>
+          <w:szCs w:val="21"/>
+        </w:rPr>
+        <w:t xml:space="preserve">companies.requires_order_approval</w:t>
+      </w:r>
+      <w:r>
+        <w:rPr>
+          <w:sz w:val="21"/>
+          <w:szCs w:val="21"/>
+        </w:rPr>
+        <w:t xml:space="preserve"> sütunu (varsayılan </w:t>
+      </w:r>
+      <w:r>
+        <w:rPr>
+          <w:rFonts w:ascii="Consolas" w:cs="Consolas" w:eastAsia="Consolas" w:hAnsi="Consolas"/>
+          <w:color w:val="1F5F56"/>
+          <w:sz w:val="21"/>
+          <w:szCs w:val="21"/>
+        </w:rPr>
+        <w:t xml:space="preserve">true</w:t>
+      </w:r>
+      <w:r>
+        <w:rPr>
+          <w:sz w:val="21"/>
+          <w:szCs w:val="21"/>
+        </w:rPr>
+        <w:t xml:space="preserve">, mevcut
+davranışı bozmuyor). Kapalıyken </w:t>
+      </w:r>
+      <w:r>
+        <w:rPr>
+          <w:rFonts w:ascii="Consolas" w:cs="Consolas" w:eastAsia="Consolas" w:hAnsi="Consolas"/>
+          <w:color w:val="1F5F56"/>
+          <w:sz w:val="21"/>
+          <w:szCs w:val="21"/>
+        </w:rPr>
+        <w:t xml:space="preserve">createOrder</w:t>
+      </w:r>
+      <w:r>
+        <w:rPr>
+          <w:sz w:val="21"/>
+          <w:szCs w:val="21"/>
+        </w:rPr>
+        <w:t xml:space="preserve"> cari/kapıda ödeme
+siparişlerini </w:t>
+      </w:r>
+      <w:r>
+        <w:rPr>
+          <w:rFonts w:ascii="Consolas" w:cs="Consolas" w:eastAsia="Consolas" w:hAnsi="Consolas"/>
+          <w:color w:val="1F5F56"/>
+          <w:sz w:val="21"/>
+          <w:szCs w:val="21"/>
+        </w:rPr>
+        <w:t xml:space="preserve">submitted → approved</w:t>
+      </w:r>
+      <w:r>
+        <w:rPr>
+          <w:sz w:val="21"/>
+          <w:szCs w:val="21"/>
+        </w:rPr>
+        <w:t xml:space="preserve">, sanal POS&amp;#39;ta ödeme başarılı
+olan siparişleri </w:t>
+      </w:r>
+      <w:r>
+        <w:rPr>
+          <w:rFonts w:ascii="Consolas" w:cs="Consolas" w:eastAsia="Consolas" w:hAnsi="Consolas"/>
+          <w:color w:val="1F5F56"/>
+          <w:sz w:val="21"/>
+          <w:szCs w:val="21"/>
+        </w:rPr>
+        <w:t xml:space="preserve">paid → approved</w:t>
+      </w:r>
+      <w:r>
+        <w:rPr>
+          <w:sz w:val="21"/>
+          <w:szCs w:val="21"/>
+        </w:rPr>
+        <w:t xml:space="preserve"> durumuna otomatik geçiriyor
+(</w:t>
+      </w:r>
+      <w:r>
+        <w:rPr>
+          <w:rFonts w:ascii="Consolas" w:cs="Consolas" w:eastAsia="Consolas" w:hAnsi="Consolas"/>
+          <w:color w:val="1F5F56"/>
+          <w:sz w:val="21"/>
+          <w:szCs w:val="21"/>
+        </w:rPr>
+        <w:t xml:space="preserve">changedBy: null</w:t>
+      </w:r>
+      <w:r>
+        <w:rPr>
+          <w:sz w:val="21"/>
+          <w:szCs w:val="21"/>
+        </w:rPr>
+        <w:t xml:space="preserve">, sistem notu ile) — durum makinesindeki mevcut
+geçiş kurallarını genişletmeden, yalnızca kimin tetiklediğini
+değiştiriyor. Onaylanmış bir sipariş bu ayardan bağımsız olarak yine
+de iptal edilebiliyor çünkü </w:t>
+      </w:r>
+      <w:r>
+        <w:rPr>
+          <w:rFonts w:ascii="Consolas" w:cs="Consolas" w:eastAsia="Consolas" w:hAnsi="Consolas"/>
+          <w:color w:val="1F5F56"/>
+          <w:sz w:val="21"/>
+          <w:szCs w:val="21"/>
+        </w:rPr>
+        <w:t xml:space="preserve">approved → cancelled</w:t>
+      </w:r>
+      <w:r>
+        <w:rPr>
+          <w:sz w:val="21"/>
+          <w:szCs w:val="21"/>
+        </w:rPr>
+        <w:t xml:space="preserve"> geçişi zaten her
+üç akışta da tanımlıydı.</w:t>
       </w:r>
     </w:p>
     <w:p>
@@ -1430,19 +1562,53 @@
       </w:pPr>
       <w:r>
         <w:rPr>
-          <w:rFonts w:ascii="Consolas" w:cs="Consolas" w:eastAsia="Consolas" w:hAnsi="Consolas"/>
-          <w:color w:val="1F5F56"/>
-          <w:sz w:val="21"/>
-          <w:szCs w:val="21"/>
-        </w:rPr>
-        <w:t xml:space="preserve">ledger_entries</w:t>
-      </w:r>
-      <w:r>
-        <w:rPr>
-          <w:sz w:val="21"/>
-          <w:szCs w:val="21"/>
-        </w:rPr>
-        <w:t xml:space="preserve"> defteri ve bakiye hesaplama</w:t>
+          <w:sz w:val="21"/>
+          <w:szCs w:val="21"/>
+        </w:rPr>
+        <w:t xml:space="preserve">Red/iptalde not zorunluluğu</w:t>
+      </w:r>
+      <w:r>
+        <w:rPr>
+          <w:sz w:val="21"/>
+          <w:szCs w:val="21"/>
+        </w:rPr>
+        <w:t xml:space="preserve"> — ✅ Tamamlandı. Yukarıdaki hızlı
+işlemlere ek olarak sipariş detay sayfasındaki tam durum geçiş formunda
+(</w:t>
+      </w:r>
+      <w:r>
+        <w:rPr>
+          <w:rFonts w:ascii="Consolas" w:cs="Consolas" w:eastAsia="Consolas" w:hAnsi="Consolas"/>
+          <w:color w:val="1F5F56"/>
+          <w:sz w:val="21"/>
+          <w:szCs w:val="21"/>
+        </w:rPr>
+        <w:t xml:space="preserve">status-actions.tsx</w:t>
+      </w:r>
+      <w:r>
+        <w:rPr>
+          <w:sz w:val="21"/>
+          <w:szCs w:val="21"/>
+        </w:rPr>
+        <w:t xml:space="preserve">) da red/iptal seçilirken not boşsa hem
+istemcide hem </w:t>
+      </w:r>
+      <w:r>
+        <w:rPr>
+          <w:rFonts w:ascii="Consolas" w:cs="Consolas" w:eastAsia="Consolas" w:hAnsi="Consolas"/>
+          <w:color w:val="1F5F56"/>
+          <w:sz w:val="21"/>
+          <w:szCs w:val="21"/>
+        </w:rPr>
+        <w:t xml:space="preserve">transitionOrderStatus</w:t>
+      </w:r>
+      <w:r>
+        <w:rPr>
+          <w:sz w:val="21"/>
+          <w:szCs w:val="21"/>
+        </w:rPr>
+        <w:t xml:space="preserve"> sunucu tarafında reddediliyor —
+tek bir yerden atlanabilecek bir kural olmasın diye iki katmanlı.</w:t>
       </w:r>
     </w:p>
     <w:p>
@@ -1459,7 +1625,269 @@
           <w:sz w:val="21"/>
           <w:szCs w:val="21"/>
         </w:rPr>
-        <w:t xml:space="preserve">Admin tarafında cari hesap ekstresi görünümü</w:t>
+        <w:t xml:space="preserve">Giriş öncesi firma seçimi (çoklu firma desteği)</w:t>
+      </w:r>
+      <w:r>
+        <w:rPr>
+          <w:sz w:val="21"/>
+          <w:szCs w:val="21"/>
+        </w:rPr>
+        <w:t xml:space="preserve"> — ✅ Tamamlandı,
+roadmap dışı bir ek kapsam. </w:t>
+      </w:r>
+      <w:r>
+        <w:rPr>
+          <w:rFonts w:ascii="Consolas" w:cs="Consolas" w:eastAsia="Consolas" w:hAnsi="Consolas"/>
+          <w:color w:val="1F5F56"/>
+          <w:sz w:val="21"/>
+          <w:szCs w:val="21"/>
+        </w:rPr>
+        <w:t xml:space="preserve">companies</w:t>
+      </w:r>
+      <w:r>
+        <w:rPr>
+          <w:sz w:val="21"/>
+          <w:szCs w:val="21"/>
+        </w:rPr>
+        <w:t xml:space="preserve"> tablosuna </w:t>
+      </w:r>
+      <w:r>
+        <w:rPr>
+          <w:rFonts w:ascii="Consolas" w:cs="Consolas" w:eastAsia="Consolas" w:hAnsi="Consolas"/>
+          <w:color w:val="1F5F56"/>
+          <w:sz w:val="21"/>
+          <w:szCs w:val="21"/>
+        </w:rPr>
+        <w:t xml:space="preserve">code</w:t>
+      </w:r>
+      <w:r>
+        <w:rPr>
+          <w:sz w:val="21"/>
+          <w:szCs w:val="21"/>
+        </w:rPr>
+        <w:t xml:space="preserve"> sütunu eklendi
+(</w:t>
+      </w:r>
+      <w:r>
+        <w:rPr>
+          <w:rFonts w:ascii="Consolas" w:cs="Consolas" w:eastAsia="Consolas" w:hAnsi="Consolas"/>
+          <w:color w:val="1F5F56"/>
+          <w:sz w:val="21"/>
+          <w:szCs w:val="21"/>
+        </w:rPr>
+        <w:t xml:space="preserve">companies_code_unique</w:t>
+      </w:r>
+      <w:r>
+        <w:rPr>
+          <w:sz w:val="21"/>
+          <w:szCs w:val="21"/>
+        </w:rPr>
+        <w:t xml:space="preserve">); ana sayfa artık doğrudan giriş formuna değil,
+bir firma kodu/adı giriş ekranına (</w:t>
+      </w:r>
+      <w:r>
+        <w:rPr>
+          <w:rFonts w:ascii="Consolas" w:cs="Consolas" w:eastAsia="Consolas" w:hAnsi="Consolas"/>
+          <w:color w:val="1F5F56"/>
+          <w:sz w:val="21"/>
+          <w:szCs w:val="21"/>
+        </w:rPr>
+        <w:t xml:space="preserve">src/app/company-gate.tsx</w:t>
+      </w:r>
+      <w:r>
+        <w:rPr>
+          <w:sz w:val="21"/>
+          <w:szCs w:val="21"/>
+        </w:rPr>
+        <w:t xml:space="preserve">) açılıyor.
+Seçilen firma </w:t>
+      </w:r>
+      <w:r>
+        <w:rPr>
+          <w:rFonts w:ascii="Consolas" w:cs="Consolas" w:eastAsia="Consolas" w:hAnsi="Consolas"/>
+          <w:color w:val="1F5F56"/>
+          <w:sz w:val="21"/>
+          <w:szCs w:val="21"/>
+        </w:rPr>
+        <w:t xml:space="preserve">localStorage</w:t>
+      </w:r>
+      <w:r>
+        <w:rPr>
+          <w:sz w:val="21"/>
+          <w:szCs w:val="21"/>
+        </w:rPr>
+        <w:t xml:space="preserve">&amp;#39;a (</w:t>
+      </w:r>
+      <w:r>
+        <w:rPr>
+          <w:rFonts w:ascii="Consolas" w:cs="Consolas" w:eastAsia="Consolas" w:hAnsi="Consolas"/>
+          <w:color w:val="1F5F56"/>
+          <w:sz w:val="21"/>
+          <w:szCs w:val="21"/>
+        </w:rPr>
+        <w:t xml:space="preserve">hb_company_code</w:t>
+      </w:r>
+      <w:r>
+        <w:rPr>
+          <w:sz w:val="21"/>
+          <w:szCs w:val="21"/>
+        </w:rPr>
+        <w:t xml:space="preserve">) önbelleklenip
+</w:t>
+      </w:r>
+      <w:r>
+        <w:rPr>
+          <w:rFonts w:ascii="Consolas" w:cs="Consolas" w:eastAsia="Consolas" w:hAnsi="Consolas"/>
+          <w:color w:val="1F5F56"/>
+          <w:sz w:val="21"/>
+          <w:szCs w:val="21"/>
+        </w:rPr>
+        <w:t xml:space="preserve">/login?company=...</w:t>
+      </w:r>
+      <w:r>
+        <w:rPr>
+          <w:sz w:val="21"/>
+          <w:szCs w:val="21"/>
+        </w:rPr>
+        <w:t xml:space="preserve">&amp;#39;a yönlendiriyor; </w:t>
+      </w:r>
+      <w:r>
+        <w:rPr>
+          <w:rFonts w:ascii="Consolas" w:cs="Consolas" w:eastAsia="Consolas" w:hAnsi="Consolas"/>
+          <w:color w:val="1F5F56"/>
+          <w:sz w:val="21"/>
+          <w:szCs w:val="21"/>
+        </w:rPr>
+        <w:t xml:space="preserve">src/auth.ts</w:t>
+      </w:r>
+      <w:r>
+        <w:rPr>
+          <w:sz w:val="21"/>
+          <w:szCs w:val="21"/>
+        </w:rPr>
+        <w:t xml:space="preserve">&amp;#39;teki </w:t>
+      </w:r>
+      <w:r>
+        <w:rPr>
+          <w:rFonts w:ascii="Consolas" w:cs="Consolas" w:eastAsia="Consolas" w:hAnsi="Consolas"/>
+          <w:color w:val="1F5F56"/>
+          <w:sz w:val="21"/>
+          <w:szCs w:val="21"/>
+        </w:rPr>
+        <w:t xml:space="preserve">authorize</w:t>
+      </w:r>
+      <w:r>
+        <w:rPr>
+          <w:sz w:val="21"/>
+          <w:szCs w:val="21"/>
+        </w:rPr>
+        <w:t xml:space="preserve">,
+kullanıcıyı artık yalnızca e-postayla değil </w:t>
+      </w:r>
+      <w:r>
+        <w:rPr>
+          <w:rFonts w:ascii="Consolas" w:cs="Consolas" w:eastAsia="Consolas" w:hAnsi="Consolas"/>
+          <w:color w:val="1F5F56"/>
+          <w:sz w:val="21"/>
+          <w:szCs w:val="21"/>
+        </w:rPr>
+        <w:t xml:space="preserve">(email, companyId)</w:t>
+      </w:r>
+      <w:r>
+        <w:rPr>
+          <w:sz w:val="21"/>
+          <w:szCs w:val="21"/>
+        </w:rPr>
+        <w:t xml:space="preserve">
+ikilisiyle arıyor — bu, aynı e-postanın farklı firmalarda ayrı
+hesaplara ait olabilmesini sağlıyor (</w:t>
+      </w:r>
+      <w:r>
+        <w:rPr>
+          <w:rFonts w:ascii="Consolas" w:cs="Consolas" w:eastAsia="Consolas" w:hAnsi="Consolas"/>
+          <w:color w:val="1F5F56"/>
+          <w:sz w:val="21"/>
+          <w:szCs w:val="21"/>
+        </w:rPr>
+        <w:t xml:space="preserve">src/lib/companies.ts:: resolveCompanyByCodeOrName</w:t>
+      </w:r>
+      <w:r>
+        <w:rPr>
+          <w:sz w:val="21"/>
+          <w:szCs w:val="21"/>
+        </w:rPr>
+        <w:t xml:space="preserve">, kod büyük/küçük harf duyarsız, isim
+karşılaştırması da yapıyor). Kayıtlı firma artık geçersizse (silinmiş/
+yanlış) </w:t>
+      </w:r>
+      <w:r>
+        <w:rPr>
+          <w:rFonts w:ascii="Consolas" w:cs="Consolas" w:eastAsia="Consolas" w:hAnsi="Consolas"/>
+          <w:color w:val="1F5F56"/>
+          <w:sz w:val="21"/>
+          <w:szCs w:val="21"/>
+        </w:rPr>
+        <w:t xml:space="preserve">/?companyError=1</w:t>
+      </w:r>
+      <w:r>
+        <w:rPr>
+          <w:sz w:val="21"/>
+          <w:szCs w:val="21"/>
+        </w:rPr>
+        <w:t xml:space="preserve"> ile ana sayfaya dönülüp önbellek temizleniyor.
+Bu değişiklik henüz yalnızca bir altyapı hazırlığı — bugün hâlâ tek bir
+firma (Tunam) çalışıyor, ama giriş akışı artık birden fazla firmayı
+ayrıştırabilecek şekilde kurulu.</w:t>
+      </w:r>
+    </w:p>
+    <w:p>
+      <w:pPr>
+        <w:spacing w:after="120"/>
+      </w:pPr>
+      <w:r>
+        <w:rPr>
+          <w:b/>
+          <w:bCs/>
+          <w:color w:val="1A2420"/>
+          <w:sz w:val="21"/>
+          <w:szCs w:val="21"/>
+        </w:rPr>
+        <w:t xml:space="preserve">Çıkış kriteri —</w:t>
+      </w:r>
+      <w:r>
+        <w:rPr>
+          <w:color w:val="1A2420"/>
+          <w:sz w:val="21"/>
+          <w:szCs w:val="21"/>
+        </w:rPr>
+        <w:t xml:space="preserve"> üç ödeme tipiyle de (cari, kapıda ödeme, sanal POS
+başarılı/başarısız) uçtan uca sipariş oluşturulabiliyor; admin panelde durum
+geçişleri izlenebiliyor. Tarayıcıda doğrulandı.</w:t>
+      </w:r>
+    </w:p>
+    <w:p>
+      <w:pPr>
+        <w:pStyle w:val="Heading2"/>
+        <w:spacing w:after="100" w:before="220"/>
+      </w:pPr>
+      <w:r>
+        <w:rPr>
+          <w:color w:val="1A2420"/>
+        </w:rPr>
+        <w:t xml:space="preserve">Faz 4 — Cari Bakiye &amp;amp; Bağımsız Tahsilat Modülü</w:t>
+      </w:r>
+    </w:p>
+    <w:p>
+      <w:pPr>
+        <w:spacing w:after="120"/>
+      </w:pPr>
+      <w:r>
+        <w:rPr>
+          <w:color w:val="1A2420"/>
+          <w:sz w:val="21"/>
+          <w:szCs w:val="21"/>
+        </w:rPr>
+        <w:t xml:space="preserve">Hedef: Siparişten kopuk, serbest tutarlı ödeme ve cari hesap defteri.</w:t>
       </w:r>
     </w:p>
     <w:p>
@@ -1476,9 +1904,583 @@
           <w:sz w:val="21"/>
           <w:szCs w:val="21"/>
         </w:rPr>
-        <w:t xml:space="preserve">Bayi kataloğunda toplu ürün seçimi + tek işlemle sepete ekleme — Payna
-Grup Portal karşılaştırmasından gelen ek kapsam, katalog tarafında
-sipariş verme hızını artırır</w:t>
+        <w:t xml:space="preserve">Bayi panelinde "Bakiye Öde" ekranı</w:t>
+      </w:r>
+      <w:r>
+        <w:rPr>
+          <w:sz w:val="21"/>
+          <w:szCs w:val="21"/>
+        </w:rPr>
+        <w:t xml:space="preserve"> — ✅ Tamamlandı
+(</w:t>
+      </w:r>
+      <w:r>
+        <w:rPr>
+          <w:rFonts w:ascii="Consolas" w:cs="Consolas" w:eastAsia="Consolas" w:hAnsi="Consolas"/>
+          <w:color w:val="1F5F56"/>
+          <w:sz w:val="21"/>
+          <w:szCs w:val="21"/>
+        </w:rPr>
+        <w:t xml:space="preserve">src/app/dealer/balance/</w:t>
+      </w:r>
+      <w:r>
+        <w:rPr>
+          <w:sz w:val="21"/>
+          <w:szCs w:val="21"/>
+        </w:rPr>
+        <w:t xml:space="preserve">). Mevcut checkout&amp;#39;taki mock sanal POS deseniyle
+aynı: devre dışı sahte kart alanı + &amp;quot;başarısız simüle et&amp;quot; checkbox&amp;#39;ı.
+Bayi serbest bir tutar girip </w:t>
+      </w:r>
+      <w:r>
+        <w:rPr>
+          <w:rFonts w:ascii="Consolas" w:cs="Consolas" w:eastAsia="Consolas" w:hAnsi="Consolas"/>
+          <w:color w:val="1F5F56"/>
+          <w:sz w:val="21"/>
+          <w:szCs w:val="21"/>
+        </w:rPr>
+        <w:t xml:space="preserve">mockPosProvider.charge()</w:t>
+      </w:r>
+      <w:r>
+        <w:rPr>
+          <w:sz w:val="21"/>
+          <w:szCs w:val="21"/>
+        </w:rPr>
+        <w:t xml:space="preserve"> ile öder.</w:t>
+      </w:r>
+    </w:p>
+    <w:p>
+      <w:pPr>
+        <w:pStyle w:val="ListParagraph"/>
+        <w:numPr>
+          <w:ilvl w:val="0"/>
+          <w:numId w:val="1"/>
+        </w:numPr>
+        <w:spacing w:after="60"/>
+      </w:pPr>
+      <w:r>
+        <w:rPr>
+          <w:sz w:val="21"/>
+          <w:szCs w:val="21"/>
+        </w:rPr>
+        <w:t xml:space="preserve">`payments` tablosunda `type = standalone_collection` kaydı</w:t>
+      </w:r>
+      <w:r>
+        <w:rPr>
+          <w:sz w:val="21"/>
+          <w:szCs w:val="21"/>
+        </w:rPr>
+        <w:t xml:space="preserve"> — ✅
+Tamamlandı. </w:t>
+      </w:r>
+      <w:r>
+        <w:rPr>
+          <w:rFonts w:ascii="Consolas" w:cs="Consolas" w:eastAsia="Consolas" w:hAnsi="Consolas"/>
+          <w:color w:val="1F5F56"/>
+          <w:sz w:val="21"/>
+          <w:szCs w:val="21"/>
+        </w:rPr>
+        <w:t xml:space="preserve">payBalance</w:t>
+      </w:r>
+      <w:r>
+        <w:rPr>
+          <w:sz w:val="21"/>
+          <w:szCs w:val="21"/>
+        </w:rPr>
+        <w:t xml:space="preserve"> action&amp;#39;ı (</w:t>
+      </w:r>
+      <w:r>
+        <w:rPr>
+          <w:rFonts w:ascii="Consolas" w:cs="Consolas" w:eastAsia="Consolas" w:hAnsi="Consolas"/>
+          <w:color w:val="1F5F56"/>
+          <w:sz w:val="21"/>
+          <w:szCs w:val="21"/>
+        </w:rPr>
+        <w:t xml:space="preserve">src/app/dealer/balance/actions.ts</w:t>
+      </w:r>
+      <w:r>
+        <w:rPr>
+          <w:sz w:val="21"/>
+          <w:szCs w:val="21"/>
+        </w:rPr>
+        <w:t xml:space="preserve">)
+</w:t>
+      </w:r>
+      <w:r>
+        <w:rPr>
+          <w:rFonts w:ascii="Consolas" w:cs="Consolas" w:eastAsia="Consolas" w:hAnsi="Consolas"/>
+          <w:color w:val="1F5F56"/>
+          <w:sz w:val="21"/>
+          <w:szCs w:val="21"/>
+        </w:rPr>
+        <w:t xml:space="preserve">orderId: null</w:t>
+      </w:r>
+      <w:r>
+        <w:rPr>
+          <w:sz w:val="21"/>
+          <w:szCs w:val="21"/>
+        </w:rPr>
+        <w:t xml:space="preserve"> ile bu tipte bir satır yazıyor; </w:t>
+      </w:r>
+      <w:r>
+        <w:rPr>
+          <w:rFonts w:ascii="Consolas" w:cs="Consolas" w:eastAsia="Consolas" w:hAnsi="Consolas"/>
+          <w:color w:val="1F5F56"/>
+          <w:sz w:val="21"/>
+          <w:szCs w:val="21"/>
+        </w:rPr>
+        <w:t xml:space="preserve">ChargeInput.orderId</w:t>
+      </w:r>
+      <w:r>
+        <w:rPr>
+          <w:sz w:val="21"/>
+          <w:szCs w:val="21"/>
+        </w:rPr>
+        <w:t xml:space="preserve">
+bu yüzden opsiyonel yapıldı (</w:t>
+      </w:r>
+      <w:r>
+        <w:rPr>
+          <w:rFonts w:ascii="Consolas" w:cs="Consolas" w:eastAsia="Consolas" w:hAnsi="Consolas"/>
+          <w:color w:val="1F5F56"/>
+          <w:sz w:val="21"/>
+          <w:szCs w:val="21"/>
+        </w:rPr>
+        <w:t xml:space="preserve">src/lib/payments/provider.ts</w:t>
+      </w:r>
+      <w:r>
+        <w:rPr>
+          <w:sz w:val="21"/>
+          <w:szCs w:val="21"/>
+        </w:rPr>
+        <w:t xml:space="preserve">) — bağımsız
+tahsilatın bağlı olduğu bir sipariş yok.</w:t>
+      </w:r>
+    </w:p>
+    <w:p>
+      <w:pPr>
+        <w:pStyle w:val="ListParagraph"/>
+        <w:numPr>
+          <w:ilvl w:val="0"/>
+          <w:numId w:val="1"/>
+        </w:numPr>
+        <w:spacing w:after="60"/>
+      </w:pPr>
+      <w:r>
+        <w:rPr>
+          <w:sz w:val="21"/>
+          <w:szCs w:val="21"/>
+        </w:rPr>
+        <w:t xml:space="preserve">`ledger_entries` defteri ve bakiye hesaplama</w:t>
+      </w:r>
+      <w:r>
+        <w:rPr>
+          <w:sz w:val="21"/>
+          <w:szCs w:val="21"/>
+        </w:rPr>
+        <w:t xml:space="preserve"> — ✅ Tamamlandı. Yeni
+tablo (</w:t>
+      </w:r>
+      <w:r>
+        <w:rPr>
+          <w:rFonts w:ascii="Consolas" w:cs="Consolas" w:eastAsia="Consolas" w:hAnsi="Consolas"/>
+          <w:color w:val="1F5F56"/>
+          <w:sz w:val="21"/>
+          <w:szCs w:val="21"/>
+        </w:rPr>
+        <w:t xml:space="preserve">src/db/schema.ts</w:t>
+      </w:r>
+      <w:r>
+        <w:rPr>
+          <w:sz w:val="21"/>
+          <w:szCs w:val="21"/>
+        </w:rPr>
+        <w:t xml:space="preserve">) + tek merkezi yazıcı </w:t>
+      </w:r>
+      <w:r>
+        <w:rPr>
+          <w:rFonts w:ascii="Consolas" w:cs="Consolas" w:eastAsia="Consolas" w:hAnsi="Consolas"/>
+          <w:color w:val="1F5F56"/>
+          <w:sz w:val="21"/>
+          <w:szCs w:val="21"/>
+        </w:rPr>
+        <w:t xml:space="preserve">postLedgerEntry</w:t>
+      </w:r>
+      <w:r>
+        <w:rPr>
+          <w:sz w:val="21"/>
+          <w:szCs w:val="21"/>
+        </w:rPr>
+        <w:t xml:space="preserve">
+(</w:t>
+      </w:r>
+      <w:r>
+        <w:rPr>
+          <w:rFonts w:ascii="Consolas" w:cs="Consolas" w:eastAsia="Consolas" w:hAnsi="Consolas"/>
+          <w:color w:val="1F5F56"/>
+          <w:sz w:val="21"/>
+          <w:szCs w:val="21"/>
+        </w:rPr>
+        <w:t xml:space="preserve">src/lib/ledger.ts</w:t>
+      </w:r>
+      <w:r>
+        <w:rPr>
+          <w:sz w:val="21"/>
+          <w:szCs w:val="21"/>
+        </w:rPr>
+        <w:t xml:space="preserve">) — her çağrı bir defter satırı yazıp
+</w:t>
+      </w:r>
+      <w:r>
+        <w:rPr>
+          <w:rFonts w:ascii="Consolas" w:cs="Consolas" w:eastAsia="Consolas" w:hAnsi="Consolas"/>
+          <w:color w:val="1F5F56"/>
+          <w:sz w:val="21"/>
+          <w:szCs w:val="21"/>
+        </w:rPr>
+        <w:t xml:space="preserve">dealers.currentBalance</w:t>
+      </w:r>
+      <w:r>
+        <w:rPr>
+          <w:sz w:val="21"/>
+          <w:szCs w:val="21"/>
+        </w:rPr>
+        <w:t xml:space="preserve"> önbelleğini aynı anda günceller. Üç yazım
+noktası: cari sipariş oluşturulduğunda otomatik borç
+(</w:t>
+      </w:r>
+      <w:r>
+        <w:rPr>
+          <w:rFonts w:ascii="Consolas" w:cs="Consolas" w:eastAsia="Consolas" w:hAnsi="Consolas"/>
+          <w:color w:val="1F5F56"/>
+          <w:sz w:val="21"/>
+          <w:szCs w:val="21"/>
+        </w:rPr>
+        <w:t xml:space="preserve">src/app/dealer/actions.ts::createOrder</w:t>
+      </w:r>
+      <w:r>
+        <w:rPr>
+          <w:sz w:val="21"/>
+          <w:szCs w:val="21"/>
+        </w:rPr>
+        <w:t xml:space="preserve">), kapıda ödemesi tahsil
+edilemeyen siparişin (</w:t>
+      </w:r>
+      <w:r>
+        <w:rPr>
+          <w:rFonts w:ascii="Consolas" w:cs="Consolas" w:eastAsia="Consolas" w:hAnsi="Consolas"/>
+          <w:color w:val="1F5F56"/>
+          <w:sz w:val="21"/>
+          <w:szCs w:val="21"/>
+        </w:rPr>
+        <w:t xml:space="preserve">delivered_unpaid</w:t>
+      </w:r>
+      <w:r>
+        <w:rPr>
+          <w:sz w:val="21"/>
+          <w:szCs w:val="21"/>
+        </w:rPr>
+        <w:t xml:space="preserve">) cariye borç düşmesi
+(</w:t>
+      </w:r>
+      <w:r>
+        <w:rPr>
+          <w:rFonts w:ascii="Consolas" w:cs="Consolas" w:eastAsia="Consolas" w:hAnsi="Consolas"/>
+          <w:color w:val="1F5F56"/>
+          <w:sz w:val="21"/>
+          <w:szCs w:val="21"/>
+        </w:rPr>
+        <w:t xml:space="preserve">src/app/admin/orders/actions.ts::transitionOrderStatus</w:t>
+      </w:r>
+      <w:r>
+        <w:rPr>
+          <w:sz w:val="21"/>
+          <w:szCs w:val="21"/>
+        </w:rPr>
+        <w:t xml:space="preserve">), ve bağımsız
+bakiye ödemesinin alacak kaydı. Neon HTTP sürücüsünün gerçek transaction
+desteklememesi nedeniyle adımlar sırayla yazılıyor (Faz 3&amp;#39;teki
+</w:t>
+      </w:r>
+      <w:r>
+        <w:rPr>
+          <w:rFonts w:ascii="Consolas" w:cs="Consolas" w:eastAsia="Consolas" w:hAnsi="Consolas"/>
+          <w:color w:val="1F5F56"/>
+          <w:sz w:val="21"/>
+          <w:szCs w:val="21"/>
+        </w:rPr>
+        <w:t xml:space="preserve">createOrder</w:t>
+      </w:r>
+      <w:r>
+        <w:rPr>
+          <w:sz w:val="21"/>
+          <w:szCs w:val="21"/>
+        </w:rPr>
+        <w:t xml:space="preserve"> yorumuyla aynı ödün). Cari bir sipariş reddedilir/iptal
+edilirse (</w:t>
+      </w:r>
+      <w:r>
+        <w:rPr>
+          <w:rFonts w:ascii="Consolas" w:cs="Consolas" w:eastAsia="Consolas" w:hAnsi="Consolas"/>
+          <w:color w:val="1F5F56"/>
+          <w:sz w:val="21"/>
+          <w:szCs w:val="21"/>
+        </w:rPr>
+        <w:t xml:space="preserve">transitionOrderStatus</w:t>
+      </w:r>
+      <w:r>
+        <w:rPr>
+          <w:sz w:val="21"/>
+          <w:szCs w:val="21"/>
+        </w:rPr>
+        <w:t xml:space="preserve">) ya da admin tarafından kalıcı silinirse
+(</w:t>
+      </w:r>
+      <w:r>
+        <w:rPr>
+          <w:rFonts w:ascii="Consolas" w:cs="Consolas" w:eastAsia="Consolas" w:hAnsi="Consolas"/>
+          <w:color w:val="1F5F56"/>
+          <w:sz w:val="21"/>
+          <w:szCs w:val="21"/>
+        </w:rPr>
+        <w:t xml:space="preserve">deleteOrder</w:t>
+      </w:r>
+      <w:r>
+        <w:rPr>
+          <w:sz w:val="21"/>
+          <w:szCs w:val="21"/>
+        </w:rPr>
+        <w:t xml:space="preserve">), oluşturulduğunda otomatik yazılan borç bir ters kayıtla
+(silmede </w:t>
+      </w:r>
+      <w:r>
+        <w:rPr>
+          <w:rFonts w:ascii="Consolas" w:cs="Consolas" w:eastAsia="Consolas" w:hAnsi="Consolas"/>
+          <w:color w:val="1F5F56"/>
+          <w:sz w:val="21"/>
+          <w:szCs w:val="21"/>
+        </w:rPr>
+        <w:t xml:space="preserve">ledger_entries</w:t>
+      </w:r>
+      <w:r>
+        <w:rPr>
+          <w:sz w:val="21"/>
+          <w:szCs w:val="21"/>
+        </w:rPr>
+        <w:t xml:space="preserve">&amp;#39;teki net bakiyeye göre hesaplanan
+</w:t>
+      </w:r>
+      <w:r>
+        <w:rPr>
+          <w:rFonts w:ascii="Consolas" w:cs="Consolas" w:eastAsia="Consolas" w:hAnsi="Consolas"/>
+          <w:color w:val="1F5F56"/>
+          <w:sz w:val="21"/>
+          <w:szCs w:val="21"/>
+        </w:rPr>
+        <w:t xml:space="preserve">manual_adjustment</w:t>
+      </w:r>
+      <w:r>
+        <w:rPr>
+          <w:sz w:val="21"/>
+          <w:szCs w:val="21"/>
+        </w:rPr>
+        <w:t xml:space="preserve">) dengeleniyor — aksi halde hiç gerçekleşmemiş sayılan
+bir siparişin borcu bayinin carisinde kalıcı olarak asılı kalırdı.</w:t>
+      </w:r>
+    </w:p>
+    <w:p>
+      <w:pPr>
+        <w:pStyle w:val="ListParagraph"/>
+        <w:numPr>
+          <w:ilvl w:val="0"/>
+          <w:numId w:val="1"/>
+        </w:numPr>
+        <w:spacing w:after="60"/>
+      </w:pPr>
+      <w:r>
+        <w:rPr>
+          <w:sz w:val="21"/>
+          <w:szCs w:val="21"/>
+        </w:rPr>
+        <w:t xml:space="preserve">Admin tarafında cari hesap ekstresi görünümü</w:t>
+      </w:r>
+      <w:r>
+        <w:rPr>
+          <w:sz w:val="21"/>
+          <w:szCs w:val="21"/>
+        </w:rPr>
+        <w:t xml:space="preserve"> — ✅ Tamamlandı
+(</w:t>
+      </w:r>
+      <w:r>
+        <w:rPr>
+          <w:rFonts w:ascii="Consolas" w:cs="Consolas" w:eastAsia="Consolas" w:hAnsi="Consolas"/>
+          <w:color w:val="1F5F56"/>
+          <w:sz w:val="21"/>
+          <w:szCs w:val="21"/>
+        </w:rPr>
+        <w:t xml:space="preserve">src/app/admin/dealers/[id]/ledger/page.tsx</w:t>
+      </w:r>
+      <w:r>
+        <w:rPr>
+          <w:sz w:val="21"/>
+          <w:szCs w:val="21"/>
+        </w:rPr>
+        <w:t xml:space="preserve">) — bayi bazlı borç/alacak
+dökümü, her satırda o anki bakiye snapshot&amp;#39;ı. Bayi detay sayfasına
+güncel bakiyeyi gösteren bir &amp;quot;Cari Hesap&amp;quot; özet kartı + ekstre linki
+eklendi.</w:t>
+      </w:r>
+    </w:p>
+    <w:p>
+      <w:pPr>
+        <w:pStyle w:val="ListParagraph"/>
+        <w:numPr>
+          <w:ilvl w:val="0"/>
+          <w:numId w:val="1"/>
+        </w:numPr>
+        <w:spacing w:after="60"/>
+      </w:pPr>
+      <w:r>
+        <w:rPr>
+          <w:sz w:val="21"/>
+          <w:szCs w:val="21"/>
+        </w:rPr>
+        <w:t xml:space="preserve">Bayi kataloğunda toplu ürün seçimi + tek işlemle sepete ekleme</w:t>
+      </w:r>
+      <w:r>
+        <w:rPr>
+          <w:sz w:val="21"/>
+          <w:szCs w:val="21"/>
+        </w:rPr>
+        <w:t xml:space="preserve"> — ✅
+Tamamlandı — Payna Grup Portal karşılaştırmasından gelen ek kapsam,
+katalog tarafında sipariş verme hızını artırır. Kataloğun sağ üstüne
+&amp;quot;Tüm miktarları temizle&amp;quot;nin yanına &amp;quot;Miktar Girilenleri Ekle&amp;quot; butonu
+eklendi (</w:t>
+      </w:r>
+      <w:r>
+        <w:rPr>
+          <w:rFonts w:ascii="Consolas" w:cs="Consolas" w:eastAsia="Consolas" w:hAnsi="Consolas"/>
+          <w:color w:val="1F5F56"/>
+          <w:sz w:val="21"/>
+          <w:szCs w:val="21"/>
+        </w:rPr>
+        <w:t xml:space="preserve">product-catalog.tsx</w:t>
+      </w:r>
+      <w:r>
+        <w:rPr>
+          <w:sz w:val="21"/>
+          <w:szCs w:val="21"/>
+        </w:rPr>
+        <w:t xml:space="preserve">): satır satır &amp;quot;Ekle&amp;quot;ye basmadan, miktar
+yazılmış tüm satırları tek tıkla sepete ekliyor; sepete zaten girmiş bir
+ürün atlanır (miktarları sessizce toplamak yerine), sipariş katına
+uymayan miktarlar da atlanır — her iki durumda da hangi ürünlerin
+neden eklenmediği toast ile bildiriliyor. Bunun için satır bazlı miktar
+state&amp;#39;i artık </w:t>
+      </w:r>
+      <w:r>
+        <w:rPr>
+          <w:rFonts w:ascii="Consolas" w:cs="Consolas" w:eastAsia="Consolas" w:hAnsi="Consolas"/>
+          <w:color w:val="1F5F56"/>
+          <w:sz w:val="21"/>
+          <w:szCs w:val="21"/>
+        </w:rPr>
+        <w:t xml:space="preserve">ProductRow</w:t>
+      </w:r>
+      <w:r>
+        <w:rPr>
+          <w:sz w:val="21"/>
+          <w:szCs w:val="21"/>
+        </w:rPr>
+        <w:t xml:space="preserve"> içinde değil üst </w:t>
+      </w:r>
+      <w:r>
+        <w:rPr>
+          <w:rFonts w:ascii="Consolas" w:cs="Consolas" w:eastAsia="Consolas" w:hAnsi="Consolas"/>
+          <w:color w:val="1F5F56"/>
+          <w:sz w:val="21"/>
+          <w:szCs w:val="21"/>
+        </w:rPr>
+        <w:t xml:space="preserve">ProductCatalog</w:t>
+      </w:r>
+      <w:r>
+        <w:rPr>
+          <w:sz w:val="21"/>
+          <w:szCs w:val="21"/>
+        </w:rPr>
+        <w:t xml:space="preserve">&amp;#39;ta tutuluyor
+(kategori grupları arasında paylaşılabilsin diye); aynı tick içinde art
+arda çağrılan </w:t>
+      </w:r>
+      <w:r>
+        <w:rPr>
+          <w:rFonts w:ascii="Consolas" w:cs="Consolas" w:eastAsia="Consolas" w:hAnsi="Consolas"/>
+          <w:color w:val="1F5F56"/>
+          <w:sz w:val="21"/>
+          <w:szCs w:val="21"/>
+        </w:rPr>
+        <w:t xml:space="preserve">addItem</w:t>
+      </w:r>
+      <w:r>
+        <w:rPr>
+          <w:sz w:val="21"/>
+          <w:szCs w:val="21"/>
+        </w:rPr>
+        <w:t xml:space="preserve">&amp;#39;ların birbirinin üstüne yazmaması için
+</w:t>
+      </w:r>
+      <w:r>
+        <w:rPr>
+          <w:rFonts w:ascii="Consolas" w:cs="Consolas" w:eastAsia="Consolas" w:hAnsi="Consolas"/>
+          <w:color w:val="1F5F56"/>
+          <w:sz w:val="21"/>
+          <w:szCs w:val="21"/>
+        </w:rPr>
+        <w:t xml:space="preserve">useCart</w:t>
+      </w:r>
+      <w:r>
+        <w:rPr>
+          <w:sz w:val="21"/>
+          <w:szCs w:val="21"/>
+        </w:rPr>
+        <w:t xml:space="preserve">/</w:t>
+      </w:r>
+      <w:r>
+        <w:rPr>
+          <w:rFonts w:ascii="Consolas" w:cs="Consolas" w:eastAsia="Consolas" w:hAnsi="Consolas"/>
+          <w:color w:val="1F5F56"/>
+          <w:sz w:val="21"/>
+          <w:szCs w:val="21"/>
+        </w:rPr>
+        <w:t xml:space="preserve">useLocalStorageStore</w:t>
+      </w:r>
+      <w:r>
+        <w:rPr>
+          <w:sz w:val="21"/>
+          <w:szCs w:val="21"/>
+        </w:rPr>
+        <w:t xml:space="preserve"> fonksiyonel updater (</w:t>
+      </w:r>
+      <w:r>
+        <w:rPr>
+          <w:rFonts w:ascii="Consolas" w:cs="Consolas" w:eastAsia="Consolas" w:hAnsi="Consolas"/>
+          <w:color w:val="1F5F56"/>
+          <w:sz w:val="21"/>
+          <w:szCs w:val="21"/>
+        </w:rPr>
+        <w:t xml:space="preserve">prev =&amp;gt; ...</w:t>
+      </w:r>
+      <w:r>
+        <w:rPr>
+          <w:sz w:val="21"/>
+          <w:szCs w:val="21"/>
+        </w:rPr>
+        <w:t xml:space="preserve">)
+desenine geçirildi. Roadmap&amp;#39;te öngörülen ayrı bir &amp;quot;Ayarlar&amp;quot; sayfasıyla
+mod seçimine gerek kalmadı (bkz. aşağıdaki not) — tekli ve toplu ekleme
+her zaman yan yana duruyor.</w:t>
       </w:r>
     </w:p>
     <w:p>
@@ -2400,9 +3402,256 @@
           <w:sz w:val="21"/>
           <w:szCs w:val="21"/>
         </w:rPr>
-        <w:t xml:space="preserve">Bayi paneli menüsüne bir &amp;quot;Ayarlar&amp;quot; sayfası — henüz yapılmadı, roadmap
-dışı bir ek kapsam. İlk ayar: sepete ekleme davranışını iki mod
-arasında seçtiren bir checkbox.</w:t>
+        <w:t xml:space="preserve">Bayi paneli menüsüne bir "Ayarlar" sayfası (sepete ekleme modu
+seçimi)</w:t>
+      </w:r>
+      <w:r>
+        <w:rPr>
+          <w:sz w:val="21"/>
+          <w:szCs w:val="21"/>
+        </w:rPr>
+        <w:t xml:space="preserve"> — farklı şekilde çözüldü, ayrı bir sayfa/ayar gerekmedi.
+Planlanan Mod 1 (satır satır &amp;quot;Ekle&amp;quot;) ve Mod 2 (toplu ekleme), bir
+tercih anahtarı arkasında seçtirilmek yerine yukarıdaki &amp;quot;Miktar
+Girilenleri Ekle&amp;quot; özelliğiyle </w:t>
+      </w:r>
+      <w:r>
+        <w:rPr>
+          <w:b/>
+          <w:bCs/>
+          <w:sz w:val="21"/>
+          <w:szCs w:val="21"/>
+        </w:rPr>
+        <w:t xml:space="preserve">her zaman birlikte</w:t>
+      </w:r>
+      <w:r>
+        <w:rPr>
+          <w:sz w:val="21"/>
+          <w:szCs w:val="21"/>
+        </w:rPr>
+        <w:t xml:space="preserve"> sunuldu — bayi
+istediği satırda tek tek &amp;quot;Ekle&amp;quot;ye basabiliyor, istediği zaman birden
+fazla satıra miktar yazıp tek butonla topluca ekleyebiliyor. Bir
+ayar ekranı ve kalıcı tercih deposu (localStorage/</w:t>
+      </w:r>
+      <w:r>
+        <w:rPr>
+          <w:rFonts w:ascii="Consolas" w:cs="Consolas" w:eastAsia="Consolas" w:hAnsi="Consolas"/>
+          <w:color w:val="1F5F56"/>
+          <w:sz w:val="21"/>
+          <w:szCs w:val="21"/>
+        </w:rPr>
+        <w:t xml:space="preserve">users</w:t>
+      </w:r>
+      <w:r>
+        <w:rPr>
+          <w:sz w:val="21"/>
+          <w:szCs w:val="21"/>
+        </w:rPr>
+        <w:t xml:space="preserve"> tablosu)
+ihtiyacını ortadan kaldırdığı için daha basit bir çözüm.</w:t>
+      </w:r>
+    </w:p>
+    <w:p>
+      <w:pPr>
+        <w:pStyle w:val="ListParagraph"/>
+        <w:numPr>
+          <w:ilvl w:val="0"/>
+          <w:numId w:val="1"/>
+        </w:numPr>
+        <w:spacing w:after="60"/>
+      </w:pPr>
+      <w:r>
+        <w:rPr>
+          <w:sz w:val="21"/>
+          <w:szCs w:val="21"/>
+        </w:rPr>
+        <w:t xml:space="preserve">Admin ve bayi paneli "Genel Bakış" ekranlarına gerçek KPI ve grafik
+içeriği</w:t>
+      </w:r>
+      <w:r>
+        <w:rPr>
+          <w:sz w:val="21"/>
+          <w:szCs w:val="21"/>
+        </w:rPr>
+        <w:t xml:space="preserve"> — ✅ Tamamlandı, roadmap dışı bir ek kapsam (bkz. Bölüm 5,
+&amp;quot;Genel Bakış&amp;quot; satırı — önceden yalnızca statik sayaç kartları vardı).
+Paylaşılan </w:t>
+      </w:r>
+      <w:r>
+        <w:rPr>
+          <w:rFonts w:ascii="Consolas" w:cs="Consolas" w:eastAsia="Consolas" w:hAnsi="Consolas"/>
+          <w:color w:val="1F5F56"/>
+          <w:sz w:val="21"/>
+          <w:szCs w:val="21"/>
+        </w:rPr>
+        <w:t xml:space="preserve">StatTile</w:t>
+      </w:r>
+      <w:r>
+        <w:rPr>
+          <w:sz w:val="21"/>
+          <w:szCs w:val="21"/>
+        </w:rPr>
+        <w:t xml:space="preserve"> (</w:t>
+      </w:r>
+      <w:r>
+        <w:rPr>
+          <w:rFonts w:ascii="Consolas" w:cs="Consolas" w:eastAsia="Consolas" w:hAnsi="Consolas"/>
+          <w:color w:val="1F5F56"/>
+          <w:sz w:val="21"/>
+          <w:szCs w:val="21"/>
+        </w:rPr>
+        <w:t xml:space="preserve">src/components/stat-tile.tsx</w:t>
+      </w:r>
+      <w:r>
+        <w:rPr>
+          <w:sz w:val="21"/>
+          <w:szCs w:val="21"/>
+        </w:rPr>
+        <w:t xml:space="preserve">) ve </w:t>
+      </w:r>
+      <w:r>
+        <w:rPr>
+          <w:rFonts w:ascii="Consolas" w:cs="Consolas" w:eastAsia="Consolas" w:hAnsi="Consolas"/>
+          <w:color w:val="1F5F56"/>
+          <w:sz w:val="21"/>
+          <w:szCs w:val="21"/>
+        </w:rPr>
+        <w:t xml:space="preserve">BarChart</w:t>
+      </w:r>
+      <w:r>
+        <w:rPr>
+          <w:sz w:val="21"/>
+          <w:szCs w:val="21"/>
+        </w:rPr>
+        <w:t xml:space="preserve">
+(</w:t>
+      </w:r>
+      <w:r>
+        <w:rPr>
+          <w:rFonts w:ascii="Consolas" w:cs="Consolas" w:eastAsia="Consolas" w:hAnsi="Consolas"/>
+          <w:color w:val="1F5F56"/>
+          <w:sz w:val="21"/>
+          <w:szCs w:val="21"/>
+        </w:rPr>
+        <w:t xml:space="preserve">src/components/bar-chart.tsx</w:t>
+      </w:r>
+      <w:r>
+        <w:rPr>
+          <w:sz w:val="21"/>
+          <w:szCs w:val="21"/>
+        </w:rPr>
+        <w:t xml:space="preserve">) bileşenleri + </w:t>
+      </w:r>
+      <w:r>
+        <w:rPr>
+          <w:rFonts w:ascii="Consolas" w:cs="Consolas" w:eastAsia="Consolas" w:hAnsi="Consolas"/>
+          <w:color w:val="1F5F56"/>
+          <w:sz w:val="21"/>
+          <w:szCs w:val="21"/>
+        </w:rPr>
+        <w:t xml:space="preserve">src/lib/month-range.ts</w:t>
+      </w:r>
+      <w:r>
+        <w:rPr>
+          <w:sz w:val="21"/>
+          <w:szCs w:val="21"/>
+        </w:rPr>
+        <w:t xml:space="preserve">
+(son N ayın kovaları) ve </w:t>
+      </w:r>
+      <w:r>
+        <w:rPr>
+          <w:rFonts w:ascii="Consolas" w:cs="Consolas" w:eastAsia="Consolas" w:hAnsi="Consolas"/>
+          <w:color w:val="1F5F56"/>
+          <w:sz w:val="21"/>
+          <w:szCs w:val="21"/>
+        </w:rPr>
+        <w:t xml:space="preserve">src/lib/format.ts</w:t>
+      </w:r>
+      <w:r>
+        <w:rPr>
+          <w:sz w:val="21"/>
+          <w:szCs w:val="21"/>
+        </w:rPr>
+        <w:t xml:space="preserve"> (para/sayı biçimlendirme)
+yardımcıları eklendi. Admin ana sayfası: bayi/ürün sayısı, bu ay sipariş
+sayısı/cirosu, toplam cari alacak KPI&amp;#39;ları + son 6 ay sipariş sayısı ve
+ciro trend grafikleri + bu ay kategori bazında en çok sipariş edilen
+ürünler tablosu. Bayi ana sayfası aynı desende kendi verisiyle: bu ay
+sipariş sayısı/tutarı, güncel cari bakiye, kalan cari limit + aynı trend
+grafikleri ve kategori bazlı en çok sipariş verdiği ürünler. İptal/
+reddedilen siparişler istatistiklerden hariç tutuluyor
+(</w:t>
+      </w:r>
+      <w:r>
+        <w:rPr>
+          <w:rFonts w:ascii="Consolas" w:cs="Consolas" w:eastAsia="Consolas" w:hAnsi="Consolas"/>
+          <w:color w:val="1F5F56"/>
+          <w:sz w:val="21"/>
+          <w:szCs w:val="21"/>
+        </w:rPr>
+        <w:t xml:space="preserve">src/lib/order-status.ts::EXCLUDED_FROM_STATS_STATUSES</w:t>
+      </w:r>
+      <w:r>
+        <w:rPr>
+          <w:sz w:val="21"/>
+          <w:szCs w:val="21"/>
+        </w:rPr>
+        <w:t xml:space="preserve">) ama teslim
+edilip tahsil edilemeyen (</w:t>
+      </w:r>
+      <w:r>
+        <w:rPr>
+          <w:rFonts w:ascii="Consolas" w:cs="Consolas" w:eastAsia="Consolas" w:hAnsi="Consolas"/>
+          <w:color w:val="1F5F56"/>
+          <w:sz w:val="21"/>
+          <w:szCs w:val="21"/>
+        </w:rPr>
+        <w:t xml:space="preserve">delivered_unpaid</w:t>
+      </w:r>
+      <w:r>
+        <w:rPr>
+          <w:sz w:val="21"/>
+          <w:szCs w:val="21"/>
+        </w:rPr>
+        <w:t xml:space="preserve">) siparişler fiilen
+gerçekleştiği için dahil tutuluyor. Bayi tarafında ürün kataloğu artık
+ayrı bir sayfaya taşındı (</w:t>
+      </w:r>
+      <w:r>
+        <w:rPr>
+          <w:rFonts w:ascii="Consolas" w:cs="Consolas" w:eastAsia="Consolas" w:hAnsi="Consolas"/>
+          <w:color w:val="1F5F56"/>
+          <w:sz w:val="21"/>
+          <w:szCs w:val="21"/>
+        </w:rPr>
+        <w:t xml:space="preserve">/dealer/catalog</w:t>
+      </w:r>
+      <w:r>
+        <w:rPr>
+          <w:sz w:val="21"/>
+          <w:szCs w:val="21"/>
+        </w:rPr>
+        <w:t xml:space="preserve">), </w:t>
+      </w:r>
+      <w:r>
+        <w:rPr>
+          <w:rFonts w:ascii="Consolas" w:cs="Consolas" w:eastAsia="Consolas" w:hAnsi="Consolas"/>
+          <w:color w:val="1F5F56"/>
+          <w:sz w:val="21"/>
+          <w:szCs w:val="21"/>
+        </w:rPr>
+        <w:t xml:space="preserve">/dealer</w:t>
+      </w:r>
+      <w:r>
+        <w:rPr>
+          <w:sz w:val="21"/>
+          <w:szCs w:val="21"/>
+        </w:rPr>
+        <w:t xml:space="preserve"> bu genel bakış
+ekranına ayrıldı; bayi menüsüne &amp;quot;Genel Bakış&amp;quot; ve &amp;quot;Bakiye Öde&amp;quot; eklendi,
+admin menüsüne &amp;quot;Ayarlar&amp;quot; eklendi.</w:t>
       </w:r>
     </w:p>
     <w:p>
@@ -6284,7 +7533,7 @@
                 <w:sz w:val="18"/>
                 <w:szCs w:val="18"/>
               </w:rPr>
-              <w:t xml:space="preserve">Günlük/haftalık sipariş ve tahsilat özeti</w:t>
+              <w:t xml:space="preserve">Aylık sipariş/ciro/cari özeti</w:t>
             </w:r>
           </w:p>
         </w:tc>
@@ -6304,7 +7553,7 @@
                 <w:sz w:val="18"/>
                 <w:szCs w:val="18"/>
               </w:rPr>
-              <w:t xml:space="preserve">KPI kartları, marka bazlı mini grafikler</w:t>
+              <w:t xml:space="preserve">KPI kartları, aylık trend grafikleri, kategori bazlı en çok sipariş edilen ürünler</w:t>
             </w:r>
           </w:p>
         </w:tc>
@@ -6813,7 +8062,7 @@
                 <w:sz w:val="18"/>
                 <w:szCs w:val="18"/>
               </w:rPr>
-              <w:t xml:space="preserve">Ana Sayfa</w:t>
+              <w:t xml:space="preserve">Genel Bakış</w:t>
             </w:r>
           </w:p>
         </w:tc>
@@ -6833,7 +8082,7 @@
                 <w:sz w:val="18"/>
                 <w:szCs w:val="18"/>
               </w:rPr>
-              <w:t xml:space="preserve">Bakiye özeti, son siparişlerin durumu</w:t>
+              <w:t xml:space="preserve">Sipariş/ciro/cari özet, aylık trend</w:t>
             </w:r>
           </w:p>
         </w:tc>
@@ -6853,7 +8102,7 @@
                 <w:sz w:val="18"/>
                 <w:szCs w:val="18"/>
               </w:rPr>
-              <w:t xml:space="preserve">Bakiye kartı, son 5 sipariş listesi</w:t>
+              <w:t xml:space="preserve">KPI kartları, sipariş sayısı/tutarı trend grafikleri, kategori bazlı en çok sipariş verilen ürünler</w:t>
             </w:r>
           </w:p>
         </w:tc>

</xml_diff>

<commit_message>
Faz 4'ü tamamla: Bayi kendi siparişini iptal edebilsin
submitted/approved durumundaki cari, nakit veya sanal POS siparişini bayi
artık kendi panelinden (liste + detay) iptal edebiliyor. İptal, admin'in
transitionOrderStatus'undaki aynı canTransitionOrderStatus guard'ını ve not
zorunluluğu kuralını kullanıyor; cari siparişte oluşturulduğunda yazılan
borç postLedgerEntry ile geri alınıyor. Faz 4 roadmap'te tamamlandı olarak
işaretlendi, PDF/DOCX yeniden üretildi.
</commit_message>
<xml_diff>
--- a/docs/output/roadmap.docx
+++ b/docs/output/roadmap.docx
@@ -59,7 +59,7 @@
           <w:sz w:val="17"/>
           <w:szCs w:val="17"/>
         </w:rPr>
-        <w:t xml:space="preserve">Oluşturulma tarihi: 17 Ağustos 2026</w:t>
+        <w:t xml:space="preserve">Oluşturulma tarihi: 19 Ağustos 2026</w:t>
       </w:r>
     </w:p>
     <w:p>
@@ -1874,7 +1874,7 @@
         <w:rPr>
           <w:color w:val="1A2420"/>
         </w:rPr>
-        <w:t xml:space="preserve">Faz 4 — Cari Bakiye &amp;amp; Bağımsız Tahsilat Modülü</w:t>
+        <w:t xml:space="preserve">Faz 4 — Cari Bakiye &amp;amp; Bağımsız Tahsilat Modülü ✅ Tamamlandı</w:t>
       </w:r>
     </w:p>
     <w:p>
@@ -3077,13 +3077,223 @@
           <w:sz w:val="21"/>
           <w:szCs w:val="21"/>
         </w:rPr>
-        <w:t xml:space="preserve">Bayinin kendi siparişini silebilmesi ya da düzenleyebilmesi — amaç bir
-bayinin hatalı/yanlış girilmiş bir siparişi iptal edip tekrar sipariş
-geçebilmesi. Admin tarafındaki &amp;quot;zorla sil&amp;quot; (yukarıdaki not) yalnızca
-test verisi temizliği içindi, bu madde gerçek bayi iş akışı için ayrı
-bir tasarım gerektiriyor (ör. hangi durumdaki siparişler
-iptal/düzenlemeye açık olacak, cari bakiyeye etkisi ne olacak).
+        <w:t xml:space="preserve">Bayinin kendi siparişini silebilmesi ya da düzenleyebilmesi</w:t>
+      </w:r>
+      <w:r>
+        <w:rPr>
+          <w:sz w:val="21"/>
+          <w:szCs w:val="21"/>
+        </w:rPr>
+        <w:t xml:space="preserve"> — ✅
+Tamamlandı. Fiziksel silme değil, durum geçişi (iptal) olarak çözüldü —
+amaç zaten bir bayinin hatalı/yanlış girilmiş bir siparişi iptal edip
+mevcut &amp;quot;Tekrar sipariş ver&amp;quot; ile tekrar sipariş geçebilmesiydi. Bayi
+panelinde (&amp;quot;Siparişlerim&amp;quot; listesi ve sipariş detayı) yeni bir
+&amp;quot;İptal Et&amp;quot; butonu (</w:t>
+      </w:r>
+      <w:r>
+        <w:rPr>
+          <w:rFonts w:ascii="Consolas" w:cs="Consolas" w:eastAsia="Consolas" w:hAnsi="Consolas"/>
+          <w:color w:val="1F5F56"/>
+          <w:sz w:val="21"/>
+          <w:szCs w:val="21"/>
+        </w:rPr>
+        <w:t xml:space="preserve">src/app/dealer/orders/cancel-order-button.tsx</w:t>
+      </w:r>
+      <w:r>
+        <w:rPr>
+          <w:sz w:val="21"/>
+          <w:szCs w:val="21"/>
+        </w:rPr>
+        <w:t xml:space="preserve">) —
+admin&amp;#39;in hızlı red/iptal deseniyle aynı iki adımlı etkileşim (ilk tık
+sebep kutusu açar, sunucu tarafı notu zorunlu tutar). Yeni
 </w:t>
+      </w:r>
+      <w:r>
+        <w:rPr>
+          <w:rFonts w:ascii="Consolas" w:cs="Consolas" w:eastAsia="Consolas" w:hAnsi="Consolas"/>
+          <w:color w:val="1F5F56"/>
+          <w:sz w:val="21"/>
+          <w:szCs w:val="21"/>
+        </w:rPr>
+        <w:t xml:space="preserve">cancelOrder</w:t>
+      </w:r>
+      <w:r>
+        <w:rPr>
+          <w:sz w:val="21"/>
+          <w:szCs w:val="21"/>
+        </w:rPr>
+        <w:t xml:space="preserve"> server action&amp;#39;ı (</w:t>
+      </w:r>
+      <w:r>
+        <w:rPr>
+          <w:rFonts w:ascii="Consolas" w:cs="Consolas" w:eastAsia="Consolas" w:hAnsi="Consolas"/>
+          <w:color w:val="1F5F56"/>
+          <w:sz w:val="21"/>
+          <w:szCs w:val="21"/>
+        </w:rPr>
+        <w:t xml:space="preserve">src/app/dealer/actions.ts</w:t>
+      </w:r>
+      <w:r>
+        <w:rPr>
+          <w:sz w:val="21"/>
+          <w:szCs w:val="21"/>
+        </w:rPr>
+        <w:t xml:space="preserve">) sipariş
+sahipliğini doğruluyor ve durum makinesindeki mevcut
+</w:t>
+      </w:r>
+      <w:r>
+        <w:rPr>
+          <w:rFonts w:ascii="Consolas" w:cs="Consolas" w:eastAsia="Consolas" w:hAnsi="Consolas"/>
+          <w:color w:val="1F5F56"/>
+          <w:sz w:val="21"/>
+          <w:szCs w:val="21"/>
+        </w:rPr>
+        <w:t xml:space="preserve">canTransitionOrderStatus</w:t>
+      </w:r>
+      <w:r>
+        <w:rPr>
+          <w:sz w:val="21"/>
+          <w:szCs w:val="21"/>
+        </w:rPr>
+        <w:t xml:space="preserve"> guard&amp;#39;ını (bkz. </w:t>
+      </w:r>
+      <w:r>
+        <w:rPr>
+          <w:rFonts w:ascii="Consolas" w:cs="Consolas" w:eastAsia="Consolas" w:hAnsi="Consolas"/>
+          <w:color w:val="1F5F56"/>
+          <w:sz w:val="21"/>
+          <w:szCs w:val="21"/>
+        </w:rPr>
+        <w:t xml:space="preserve">src/lib/order-status.ts</w:t>
+      </w:r>
+      <w:r>
+        <w:rPr>
+          <w:sz w:val="21"/>
+          <w:szCs w:val="21"/>
+        </w:rPr>
+        <w:t xml:space="preserve">)
+aynen kullanıyor — ek bir kısıtlama yazılmadı, zaten her üç akışta da
+</w:t>
+      </w:r>
+      <w:r>
+        <w:rPr>
+          <w:rFonts w:ascii="Consolas" w:cs="Consolas" w:eastAsia="Consolas" w:hAnsi="Consolas"/>
+          <w:color w:val="1F5F56"/>
+          <w:sz w:val="21"/>
+          <w:szCs w:val="21"/>
+        </w:rPr>
+        <w:t xml:space="preserve">cancelled</w:t>
+      </w:r>
+      <w:r>
+        <w:rPr>
+          <w:sz w:val="21"/>
+          <w:szCs w:val="21"/>
+        </w:rPr>
+        <w:t xml:space="preserve"> geçişi yalnızca </w:t>
+      </w:r>
+      <w:r>
+        <w:rPr>
+          <w:rFonts w:ascii="Consolas" w:cs="Consolas" w:eastAsia="Consolas" w:hAnsi="Consolas"/>
+          <w:color w:val="1F5F56"/>
+          <w:sz w:val="21"/>
+          <w:szCs w:val="21"/>
+        </w:rPr>
+        <w:t xml:space="preserve">submitted</w:t>
+      </w:r>
+      <w:r>
+        <w:rPr>
+          <w:sz w:val="21"/>
+          <w:szCs w:val="21"/>
+        </w:rPr>
+        <w:t xml:space="preserve">/</w:t>
+      </w:r>
+      <w:r>
+        <w:rPr>
+          <w:rFonts w:ascii="Consolas" w:cs="Consolas" w:eastAsia="Consolas" w:hAnsi="Consolas"/>
+          <w:color w:val="1F5F56"/>
+          <w:sz w:val="21"/>
+          <w:szCs w:val="21"/>
+        </w:rPr>
+        <w:t xml:space="preserve">approved</w:t>
+      </w:r>
+      <w:r>
+        <w:rPr>
+          <w:sz w:val="21"/>
+          <w:szCs w:val="21"/>
+        </w:rPr>
+        <w:t xml:space="preserve">&amp;#39;ta tanımlı olduğundan
+bayi bir sipariş </w:t>
+      </w:r>
+      <w:r>
+        <w:rPr>
+          <w:rFonts w:ascii="Consolas" w:cs="Consolas" w:eastAsia="Consolas" w:hAnsi="Consolas"/>
+          <w:color w:val="1F5F56"/>
+          <w:sz w:val="21"/>
+          <w:szCs w:val="21"/>
+        </w:rPr>
+        <w:t xml:space="preserve">preparing</w:t>
+      </w:r>
+      <w:r>
+        <w:rPr>
+          <w:sz w:val="21"/>
+          <w:szCs w:val="21"/>
+        </w:rPr>
+        <w:t xml:space="preserve">&amp;#39;e geçtikten sonra artık iptal edemiyor.
+Cari siparişte oluşturulduğunda otomatik yazılan borç, admin&amp;#39;in
+</w:t>
+      </w:r>
+      <w:r>
+        <w:rPr>
+          <w:rFonts w:ascii="Consolas" w:cs="Consolas" w:eastAsia="Consolas" w:hAnsi="Consolas"/>
+          <w:color w:val="1F5F56"/>
+          <w:sz w:val="21"/>
+          <w:szCs w:val="21"/>
+        </w:rPr>
+        <w:t xml:space="preserve">transitionOrderStatus</w:t>
+      </w:r>
+      <w:r>
+        <w:rPr>
+          <w:sz w:val="21"/>
+          <w:szCs w:val="21"/>
+        </w:rPr>
+        <w:t xml:space="preserve">&amp;#39;undaki iptal/red bloğuyla birebir aynı desende
+(</w:t>
+      </w:r>
+      <w:r>
+        <w:rPr>
+          <w:rFonts w:ascii="Consolas" w:cs="Consolas" w:eastAsia="Consolas" w:hAnsi="Consolas"/>
+          <w:color w:val="1F5F56"/>
+          <w:sz w:val="21"/>
+          <w:szCs w:val="21"/>
+        </w:rPr>
+        <w:t xml:space="preserve">postLedgerEntry</w:t>
+      </w:r>
+      <w:r>
+        <w:rPr>
+          <w:sz w:val="21"/>
+          <w:szCs w:val="21"/>
+        </w:rPr>
+        <w:t xml:space="preserve"> ile alacak kaydı, </w:t>
+      </w:r>
+      <w:r>
+        <w:rPr>
+          <w:rFonts w:ascii="Consolas" w:cs="Consolas" w:eastAsia="Consolas" w:hAnsi="Consolas"/>
+          <w:color w:val="1F5F56"/>
+          <w:sz w:val="21"/>
+          <w:szCs w:val="21"/>
+        </w:rPr>
+        <w:t xml:space="preserve">sourceType: &amp;quot;order&amp;quot;</w:t>
+      </w:r>
+      <w:r>
+        <w:rPr>
+          <w:sz w:val="21"/>
+          <w:szCs w:val="21"/>
+        </w:rPr>
+        <w:t xml:space="preserve">) geri
+alınıyor. </w:t>
       </w:r>
       <w:r>
         <w:rPr>
@@ -3092,15 +3302,32 @@
           <w:sz w:val="21"/>
           <w:szCs w:val="21"/>
         </w:rPr>
-        <w:t xml:space="preserve">Faz 7 (ERP entegrasyonu) ile çakışma notu:</w:t>
-      </w:r>
-      <w:r>
-        <w:rPr>
-          <w:sz w:val="21"/>
-          <w:szCs w:val="21"/>
-        </w:rPr>
-        <w:t xml:space="preserve"> bu özelliğin durum
-makinesi, ileride eklenecek </w:t>
+        <w:t xml:space="preserve">Faz 7 çakışma notu bu tasarımla karşılanmış oldu:</w:t>
+      </w:r>
+      <w:r>
+        <w:rPr>
+          <w:sz w:val="21"/>
+          <w:szCs w:val="21"/>
+        </w:rPr>
+        <w:t xml:space="preserve"> iptal
+edilebilirlik kontrolü tek bir yerde (</w:t>
+      </w:r>
+      <w:r>
+        <w:rPr>
+          <w:rFonts w:ascii="Consolas" w:cs="Consolas" w:eastAsia="Consolas" w:hAnsi="Consolas"/>
+          <w:color w:val="1F5F56"/>
+          <w:sz w:val="21"/>
+          <w:szCs w:val="21"/>
+        </w:rPr>
+        <w:t xml:space="preserve">canTransitionOrderStatus</w:t>
+      </w:r>
+      <w:r>
+        <w:rPr>
+          <w:sz w:val="21"/>
+          <w:szCs w:val="21"/>
+        </w:rPr>
+        <w:t xml:space="preserve">)
+toplandığı için, ileride eklenecek </w:t>
       </w:r>
       <w:r>
         <w:rPr>
@@ -3116,14 +3343,9 @@
           <w:sz w:val="21"/>
           <w:szCs w:val="21"/>
         </w:rPr>
-        <w:t xml:space="preserve"> alanını üçüncü bir
-kilit koşulu olarak kabul edecek şekilde tasarlanmalı — bir sipariş
-ERP&amp;#39;ye aktarıldıktan sonra (bu alan dolduktan sonra) yerelde artık ne
-düzenlenebilir ne silinebilir olmalı; düzeltme ihtiyacı iptal + yeni
-sipariş şeklinde çözülür (muhasebedeki &amp;quot;credit note&amp;quot; mantığı, ERP
-tarafıyla senkron kalır). Bu notu şimdiden düşmemizin nedeni, bugün
-yazılacak düzenleme/silme yetki kontrolünün Faz 7 geldiğinde yeniden
-tasarlanmak zorunda kalmaması.</w:t>
+        <w:t xml:space="preserve"> alanı bu
+fonksiyona üçüncü bir koşul olarak eklenmesi yeterli olacak, ayrı bir
+yeniden tasarım gerekmeyecek.</w:t>
       </w:r>
     </w:p>
     <w:p>

</xml_diff>

<commit_message>
Faz 5'i tamamla: marka bazlı satış raporu Excel export + pasif bayi raporu
Yeni /admin/reports sayfası: seçili dönem+marka için satış tablosu ve
30/60/90 gündür sipariş vermeyen bayiler listesi, ikisi de exceljs ile
.xlsx indirilebiliyor. Ürün bazlı filtre, CSV/PDF export ve materialized
view stratejisi bilinçli olarak kapsam dışı bırakıldı (roadmap'te not
düşüldü); PDF export ihtiyaç oldukça birkaç belirli rapor için ayrıca
ele alınacak.

Co-Authored-By: Claude Sonnet 5 <noreply@anthropic.com>
Claude-Session: https://claude.ai/code/session_01KmZwWuG1qX6Ycv6pfxtezD
</commit_message>
<xml_diff>
--- a/docs/output/roadmap.docx
+++ b/docs/output/roadmap.docx
@@ -59,7 +59,7 @@
           <w:sz w:val="17"/>
           <w:szCs w:val="17"/>
         </w:rPr>
-        <w:t xml:space="preserve">Oluşturulma tarihi: 19 Ağustos 2026</w:t>
+        <w:t xml:space="preserve">Oluşturulma tarihi: 23 Ağustos 2026</w:t>
       </w:r>
     </w:p>
     <w:p>
@@ -3909,7 +3909,7 @@
         <w:rPr>
           <w:color w:val="1A2420"/>
         </w:rPr>
-        <w:t xml:space="preserve">Faz 5 — Raporlama &amp;amp; Analitik</w:t>
+        <w:t xml:space="preserve">Faz 5 — Raporlama &amp;amp; Analitik ✅ Tamamlandı</w:t>
       </w:r>
     </w:p>
     <w:p>
@@ -3939,7 +3939,152 @@
           <w:sz w:val="21"/>
           <w:szCs w:val="21"/>
         </w:rPr>
-        <w:t xml:space="preserve">Marka / bayi / ürün / tarih aralığı filtreleriyle dinamik tablo ve grafikler</w:t>
+        <w:t xml:space="preserve">Marka / tarih aralığı filtreleriyle dinamik tablo ve grafikler</w:t>
+      </w:r>
+      <w:r>
+        <w:rPr>
+          <w:sz w:val="21"/>
+          <w:szCs w:val="21"/>
+        </w:rPr>
+        <w:t xml:space="preserve"> — ✅
+Tamamlandı. Ürün bazlı filtre şimdilik kapsam dışı bırakıldı; bayi bazlı
+filtre de eklenmedi — bayiler raporlarda sadece gruplanmış çıktı (en çok
+sipariş/ciro yapan bayiler) olarak görünüyor, filtre girdisi değil.
+Admin genel bakış (</w:t>
+      </w:r>
+      <w:r>
+        <w:rPr>
+          <w:rFonts w:ascii="Consolas" w:cs="Consolas" w:eastAsia="Consolas" w:hAnsi="Consolas"/>
+          <w:color w:val="1F5F56"/>
+          <w:sz w:val="21"/>
+          <w:szCs w:val="21"/>
+        </w:rPr>
+        <w:t xml:space="preserve">src/app/admin/page.tsx</w:t>
+      </w:r>
+      <w:r>
+        <w:rPr>
+          <w:sz w:val="21"/>
+          <w:szCs w:val="21"/>
+        </w:rPr>
+        <w:t xml:space="preserve">) ve siparişler
+(</w:t>
+      </w:r>
+      <w:r>
+        <w:rPr>
+          <w:rFonts w:ascii="Consolas" w:cs="Consolas" w:eastAsia="Consolas" w:hAnsi="Consolas"/>
+          <w:color w:val="1F5F56"/>
+          <w:sz w:val="21"/>
+          <w:szCs w:val="21"/>
+        </w:rPr>
+        <w:t xml:space="preserve">src/app/admin/orders/</w:t>
+      </w:r>
+      <w:r>
+        <w:rPr>
+          <w:sz w:val="21"/>
+          <w:szCs w:val="21"/>
+        </w:rPr>
+        <w:t xml:space="preserve">) ekranlarına dönem filtresi
+(</w:t>
+      </w:r>
+      <w:r>
+        <w:rPr>
+          <w:rFonts w:ascii="Consolas" w:cs="Consolas" w:eastAsia="Consolas" w:hAnsi="Consolas"/>
+          <w:color w:val="1F5F56"/>
+          <w:sz w:val="21"/>
+          <w:szCs w:val="21"/>
+        </w:rPr>
+        <w:t xml:space="preserve">src/components/period-filter.tsx</w:t>
+      </w:r>
+      <w:r>
+        <w:rPr>
+          <w:sz w:val="21"/>
+          <w:szCs w:val="21"/>
+        </w:rPr>
+        <w:t xml:space="preserve">, </w:t>
+      </w:r>
+      <w:r>
+        <w:rPr>
+          <w:rFonts w:ascii="Consolas" w:cs="Consolas" w:eastAsia="Consolas" w:hAnsi="Consolas"/>
+          <w:color w:val="1F5F56"/>
+          <w:sz w:val="21"/>
+          <w:szCs w:val="21"/>
+        </w:rPr>
+        <w:t xml:space="preserve">src/lib/date-range.ts</w:t>
+      </w:r>
+      <w:r>
+        <w:rPr>
+          <w:sz w:val="21"/>
+          <w:szCs w:val="21"/>
+        </w:rPr>
+        <w:t xml:space="preserve">) ve marka
+filtresi (</w:t>
+      </w:r>
+      <w:r>
+        <w:rPr>
+          <w:rFonts w:ascii="Consolas" w:cs="Consolas" w:eastAsia="Consolas" w:hAnsi="Consolas"/>
+          <w:color w:val="1F5F56"/>
+          <w:sz w:val="21"/>
+          <w:szCs w:val="21"/>
+        </w:rPr>
+        <w:t xml:space="preserve">src/components/brand-filter-buttons.tsx</w:t>
+      </w:r>
+      <w:r>
+        <w:rPr>
+          <w:sz w:val="21"/>
+          <w:szCs w:val="21"/>
+        </w:rPr>
+        <w:t xml:space="preserve">,
+</w:t>
+      </w:r>
+      <w:r>
+        <w:rPr>
+          <w:rFonts w:ascii="Consolas" w:cs="Consolas" w:eastAsia="Consolas" w:hAnsi="Consolas"/>
+          <w:color w:val="1F5F56"/>
+          <w:sz w:val="21"/>
+          <w:szCs w:val="21"/>
+        </w:rPr>
+        <w:t xml:space="preserve">src/components/by-brand-toggle.tsx</w:t>
+      </w:r>
+      <w:r>
+        <w:rPr>
+          <w:sz w:val="21"/>
+          <w:szCs w:val="21"/>
+        </w:rPr>
+        <w:t xml:space="preserve">) eklendi; grafikler seçilen döneme
+göre saat/gün/hafta/ay bucket&amp;#39;larına bölünüyor
+(</w:t>
+      </w:r>
+      <w:r>
+        <w:rPr>
+          <w:rFonts w:ascii="Consolas" w:cs="Consolas" w:eastAsia="Consolas" w:hAnsi="Consolas"/>
+          <w:color w:val="1F5F56"/>
+          <w:sz w:val="21"/>
+          <w:szCs w:val="21"/>
+        </w:rPr>
+        <w:t xml:space="preserve">src/lib/chart-buckets.ts</w:t>
+      </w:r>
+      <w:r>
+        <w:rPr>
+          <w:sz w:val="21"/>
+          <w:szCs w:val="21"/>
+        </w:rPr>
+        <w:t xml:space="preserve">, </w:t>
+      </w:r>
+      <w:r>
+        <w:rPr>
+          <w:rFonts w:ascii="Consolas" w:cs="Consolas" w:eastAsia="Consolas" w:hAnsi="Consolas"/>
+          <w:color w:val="1F5F56"/>
+          <w:sz w:val="21"/>
+          <w:szCs w:val="21"/>
+        </w:rPr>
+        <w:t xml:space="preserve">src/components/grouped-bar-chart.tsx</w:t>
+      </w:r>
+      <w:r>
+        <w:rPr>
+          <w:sz w:val="21"/>
+          <w:szCs w:val="21"/>
+        </w:rPr>
+        <w:t xml:space="preserve">).</w:t>
       </w:r>
     </w:p>
     <w:p>
@@ -3956,7 +4101,118 @@
           <w:sz w:val="21"/>
           <w:szCs w:val="21"/>
         </w:rPr>
-        <w:t xml:space="preserve">Excel (.xlsx), CSV ve PDF export</w:t>
+        <w:t xml:space="preserve">Excel (.xlsx) export</w:t>
+      </w:r>
+      <w:r>
+        <w:rPr>
+          <w:sz w:val="21"/>
+          <w:szCs w:val="21"/>
+        </w:rPr>
+        <w:t xml:space="preserve"> — ✅ Tamamlandı, sadece Excel ile — CSV şimdilik
+kapsam dışı, PDF ise ileride sayısı az birkaç belirli rapor için ayrıca
+ele alınacak. Yeni </w:t>
+      </w:r>
+      <w:r>
+        <w:rPr>
+          <w:rFonts w:ascii="Consolas" w:cs="Consolas" w:eastAsia="Consolas" w:hAnsi="Consolas"/>
+          <w:color w:val="1F5F56"/>
+          <w:sz w:val="21"/>
+          <w:szCs w:val="21"/>
+        </w:rPr>
+        <w:t xml:space="preserve">/admin/reports</w:t>
+      </w:r>
+      <w:r>
+        <w:rPr>
+          <w:sz w:val="21"/>
+          <w:szCs w:val="21"/>
+        </w:rPr>
+        <w:t xml:space="preserve"> sayfası (</w:t>
+      </w:r>
+      <w:r>
+        <w:rPr>
+          <w:rFonts w:ascii="Consolas" w:cs="Consolas" w:eastAsia="Consolas" w:hAnsi="Consolas"/>
+          <w:color w:val="1F5F56"/>
+          <w:sz w:val="21"/>
+          <w:szCs w:val="21"/>
+        </w:rPr>
+        <w:t xml:space="preserve">src/app/admin/reports/</w:t>
+      </w:r>
+      <w:r>
+        <w:rPr>
+          <w:sz w:val="21"/>
+          <w:szCs w:val="21"/>
+        </w:rPr>
+        <w:t xml:space="preserve">)
+altında marka bazlı satış raporu ve pasif bayi raporu için birer
+&amp;quot;Excel&amp;#39;e Aktar&amp;quot; butonu; indirme, seçili filtrelerle aynı sorguyu tekrar
+çalıştırıp </w:t>
+      </w:r>
+      <w:r>
+        <w:rPr>
+          <w:rFonts w:ascii="Consolas" w:cs="Consolas" w:eastAsia="Consolas" w:hAnsi="Consolas"/>
+          <w:color w:val="1F5F56"/>
+          <w:sz w:val="21"/>
+          <w:szCs w:val="21"/>
+        </w:rPr>
+        <w:t xml:space="preserve">exceljs</w:t>
+      </w:r>
+      <w:r>
+        <w:rPr>
+          <w:sz w:val="21"/>
+          <w:szCs w:val="21"/>
+        </w:rPr>
+        <w:t xml:space="preserve"> ile </w:t>
+      </w:r>
+      <w:r>
+        <w:rPr>
+          <w:rFonts w:ascii="Consolas" w:cs="Consolas" w:eastAsia="Consolas" w:hAnsi="Consolas"/>
+          <w:color w:val="1F5F56"/>
+          <w:sz w:val="21"/>
+          <w:szCs w:val="21"/>
+        </w:rPr>
+        <w:t xml:space="preserve">.xlsx</w:t>
+      </w:r>
+      <w:r>
+        <w:rPr>
+          <w:sz w:val="21"/>
+          <w:szCs w:val="21"/>
+        </w:rPr>
+        <w:t xml:space="preserve"> üreten bir route handler&amp;#39;dan geçiyor
+(</w:t>
+      </w:r>
+      <w:r>
+        <w:rPr>
+          <w:rFonts w:ascii="Consolas" w:cs="Consolas" w:eastAsia="Consolas" w:hAnsi="Consolas"/>
+          <w:color w:val="1F5F56"/>
+          <w:sz w:val="21"/>
+          <w:szCs w:val="21"/>
+        </w:rPr>
+        <w:t xml:space="preserve">src/app/admin/reports/export/route.ts</w:t>
+      </w:r>
+      <w:r>
+        <w:rPr>
+          <w:sz w:val="21"/>
+          <w:szCs w:val="21"/>
+        </w:rPr>
+        <w:t xml:space="preserve">). Rapor sorguları
+</w:t>
+      </w:r>
+      <w:r>
+        <w:rPr>
+          <w:rFonts w:ascii="Consolas" w:cs="Consolas" w:eastAsia="Consolas" w:hAnsi="Consolas"/>
+          <w:color w:val="1F5F56"/>
+          <w:sz w:val="21"/>
+          <w:szCs w:val="21"/>
+        </w:rPr>
+        <w:t xml:space="preserve">src/lib/reports.ts</w:t>
+      </w:r>
+      <w:r>
+        <w:rPr>
+          <w:sz w:val="21"/>
+          <w:szCs w:val="21"/>
+        </w:rPr>
+        <w:t xml:space="preserve">&amp;#39;te toplandı ki sayfa ve export handler&amp;#39;ı aynı
+mantığı kullansın.</w:t>
       </w:r>
     </w:p>
     <w:p>
@@ -3973,25 +4229,117 @@
           <w:sz w:val="21"/>
           <w:szCs w:val="21"/>
         </w:rPr>
-        <w:t xml:space="preserve">Büyüyen veri hacmi için özet tablo / materialized view stratejisi</w:t>
-      </w:r>
-    </w:p>
-    <w:p>
-      <w:pPr>
-        <w:pStyle w:val="ListParagraph"/>
-        <w:numPr>
-          <w:ilvl w:val="0"/>
-          <w:numId w:val="1"/>
-        </w:numPr>
-        <w:spacing w:after="60"/>
-      </w:pPr>
-      <w:r>
-        <w:rPr>
-          <w:sz w:val="21"/>
-          <w:szCs w:val="21"/>
-        </w:rPr>
-        <w:t xml:space="preserve">Sipariş vermeyen bayi raporu — pasif bayi takibi için Payna Grup Portal
-karşılaştırmasından gelen ek kapsam</w:t>
+        <w:t xml:space="preserve">Sipariş vermeyen bayi raporu</w:t>
+      </w:r>
+      <w:r>
+        <w:rPr>
+          <w:sz w:val="21"/>
+          <w:szCs w:val="21"/>
+        </w:rPr>
+        <w:t xml:space="preserve"> — ✅ Tamamlandı — pasif bayi takibi için
+Payna Grup Portal karşılaştırmasından gelen ek kapsam. </w:t>
+      </w:r>
+      <w:r>
+        <w:rPr>
+          <w:rFonts w:ascii="Consolas" w:cs="Consolas" w:eastAsia="Consolas" w:hAnsi="Consolas"/>
+          <w:color w:val="1F5F56"/>
+          <w:sz w:val="21"/>
+          <w:szCs w:val="21"/>
+        </w:rPr>
+        <w:t xml:space="preserve">/admin/reports</w:t>
+      </w:r>
+      <w:r>
+        <w:rPr>
+          <w:sz w:val="21"/>
+          <w:szCs w:val="21"/>
+        </w:rPr>
+        <w:t xml:space="preserve">
+sayfasında 30/60/90 günlük eşik seçilebiliyor
+(</w:t>
+      </w:r>
+      <w:r>
+        <w:rPr>
+          <w:rFonts w:ascii="Consolas" w:cs="Consolas" w:eastAsia="Consolas" w:hAnsi="Consolas"/>
+          <w:color w:val="1F5F56"/>
+          <w:sz w:val="21"/>
+          <w:szCs w:val="21"/>
+        </w:rPr>
+        <w:t xml:space="preserve">src/app/admin/reports/reports-filters.tsx</w:t>
+      </w:r>
+      <w:r>
+        <w:rPr>
+          <w:sz w:val="21"/>
+          <w:szCs w:val="21"/>
+        </w:rPr>
+        <w:t xml:space="preserve">); hiç sipariş vermemiş ya da
+eşik gün sayısından uzun süredir sipariş vermemiş bayiler, hangi
+marka(lar)a bağlı oldukları ve son sipariş tarihiyle birlikte listeleniyor
+(</w:t>
+      </w:r>
+      <w:r>
+        <w:rPr>
+          <w:rFonts w:ascii="Consolas" w:cs="Consolas" w:eastAsia="Consolas" w:hAnsi="Consolas"/>
+          <w:color w:val="1F5F56"/>
+          <w:sz w:val="21"/>
+          <w:szCs w:val="21"/>
+        </w:rPr>
+        <w:t xml:space="preserve">getInactiveDealersReport</w:t>
+      </w:r>
+      <w:r>
+        <w:rPr>
+          <w:sz w:val="21"/>
+          <w:szCs w:val="21"/>
+        </w:rPr>
+        <w:t xml:space="preserve">, </w:t>
+      </w:r>
+      <w:r>
+        <w:rPr>
+          <w:rFonts w:ascii="Consolas" w:cs="Consolas" w:eastAsia="Consolas" w:hAnsi="Consolas"/>
+          <w:color w:val="1F5F56"/>
+          <w:sz w:val="21"/>
+          <w:szCs w:val="21"/>
+        </w:rPr>
+        <w:t xml:space="preserve">src/lib/reports.ts</w:t>
+      </w:r>
+      <w:r>
+        <w:rPr>
+          <w:sz w:val="21"/>
+          <w:szCs w:val="21"/>
+        </w:rPr>
+        <w:t xml:space="preserve">). İptal/red edilen
+siparişler &amp;quot;sipariş verdi&amp;quot; sayılmıyor — genel bakış istatistikleriyle
+aynı kural (</w:t>
+      </w:r>
+      <w:r>
+        <w:rPr>
+          <w:rFonts w:ascii="Consolas" w:cs="Consolas" w:eastAsia="Consolas" w:hAnsi="Consolas"/>
+          <w:color w:val="1F5F56"/>
+          <w:sz w:val="21"/>
+          <w:szCs w:val="21"/>
+        </w:rPr>
+        <w:t xml:space="preserve">EXCLUDED_FROM_STATS_STATUSES</w:t>
+      </w:r>
+      <w:r>
+        <w:rPr>
+          <w:sz w:val="21"/>
+          <w:szCs w:val="21"/>
+        </w:rPr>
+        <w:t xml:space="preserve">).</w:t>
+      </w:r>
+    </w:p>
+    <w:p>
+      <w:pPr>
+        <w:spacing w:after="120"/>
+      </w:pPr>
+      <w:r>
+        <w:rPr>
+          <w:color w:val="1A2420"/>
+          <w:sz w:val="21"/>
+          <w:szCs w:val="21"/>
+        </w:rPr>
+        <w:t xml:space="preserve">Kapsam dışı bırakıldı: büyüyen veri hacmi için özet tablo / materialized
+view stratejisi — genel bakış grafikleri mevcut hacimde yeterli
+performans sağlıyor, ileride ihtiyaç olursa ayrı bir işe konu edilecek.</w:t>
       </w:r>
     </w:p>
     <w:p>

</xml_diff>

<commit_message>
Pasif bayi eşiğini gün sayısı yerine Bugün/Dün/1 Hafta/2 Hafta yap
30/60/90 gün yerine daha kısa, takvim günü bazlı dört seçenek: Bugün, Dün,
1 Hafta, 2 Hafta (en sıkı uç). Eşik listesi src/lib/inactive-threshold.ts'e
taşındı — server-only DB kodu içeren src/lib/reports.ts'i client filtre
bileşenine sızdırmadan hem sayfa hem export route'u aynı tanımı paylaşsın
diye. Gün farkı artık takvim gününe göre hesaplanıyor (saat bazlı 24 saatlik
dilimler yerine), aksi halde "Bugün"/"Dün" gibi dar eşikler sipariş saatine
göre yanlış sonuç verirdi.

Co-Authored-By: Claude Sonnet 5 <noreply@anthropic.com>
Claude-Session: https://claude.ai/code/session_01KmZwWuG1qX6Ycv6pfxtezD
</commit_message>
<xml_diff>
--- a/docs/output/roadmap.docx
+++ b/docs/output/roadmap.docx
@@ -4254,7 +4254,7 @@
           <w:szCs w:val="21"/>
         </w:rPr>
         <w:t xml:space="preserve">
-sayfasında 30/60/90 günlük eşik seçilebiliyor
+sayfasında Bugün / Dün / 1 Hafta / 2 Hafta (en sıkı uç) eşiği seçilebiliyor
 (</w:t>
       </w:r>
       <w:r>
@@ -4264,6 +4264,22 @@
           <w:sz w:val="21"/>
           <w:szCs w:val="21"/>
         </w:rPr>
+        <w:t xml:space="preserve">src/lib/inactive-threshold.ts</w:t>
+      </w:r>
+      <w:r>
+        <w:rPr>
+          <w:sz w:val="21"/>
+          <w:szCs w:val="21"/>
+        </w:rPr>
+        <w:t xml:space="preserve">, </w:t>
+      </w:r>
+      <w:r>
+        <w:rPr>
+          <w:rFonts w:ascii="Consolas" w:cs="Consolas" w:eastAsia="Consolas" w:hAnsi="Consolas"/>
+          <w:color w:val="1F5F56"/>
+          <w:sz w:val="21"/>
+          <w:szCs w:val="21"/>
+        </w:rPr>
         <w:t xml:space="preserve">src/app/admin/reports/reports-filters.tsx</w:t>
       </w:r>
       <w:r>
@@ -4271,8 +4287,8 @@
           <w:sz w:val="21"/>
           <w:szCs w:val="21"/>
         </w:rPr>
-        <w:t xml:space="preserve">); hiç sipariş vermemiş ya da
-eşik gün sayısından uzun süredir sipariş vermemiş bayiler, hangi
+        <w:t xml:space="preserve">);
+hiç sipariş vermemiş ya da eşik gün sayısından uzun süredir sipariş vermemiş bayiler, hangi
 marka(lar)a bağlı oldukları ve son sipariş tarihiyle birlikte listeleniyor
 (</w:t>
       </w:r>

</xml_diff>

<commit_message>
Sipariş dökümanı: tek/toplu PDF indirme (sistemdeki tek PDF çıktısı)
Siparişler sayfasına marka/durum/tarih aralığı filtresiyle eşleşen tüm
siparişleri tek PDF'te üreten "PDF Olarak İndir", tablo satırlarına tekli
indirme ikonu, sipariş detayına "Sipariş Dökümanını İndir" butonu eklendi.
Döküman ürün kategorilerini sistemdeki kategori ağacından okuyor (kategori
değişince otomatik güncellenir), boş "Sevk" kutucuğuyla depo/sevkiyat
akışına uygun. Türkçe karakterler için PT Sans (SIL OFL, ücretsiz) fontu
gömülü; pdfkit'in Next.js bundling'inde kırılan normal girişi yerine
standalone build kullanıldı.

Co-Authored-By: Claude Sonnet 5 <noreply@anthropic.com>
Claude-Session: https://claude.ai/code/session_01KmZwWuG1qX6Ycv6pfxtezD
</commit_message>
<xml_diff>
--- a/docs/output/roadmap.docx
+++ b/docs/output/roadmap.docx
@@ -1863,6 +1863,162 @@
         <w:t xml:space="preserve"> üç ödeme tipiyle de (cari, kapıda ödeme, sanal POS
 başarılı/başarısız) uçtan uca sipariş oluşturulabiliyor; admin panelde durum
 geçişleri izlenebiliyor. Tarayıcıda doğrulandı.</w:t>
+      </w:r>
+    </w:p>
+    <w:p>
+      <w:pPr>
+        <w:pStyle w:val="ListParagraph"/>
+        <w:numPr>
+          <w:ilvl w:val="0"/>
+          <w:numId w:val="1"/>
+        </w:numPr>
+        <w:spacing w:after="60"/>
+      </w:pPr>
+      <w:r>
+        <w:rPr>
+          <w:sz w:val="21"/>
+          <w:szCs w:val="21"/>
+        </w:rPr>
+        <w:t xml:space="preserve">Sipariş dökümanı (PDF)</w:t>
+      </w:r>
+      <w:r>
+        <w:rPr>
+          <w:sz w:val="21"/>
+          <w:szCs w:val="21"/>
+        </w:rPr>
+        <w:t xml:space="preserve"> — ✅ Tamamlandı, roadmap dışı bir ek kapsam.
+Sistemdeki tek PDF çıktısı olarak kasıtlı biçimde kapsamı dar tutuldu.
+Kullanıcının verdiği örnek eski-ERP çıktısına (depo/sevkiyat için ürün
+bazlı toplama listesi) benzer, ama modern ve markanın kendi kategori
+ağacını kullanan bir tasarım: firma/marka başlığı, bayi/tarih/sipariş no,
+ürünlerin sistemdeki kategoriye göre gruplanmış tablosu (kategori
+değişirse döküman otomatik güncellenir), boş &amp;quot;Sevk&amp;quot; kutucuğu (depo
+personeli elle işaretlesin diye) ve KDV dahil toplamlar
+(</w:t>
+      </w:r>
+      <w:r>
+        <w:rPr>
+          <w:rFonts w:ascii="Consolas" w:cs="Consolas" w:eastAsia="Consolas" w:hAnsi="Consolas"/>
+          <w:color w:val="1F5F56"/>
+          <w:sz w:val="21"/>
+          <w:szCs w:val="21"/>
+        </w:rPr>
+        <w:t xml:space="preserve">src/lib/pdf/order-pdf.ts</w:t>
+      </w:r>
+      <w:r>
+        <w:rPr>
+          <w:sz w:val="21"/>
+          <w:szCs w:val="21"/>
+        </w:rPr>
+        <w:t xml:space="preserve">, </w:t>
+      </w:r>
+      <w:r>
+        <w:rPr>
+          <w:rFonts w:ascii="Consolas" w:cs="Consolas" w:eastAsia="Consolas" w:hAnsi="Consolas"/>
+          <w:color w:val="1F5F56"/>
+          <w:sz w:val="21"/>
+          <w:szCs w:val="21"/>
+        </w:rPr>
+        <w:t xml:space="preserve">src/lib/order-document.ts</w:t>
+      </w:r>
+      <w:r>
+        <w:rPr>
+          <w:sz w:val="21"/>
+          <w:szCs w:val="21"/>
+        </w:rPr>
+        <w:t xml:space="preserve">). Üç giriş
+noktası: sipariş listesindeki her satırda tekli indirme ikonu, sipariş
+detay sayfasında &amp;quot;Sipariş Dökümanını İndir&amp;quot; butonu, ve siparişler
+sayfasının üstünde geçerli tablo filtresiyle (marka/durum/tarih aralığı)
+eşleşen tüm siparişleri tek bir PDF&amp;#39;te art arda üreten &amp;quot;PDF Olarak İndir&amp;quot;
+(</w:t>
+      </w:r>
+      <w:r>
+        <w:rPr>
+          <w:rFonts w:ascii="Consolas" w:cs="Consolas" w:eastAsia="Consolas" w:hAnsi="Consolas"/>
+          <w:color w:val="1F5F56"/>
+          <w:sz w:val="21"/>
+          <w:szCs w:val="21"/>
+        </w:rPr>
+        <w:t xml:space="preserve">src/app/admin/orders/document/route.ts</w:t>
+      </w:r>
+      <w:r>
+        <w:rPr>
+          <w:sz w:val="21"/>
+          <w:szCs w:val="21"/>
+        </w:rPr>
+        <w:t xml:space="preserve">) — filtre mantığı
+(</w:t>
+      </w:r>
+      <w:r>
+        <w:rPr>
+          <w:rFonts w:ascii="Consolas" w:cs="Consolas" w:eastAsia="Consolas" w:hAnsi="Consolas"/>
+          <w:color w:val="1F5F56"/>
+          <w:sz w:val="21"/>
+          <w:szCs w:val="21"/>
+        </w:rPr>
+        <w:t xml:space="preserve">getFilteredOrderIds</w:t>
+      </w:r>
+      <w:r>
+        <w:rPr>
+          <w:sz w:val="21"/>
+          <w:szCs w:val="21"/>
+        </w:rPr>
+        <w:t xml:space="preserve">) hem tabloda hem export&amp;#39;ta aynı. Türkçe karakterler
+(ş/ğ/ı/İ) için PT Sans fontu gömülü (</w:t>
+      </w:r>
+      <w:r>
+        <w:rPr>
+          <w:rFonts w:ascii="Consolas" w:cs="Consolas" w:eastAsia="Consolas" w:hAnsi="Consolas"/>
+          <w:color w:val="1F5F56"/>
+          <w:sz w:val="21"/>
+          <w:szCs w:val="21"/>
+        </w:rPr>
+        <w:t xml:space="preserve">src/lib/pdf/fonts/</w:t>
+      </w:r>
+      <w:r>
+        <w:rPr>
+          <w:sz w:val="21"/>
+          <w:szCs w:val="21"/>
+        </w:rPr>
+        <w:t xml:space="preserve">, SIL Open Font
+License — ücretsiz, projeye maliyeti yok). pdfkit&amp;#39;in normal girişi
+Next.js bundling&amp;#39;inde font-metrik dosyalarını bulamadığından
+(</w:t>
+      </w:r>
+      <w:r>
+        <w:rPr>
+          <w:rFonts w:ascii="Consolas" w:cs="Consolas" w:eastAsia="Consolas" w:hAnsi="Consolas"/>
+          <w:color w:val="1F5F56"/>
+          <w:sz w:val="21"/>
+          <w:szCs w:val="21"/>
+        </w:rPr>
+        <w:t xml:space="preserve">ENOENT Helvetica.afm</w:t>
+      </w:r>
+      <w:r>
+        <w:rPr>
+          <w:sz w:val="21"/>
+          <w:szCs w:val="21"/>
+        </w:rPr>
+        <w:t xml:space="preserve">) </w:t>
+      </w:r>
+      <w:r>
+        <w:rPr>
+          <w:rFonts w:ascii="Consolas" w:cs="Consolas" w:eastAsia="Consolas" w:hAnsi="Consolas"/>
+          <w:color w:val="1F5F56"/>
+          <w:sz w:val="21"/>
+          <w:szCs w:val="21"/>
+        </w:rPr>
+        <w:t xml:space="preserve">pdfkit/js/pdfkit.standalone.js</w:t>
+      </w:r>
+      <w:r>
+        <w:rPr>
+          <w:sz w:val="21"/>
+          <w:szCs w:val="21"/>
+        </w:rPr>
+        <w:t xml:space="preserve"> kullanılıyor.
+CSV/Excel export zaten Faz 5&amp;#39;te var; ek PDF raporları (sayıca az,
+belirli) ileride ayrıca istenirse eklenecek.</w:t>
       </w:r>
     </w:p>
     <w:p>

</xml_diff>

<commit_message>
Roadmap'e Faz 8'i ekle: Kullanıcı Rolleri, Kullanıcılar Sayfası & Bölgesel Yetkilendirme
Bayiye bağlı olmayan head-office kullanıcıları (bölge müdürü, muhasebeci,
raporlamacı) için ayrı roller, bunları listeleyecek bir Kullanıcılar
sayfası, bölge bazlı admin tarafından değiştirilebilir erişim ataması ve
rol bazlı açılıp kapanabilir izinler (ör. sipariş silme) — dört bağımlı
alt adıma (8.1-8.4) bölünmüş planlama, henüz kod implementasyonu yok.

Co-Authored-By: Claude Sonnet 5 <noreply@anthropic.com>
Claude-Session: https://claude.ai/code/session_01KmZwWuG1qX6Ycv6pfxtezD
</commit_message>
<xml_diff>
--- a/docs/output/roadmap.docx
+++ b/docs/output/roadmap.docx
@@ -4974,6 +4974,618 @@
 aktarılan sipariş yerelde düzenleme/silme denemesinde reddediliyor; mock
 sağlayıcı hiçbir çağıran kodu değiştirmeden gerçek ERP bağlayıcısıyla
 değiştirilebiliyor.</w:t>
+      </w:r>
+    </w:p>
+    <w:p>
+      <w:pPr>
+        <w:pStyle w:val="Heading2"/>
+        <w:spacing w:after="100" w:before="220"/>
+      </w:pPr>
+      <w:r>
+        <w:rPr>
+          <w:color w:val="1A2420"/>
+        </w:rPr>
+        <w:t xml:space="preserve">Faz 8 — Kullanıcı Rolleri, Kullanıcılar Sayfası &amp;amp; Bölgesel Yetkilendirme</w:t>
+      </w:r>
+    </w:p>
+    <w:p>
+      <w:pPr>
+        <w:spacing w:after="120"/>
+      </w:pPr>
+      <w:r>
+        <w:rPr>
+          <w:color w:val="1A2420"/>
+          <w:sz w:val="21"/>
+          <w:szCs w:val="21"/>
+        </w:rPr>
+        <w:t xml:space="preserve">Hedef: Bayiye bağlı olmayan head-office kullanıcıları (bölge müdürü,
+muhasebeci, raporlamacı vb.) için ayrı roller, bunları yönetecek bir
+Kullanıcılar sayfası ve bölge bazlı, admin tarafından değiştirilebilir
+bir yetkilendirme modeli. Dört bağımlı alt adıma ayrılıyor — her biri
+bir öncekinin üstüne çalışıyor.</w:t>
+      </w:r>
+    </w:p>
+    <w:p>
+      <w:pPr>
+        <w:spacing w:after="120"/>
+      </w:pPr>
+      <w:r>
+        <w:rPr>
+          <w:b/>
+          <w:bCs/>
+          <w:color w:val="1A2420"/>
+          <w:sz w:val="21"/>
+          <w:szCs w:val="21"/>
+        </w:rPr>
+        <w:t xml:space="preserve">8.1 — Kullanıcılar sayfası &amp;amp; yeni roller</w:t>
+      </w:r>
+    </w:p>
+    <w:p>
+      <w:pPr>
+        <w:pStyle w:val="ListParagraph"/>
+        <w:numPr>
+          <w:ilvl w:val="0"/>
+          <w:numId w:val="1"/>
+        </w:numPr>
+        <w:spacing w:after="60"/>
+      </w:pPr>
+      <w:r>
+        <w:rPr>
+          <w:rFonts w:ascii="Consolas" w:cs="Consolas" w:eastAsia="Consolas" w:hAnsi="Consolas"/>
+          <w:color w:val="1F5F56"/>
+          <w:sz w:val="21"/>
+          <w:szCs w:val="21"/>
+        </w:rPr>
+        <w:t xml:space="preserve">USER_ROLES</w:t>
+      </w:r>
+      <w:r>
+        <w:rPr>
+          <w:sz w:val="21"/>
+          <w:szCs w:val="21"/>
+        </w:rPr>
+        <w:t xml:space="preserve"> genişletilir: bölge müdürü, muhasebeci, raporlamacı
+eklenir (rol slug&amp;#39;ları uygulama aşamasında netleşecek — ör.
+</w:t>
+      </w:r>
+      <w:r>
+        <w:rPr>
+          <w:rFonts w:ascii="Consolas" w:cs="Consolas" w:eastAsia="Consolas" w:hAnsi="Consolas"/>
+          <w:color w:val="1F5F56"/>
+          <w:sz w:val="21"/>
+          <w:szCs w:val="21"/>
+        </w:rPr>
+        <w:t xml:space="preserve">regional_manager</w:t>
+      </w:r>
+      <w:r>
+        <w:rPr>
+          <w:sz w:val="21"/>
+          <w:szCs w:val="21"/>
+        </w:rPr>
+        <w:t xml:space="preserve"> / </w:t>
+      </w:r>
+      <w:r>
+        <w:rPr>
+          <w:rFonts w:ascii="Consolas" w:cs="Consolas" w:eastAsia="Consolas" w:hAnsi="Consolas"/>
+          <w:color w:val="1F5F56"/>
+          <w:sz w:val="21"/>
+          <w:szCs w:val="21"/>
+        </w:rPr>
+        <w:t xml:space="preserve">accountant</w:t>
+      </w:r>
+      <w:r>
+        <w:rPr>
+          <w:sz w:val="21"/>
+          <w:szCs w:val="21"/>
+        </w:rPr>
+        <w:t xml:space="preserve"> / </w:t>
+      </w:r>
+      <w:r>
+        <w:rPr>
+          <w:rFonts w:ascii="Consolas" w:cs="Consolas" w:eastAsia="Consolas" w:hAnsi="Consolas"/>
+          <w:color w:val="1F5F56"/>
+          <w:sz w:val="21"/>
+          <w:szCs w:val="21"/>
+        </w:rPr>
+        <w:t xml:space="preserve">reporter</w:t>
+      </w:r>
+      <w:r>
+        <w:rPr>
+          <w:sz w:val="21"/>
+          <w:szCs w:val="21"/>
+        </w:rPr>
+        <w:t xml:space="preserve">)</w:t>
+      </w:r>
+    </w:p>
+    <w:p>
+      <w:pPr>
+        <w:pStyle w:val="ListParagraph"/>
+        <w:numPr>
+          <w:ilvl w:val="0"/>
+          <w:numId w:val="1"/>
+        </w:numPr>
+        <w:spacing w:after="60"/>
+      </w:pPr>
+      <w:r>
+        <w:rPr>
+          <w:sz w:val="21"/>
+          <w:szCs w:val="21"/>
+        </w:rPr>
+        <w:t xml:space="preserve">Yeni </w:t>
+      </w:r>
+      <w:r>
+        <w:rPr>
+          <w:rFonts w:ascii="Consolas" w:cs="Consolas" w:eastAsia="Consolas" w:hAnsi="Consolas"/>
+          <w:color w:val="1F5F56"/>
+          <w:sz w:val="21"/>
+          <w:szCs w:val="21"/>
+        </w:rPr>
+        <w:t xml:space="preserve">/admin/users</w:t>
+      </w:r>
+      <w:r>
+        <w:rPr>
+          <w:sz w:val="21"/>
+          <w:szCs w:val="21"/>
+        </w:rPr>
+        <w:t xml:space="preserve"> (Kullanıcılar) sayfası: yalnızca </w:t>
+      </w:r>
+      <w:r>
+        <w:rPr>
+          <w:rFonts w:ascii="Consolas" w:cs="Consolas" w:eastAsia="Consolas" w:hAnsi="Consolas"/>
+          <w:color w:val="1F5F56"/>
+          <w:sz w:val="21"/>
+          <w:szCs w:val="21"/>
+        </w:rPr>
+        <w:t xml:space="preserve">dealerId = NULL</w:t>
+      </w:r>
+      <w:r>
+        <w:rPr>
+          <w:sz w:val="21"/>
+          <w:szCs w:val="21"/>
+        </w:rPr>
+        <w:t xml:space="preserve">
+olan head-office kullanıcılarını listeler (</w:t>
+      </w:r>
+      <w:r>
+        <w:rPr>
+          <w:rFonts w:ascii="Consolas" w:cs="Consolas" w:eastAsia="Consolas" w:hAnsi="Consolas"/>
+          <w:color w:val="1F5F56"/>
+          <w:sz w:val="21"/>
+          <w:szCs w:val="21"/>
+        </w:rPr>
+        <w:t xml:space="preserve">company_admin</w:t>
+      </w:r>
+      <w:r>
+        <w:rPr>
+          <w:sz w:val="21"/>
+          <w:szCs w:val="21"/>
+        </w:rPr>
+        <w:t xml:space="preserve">,
+</w:t>
+      </w:r>
+      <w:r>
+        <w:rPr>
+          <w:rFonts w:ascii="Consolas" w:cs="Consolas" w:eastAsia="Consolas" w:hAnsi="Consolas"/>
+          <w:color w:val="1F5F56"/>
+          <w:sz w:val="21"/>
+          <w:szCs w:val="21"/>
+        </w:rPr>
+        <w:t xml:space="preserve">brand_manager</w:t>
+      </w:r>
+      <w:r>
+        <w:rPr>
+          <w:sz w:val="21"/>
+          <w:szCs w:val="21"/>
+        </w:rPr>
+        <w:t xml:space="preserve">, yeni roller) — bayi kullanıcıları (</w:t>
+      </w:r>
+      <w:r>
+        <w:rPr>
+          <w:rFonts w:ascii="Consolas" w:cs="Consolas" w:eastAsia="Consolas" w:hAnsi="Consolas"/>
+          <w:color w:val="1F5F56"/>
+          <w:sz w:val="21"/>
+          <w:szCs w:val="21"/>
+        </w:rPr>
+        <w:t xml:space="preserve">dealer_user</w:t>
+      </w:r>
+      <w:r>
+        <w:rPr>
+          <w:sz w:val="21"/>
+          <w:szCs w:val="21"/>
+        </w:rPr>
+        <w:t xml:space="preserve">) bu
+sayfada hiç görünmez, kullanıcı bilerek Markalar &amp;amp; Bayiler&amp;#39;e
+yönlendirilir</w:t>
+      </w:r>
+    </w:p>
+    <w:p>
+      <w:pPr>
+        <w:pStyle w:val="ListParagraph"/>
+        <w:numPr>
+          <w:ilvl w:val="0"/>
+          <w:numId w:val="1"/>
+        </w:numPr>
+        <w:spacing w:after="60"/>
+      </w:pPr>
+      <w:r>
+        <w:rPr>
+          <w:sz w:val="21"/>
+          <w:szCs w:val="21"/>
+        </w:rPr>
+        <w:t xml:space="preserve">Kullanıcı oluşturma iki yerden mümkün olmaya devam eder — Markalar &amp;amp;
+Bayiler&amp;#39;deki mevcut modal (tüm roller, bayi dahil) ve yeni Kullanıcılar
+sayfasındaki form (yalnızca head-office rolleri, bayi/dealer_user
+seçeneği sunulmaz) — ikisi de aynı </w:t>
+      </w:r>
+      <w:r>
+        <w:rPr>
+          <w:rFonts w:ascii="Consolas" w:cs="Consolas" w:eastAsia="Consolas" w:hAnsi="Consolas"/>
+          <w:color w:val="1F5F56"/>
+          <w:sz w:val="21"/>
+          <w:szCs w:val="21"/>
+        </w:rPr>
+        <w:t xml:space="preserve">createDealerOrUser</w:t>
+      </w:r>
+      <w:r>
+        <w:rPr>
+          <w:sz w:val="21"/>
+          <w:szCs w:val="21"/>
+        </w:rPr>
+        <w:t xml:space="preserve"> action&amp;#39;ını
+paylaşır. Yeni bir bayi/marka oluşturmak için kullanıcı her zaman
+Markalar &amp;amp; Bayiler sayfasına yönlendirilir.</w:t>
+      </w:r>
+    </w:p>
+    <w:p>
+      <w:pPr>
+        <w:spacing w:after="120"/>
+      </w:pPr>
+      <w:r>
+        <w:rPr>
+          <w:b/>
+          <w:bCs/>
+          <w:color w:val="1A2420"/>
+          <w:sz w:val="21"/>
+          <w:szCs w:val="21"/>
+        </w:rPr>
+        <w:t xml:space="preserve">8.2 — Bölge tanımı &amp;amp; atanabilir erişim</w:t>
+      </w:r>
+    </w:p>
+    <w:p>
+      <w:pPr>
+        <w:pStyle w:val="ListParagraph"/>
+        <w:numPr>
+          <w:ilvl w:val="0"/>
+          <w:numId w:val="1"/>
+        </w:numPr>
+        <w:spacing w:after="60"/>
+      </w:pPr>
+      <w:r>
+        <w:rPr>
+          <w:sz w:val="21"/>
+          <w:szCs w:val="21"/>
+        </w:rPr>
+        <w:t xml:space="preserve">Bölge müdürü gibi rollerin &amp;quot;hangi bölge(ler)e erişimi var&amp;quot; bilgisini
+tutan yeni bir ilişki tablosu (ör. </w:t>
+      </w:r>
+      <w:r>
+        <w:rPr>
+          <w:rFonts w:ascii="Consolas" w:cs="Consolas" w:eastAsia="Consolas" w:hAnsi="Consolas"/>
+          <w:color w:val="1F5F56"/>
+          <w:sz w:val="21"/>
+          <w:szCs w:val="21"/>
+        </w:rPr>
+        <w:t xml:space="preserve">user_region_access</w:t>
+      </w:r>
+      <w:r>
+        <w:rPr>
+          <w:sz w:val="21"/>
+          <w:szCs w:val="21"/>
+        </w:rPr>
+        <w:t xml:space="preserve">: userId,
+bölge) — </w:t>
+      </w:r>
+      <w:r>
+        <w:rPr>
+          <w:rFonts w:ascii="Consolas" w:cs="Consolas" w:eastAsia="Consolas" w:hAnsi="Consolas"/>
+          <w:color w:val="1F5F56"/>
+          <w:sz w:val="21"/>
+          <w:szCs w:val="21"/>
+        </w:rPr>
+        <w:t xml:space="preserve">dealers.bolge</w:t>
+      </w:r>
+      <w:r>
+        <w:rPr>
+          <w:sz w:val="21"/>
+          <w:szCs w:val="21"/>
+        </w:rPr>
+        <w:t xml:space="preserve"> alanındaki (bugün serbest metin, sabitlenmemiş)
+değerlerle eşleşir</w:t>
+      </w:r>
+    </w:p>
+    <w:p>
+      <w:pPr>
+        <w:pStyle w:val="ListParagraph"/>
+        <w:numPr>
+          <w:ilvl w:val="0"/>
+          <w:numId w:val="1"/>
+        </w:numPr>
+        <w:spacing w:after="60"/>
+      </w:pPr>
+      <w:r>
+        <w:rPr>
+          <w:sz w:val="21"/>
+          <w:szCs w:val="21"/>
+        </w:rPr>
+        <w:t xml:space="preserve">Bir kullanıcı birden fazla bölgeye atanabilir ve bu atama admin
+tarafından her zaman değiştirilebilir — ör. Avrupa Yakası&amp;#39;ndaki bölge
+müdürü ayrılırsa, Anadolu Yakası&amp;#39;ndaki müdüre Avrupa Yakası erişimi de
+eklenebilir</w:t>
+      </w:r>
+    </w:p>
+    <w:p>
+      <w:pPr>
+        <w:pStyle w:val="ListParagraph"/>
+        <w:numPr>
+          <w:ilvl w:val="0"/>
+          <w:numId w:val="1"/>
+        </w:numPr>
+        <w:spacing w:after="60"/>
+      </w:pPr>
+      <w:r>
+        <w:rPr>
+          <w:sz w:val="21"/>
+          <w:szCs w:val="21"/>
+        </w:rPr>
+        <w:t xml:space="preserve">Kullanıcılar sayfasında bölge kısıtlı bir kullanıcıyı düzenlerken
+&amp;quot;Erişebileceği Bölgeler&amp;quot; çoklu seçim alanı</w:t>
+      </w:r>
+    </w:p>
+    <w:p>
+      <w:pPr>
+        <w:spacing w:after="120"/>
+      </w:pPr>
+      <w:r>
+        <w:rPr>
+          <w:b/>
+          <w:bCs/>
+          <w:color w:val="1A2420"/>
+          <w:sz w:val="21"/>
+          <w:szCs w:val="21"/>
+        </w:rPr>
+        <w:t xml:space="preserve">8.3 — Bölge bazlı veri kapsamı (scoping)</w:t>
+      </w:r>
+    </w:p>
+    <w:p>
+      <w:pPr>
+        <w:pStyle w:val="ListParagraph"/>
+        <w:numPr>
+          <w:ilvl w:val="0"/>
+          <w:numId w:val="1"/>
+        </w:numPr>
+        <w:spacing w:after="60"/>
+      </w:pPr>
+      <w:r>
+        <w:rPr>
+          <w:sz w:val="21"/>
+          <w:szCs w:val="21"/>
+        </w:rPr>
+        <w:t xml:space="preserve">Oturum modeli (</w:t>
+      </w:r>
+      <w:r>
+        <w:rPr>
+          <w:rFonts w:ascii="Consolas" w:cs="Consolas" w:eastAsia="Consolas" w:hAnsi="Consolas"/>
+          <w:color w:val="1F5F56"/>
+          <w:sz w:val="21"/>
+          <w:szCs w:val="21"/>
+        </w:rPr>
+        <w:t xml:space="preserve">src/lib/session.ts</w:t>
+      </w:r>
+      <w:r>
+        <w:rPr>
+          <w:sz w:val="21"/>
+          <w:szCs w:val="21"/>
+        </w:rPr>
+        <w:t xml:space="preserve">), kullanıcının bölge erişim
+listesini taşıyacak şekilde genişletilir</w:t>
+      </w:r>
+    </w:p>
+    <w:p>
+      <w:pPr>
+        <w:pStyle w:val="ListParagraph"/>
+        <w:numPr>
+          <w:ilvl w:val="0"/>
+          <w:numId w:val="1"/>
+        </w:numPr>
+        <w:spacing w:after="60"/>
+      </w:pPr>
+      <w:r>
+        <w:rPr>
+          <w:sz w:val="21"/>
+          <w:szCs w:val="21"/>
+        </w:rPr>
+        <w:t xml:space="preserve">Bayiler, Siparişler, Raporlar, Genel Bakış sorguları — bölge kısıtlı
+bir rol için otomatik olarak yalnızca erişilebilir bölgelerdeki
+bayi/sipariş verisini döndürür; </w:t>
+      </w:r>
+      <w:r>
+        <w:rPr>
+          <w:rFonts w:ascii="Consolas" w:cs="Consolas" w:eastAsia="Consolas" w:hAnsi="Consolas"/>
+          <w:color w:val="1F5F56"/>
+          <w:sz w:val="21"/>
+          <w:szCs w:val="21"/>
+        </w:rPr>
+        <w:t xml:space="preserve">company_admin</w:t>
+      </w:r>
+      <w:r>
+        <w:rPr>
+          <w:sz w:val="21"/>
+          <w:szCs w:val="21"/>
+        </w:rPr>
+        <w:t xml:space="preserve">/</w:t>
+      </w:r>
+      <w:r>
+        <w:rPr>
+          <w:rFonts w:ascii="Consolas" w:cs="Consolas" w:eastAsia="Consolas" w:hAnsi="Consolas"/>
+          <w:color w:val="1F5F56"/>
+          <w:sz w:val="21"/>
+          <w:szCs w:val="21"/>
+        </w:rPr>
+        <w:t xml:space="preserve">brand_manager</w:t>
+      </w:r>
+      <w:r>
+        <w:rPr>
+          <w:sz w:val="21"/>
+          <w:szCs w:val="21"/>
+        </w:rPr>
+        <w:t xml:space="preserve">
+kısıtlanmaz</w:t>
+      </w:r>
+    </w:p>
+    <w:p>
+      <w:pPr>
+        <w:pStyle w:val="ListParagraph"/>
+        <w:numPr>
+          <w:ilvl w:val="0"/>
+          <w:numId w:val="1"/>
+        </w:numPr>
+        <w:spacing w:after="60"/>
+      </w:pPr>
+      <w:r>
+        <w:rPr>
+          <w:sz w:val="21"/>
+          <w:szCs w:val="21"/>
+        </w:rPr>
+        <w:t xml:space="preserve">Kısıtlama sunucu tarafında (route/query seviyesinde) uygulanır, yalnızca
+arayüzde gizleme değil — başka bölgenin sipariş id&amp;#39;sine doğrudan URL ile
+gidilse bile erişim reddedilir</w:t>
+      </w:r>
+    </w:p>
+    <w:p>
+      <w:pPr>
+        <w:spacing w:after="120"/>
+      </w:pPr>
+      <w:r>
+        <w:rPr>
+          <w:b/>
+          <w:bCs/>
+          <w:color w:val="1A2420"/>
+          <w:sz w:val="21"/>
+          <w:szCs w:val="21"/>
+        </w:rPr>
+        <w:t xml:space="preserve">8.4 — Rol bazlı ince yetkiler (açılıp kapanabilir izinler)</w:t>
+      </w:r>
+    </w:p>
+    <w:p>
+      <w:pPr>
+        <w:pStyle w:val="ListParagraph"/>
+        <w:numPr>
+          <w:ilvl w:val="0"/>
+          <w:numId w:val="1"/>
+        </w:numPr>
+        <w:spacing w:after="60"/>
+      </w:pPr>
+      <w:r>
+        <w:rPr>
+          <w:sz w:val="21"/>
+          <w:szCs w:val="21"/>
+        </w:rPr>
+        <w:t xml:space="preserve">Basit rol üyeliği yetmiyor — &amp;quot;bu rol sipariş silebilir mi&amp;quot; gibi admin
+tarafından açılıp kapatılabilen izinler gerekiyor</w:t>
+      </w:r>
+    </w:p>
+    <w:p>
+      <w:pPr>
+        <w:pStyle w:val="ListParagraph"/>
+        <w:numPr>
+          <w:ilvl w:val="0"/>
+          <w:numId w:val="1"/>
+        </w:numPr>
+        <w:spacing w:after="60"/>
+      </w:pPr>
+      <w:r>
+        <w:rPr>
+          <w:sz w:val="21"/>
+          <w:szCs w:val="21"/>
+        </w:rPr>
+        <w:t xml:space="preserve">Yeni bir izin modeli (ör. rol + izin anahtarı + açık/kapalı) ve
+Ayarlar sayfasında rol bazlı bir izin matrisi</w:t>
+      </w:r>
+    </w:p>
+    <w:p>
+      <w:pPr>
+        <w:pStyle w:val="ListParagraph"/>
+        <w:numPr>
+          <w:ilvl w:val="0"/>
+          <w:numId w:val="1"/>
+        </w:numPr>
+        <w:spacing w:after="60"/>
+      </w:pPr>
+      <w:r>
+        <w:rPr>
+          <w:sz w:val="21"/>
+          <w:szCs w:val="21"/>
+        </w:rPr>
+        <w:t xml:space="preserve">İlk izin: </w:t>
+      </w:r>
+      <w:r>
+        <w:rPr>
+          <w:b/>
+          <w:bCs/>
+          <w:sz w:val="21"/>
+          <w:szCs w:val="21"/>
+        </w:rPr>
+        <w:t xml:space="preserve">Sipariş Silme</w:t>
+      </w:r>
+      <w:r>
+        <w:rPr>
+          <w:sz w:val="21"/>
+          <w:szCs w:val="21"/>
+        </w:rPr>
+        <w:t xml:space="preserve"> — bölge müdürü/muhasebeci gibi roller için
+varsayılan kapalı, admin </w:t>
+      </w:r>
+      <w:r>
+        <w:rPr>
+          <w:rFonts w:ascii="Consolas" w:cs="Consolas" w:eastAsia="Consolas" w:hAnsi="Consolas"/>
+          <w:color w:val="1F5F56"/>
+          <w:sz w:val="21"/>
+          <w:szCs w:val="21"/>
+        </w:rPr>
+        <w:t xml:space="preserve">/admin/settings</w:t>
+      </w:r>
+      <w:r>
+        <w:rPr>
+          <w:sz w:val="21"/>
+          <w:szCs w:val="21"/>
+        </w:rPr>
+        <w:t xml:space="preserve">&amp;#39;ten açıp kapatabilir</w:t>
+      </w:r>
+    </w:p>
+    <w:p>
+      <w:pPr>
+        <w:spacing w:after="120"/>
+      </w:pPr>
+      <w:r>
+        <w:rPr>
+          <w:b/>
+          <w:bCs/>
+          <w:color w:val="1A2420"/>
+          <w:sz w:val="21"/>
+          <w:szCs w:val="21"/>
+        </w:rPr>
+        <w:t xml:space="preserve">Çıkış kriteri —</w:t>
+      </w:r>
+      <w:r>
+        <w:rPr>
+          <w:color w:val="1A2420"/>
+          <w:sz w:val="21"/>
+          <w:szCs w:val="21"/>
+        </w:rPr>
+        <w:t xml:space="preserve"> bölge müdürü/muhasebeci/raporlamacı hesabıyla giriş
+yapıldığında yalnızca yetkili olunan bölge/marka verisi görünüyor; admin
+bu bölge erişimini ve ek izinleri (sipariş silme gibi) Kullanıcılar/
+Ayarlar sayfalarından istediği zaman değiştirebiliyor; bayi kullanıcıları
+hâlâ yalnızca Markalar &amp;amp; Bayiler&amp;#39;den yönetiliyor.</w:t>
       </w:r>
     </w:p>
     <w:p>

</xml_diff>

<commit_message>
Roadmap'e Faz 9 (yeni operasyonel sayfalar) ve Faz 10'u (responsive tasarım) ekle
Faz 9: Gün Sonu, Sipariş (Detaylı), Dış Sipariş — iskeletleri az önce
eklendi, bu faz gerçek işlevi kapsıyor. Faz 8'e de Kullanıcılar
sayfasının yer tutucusunun eklendiği notu düşüldü.

Faz 10: Responsive tasarım, üç aşama — mobil sidebar (hem admin hem
dealer), tablo taşmalarını overflow-x-auto ile sarmalama, kalan
sayfa/grid düzenlerini breakpoint'lerle gözden geçirme.

Co-Authored-By: Claude Sonnet 5 <noreply@anthropic.com>
Claude-Session: https://claude.ai/code/session_01KmZwWuG1qX6Ycv6pfxtezD
</commit_message>
<xml_diff>
--- a/docs/output/roadmap.docx
+++ b/docs/output/roadmap.docx
@@ -5237,21 +5237,6 @@
     </w:p>
     <w:p>
       <w:pPr>
-        <w:spacing w:after="120"/>
-      </w:pPr>
-      <w:r>
-        <w:rPr>
-          <w:b/>
-          <w:bCs/>
-          <w:color w:val="1A2420"/>
-          <w:sz w:val="21"/>
-          <w:szCs w:val="21"/>
-        </w:rPr>
-        <w:t xml:space="preserve">8.2 — Bölge tanımı &amp;amp; atanabilir erişim</w:t>
-      </w:r>
-    </w:p>
-    <w:p>
-      <w:pPr>
         <w:pStyle w:val="ListParagraph"/>
         <w:numPr>
           <w:ilvl w:val="0"/>
@@ -5264,42 +5249,48 @@
           <w:sz w:val="21"/>
           <w:szCs w:val="21"/>
         </w:rPr>
-        <w:t xml:space="preserve">Bölge müdürü gibi rollerin &amp;quot;hangi bölge(ler)e erişimi var&amp;quot; bilgisini
-tutan yeni bir ilişki tablosu (ör. </w:t>
-      </w:r>
-      <w:r>
-        <w:rPr>
-          <w:rFonts w:ascii="Consolas" w:cs="Consolas" w:eastAsia="Consolas" w:hAnsi="Consolas"/>
-          <w:color w:val="1F5F56"/>
-          <w:sz w:val="21"/>
-          <w:szCs w:val="21"/>
-        </w:rPr>
-        <w:t xml:space="preserve">user_region_access</w:t>
-      </w:r>
-      <w:r>
-        <w:rPr>
-          <w:sz w:val="21"/>
-          <w:szCs w:val="21"/>
-        </w:rPr>
-        <w:t xml:space="preserve">: userId,
-bölge) — </w:t>
-      </w:r>
-      <w:r>
-        <w:rPr>
-          <w:rFonts w:ascii="Consolas" w:cs="Consolas" w:eastAsia="Consolas" w:hAnsi="Consolas"/>
-          <w:color w:val="1F5F56"/>
-          <w:sz w:val="21"/>
-          <w:szCs w:val="21"/>
-        </w:rPr>
-        <w:t xml:space="preserve">dealers.bolge</w:t>
-      </w:r>
-      <w:r>
-        <w:rPr>
-          <w:sz w:val="21"/>
-          <w:szCs w:val="21"/>
-        </w:rPr>
-        <w:t xml:space="preserve"> alanındaki (bugün serbest metin, sabitlenmemiş)
-değerlerle eşleşir</w:t>
+        <w:t xml:space="preserve">`/admin/users` sayfasının yeri ayrıldı</w:t>
+      </w:r>
+      <w:r>
+        <w:rPr>
+          <w:sz w:val="21"/>
+          <w:szCs w:val="21"/>
+        </w:rPr>
+        <w:t xml:space="preserve"> — ✅ Kısmen. Nav&amp;#39;a &amp;quot;Kullanıcılar&amp;quot;
+eklendi, rota &amp;quot;Yapım aşamasında&amp;quot; yer tutucusu gösteriyor
+(</w:t>
+      </w:r>
+      <w:r>
+        <w:rPr>
+          <w:rFonts w:ascii="Consolas" w:cs="Consolas" w:eastAsia="Consolas" w:hAnsi="Consolas"/>
+          <w:color w:val="1F5F56"/>
+          <w:sz w:val="21"/>
+          <w:szCs w:val="21"/>
+        </w:rPr>
+        <w:t xml:space="preserve">src/components/coming-soon.tsx</w:t>
+      </w:r>
+      <w:r>
+        <w:rPr>
+          <w:sz w:val="21"/>
+          <w:szCs w:val="21"/>
+        </w:rPr>
+        <w:t xml:space="preserve">) — 8.1&amp;#39;in geri kalanı (gerçek liste,
+yeni roller, form) henüz yapılmadı.</w:t>
+      </w:r>
+    </w:p>
+    <w:p>
+      <w:pPr>
+        <w:spacing w:after="120"/>
+      </w:pPr>
+      <w:r>
+        <w:rPr>
+          <w:b/>
+          <w:bCs/>
+          <w:color w:val="1A2420"/>
+          <w:sz w:val="21"/>
+          <w:szCs w:val="21"/>
+        </w:rPr>
+        <w:t xml:space="preserve">8.2 — Bölge tanımı &amp;amp; atanabilir erişim</w:t>
       </w:r>
     </w:p>
     <w:p>
@@ -5316,10 +5307,42 @@
           <w:sz w:val="21"/>
           <w:szCs w:val="21"/>
         </w:rPr>
-        <w:t xml:space="preserve">Bir kullanıcı birden fazla bölgeye atanabilir ve bu atama admin
-tarafından her zaman değiştirilebilir — ör. Avrupa Yakası&amp;#39;ndaki bölge
-müdürü ayrılırsa, Anadolu Yakası&amp;#39;ndaki müdüre Avrupa Yakası erişimi de
-eklenebilir</w:t>
+        <w:t xml:space="preserve">Bölge müdürü gibi rollerin &amp;quot;hangi bölge(ler)e erişimi var&amp;quot; bilgisini
+tutan yeni bir ilişki tablosu (ör. </w:t>
+      </w:r>
+      <w:r>
+        <w:rPr>
+          <w:rFonts w:ascii="Consolas" w:cs="Consolas" w:eastAsia="Consolas" w:hAnsi="Consolas"/>
+          <w:color w:val="1F5F56"/>
+          <w:sz w:val="21"/>
+          <w:szCs w:val="21"/>
+        </w:rPr>
+        <w:t xml:space="preserve">user_region_access</w:t>
+      </w:r>
+      <w:r>
+        <w:rPr>
+          <w:sz w:val="21"/>
+          <w:szCs w:val="21"/>
+        </w:rPr>
+        <w:t xml:space="preserve">: userId,
+bölge) — </w:t>
+      </w:r>
+      <w:r>
+        <w:rPr>
+          <w:rFonts w:ascii="Consolas" w:cs="Consolas" w:eastAsia="Consolas" w:hAnsi="Consolas"/>
+          <w:color w:val="1F5F56"/>
+          <w:sz w:val="21"/>
+          <w:szCs w:val="21"/>
+        </w:rPr>
+        <w:t xml:space="preserve">dealers.bolge</w:t>
+      </w:r>
+      <w:r>
+        <w:rPr>
+          <w:sz w:val="21"/>
+          <w:szCs w:val="21"/>
+        </w:rPr>
+        <w:t xml:space="preserve"> alanındaki (bugün serbest metin, sabitlenmemiş)
+değerlerle eşleşir</w:t>
       </w:r>
     </w:p>
     <w:p>
@@ -5336,23 +5359,10 @@
           <w:sz w:val="21"/>
           <w:szCs w:val="21"/>
         </w:rPr>
-        <w:t xml:space="preserve">Kullanıcılar sayfasında bölge kısıtlı bir kullanıcıyı düzenlerken
-&amp;quot;Erişebileceği Bölgeler&amp;quot; çoklu seçim alanı</w:t>
-      </w:r>
-    </w:p>
-    <w:p>
-      <w:pPr>
-        <w:spacing w:after="120"/>
-      </w:pPr>
-      <w:r>
-        <w:rPr>
-          <w:b/>
-          <w:bCs/>
-          <w:color w:val="1A2420"/>
-          <w:sz w:val="21"/>
-          <w:szCs w:val="21"/>
-        </w:rPr>
-        <w:t xml:space="preserve">8.3 — Bölge bazlı veri kapsamı (scoping)</w:t>
+        <w:t xml:space="preserve">Bir kullanıcı birden fazla bölgeye atanabilir ve bu atama admin
+tarafından her zaman değiştirilebilir — ör. Avrupa Yakası&amp;#39;ndaki bölge
+müdürü ayrılırsa, Anadolu Yakası&amp;#39;ndaki müdüre Avrupa Yakası erişimi de
+eklenebilir</w:t>
       </w:r>
     </w:p>
     <w:p>
@@ -5369,24 +5379,23 @@
           <w:sz w:val="21"/>
           <w:szCs w:val="21"/>
         </w:rPr>
-        <w:t xml:space="preserve">Oturum modeli (</w:t>
-      </w:r>
-      <w:r>
-        <w:rPr>
-          <w:rFonts w:ascii="Consolas" w:cs="Consolas" w:eastAsia="Consolas" w:hAnsi="Consolas"/>
-          <w:color w:val="1F5F56"/>
-          <w:sz w:val="21"/>
-          <w:szCs w:val="21"/>
-        </w:rPr>
-        <w:t xml:space="preserve">src/lib/session.ts</w:t>
-      </w:r>
-      <w:r>
-        <w:rPr>
-          <w:sz w:val="21"/>
-          <w:szCs w:val="21"/>
-        </w:rPr>
-        <w:t xml:space="preserve">), kullanıcının bölge erişim
-listesini taşıyacak şekilde genişletilir</w:t>
+        <w:t xml:space="preserve">Kullanıcılar sayfasında bölge kısıtlı bir kullanıcıyı düzenlerken
+&amp;quot;Erişebileceği Bölgeler&amp;quot; çoklu seçim alanı</w:t>
+      </w:r>
+    </w:p>
+    <w:p>
+      <w:pPr>
+        <w:spacing w:after="120"/>
+      </w:pPr>
+      <w:r>
+        <w:rPr>
+          <w:b/>
+          <w:bCs/>
+          <w:color w:val="1A2420"/>
+          <w:sz w:val="21"/>
+          <w:szCs w:val="21"/>
+        </w:rPr>
+        <w:t xml:space="preserve">8.3 — Bölge bazlı veri kapsamı (scoping)</w:t>
       </w:r>
     </w:p>
     <w:p>
@@ -5403,42 +5412,24 @@
           <w:sz w:val="21"/>
           <w:szCs w:val="21"/>
         </w:rPr>
-        <w:t xml:space="preserve">Bayiler, Siparişler, Raporlar, Genel Bakış sorguları — bölge kısıtlı
-bir rol için otomatik olarak yalnızca erişilebilir bölgelerdeki
-bayi/sipariş verisini döndürür; </w:t>
-      </w:r>
-      <w:r>
-        <w:rPr>
-          <w:rFonts w:ascii="Consolas" w:cs="Consolas" w:eastAsia="Consolas" w:hAnsi="Consolas"/>
-          <w:color w:val="1F5F56"/>
-          <w:sz w:val="21"/>
-          <w:szCs w:val="21"/>
-        </w:rPr>
-        <w:t xml:space="preserve">company_admin</w:t>
-      </w:r>
-      <w:r>
-        <w:rPr>
-          <w:sz w:val="21"/>
-          <w:szCs w:val="21"/>
-        </w:rPr>
-        <w:t xml:space="preserve">/</w:t>
-      </w:r>
-      <w:r>
-        <w:rPr>
-          <w:rFonts w:ascii="Consolas" w:cs="Consolas" w:eastAsia="Consolas" w:hAnsi="Consolas"/>
-          <w:color w:val="1F5F56"/>
-          <w:sz w:val="21"/>
-          <w:szCs w:val="21"/>
-        </w:rPr>
-        <w:t xml:space="preserve">brand_manager</w:t>
-      </w:r>
-      <w:r>
-        <w:rPr>
-          <w:sz w:val="21"/>
-          <w:szCs w:val="21"/>
-        </w:rPr>
-        <w:t xml:space="preserve">
-kısıtlanmaz</w:t>
+        <w:t xml:space="preserve">Oturum modeli (</w:t>
+      </w:r>
+      <w:r>
+        <w:rPr>
+          <w:rFonts w:ascii="Consolas" w:cs="Consolas" w:eastAsia="Consolas" w:hAnsi="Consolas"/>
+          <w:color w:val="1F5F56"/>
+          <w:sz w:val="21"/>
+          <w:szCs w:val="21"/>
+        </w:rPr>
+        <w:t xml:space="preserve">src/lib/session.ts</w:t>
+      </w:r>
+      <w:r>
+        <w:rPr>
+          <w:sz w:val="21"/>
+          <w:szCs w:val="21"/>
+        </w:rPr>
+        <w:t xml:space="preserve">), kullanıcının bölge erişim
+listesini taşıyacak şekilde genişletilir</w:t>
       </w:r>
     </w:p>
     <w:p>
@@ -5455,24 +5446,42 @@
           <w:sz w:val="21"/>
           <w:szCs w:val="21"/>
         </w:rPr>
-        <w:t xml:space="preserve">Kısıtlama sunucu tarafında (route/query seviyesinde) uygulanır, yalnızca
-arayüzde gizleme değil — başka bölgenin sipariş id&amp;#39;sine doğrudan URL ile
-gidilse bile erişim reddedilir</w:t>
-      </w:r>
-    </w:p>
-    <w:p>
-      <w:pPr>
-        <w:spacing w:after="120"/>
-      </w:pPr>
-      <w:r>
-        <w:rPr>
-          <w:b/>
-          <w:bCs/>
-          <w:color w:val="1A2420"/>
-          <w:sz w:val="21"/>
-          <w:szCs w:val="21"/>
-        </w:rPr>
-        <w:t xml:space="preserve">8.4 — Rol bazlı ince yetkiler (açılıp kapanabilir izinler)</w:t>
+        <w:t xml:space="preserve">Bayiler, Siparişler, Raporlar, Genel Bakış sorguları — bölge kısıtlı
+bir rol için otomatik olarak yalnızca erişilebilir bölgelerdeki
+bayi/sipariş verisini döndürür; </w:t>
+      </w:r>
+      <w:r>
+        <w:rPr>
+          <w:rFonts w:ascii="Consolas" w:cs="Consolas" w:eastAsia="Consolas" w:hAnsi="Consolas"/>
+          <w:color w:val="1F5F56"/>
+          <w:sz w:val="21"/>
+          <w:szCs w:val="21"/>
+        </w:rPr>
+        <w:t xml:space="preserve">company_admin</w:t>
+      </w:r>
+      <w:r>
+        <w:rPr>
+          <w:sz w:val="21"/>
+          <w:szCs w:val="21"/>
+        </w:rPr>
+        <w:t xml:space="preserve">/</w:t>
+      </w:r>
+      <w:r>
+        <w:rPr>
+          <w:rFonts w:ascii="Consolas" w:cs="Consolas" w:eastAsia="Consolas" w:hAnsi="Consolas"/>
+          <w:color w:val="1F5F56"/>
+          <w:sz w:val="21"/>
+          <w:szCs w:val="21"/>
+        </w:rPr>
+        <w:t xml:space="preserve">brand_manager</w:t>
+      </w:r>
+      <w:r>
+        <w:rPr>
+          <w:sz w:val="21"/>
+          <w:szCs w:val="21"/>
+        </w:rPr>
+        <w:t xml:space="preserve">
+kısıtlanmaz</w:t>
       </w:r>
     </w:p>
     <w:p>
@@ -5489,8 +5498,24 @@
           <w:sz w:val="21"/>
           <w:szCs w:val="21"/>
         </w:rPr>
-        <w:t xml:space="preserve">Basit rol üyeliği yetmiyor — &amp;quot;bu rol sipariş silebilir mi&amp;quot; gibi admin
-tarafından açılıp kapatılabilen izinler gerekiyor</w:t>
+        <w:t xml:space="preserve">Kısıtlama sunucu tarafında (route/query seviyesinde) uygulanır, yalnızca
+arayüzde gizleme değil — başka bölgenin sipariş id&amp;#39;sine doğrudan URL ile
+gidilse bile erişim reddedilir</w:t>
+      </w:r>
+    </w:p>
+    <w:p>
+      <w:pPr>
+        <w:spacing w:after="120"/>
+      </w:pPr>
+      <w:r>
+        <w:rPr>
+          <w:b/>
+          <w:bCs/>
+          <w:color w:val="1A2420"/>
+          <w:sz w:val="21"/>
+          <w:szCs w:val="21"/>
+        </w:rPr>
+        <w:t xml:space="preserve">8.4 — Rol bazlı ince yetkiler (açılıp kapanabilir izinler)</w:t>
       </w:r>
     </w:p>
     <w:p>
@@ -5507,8 +5532,8 @@
           <w:sz w:val="21"/>
           <w:szCs w:val="21"/>
         </w:rPr>
-        <w:t xml:space="preserve">Yeni bir izin modeli (ör. rol + izin anahtarı + açık/kapalı) ve
-Ayarlar sayfasında rol bazlı bir izin matrisi</w:t>
+        <w:t xml:space="preserve">Basit rol üyeliği yetmiyor — &amp;quot;bu rol sipariş silebilir mi&amp;quot; gibi admin
+tarafından açılıp kapatılabilen izinler gerekiyor</w:t>
       </w:r>
     </w:p>
     <w:p>
@@ -5525,6 +5550,24 @@
           <w:sz w:val="21"/>
           <w:szCs w:val="21"/>
         </w:rPr>
+        <w:t xml:space="preserve">Yeni bir izin modeli (ör. rol + izin anahtarı + açık/kapalı) ve
+Ayarlar sayfasında rol bazlı bir izin matrisi</w:t>
+      </w:r>
+    </w:p>
+    <w:p>
+      <w:pPr>
+        <w:pStyle w:val="ListParagraph"/>
+        <w:numPr>
+          <w:ilvl w:val="0"/>
+          <w:numId w:val="1"/>
+        </w:numPr>
+        <w:spacing w:after="60"/>
+      </w:pPr>
+      <w:r>
+        <w:rPr>
+          <w:sz w:val="21"/>
+          <w:szCs w:val="21"/>
+        </w:rPr>
         <w:t xml:space="preserve">İlk izin: </w:t>
       </w:r>
       <w:r>
@@ -5586,6 +5629,650 @@
 bu bölge erişimini ve ek izinleri (sipariş silme gibi) Kullanıcılar/
 Ayarlar sayfalarından istediği zaman değiştirebiliyor; bayi kullanıcıları
 hâlâ yalnızca Markalar &amp;amp; Bayiler&amp;#39;den yönetiliyor.</w:t>
+      </w:r>
+    </w:p>
+    <w:p>
+      <w:pPr>
+        <w:pStyle w:val="Heading2"/>
+        <w:spacing w:after="100" w:before="220"/>
+      </w:pPr>
+      <w:r>
+        <w:rPr>
+          <w:color w:val="1A2420"/>
+        </w:rPr>
+        <w:t xml:space="preserve">Faz 9 — Ek Operasyonel Sayfalar (Gün Sonu, Sipariş Detaylı, Dış Sipariş)</w:t>
+      </w:r>
+    </w:p>
+    <w:p>
+      <w:pPr>
+        <w:spacing w:after="120"/>
+      </w:pPr>
+      <w:r>
+        <w:rPr>
+          <w:color w:val="1A2420"/>
+          <w:sz w:val="21"/>
+          <w:szCs w:val="21"/>
+        </w:rPr>
+        <w:t xml:space="preserve">Hedef: Operasyonel ekibin ihtiyaç duyduğu, birbirinden bağımsız üç yeni
+admin sayfası. Sayfa iskeletleri ve nav girişleri şimdiden eklendi
+(</w:t>
+      </w:r>
+      <w:r>
+        <w:rPr>
+          <w:rFonts w:ascii="Consolas" w:cs="Consolas" w:eastAsia="Consolas" w:hAnsi="Consolas"/>
+          <w:color w:val="1A2420"/>
+          <w:sz w:val="21"/>
+          <w:szCs w:val="21"/>
+        </w:rPr>
+        <w:t xml:space="preserve">src/app/admin/end-of-day/</w:t>
+      </w:r>
+      <w:r>
+        <w:rPr>
+          <w:color w:val="1A2420"/>
+          <w:sz w:val="21"/>
+          <w:szCs w:val="21"/>
+        </w:rPr>
+        <w:t xml:space="preserve">, </w:t>
+      </w:r>
+      <w:r>
+        <w:rPr>
+          <w:rFonts w:ascii="Consolas" w:cs="Consolas" w:eastAsia="Consolas" w:hAnsi="Consolas"/>
+          <w:color w:val="1A2420"/>
+          <w:sz w:val="21"/>
+          <w:szCs w:val="21"/>
+        </w:rPr>
+        <w:t xml:space="preserve">src/app/admin/order-details/</w:t>
+      </w:r>
+      <w:r>
+        <w:rPr>
+          <w:color w:val="1A2420"/>
+          <w:sz w:val="21"/>
+          <w:szCs w:val="21"/>
+        </w:rPr>
+        <w:t xml:space="preserve">,
+</w:t>
+      </w:r>
+      <w:r>
+        <w:rPr>
+          <w:rFonts w:ascii="Consolas" w:cs="Consolas" w:eastAsia="Consolas" w:hAnsi="Consolas"/>
+          <w:color w:val="1A2420"/>
+          <w:sz w:val="21"/>
+          <w:szCs w:val="21"/>
+        </w:rPr>
+        <w:t xml:space="preserve">src/app/admin/external-orders/</w:t>
+      </w:r>
+      <w:r>
+        <w:rPr>
+          <w:color w:val="1A2420"/>
+          <w:sz w:val="21"/>
+          <w:szCs w:val="21"/>
+        </w:rPr>
+        <w:t xml:space="preserve">, hepsi ortak </w:t>
+      </w:r>
+      <w:r>
+        <w:rPr>
+          <w:rFonts w:ascii="Consolas" w:cs="Consolas" w:eastAsia="Consolas" w:hAnsi="Consolas"/>
+          <w:color w:val="1A2420"/>
+          <w:sz w:val="21"/>
+          <w:szCs w:val="21"/>
+        </w:rPr>
+        <w:t xml:space="preserve">ComingSoon</w:t>
+      </w:r>
+      <w:r>
+        <w:rPr>
+          <w:color w:val="1A2420"/>
+          <w:sz w:val="21"/>
+          <w:szCs w:val="21"/>
+        </w:rPr>
+        <w:t xml:space="preserve"> bileşeniyle
+&amp;quot;Yapım aşamasında&amp;quot; gösteriyor) — bu fazın kapsamı gerçek işlevi
+uygulamak.</w:t>
+      </w:r>
+    </w:p>
+    <w:p>
+      <w:pPr>
+        <w:pStyle w:val="ListParagraph"/>
+        <w:numPr>
+          <w:ilvl w:val="0"/>
+          <w:numId w:val="1"/>
+        </w:numPr>
+        <w:spacing w:after="60"/>
+      </w:pPr>
+      <w:r>
+        <w:rPr>
+          <w:b/>
+          <w:bCs/>
+          <w:sz w:val="21"/>
+          <w:szCs w:val="21"/>
+        </w:rPr>
+        <w:t xml:space="preserve">Gün Sonu</w:t>
+      </w:r>
+      <w:r>
+        <w:rPr>
+          <w:sz w:val="21"/>
+          <w:szCs w:val="21"/>
+        </w:rPr>
+        <w:t xml:space="preserve"> (</w:t>
+      </w:r>
+      <w:r>
+        <w:rPr>
+          <w:rFonts w:ascii="Consolas" w:cs="Consolas" w:eastAsia="Consolas" w:hAnsi="Consolas"/>
+          <w:color w:val="1F5F56"/>
+          <w:sz w:val="21"/>
+          <w:szCs w:val="21"/>
+        </w:rPr>
+        <w:t xml:space="preserve">/admin/end-of-day</w:t>
+      </w:r>
+      <w:r>
+        <w:rPr>
+          <w:sz w:val="21"/>
+          <w:szCs w:val="21"/>
+        </w:rPr>
+        <w:t xml:space="preserve">) — günlük kapanış özeti/mutabakat:
+o gün alınan siparişlerin ödeme tipine göre (cari/kapıda ödeme/sanal
+POS) dökümü, tahsil edilen/edilemeyen tutarlar. Kapsam (hangi
+verilerin göründüğü, bir &amp;quot;günü kapatma&amp;quot; aksiyonu olup olmayacağı)
+uygulama aşamasında netleşecek</w:t>
+      </w:r>
+    </w:p>
+    <w:p>
+      <w:pPr>
+        <w:pStyle w:val="ListParagraph"/>
+        <w:numPr>
+          <w:ilvl w:val="0"/>
+          <w:numId w:val="1"/>
+        </w:numPr>
+        <w:spacing w:after="60"/>
+      </w:pPr>
+      <w:r>
+        <w:rPr>
+          <w:b/>
+          <w:bCs/>
+          <w:sz w:val="21"/>
+          <w:szCs w:val="21"/>
+        </w:rPr>
+        <w:t xml:space="preserve">Sipariş (Detaylı)</w:t>
+      </w:r>
+      <w:r>
+        <w:rPr>
+          <w:sz w:val="21"/>
+          <w:szCs w:val="21"/>
+        </w:rPr>
+        <w:t xml:space="preserve"> (</w:t>
+      </w:r>
+      <w:r>
+        <w:rPr>
+          <w:rFonts w:ascii="Consolas" w:cs="Consolas" w:eastAsia="Consolas" w:hAnsi="Consolas"/>
+          <w:color w:val="1F5F56"/>
+          <w:sz w:val="21"/>
+          <w:szCs w:val="21"/>
+        </w:rPr>
+        <w:t xml:space="preserve">/admin/order-details</w:t>
+      </w:r>
+      <w:r>
+        <w:rPr>
+          <w:sz w:val="21"/>
+          <w:szCs w:val="21"/>
+        </w:rPr>
+        <w:t xml:space="preserve">) — sipariş kalemi
+bazında (mevcut </w:t>
+      </w:r>
+      <w:r>
+        <w:rPr>
+          <w:rFonts w:ascii="Consolas" w:cs="Consolas" w:eastAsia="Consolas" w:hAnsi="Consolas"/>
+          <w:color w:val="1F5F56"/>
+          <w:sz w:val="21"/>
+          <w:szCs w:val="21"/>
+        </w:rPr>
+        <w:t xml:space="preserve">/admin/orders</w:t>
+      </w:r>
+      <w:r>
+        <w:rPr>
+          <w:sz w:val="21"/>
+          <w:szCs w:val="21"/>
+        </w:rPr>
+        <w:t xml:space="preserve">&amp;#39;ın sipariş bazlı listesinin aksine)
+filtrelenebilir bir görünüm; hangi ürün hangi bayiye ne zaman gitmiş
+sorgusunu tek satırda cevaplar</w:t>
+      </w:r>
+    </w:p>
+    <w:p>
+      <w:pPr>
+        <w:pStyle w:val="ListParagraph"/>
+        <w:numPr>
+          <w:ilvl w:val="0"/>
+          <w:numId w:val="1"/>
+        </w:numPr>
+        <w:spacing w:after="60"/>
+      </w:pPr>
+      <w:r>
+        <w:rPr>
+          <w:b/>
+          <w:bCs/>
+          <w:sz w:val="21"/>
+          <w:szCs w:val="21"/>
+        </w:rPr>
+        <w:t xml:space="preserve">Dış Sipariş</w:t>
+      </w:r>
+      <w:r>
+        <w:rPr>
+          <w:sz w:val="21"/>
+          <w:szCs w:val="21"/>
+        </w:rPr>
+        <w:t xml:space="preserve"> (</w:t>
+      </w:r>
+      <w:r>
+        <w:rPr>
+          <w:rFonts w:ascii="Consolas" w:cs="Consolas" w:eastAsia="Consolas" w:hAnsi="Consolas"/>
+          <w:color w:val="1F5F56"/>
+          <w:sz w:val="21"/>
+          <w:szCs w:val="21"/>
+        </w:rPr>
+        <w:t xml:space="preserve">/admin/external-orders</w:t>
+      </w:r>
+      <w:r>
+        <w:rPr>
+          <w:sz w:val="21"/>
+          <w:szCs w:val="21"/>
+        </w:rPr>
+        <w:t xml:space="preserve">) — sistem dışından
+(telefon, e-posta vb.) gelen siparişlerin admin tarafından elle
+girilmesi; mevcut sipariş modeliyle (ürün/bayi/ödeme tipi) aynı
+şemayı kullanır, yalnızca giriş noktası farklı</w:t>
+      </w:r>
+    </w:p>
+    <w:p>
+      <w:pPr>
+        <w:spacing w:after="120"/>
+      </w:pPr>
+      <w:r>
+        <w:rPr>
+          <w:b/>
+          <w:bCs/>
+          <w:color w:val="1A2420"/>
+          <w:sz w:val="21"/>
+          <w:szCs w:val="21"/>
+        </w:rPr>
+        <w:t xml:space="preserve">Çıkış kriteri —</w:t>
+      </w:r>
+      <w:r>
+        <w:rPr>
+          <w:color w:val="1A2420"/>
+          <w:sz w:val="21"/>
+          <w:szCs w:val="21"/>
+        </w:rPr>
+        <w:t xml:space="preserve"> üç sayfa da gerçek veriyle çalışıyor; &amp;quot;Yapım
+aşamasında&amp;quot; yer tutucusu kaldırılmış.</w:t>
+      </w:r>
+    </w:p>
+    <w:p>
+      <w:pPr>
+        <w:pStyle w:val="Heading2"/>
+        <w:spacing w:after="100" w:before="220"/>
+      </w:pPr>
+      <w:r>
+        <w:rPr>
+          <w:color w:val="1A2420"/>
+        </w:rPr>
+        <w:t xml:space="preserve">Faz 10 — Responsive Tasarım</w:t>
+      </w:r>
+    </w:p>
+    <w:p>
+      <w:pPr>
+        <w:spacing w:after="120"/>
+      </w:pPr>
+      <w:r>
+        <w:rPr>
+          <w:color w:val="1A2420"/>
+          <w:sz w:val="21"/>
+          <w:szCs w:val="21"/>
+        </w:rPr>
+        <w:t xml:space="preserve">Hedef: Site mobil/tablet ekranlarda kullanılabilir hale gelsin. Şu anki
+durum: sidebar (</w:t>
+      </w:r>
+      <w:r>
+        <w:rPr>
+          <w:rFonts w:ascii="Consolas" w:cs="Consolas" w:eastAsia="Consolas" w:hAnsi="Consolas"/>
+          <w:color w:val="1A2420"/>
+          <w:sz w:val="21"/>
+          <w:szCs w:val="21"/>
+        </w:rPr>
+        <w:t xml:space="preserve">src/app/admin/sidebar.tsx</w:t>
+      </w:r>
+      <w:r>
+        <w:rPr>
+          <w:color w:val="1A2420"/>
+          <w:sz w:val="21"/>
+          <w:szCs w:val="21"/>
+        </w:rPr>
+        <w:t xml:space="preserve">, </w:t>
+      </w:r>
+      <w:r>
+        <w:rPr>
+          <w:rFonts w:ascii="Consolas" w:cs="Consolas" w:eastAsia="Consolas" w:hAnsi="Consolas"/>
+          <w:color w:val="1A2420"/>
+          <w:sz w:val="21"/>
+          <w:szCs w:val="21"/>
+        </w:rPr>
+        <w:t xml:space="preserve">src/app/dealer/layout.tsx</w:t>
+      </w:r>
+      <w:r>
+        <w:rPr>
+          <w:color w:val="1A2420"/>
+          <w:sz w:val="21"/>
+          <w:szCs w:val="21"/>
+        </w:rPr>
+        <w:t xml:space="preserve">)
+dar ekranda daralmıyor/hamburger&amp;#39;e dönüşmüyor, birçok tablo
+</w:t>
+      </w:r>
+      <w:r>
+        <w:rPr>
+          <w:rFonts w:ascii="Consolas" w:cs="Consolas" w:eastAsia="Consolas" w:hAnsi="Consolas"/>
+          <w:color w:val="1A2420"/>
+          <w:sz w:val="21"/>
+          <w:szCs w:val="21"/>
+        </w:rPr>
+        <w:t xml:space="preserve">overflow-x-auto</w:t>
+      </w:r>
+      <w:r>
+        <w:rPr>
+          <w:color w:val="1A2420"/>
+          <w:sz w:val="21"/>
+          <w:szCs w:val="21"/>
+        </w:rPr>
+        <w:t xml:space="preserve"> olmadan taşıyor, </w:t>
+      </w:r>
+      <w:r>
+        <w:rPr>
+          <w:rFonts w:ascii="Consolas" w:cs="Consolas" w:eastAsia="Consolas" w:hAnsi="Consolas"/>
+          <w:color w:val="1A2420"/>
+          <w:sz w:val="21"/>
+          <w:szCs w:val="21"/>
+        </w:rPr>
+        <w:t xml:space="preserve">src/lib/ui.ts</w:t>
+      </w:r>
+      <w:r>
+        <w:rPr>
+          <w:color w:val="1A2420"/>
+          <w:sz w:val="21"/>
+          <w:szCs w:val="21"/>
+        </w:rPr>
+        <w:t xml:space="preserve">/</w:t>
+      </w:r>
+      <w:r>
+        <w:rPr>
+          <w:rFonts w:ascii="Consolas" w:cs="Consolas" w:eastAsia="Consolas" w:hAnsi="Consolas"/>
+          <w:color w:val="1A2420"/>
+          <w:sz w:val="21"/>
+          <w:szCs w:val="21"/>
+        </w:rPr>
+        <w:t xml:space="preserve">globals.css</w:t>
+      </w:r>
+      <w:r>
+        <w:rPr>
+          <w:color w:val="1A2420"/>
+          <w:sz w:val="21"/>
+          <w:szCs w:val="21"/>
+        </w:rPr>
+        <w:t xml:space="preserve">&amp;#39;te hiç
+breakpoint tanımlı değil. Üç aşamaya ayrılıyor, her biri bağımsız
+uygulanabilir ama bu sırayla en çok görsel etkiyi en düşük riskle verir.</w:t>
+      </w:r>
+    </w:p>
+    <w:p>
+      <w:pPr>
+        <w:spacing w:after="120"/>
+      </w:pPr>
+      <w:r>
+        <w:rPr>
+          <w:b/>
+          <w:bCs/>
+          <w:color w:val="1A2420"/>
+          <w:sz w:val="21"/>
+          <w:szCs w:val="21"/>
+        </w:rPr>
+        <w:t xml:space="preserve">10.1 — Mobil sidebar</w:t>
+      </w:r>
+    </w:p>
+    <w:p>
+      <w:pPr>
+        <w:pStyle w:val="ListParagraph"/>
+        <w:numPr>
+          <w:ilvl w:val="0"/>
+          <w:numId w:val="1"/>
+        </w:numPr>
+        <w:spacing w:after="60"/>
+      </w:pPr>
+      <w:r>
+        <w:rPr>
+          <w:sz w:val="21"/>
+          <w:szCs w:val="21"/>
+        </w:rPr>
+        <w:t xml:space="preserve">Hem admin hem dealer sidebar&amp;#39;ını aynı anda düzelten paylaşılan bir
+off-canvas/hamburger bileşeni — dar ekranda sidebar gizlenir, bir
+hamburger butonuyla üstten açılır</w:t>
+      </w:r>
+    </w:p>
+    <w:p>
+      <w:pPr>
+        <w:spacing w:after="120"/>
+      </w:pPr>
+      <w:r>
+        <w:rPr>
+          <w:b/>
+          <w:bCs/>
+          <w:color w:val="1A2420"/>
+          <w:sz w:val="21"/>
+          <w:szCs w:val="21"/>
+        </w:rPr>
+        <w:t xml:space="preserve">10.2 — Tablo taşmalarını sarmala</w:t>
+      </w:r>
+    </w:p>
+    <w:p>
+      <w:pPr>
+        <w:pStyle w:val="ListParagraph"/>
+        <w:numPr>
+          <w:ilvl w:val="0"/>
+          <w:numId w:val="1"/>
+        </w:numPr>
+        <w:spacing w:after="60"/>
+      </w:pPr>
+      <w:r>
+        <w:rPr>
+          <w:sz w:val="21"/>
+          <w:szCs w:val="21"/>
+        </w:rPr>
+        <w:t xml:space="preserve">Tüm </w:t>
+      </w:r>
+      <w:r>
+        <w:rPr>
+          <w:rFonts w:ascii="Consolas" w:cs="Consolas" w:eastAsia="Consolas" w:hAnsi="Consolas"/>
+          <w:color w:val="1F5F56"/>
+          <w:sz w:val="21"/>
+          <w:szCs w:val="21"/>
+        </w:rPr>
+        <w:t xml:space="preserve">&amp;lt;table&amp;gt;</w:t>
+      </w:r>
+      <w:r>
+        <w:rPr>
+          <w:sz w:val="21"/>
+          <w:szCs w:val="21"/>
+        </w:rPr>
+        <w:t xml:space="preserve"> içeren ekranlar (</w:t>
+      </w:r>
+      <w:r>
+        <w:rPr>
+          <w:rFonts w:ascii="Consolas" w:cs="Consolas" w:eastAsia="Consolas" w:hAnsi="Consolas"/>
+          <w:color w:val="1F5F56"/>
+          <w:sz w:val="21"/>
+          <w:szCs w:val="21"/>
+        </w:rPr>
+        <w:t xml:space="preserve">/admin/orders</w:t>
+      </w:r>
+      <w:r>
+        <w:rPr>
+          <w:sz w:val="21"/>
+          <w:szCs w:val="21"/>
+        </w:rPr>
+        <w:t xml:space="preserve">, </w:t>
+      </w:r>
+      <w:r>
+        <w:rPr>
+          <w:rFonts w:ascii="Consolas" w:cs="Consolas" w:eastAsia="Consolas" w:hAnsi="Consolas"/>
+          <w:color w:val="1F5F56"/>
+          <w:sz w:val="21"/>
+          <w:szCs w:val="21"/>
+        </w:rPr>
+        <w:t xml:space="preserve">/admin/products</w:t>
+      </w:r>
+      <w:r>
+        <w:rPr>
+          <w:sz w:val="21"/>
+          <w:szCs w:val="21"/>
+        </w:rPr>
+        <w:t xml:space="preserve">,
+</w:t>
+      </w:r>
+      <w:r>
+        <w:rPr>
+          <w:rFonts w:ascii="Consolas" w:cs="Consolas" w:eastAsia="Consolas" w:hAnsi="Consolas"/>
+          <w:color w:val="1F5F56"/>
+          <w:sz w:val="21"/>
+          <w:szCs w:val="21"/>
+        </w:rPr>
+        <w:t xml:space="preserve">/admin/brands</w:t>
+      </w:r>
+      <w:r>
+        <w:rPr>
+          <w:sz w:val="21"/>
+          <w:szCs w:val="21"/>
+        </w:rPr>
+        <w:t xml:space="preserve"> bayi listesi, dealer sipariş geçmişi vb.)
+</w:t>
+      </w:r>
+      <w:r>
+        <w:rPr>
+          <w:rFonts w:ascii="Consolas" w:cs="Consolas" w:eastAsia="Consolas" w:hAnsi="Consolas"/>
+          <w:color w:val="1F5F56"/>
+          <w:sz w:val="21"/>
+          <w:szCs w:val="21"/>
+        </w:rPr>
+        <w:t xml:space="preserve">overflow-x-auto</w:t>
+      </w:r>
+      <w:r>
+        <w:rPr>
+          <w:sz w:val="21"/>
+          <w:szCs w:val="21"/>
+        </w:rPr>
+        <w:t xml:space="preserve"> kapsayıcıya alınır — mekanik, düşük riskli, tek tek
+test edilecek ama tasarım kararı gerektirmiyor</w:t>
+      </w:r>
+    </w:p>
+    <w:p>
+      <w:pPr>
+        <w:spacing w:after="120"/>
+      </w:pPr>
+      <w:r>
+        <w:rPr>
+          <w:b/>
+          <w:bCs/>
+          <w:color w:val="1A2420"/>
+          <w:sz w:val="21"/>
+          <w:szCs w:val="21"/>
+        </w:rPr>
+        <w:t xml:space="preserve">10.3 — Sayfa/grid düzenlerini gözden geçir</w:t>
+      </w:r>
+    </w:p>
+    <w:p>
+      <w:pPr>
+        <w:pStyle w:val="ListParagraph"/>
+        <w:numPr>
+          <w:ilvl w:val="0"/>
+          <w:numId w:val="1"/>
+        </w:numPr>
+        <w:spacing w:after="60"/>
+      </w:pPr>
+      <w:r>
+        <w:rPr>
+          <w:sz w:val="21"/>
+          <w:szCs w:val="21"/>
+        </w:rPr>
+        <w:t xml:space="preserve">Kalan sayfa/grid düzenleri (stat kartları, form grid&amp;#39;leri, modal
+genişlikleri) breakpoint&amp;#39;lerle (</w:t>
+      </w:r>
+      <w:r>
+        <w:rPr>
+          <w:rFonts w:ascii="Consolas" w:cs="Consolas" w:eastAsia="Consolas" w:hAnsi="Consolas"/>
+          <w:color w:val="1F5F56"/>
+          <w:sz w:val="21"/>
+          <w:szCs w:val="21"/>
+        </w:rPr>
+        <w:t xml:space="preserve">sm:</w:t>
+      </w:r>
+      <w:r>
+        <w:rPr>
+          <w:sz w:val="21"/>
+          <w:szCs w:val="21"/>
+        </w:rPr>
+        <w:t xml:space="preserve">/</w:t>
+      </w:r>
+      <w:r>
+        <w:rPr>
+          <w:rFonts w:ascii="Consolas" w:cs="Consolas" w:eastAsia="Consolas" w:hAnsi="Consolas"/>
+          <w:color w:val="1F5F56"/>
+          <w:sz w:val="21"/>
+          <w:szCs w:val="21"/>
+        </w:rPr>
+        <w:t xml:space="preserve">md:</w:t>
+      </w:r>
+      <w:r>
+        <w:rPr>
+          <w:sz w:val="21"/>
+          <w:szCs w:val="21"/>
+        </w:rPr>
+        <w:t xml:space="preserve">/</w:t>
+      </w:r>
+      <w:r>
+        <w:rPr>
+          <w:rFonts w:ascii="Consolas" w:cs="Consolas" w:eastAsia="Consolas" w:hAnsi="Consolas"/>
+          <w:color w:val="1F5F56"/>
+          <w:sz w:val="21"/>
+          <w:szCs w:val="21"/>
+        </w:rPr>
+        <w:t xml:space="preserve">lg:</w:t>
+      </w:r>
+      <w:r>
+        <w:rPr>
+          <w:sz w:val="21"/>
+          <w:szCs w:val="21"/>
+        </w:rPr>
+        <w:t xml:space="preserve">) gözden geçirilir</w:t>
+      </w:r>
+    </w:p>
+    <w:p>
+      <w:pPr>
+        <w:spacing w:after="120"/>
+      </w:pPr>
+      <w:r>
+        <w:rPr>
+          <w:b/>
+          <w:bCs/>
+          <w:color w:val="1A2420"/>
+          <w:sz w:val="21"/>
+          <w:szCs w:val="21"/>
+        </w:rPr>
+        <w:t xml:space="preserve">Çıkış kriteri —</w:t>
+      </w:r>
+      <w:r>
+        <w:rPr>
+          <w:color w:val="1A2420"/>
+          <w:sz w:val="21"/>
+          <w:szCs w:val="21"/>
+        </w:rPr>
+        <w:t xml:space="preserve"> admin ve dealer panelleri bir telefon ekranında
+(375px genişlik) yatay kaydırma gerektirmeden, sidebar erişilebilir
+şekilde kullanılabiliyor.</w:t>
       </w:r>
     </w:p>
     <w:p>

</xml_diff>

<commit_message>
Faz 9'u güncelle: Gün Sonu/Sipariş Detaylı/Dış Sipariş bayi paneline de açık
Bu üç sayfa yalnızca admin'e özel değilmiş, bayiler de kendi verilerine
bakabilecek şekilde erişecek. Yer tutucu rotaların artık hem admin hem
dealer tarafında eklendiği not düşüldü.

Co-Authored-By: Claude Sonnet 5 <noreply@anthropic.com>
Claude-Session: https://claude.ai/code/session_01KmZwWuG1qX6Ycv6pfxtezD
</commit_message>
<xml_diff>
--- a/docs/output/roadmap.docx
+++ b/docs/output/roadmap.docx
@@ -5654,8 +5654,28 @@
           <w:szCs w:val="21"/>
         </w:rPr>
         <w:t xml:space="preserve">Hedef: Operasyonel ekibin ihtiyaç duyduğu, birbirinden bağımsız üç yeni
-admin sayfası. Sayfa iskeletleri ve nav girişleri şimdiden eklendi
-(</w:t>
+sayfa. Yalnızca admin&amp;#39;e değil </w:t>
+      </w:r>
+      <w:r>
+        <w:rPr>
+          <w:b/>
+          <w:bCs/>
+          <w:color w:val="1A2420"/>
+          <w:sz w:val="21"/>
+          <w:szCs w:val="21"/>
+        </w:rPr>
+        <w:t xml:space="preserve">bayi paneline de</w:t>
+      </w:r>
+      <w:r>
+        <w:rPr>
+          <w:color w:val="1A2420"/>
+          <w:sz w:val="21"/>
+          <w:szCs w:val="21"/>
+        </w:rPr>
+        <w:t xml:space="preserve"> açık — bayiler kendi
+verilerine bakabilir, firma geneline değil (admin/marka yöneticisi her
+zamanki gibi tam görür). Sayfa iskeletleri ve nav girişleri iki tarafta
+da şimdiden eklendi (</w:t>
       </w:r>
       <w:r>
         <w:rPr>
@@ -5665,23 +5685,6 @@
           <w:szCs w:val="21"/>
         </w:rPr>
         <w:t xml:space="preserve">src/app/admin/end-of-day/</w:t>
-      </w:r>
-      <w:r>
-        <w:rPr>
-          <w:color w:val="1A2420"/>
-          <w:sz w:val="21"/>
-          <w:szCs w:val="21"/>
-        </w:rPr>
-        <w:t xml:space="preserve">, </w:t>
-      </w:r>
-      <w:r>
-        <w:rPr>
-          <w:rFonts w:ascii="Consolas" w:cs="Consolas" w:eastAsia="Consolas" w:hAnsi="Consolas"/>
-          <w:color w:val="1A2420"/>
-          <w:sz w:val="21"/>
-          <w:szCs w:val="21"/>
-        </w:rPr>
-        <w:t xml:space="preserve">src/app/admin/order-details/</w:t>
       </w:r>
       <w:r>
         <w:rPr>
@@ -5699,6 +5702,23 @@
           <w:sz w:val="21"/>
           <w:szCs w:val="21"/>
         </w:rPr>
+        <w:t xml:space="preserve">src/app/admin/order-details/</w:t>
+      </w:r>
+      <w:r>
+        <w:rPr>
+          <w:color w:val="1A2420"/>
+          <w:sz w:val="21"/>
+          <w:szCs w:val="21"/>
+        </w:rPr>
+        <w:t xml:space="preserve">, </w:t>
+      </w:r>
+      <w:r>
+        <w:rPr>
+          <w:rFonts w:ascii="Consolas" w:cs="Consolas" w:eastAsia="Consolas" w:hAnsi="Consolas"/>
+          <w:color w:val="1A2420"/>
+          <w:sz w:val="21"/>
+          <w:szCs w:val="21"/>
+        </w:rPr>
         <w:t xml:space="preserve">src/app/admin/external-orders/</w:t>
       </w:r>
       <w:r>
@@ -5707,7 +5727,25 @@
           <w:sz w:val="21"/>
           <w:szCs w:val="21"/>
         </w:rPr>
-        <w:t xml:space="preserve">, hepsi ortak </w:t>
+        <w:t xml:space="preserve"> ve
+bunların </w:t>
+      </w:r>
+      <w:r>
+        <w:rPr>
+          <w:rFonts w:ascii="Consolas" w:cs="Consolas" w:eastAsia="Consolas" w:hAnsi="Consolas"/>
+          <w:color w:val="1A2420"/>
+          <w:sz w:val="21"/>
+          <w:szCs w:val="21"/>
+        </w:rPr>
+        <w:t xml:space="preserve">src/app/dealer/</w:t>
+      </w:r>
+      <w:r>
+        <w:rPr>
+          <w:color w:val="1A2420"/>
+          <w:sz w:val="21"/>
+          <w:szCs w:val="21"/>
+        </w:rPr>
+        <w:t xml:space="preserve"> altındaki eşleri — hepsi ortak </w:t>
       </w:r>
       <w:r>
         <w:rPr>
@@ -5724,9 +5762,9 @@
           <w:sz w:val="21"/>
           <w:szCs w:val="21"/>
         </w:rPr>
-        <w:t xml:space="preserve"> bileşeniyle
-&amp;quot;Yapım aşamasında&amp;quot; gösteriyor) — bu fazın kapsamı gerçek işlevi
-uygulamak.</w:t>
+        <w:t xml:space="preserve">
+bileşeniyle &amp;quot;Yapım aşamasında&amp;quot; gösteriyor) — bu fazın kapsamı gerçek
+işlevi uygulamak.</w:t>
       </w:r>
     </w:p>
     <w:p>
@@ -5768,11 +5806,28 @@
           <w:sz w:val="21"/>
           <w:szCs w:val="21"/>
         </w:rPr>
-        <w:t xml:space="preserve">) — günlük kapanış özeti/mutabakat:
-o gün alınan siparişlerin ödeme tipine göre (cari/kapıda ödeme/sanal
-POS) dökümü, tahsil edilen/edilemeyen tutarlar. Kapsam (hangi
-verilerin göründüğü, bir &amp;quot;günü kapatma&amp;quot; aksiyonu olup olmayacağı)
-uygulama aşamasında netleşecek</w:t>
+        <w:t xml:space="preserve">, </w:t>
+      </w:r>
+      <w:r>
+        <w:rPr>
+          <w:rFonts w:ascii="Consolas" w:cs="Consolas" w:eastAsia="Consolas" w:hAnsi="Consolas"/>
+          <w:color w:val="1F5F56"/>
+          <w:sz w:val="21"/>
+          <w:szCs w:val="21"/>
+        </w:rPr>
+        <w:t xml:space="preserve">/dealer/end-of-day</w:t>
+      </w:r>
+      <w:r>
+        <w:rPr>
+          <w:sz w:val="21"/>
+          <w:szCs w:val="21"/>
+        </w:rPr>
+        <w:t xml:space="preserve">) — günlük
+kapanış özeti/mutabakat: o gün alınan siparişlerin ödeme tipine göre
+(cari/kapıda ödeme/sanal POS) dökümü, tahsil edilen/edilemeyen
+tutarlar. Bayi tarafında yalnızca kendi siparişleri. Kapsam (bir
+&amp;quot;günü kapatma&amp;quot; aksiyonu olup olmayacağı) uygulama aşamasında
+netleşecek</w:t>
       </w:r>
     </w:p>
     <w:p>
@@ -5814,26 +5869,27 @@
           <w:sz w:val="21"/>
           <w:szCs w:val="21"/>
         </w:rPr>
-        <w:t xml:space="preserve">) — sipariş kalemi
-bazında (mevcut </w:t>
-      </w:r>
-      <w:r>
-        <w:rPr>
-          <w:rFonts w:ascii="Consolas" w:cs="Consolas" w:eastAsia="Consolas" w:hAnsi="Consolas"/>
-          <w:color w:val="1F5F56"/>
-          <w:sz w:val="21"/>
-          <w:szCs w:val="21"/>
-        </w:rPr>
-        <w:t xml:space="preserve">/admin/orders</w:t>
-      </w:r>
-      <w:r>
-        <w:rPr>
-          <w:sz w:val="21"/>
-          <w:szCs w:val="21"/>
-        </w:rPr>
-        <w:t xml:space="preserve">&amp;#39;ın sipariş bazlı listesinin aksine)
+        <w:t xml:space="preserve">, </w:t>
+      </w:r>
+      <w:r>
+        <w:rPr>
+          <w:rFonts w:ascii="Consolas" w:cs="Consolas" w:eastAsia="Consolas" w:hAnsi="Consolas"/>
+          <w:color w:val="1F5F56"/>
+          <w:sz w:val="21"/>
+          <w:szCs w:val="21"/>
+        </w:rPr>
+        <w:t xml:space="preserve">/dealer/order-details</w:t>
+      </w:r>
+      <w:r>
+        <w:rPr>
+          <w:sz w:val="21"/>
+          <w:szCs w:val="21"/>
+        </w:rPr>
+        <w:t xml:space="preserve">)
+— sipariş kalemi bazında (mevcut sipariş listesinin aksine)
 filtrelenebilir bir görünüm; hangi ürün hangi bayiye ne zaman gitmiş
-sorgusunu tek satırda cevaplar</w:t>
+sorgusunu tek satırda cevaplar. Bayi tarafında yalnızca kendi
+siparişlerinin kalemleri</w:t>
       </w:r>
     </w:p>
     <w:p>
@@ -5875,10 +5931,27 @@
           <w:sz w:val="21"/>
           <w:szCs w:val="21"/>
         </w:rPr>
-        <w:t xml:space="preserve">) — sistem dışından
-(telefon, e-posta vb.) gelen siparişlerin admin tarafından elle
+        <w:t xml:space="preserve">, </w:t>
+      </w:r>
+      <w:r>
+        <w:rPr>
+          <w:rFonts w:ascii="Consolas" w:cs="Consolas" w:eastAsia="Consolas" w:hAnsi="Consolas"/>
+          <w:color w:val="1F5F56"/>
+          <w:sz w:val="21"/>
+          <w:szCs w:val="21"/>
+        </w:rPr>
+        <w:t xml:space="preserve">/dealer/external-orders</w:t>
+      </w:r>
+      <w:r>
+        <w:rPr>
+          <w:sz w:val="21"/>
+          <w:szCs w:val="21"/>
+        </w:rPr>
+        <w:t xml:space="preserve">)
+— sistem dışından (telefon, e-posta vb.) gelen siparişlerin elle
 girilmesi; mevcut sipariş modeliyle (ürün/bayi/ödeme tipi) aynı
-şemayı kullanır, yalnızca giriş noktası farklı</w:t>
+şemayı kullanır, yalnızca giriş noktası farklı. Bayi kendi dış
+siparişini girip görebilir, başka bayininkini göremez</w:t>
       </w:r>
     </w:p>
     <w:p>
@@ -5901,7 +5974,8 @@
           <w:sz w:val="21"/>
           <w:szCs w:val="21"/>
         </w:rPr>
-        <w:t xml:space="preserve"> üç sayfa da gerçek veriyle çalışıyor; &amp;quot;Yapım
+        <w:t xml:space="preserve"> üç sayfa da hem admin hem bayi panelinde gerçek
+veriyle çalışıyor; bayi girişinde veri kendi kaydıyla sınırlı; &amp;quot;Yapım
 aşamasında&amp;quot; yer tutucusu kaldırılmış.</w:t>
       </w:r>
     </w:p>

</xml_diff>

<commit_message>
Faz 10 (responsive tasarım) tamamlandı, Denetim yer tutucuları eklendi, Raporlar yapım aşamasına alındı
- Mobil hamburger/off-canvas sidebar (admin+dealer), tablo overflow-x-auto sarmalayıcıları, form grid'leri responsive
- src/app/admin/audit ve src/app/dealer/audit için "Yapım aşamasında" yer tutucu sayfalar (Faz 11 hazırlığı)
- Raporlar sayfası ve export/lib kodu kaldırılıp ComingSoon yer tutucusuna çevrildi

Co-Authored-By: Claude Sonnet 5 <noreply@anthropic.com>
Claude-Session: https://claude.ai/code/session_01AM6vn7Z3j8482adzzh9SrV
</commit_message>
<xml_diff>
--- a/docs/output/roadmap.docx
+++ b/docs/output/roadmap.docx
@@ -59,7 +59,7 @@
           <w:sz w:val="17"/>
           <w:szCs w:val="17"/>
         </w:rPr>
-        <w:t xml:space="preserve">Oluşturulma tarihi: 23 Ağustos 2026</w:t>
+        <w:t xml:space="preserve">Oluşturulma tarihi: 12 Eylül 2026</w:t>
       </w:r>
     </w:p>
     <w:p>
@@ -5988,7 +5988,7 @@
         <w:rPr>
           <w:color w:val="1A2420"/>
         </w:rPr>
-        <w:t xml:space="preserve">Faz 10 — Responsive Tasarım</w:t>
+        <w:t xml:space="preserve">Faz 10 — Responsive Tasarım ✅ Tamamlandı</w:t>
       </w:r>
     </w:p>
     <w:p>
@@ -6001,112 +6001,7 @@
           <w:sz w:val="21"/>
           <w:szCs w:val="21"/>
         </w:rPr>
-        <w:t xml:space="preserve">Hedef: Site mobil/tablet ekranlarda kullanılabilir hale gelsin. Şu anki
-durum: sidebar (</w:t>
-      </w:r>
-      <w:r>
-        <w:rPr>
-          <w:rFonts w:ascii="Consolas" w:cs="Consolas" w:eastAsia="Consolas" w:hAnsi="Consolas"/>
-          <w:color w:val="1A2420"/>
-          <w:sz w:val="21"/>
-          <w:szCs w:val="21"/>
-        </w:rPr>
-        <w:t xml:space="preserve">src/app/admin/sidebar.tsx</w:t>
-      </w:r>
-      <w:r>
-        <w:rPr>
-          <w:color w:val="1A2420"/>
-          <w:sz w:val="21"/>
-          <w:szCs w:val="21"/>
-        </w:rPr>
-        <w:t xml:space="preserve">, </w:t>
-      </w:r>
-      <w:r>
-        <w:rPr>
-          <w:rFonts w:ascii="Consolas" w:cs="Consolas" w:eastAsia="Consolas" w:hAnsi="Consolas"/>
-          <w:color w:val="1A2420"/>
-          <w:sz w:val="21"/>
-          <w:szCs w:val="21"/>
-        </w:rPr>
-        <w:t xml:space="preserve">src/app/dealer/layout.tsx</w:t>
-      </w:r>
-      <w:r>
-        <w:rPr>
-          <w:color w:val="1A2420"/>
-          <w:sz w:val="21"/>
-          <w:szCs w:val="21"/>
-        </w:rPr>
-        <w:t xml:space="preserve">)
-dar ekranda daralmıyor/hamburger&amp;#39;e dönüşmüyor, birçok tablo
-</w:t>
-      </w:r>
-      <w:r>
-        <w:rPr>
-          <w:rFonts w:ascii="Consolas" w:cs="Consolas" w:eastAsia="Consolas" w:hAnsi="Consolas"/>
-          <w:color w:val="1A2420"/>
-          <w:sz w:val="21"/>
-          <w:szCs w:val="21"/>
-        </w:rPr>
-        <w:t xml:space="preserve">overflow-x-auto</w:t>
-      </w:r>
-      <w:r>
-        <w:rPr>
-          <w:color w:val="1A2420"/>
-          <w:sz w:val="21"/>
-          <w:szCs w:val="21"/>
-        </w:rPr>
-        <w:t xml:space="preserve"> olmadan taşıyor, </w:t>
-      </w:r>
-      <w:r>
-        <w:rPr>
-          <w:rFonts w:ascii="Consolas" w:cs="Consolas" w:eastAsia="Consolas" w:hAnsi="Consolas"/>
-          <w:color w:val="1A2420"/>
-          <w:sz w:val="21"/>
-          <w:szCs w:val="21"/>
-        </w:rPr>
-        <w:t xml:space="preserve">src/lib/ui.ts</w:t>
-      </w:r>
-      <w:r>
-        <w:rPr>
-          <w:color w:val="1A2420"/>
-          <w:sz w:val="21"/>
-          <w:szCs w:val="21"/>
-        </w:rPr>
-        <w:t xml:space="preserve">/</w:t>
-      </w:r>
-      <w:r>
-        <w:rPr>
-          <w:rFonts w:ascii="Consolas" w:cs="Consolas" w:eastAsia="Consolas" w:hAnsi="Consolas"/>
-          <w:color w:val="1A2420"/>
-          <w:sz w:val="21"/>
-          <w:szCs w:val="21"/>
-        </w:rPr>
-        <w:t xml:space="preserve">globals.css</w:t>
-      </w:r>
-      <w:r>
-        <w:rPr>
-          <w:color w:val="1A2420"/>
-          <w:sz w:val="21"/>
-          <w:szCs w:val="21"/>
-        </w:rPr>
-        <w:t xml:space="preserve">&amp;#39;te hiç
-breakpoint tanımlı değil. Üç aşamaya ayrılıyor, her biri bağımsız
-uygulanabilir ama bu sırayla en çok görsel etkiyi en düşük riskle verir.</w:t>
-      </w:r>
-    </w:p>
-    <w:p>
-      <w:pPr>
-        <w:spacing w:after="120"/>
-      </w:pPr>
-      <w:r>
-        <w:rPr>
-          <w:b/>
-          <w:bCs/>
-          <w:color w:val="1A2420"/>
-          <w:sz w:val="21"/>
-          <w:szCs w:val="21"/>
-        </w:rPr>
-        <w:t xml:space="preserve">10.1 — Mobil sidebar</w:t>
+        <w:t xml:space="preserve">Hedef: Site mobil/tablet ekranlarda kullanılabilir hale gelsin.</w:t>
       </w:r>
     </w:p>
     <w:p>
@@ -6123,24 +6018,362 @@
           <w:sz w:val="21"/>
           <w:szCs w:val="21"/>
         </w:rPr>
-        <w:t xml:space="preserve">Hem admin hem dealer sidebar&amp;#39;ını aynı anda düzelten paylaşılan bir
-off-canvas/hamburger bileşeni — dar ekranda sidebar gizlenir, bir
-hamburger butonuyla üstten açılır</w:t>
-      </w:r>
-    </w:p>
-    <w:p>
-      <w:pPr>
-        <w:spacing w:after="120"/>
-      </w:pPr>
-      <w:r>
-        <w:rPr>
-          <w:b/>
-          <w:bCs/>
-          <w:color w:val="1A2420"/>
-          <w:sz w:val="21"/>
-          <w:szCs w:val="21"/>
-        </w:rPr>
-        <w:t xml:space="preserve">10.2 — Tablo taşmalarını sarmala</w:t>
+        <w:t xml:space="preserve">10.1 — Mobil sidebar</w:t>
+      </w:r>
+      <w:r>
+        <w:rPr>
+          <w:sz w:val="21"/>
+          <w:szCs w:val="21"/>
+        </w:rPr>
+        <w:t xml:space="preserve"> — ✅ Tamamlandı. Paylaşılan
+</w:t>
+      </w:r>
+      <w:r>
+        <w:rPr>
+          <w:rFonts w:ascii="Consolas" w:cs="Consolas" w:eastAsia="Consolas" w:hAnsi="Consolas"/>
+          <w:color w:val="1F5F56"/>
+          <w:sz w:val="21"/>
+          <w:szCs w:val="21"/>
+        </w:rPr>
+        <w:t xml:space="preserve">src/components/mobile-nav-context.tsx</w:t>
+      </w:r>
+      <w:r>
+        <w:rPr>
+          <w:sz w:val="21"/>
+          <w:szCs w:val="21"/>
+        </w:rPr>
+        <w:t xml:space="preserve"> (</w:t>
+      </w:r>
+      <w:r>
+        <w:rPr>
+          <w:rFonts w:ascii="Consolas" w:cs="Consolas" w:eastAsia="Consolas" w:hAnsi="Consolas"/>
+          <w:color w:val="1F5F56"/>
+          <w:sz w:val="21"/>
+          <w:szCs w:val="21"/>
+        </w:rPr>
+        <w:t xml:space="preserve">MobileNavProvider</w:t>
+      </w:r>
+      <w:r>
+        <w:rPr>
+          <w:sz w:val="21"/>
+          <w:szCs w:val="21"/>
+        </w:rPr>
+        <w:t xml:space="preserve">/
+</w:t>
+      </w:r>
+      <w:r>
+        <w:rPr>
+          <w:rFonts w:ascii="Consolas" w:cs="Consolas" w:eastAsia="Consolas" w:hAnsi="Consolas"/>
+          <w:color w:val="1F5F56"/>
+          <w:sz w:val="21"/>
+          <w:szCs w:val="21"/>
+        </w:rPr>
+        <w:t xml:space="preserve">useMobileNav</w:t>
+      </w:r>
+      <w:r>
+        <w:rPr>
+          <w:sz w:val="21"/>
+          <w:szCs w:val="21"/>
+        </w:rPr>
+        <w:t xml:space="preserve">, dealer&amp;#39;daki </w:t>
+      </w:r>
+      <w:r>
+        <w:rPr>
+          <w:rFonts w:ascii="Consolas" w:cs="Consolas" w:eastAsia="Consolas" w:hAnsi="Consolas"/>
+          <w:color w:val="1F5F56"/>
+          <w:sz w:val="21"/>
+          <w:szCs w:val="21"/>
+        </w:rPr>
+        <w:t xml:space="preserve">CartProvider</w:t>
+      </w:r>
+      <w:r>
+        <w:rPr>
+          <w:sz w:val="21"/>
+          <w:szCs w:val="21"/>
+        </w:rPr>
+        <w:t xml:space="preserve">/</w:t>
+      </w:r>
+      <w:r>
+        <w:rPr>
+          <w:rFonts w:ascii="Consolas" w:cs="Consolas" w:eastAsia="Consolas" w:hAnsi="Consolas"/>
+          <w:color w:val="1F5F56"/>
+          <w:sz w:val="21"/>
+          <w:szCs w:val="21"/>
+        </w:rPr>
+        <w:t xml:space="preserve">useCart</w:t>
+      </w:r>
+      <w:r>
+        <w:rPr>
+          <w:sz w:val="21"/>
+          <w:szCs w:val="21"/>
+        </w:rPr>
+        <w:t xml:space="preserve"> deseniyle aynı) +
+</w:t>
+      </w:r>
+      <w:r>
+        <w:rPr>
+          <w:rFonts w:ascii="Consolas" w:cs="Consolas" w:eastAsia="Consolas" w:hAnsi="Consolas"/>
+          <w:color w:val="1F5F56"/>
+          <w:sz w:val="21"/>
+          <w:szCs w:val="21"/>
+        </w:rPr>
+        <w:t xml:space="preserve">mobile-nav-toggle.tsx</w:t>
+      </w:r>
+      <w:r>
+        <w:rPr>
+          <w:sz w:val="21"/>
+          <w:szCs w:val="21"/>
+        </w:rPr>
+        <w:t xml:space="preserve"> (hamburger, </w:t>
+      </w:r>
+      <w:r>
+        <w:rPr>
+          <w:rFonts w:ascii="Consolas" w:cs="Consolas" w:eastAsia="Consolas" w:hAnsi="Consolas"/>
+          <w:color w:val="1F5F56"/>
+          <w:sz w:val="21"/>
+          <w:szCs w:val="21"/>
+        </w:rPr>
+        <w:t xml:space="preserve">CartDrawerTrigger</w:t>
+      </w:r>
+      <w:r>
+        <w:rPr>
+          <w:sz w:val="21"/>
+          <w:szCs w:val="21"/>
+        </w:rPr>
+        <w:t xml:space="preserve"> ikon
+butonuyla aynı stil). </w:t>
+      </w:r>
+      <w:r>
+        <w:rPr>
+          <w:rFonts w:ascii="Consolas" w:cs="Consolas" w:eastAsia="Consolas" w:hAnsi="Consolas"/>
+          <w:color w:val="1F5F56"/>
+          <w:sz w:val="21"/>
+          <w:szCs w:val="21"/>
+        </w:rPr>
+        <w:t xml:space="preserve">md</w:t>
+      </w:r>
+      <w:r>
+        <w:rPr>
+          <w:sz w:val="21"/>
+          <w:szCs w:val="21"/>
+        </w:rPr>
+        <w:t xml:space="preserve"> altında admin/dealer sidebar&amp;#39;ları
+(</w:t>
+      </w:r>
+      <w:r>
+        <w:rPr>
+          <w:rFonts w:ascii="Consolas" w:cs="Consolas" w:eastAsia="Consolas" w:hAnsi="Consolas"/>
+          <w:color w:val="1F5F56"/>
+          <w:sz w:val="21"/>
+          <w:szCs w:val="21"/>
+        </w:rPr>
+        <w:t xml:space="preserve">sidebar.tsx</w:t>
+      </w:r>
+      <w:r>
+        <w:rPr>
+          <w:sz w:val="21"/>
+          <w:szCs w:val="21"/>
+        </w:rPr>
+        <w:t xml:space="preserve">) </w:t>
+      </w:r>
+      <w:r>
+        <w:rPr>
+          <w:rFonts w:ascii="Consolas" w:cs="Consolas" w:eastAsia="Consolas" w:hAnsi="Consolas"/>
+          <w:color w:val="1F5F56"/>
+          <w:sz w:val="21"/>
+          <w:szCs w:val="21"/>
+        </w:rPr>
+        <w:t xml:space="preserve">fixed</w:t>
+      </w:r>
+      <w:r>
+        <w:rPr>
+          <w:sz w:val="21"/>
+          <w:szCs w:val="21"/>
+        </w:rPr>
+        <w:t xml:space="preserve">+</w:t>
+      </w:r>
+      <w:r>
+        <w:rPr>
+          <w:rFonts w:ascii="Consolas" w:cs="Consolas" w:eastAsia="Consolas" w:hAnsi="Consolas"/>
+          <w:color w:val="1F5F56"/>
+          <w:sz w:val="21"/>
+          <w:szCs w:val="21"/>
+        </w:rPr>
+        <w:t xml:space="preserve">-translate-x-full</w:t>
+      </w:r>
+      <w:r>
+        <w:rPr>
+          <w:sz w:val="21"/>
+          <w:szCs w:val="21"/>
+        </w:rPr>
+        <w:t xml:space="preserve">/</w:t>
+      </w:r>
+      <w:r>
+        <w:rPr>
+          <w:rFonts w:ascii="Consolas" w:cs="Consolas" w:eastAsia="Consolas" w:hAnsi="Consolas"/>
+          <w:color w:val="1F5F56"/>
+          <w:sz w:val="21"/>
+          <w:szCs w:val="21"/>
+        </w:rPr>
+        <w:t xml:space="preserve">translate-x-0</w:t>
+      </w:r>
+      <w:r>
+        <w:rPr>
+          <w:sz w:val="21"/>
+          <w:szCs w:val="21"/>
+        </w:rPr>
+        <w:t xml:space="preserve"> ile
+off-canvas&amp;#39;a dönüyor, karartılmış bir backdrop&amp;#39;la (</w:t>
+      </w:r>
+      <w:r>
+        <w:rPr>
+          <w:rFonts w:ascii="Consolas" w:cs="Consolas" w:eastAsia="Consolas" w:hAnsi="Consolas"/>
+          <w:color w:val="1F5F56"/>
+          <w:sz w:val="21"/>
+          <w:szCs w:val="21"/>
+        </w:rPr>
+        <w:t xml:space="preserve">md:hidden</w:t>
+      </w:r>
+      <w:r>
+        <w:rPr>
+          <w:sz w:val="21"/>
+          <w:szCs w:val="21"/>
+        </w:rPr>
+        <w:t xml:space="preserve">)
+açılıp kapanıyor, rota değişince otomatik kapanıyor; </w:t>
+      </w:r>
+      <w:r>
+        <w:rPr>
+          <w:rFonts w:ascii="Consolas" w:cs="Consolas" w:eastAsia="Consolas" w:hAnsi="Consolas"/>
+          <w:color w:val="1F5F56"/>
+          <w:sz w:val="21"/>
+          <w:szCs w:val="21"/>
+        </w:rPr>
+        <w:t xml:space="preserve">md</w:t>
+      </w:r>
+      <w:r>
+        <w:rPr>
+          <w:sz w:val="21"/>
+          <w:szCs w:val="21"/>
+        </w:rPr>
+        <w:t xml:space="preserve"> ve üstünde
+önceki sticky/daraltılabilir davranış birebir korunuyor (mobilde
+masaüstü &amp;quot;daralt&amp;quot; tercihi görmezden geliniyor, o zaten tüm genişlikte
+açılan bir overlay). Header&amp;#39;lar (</w:t>
+      </w:r>
+      <w:r>
+        <w:rPr>
+          <w:rFonts w:ascii="Consolas" w:cs="Consolas" w:eastAsia="Consolas" w:hAnsi="Consolas"/>
+          <w:color w:val="1F5F56"/>
+          <w:sz w:val="21"/>
+          <w:szCs w:val="21"/>
+        </w:rPr>
+        <w:t xml:space="preserve">admin/layout.tsx</w:t>
+      </w:r>
+      <w:r>
+        <w:rPr>
+          <w:sz w:val="21"/>
+          <w:szCs w:val="21"/>
+        </w:rPr>
+        <w:t xml:space="preserve">,
+</w:t>
+      </w:r>
+      <w:r>
+        <w:rPr>
+          <w:rFonts w:ascii="Consolas" w:cs="Consolas" w:eastAsia="Consolas" w:hAnsi="Consolas"/>
+          <w:color w:val="1F5F56"/>
+          <w:sz w:val="21"/>
+          <w:szCs w:val="21"/>
+        </w:rPr>
+        <w:t xml:space="preserve">dealer/layout.tsx</w:t>
+      </w:r>
+      <w:r>
+        <w:rPr>
+          <w:sz w:val="21"/>
+          <w:szCs w:val="21"/>
+        </w:rPr>
+        <w:t xml:space="preserve">) da daraltıldı: tarih </w:t>
+      </w:r>
+      <w:r>
+        <w:rPr>
+          <w:rFonts w:ascii="Consolas" w:cs="Consolas" w:eastAsia="Consolas" w:hAnsi="Consolas"/>
+          <w:color w:val="1F5F56"/>
+          <w:sz w:val="21"/>
+          <w:szCs w:val="21"/>
+        </w:rPr>
+        <w:t xml:space="preserve">sm</w:t>
+      </w:r>
+      <w:r>
+        <w:rPr>
+          <w:sz w:val="21"/>
+          <w:szCs w:val="21"/>
+        </w:rPr>
+        <w:t xml:space="preserve"> altında gizleniyor,
+e-posta </w:t>
+      </w:r>
+      <w:r>
+        <w:rPr>
+          <w:rFonts w:ascii="Consolas" w:cs="Consolas" w:eastAsia="Consolas" w:hAnsi="Consolas"/>
+          <w:color w:val="1F5F56"/>
+          <w:sz w:val="21"/>
+          <w:szCs w:val="21"/>
+        </w:rPr>
+        <w:t xml:space="preserve">truncate</w:t>
+      </w:r>
+      <w:r>
+        <w:rPr>
+          <w:sz w:val="21"/>
+          <w:szCs w:val="21"/>
+        </w:rPr>
+        <w:t xml:space="preserve">, </w:t>
+      </w:r>
+      <w:r>
+        <w:rPr>
+          <w:rFonts w:ascii="Consolas" w:cs="Consolas" w:eastAsia="Consolas" w:hAnsi="Consolas"/>
+          <w:color w:val="1F5F56"/>
+          <w:sz w:val="21"/>
+          <w:szCs w:val="21"/>
+        </w:rPr>
+        <w:t xml:space="preserve">main</w:t>
+      </w:r>
+      <w:r>
+        <w:rPr>
+          <w:sz w:val="21"/>
+          <w:szCs w:val="21"/>
+        </w:rPr>
+        <w:t xml:space="preserve">/</w:t>
+      </w:r>
+      <w:r>
+        <w:rPr>
+          <w:rFonts w:ascii="Consolas" w:cs="Consolas" w:eastAsia="Consolas" w:hAnsi="Consolas"/>
+          <w:color w:val="1F5F56"/>
+          <w:sz w:val="21"/>
+          <w:szCs w:val="21"/>
+        </w:rPr>
+        <w:t xml:space="preserve">header</w:t>
+      </w:r>
+      <w:r>
+        <w:rPr>
+          <w:sz w:val="21"/>
+          <w:szCs w:val="21"/>
+        </w:rPr>
+        <w:t xml:space="preserve"> padding&amp;#39;i </w:t>
+      </w:r>
+      <w:r>
+        <w:rPr>
+          <w:rFonts w:ascii="Consolas" w:cs="Consolas" w:eastAsia="Consolas" w:hAnsi="Consolas"/>
+          <w:color w:val="1F5F56"/>
+          <w:sz w:val="21"/>
+          <w:szCs w:val="21"/>
+        </w:rPr>
+        <w:t xml:space="preserve">px-4</w:t>
+      </w:r>
+      <w:r>
+        <w:rPr>
+          <w:sz w:val="21"/>
+          <w:szCs w:val="21"/>
+        </w:rPr>
+        <w:t xml:space="preserve">&amp;#39;e düşüyor.</w:t>
       </w:r>
     </w:p>
     <w:p>
@@ -6157,7 +6390,15 @@
           <w:sz w:val="21"/>
           <w:szCs w:val="21"/>
         </w:rPr>
-        <w:t xml:space="preserve">Tüm </w:t>
+        <w:t xml:space="preserve">10.2 — Tablo taşmalarını sarmala</w:t>
+      </w:r>
+      <w:r>
+        <w:rPr>
+          <w:sz w:val="21"/>
+          <w:szCs w:val="21"/>
+        </w:rPr>
+        <w:t xml:space="preserve"> — ✅ Tamamlandı. 12 dosyadaki 17
+</w:t>
       </w:r>
       <w:r>
         <w:rPr>
@@ -6173,39 +6414,56 @@
           <w:sz w:val="21"/>
           <w:szCs w:val="21"/>
         </w:rPr>
-        <w:t xml:space="preserve"> içeren ekranlar (</w:t>
-      </w:r>
-      <w:r>
-        <w:rPr>
-          <w:rFonts w:ascii="Consolas" w:cs="Consolas" w:eastAsia="Consolas" w:hAnsi="Consolas"/>
-          <w:color w:val="1F5F56"/>
-          <w:sz w:val="21"/>
-          <w:szCs w:val="21"/>
-        </w:rPr>
-        <w:t xml:space="preserve">/admin/orders</w:t>
-      </w:r>
-      <w:r>
-        <w:rPr>
-          <w:sz w:val="21"/>
-          <w:szCs w:val="21"/>
-        </w:rPr>
-        <w:t xml:space="preserve">, </w:t>
-      </w:r>
-      <w:r>
-        <w:rPr>
-          <w:rFonts w:ascii="Consolas" w:cs="Consolas" w:eastAsia="Consolas" w:hAnsi="Consolas"/>
-          <w:color w:val="1F5F56"/>
-          <w:sz w:val="21"/>
-          <w:szCs w:val="21"/>
-        </w:rPr>
-        <w:t xml:space="preserve">/admin/products</w:t>
-      </w:r>
-      <w:r>
-        <w:rPr>
-          <w:sz w:val="21"/>
-          <w:szCs w:val="21"/>
-        </w:rPr>
-        <w:t xml:space="preserve">,
+        <w:t xml:space="preserve"> de </w:t>
+      </w:r>
+      <w:r>
+        <w:rPr>
+          <w:rFonts w:ascii="Consolas" w:cs="Consolas" w:eastAsia="Consolas" w:hAnsi="Consolas"/>
+          <w:color w:val="1F5F56"/>
+          <w:sz w:val="21"/>
+          <w:szCs w:val="21"/>
+        </w:rPr>
+        <w:t xml:space="preserve">overflow-x-auto</w:t>
+      </w:r>
+      <w:r>
+        <w:rPr>
+          <w:sz w:val="21"/>
+          <w:szCs w:val="21"/>
+        </w:rPr>
+        <w:t xml:space="preserve"> kapsayıcıya alındı. Bunu yaparken asıl
+hata ortaya çıktı: </w:t>
+      </w:r>
+      <w:r>
+        <w:rPr>
+          <w:rFonts w:ascii="Consolas" w:cs="Consolas" w:eastAsia="Consolas" w:hAnsi="Consolas"/>
+          <w:color w:val="1F5F56"/>
+          <w:sz w:val="21"/>
+          <w:szCs w:val="21"/>
+        </w:rPr>
+        <w:t xml:space="preserve">admin/layout.tsx</w:t>
+      </w:r>
+      <w:r>
+        <w:rPr>
+          <w:sz w:val="21"/>
+          <w:szCs w:val="21"/>
+        </w:rPr>
+        <w:t xml:space="preserve">/</w:t>
+      </w:r>
+      <w:r>
+        <w:rPr>
+          <w:rFonts w:ascii="Consolas" w:cs="Consolas" w:eastAsia="Consolas" w:hAnsi="Consolas"/>
+          <w:color w:val="1F5F56"/>
+          <w:sz w:val="21"/>
+          <w:szCs w:val="21"/>
+        </w:rPr>
+        <w:t xml:space="preserve">dealer/layout.tsx</w:t>
+      </w:r>
+      <w:r>
+        <w:rPr>
+          <w:sz w:val="21"/>
+          <w:szCs w:val="21"/>
+        </w:rPr>
+        <w:t xml:space="preserve">&amp;#39;teki iç içe
 </w:t>
       </w:r>
       <w:r>
@@ -6215,14 +6473,31 @@
           <w:sz w:val="21"/>
           <w:szCs w:val="21"/>
         </w:rPr>
-        <w:t xml:space="preserve">/admin/brands</w:t>
-      </w:r>
-      <w:r>
-        <w:rPr>
-          <w:sz w:val="21"/>
-          <w:szCs w:val="21"/>
-        </w:rPr>
-        <w:t xml:space="preserve"> bayi listesi, dealer sipariş geçmişi vb.)
+        <w:t xml:space="preserve">flex flex-1</w:t>
+      </w:r>
+      <w:r>
+        <w:rPr>
+          <w:sz w:val="21"/>
+          <w:szCs w:val="21"/>
+        </w:rPr>
+        <w:t xml:space="preserve"> kapsayıcılarında </w:t>
+      </w:r>
+      <w:r>
+        <w:rPr>
+          <w:rFonts w:ascii="Consolas" w:cs="Consolas" w:eastAsia="Consolas" w:hAnsi="Consolas"/>
+          <w:color w:val="1F5F56"/>
+          <w:sz w:val="21"/>
+          <w:szCs w:val="21"/>
+        </w:rPr>
+        <w:t xml:space="preserve">min-w-0</w:t>
+      </w:r>
+      <w:r>
+        <w:rPr>
+          <w:sz w:val="21"/>
+          <w:szCs w:val="21"/>
+        </w:rPr>
+        <w:t xml:space="preserve"> olmadığından, tablo
+sarmalayıcısı içeride doğru scroll etse bile üstteki flex zincirinin
 </w:t>
       </w:r>
       <w:r>
@@ -6232,30 +6507,81 @@
           <w:sz w:val="21"/>
           <w:szCs w:val="21"/>
         </w:rPr>
-        <w:t xml:space="preserve">overflow-x-auto</w:t>
-      </w:r>
-      <w:r>
-        <w:rPr>
-          <w:sz w:val="21"/>
-          <w:szCs w:val="21"/>
-        </w:rPr>
-        <w:t xml:space="preserve"> kapsayıcıya alınır — mekanik, düşük riskli, tek tek
-test edilecek ama tasarım kararı gerektirmiyor</w:t>
-      </w:r>
-    </w:p>
-    <w:p>
-      <w:pPr>
-        <w:spacing w:after="120"/>
-      </w:pPr>
+        <w:t xml:space="preserve">min-width: auto</w:t>
+      </w:r>
+      <w:r>
+        <w:rPr>
+          <w:sz w:val="21"/>
+          <w:szCs w:val="21"/>
+        </w:rPr>
+        <w:t xml:space="preserve"> varsayılanı yüzünden </w:t>
+      </w:r>
       <w:r>
         <w:rPr>
           <w:b/>
           <w:bCs/>
-          <w:color w:val="1A2420"/>
-          <w:sz w:val="21"/>
-          <w:szCs w:val="21"/>
-        </w:rPr>
-        <w:t xml:space="preserve">10.3 — Sayfa/grid düzenlerini gözden geçir</w:t>
+          <w:sz w:val="21"/>
+          <w:szCs w:val="21"/>
+        </w:rPr>
+        <w:t xml:space="preserve">tüm sayfa</w:t>
+      </w:r>
+      <w:r>
+        <w:rPr>
+          <w:sz w:val="21"/>
+          <w:szCs w:val="21"/>
+        </w:rPr>
+        <w:t xml:space="preserve"> yatay kaydırma
+kazanıyordu — 375px&amp;#39;te fark edilmeyen ama gerçek cihazda görülecek bir
+bug. </w:t>
+      </w:r>
+      <w:r>
+        <w:rPr>
+          <w:rFonts w:ascii="Consolas" w:cs="Consolas" w:eastAsia="Consolas" w:hAnsi="Consolas"/>
+          <w:color w:val="1F5F56"/>
+          <w:sz w:val="21"/>
+          <w:szCs w:val="21"/>
+        </w:rPr>
+        <w:t xml:space="preserve">min-w-0</w:t>
+      </w:r>
+      <w:r>
+        <w:rPr>
+          <w:sz w:val="21"/>
+          <w:szCs w:val="21"/>
+        </w:rPr>
+        <w:t xml:space="preserve"> hem </w:t>
+      </w:r>
+      <w:r>
+        <w:rPr>
+          <w:rFonts w:ascii="Consolas" w:cs="Consolas" w:eastAsia="Consolas" w:hAnsi="Consolas"/>
+          <w:color w:val="1F5F56"/>
+          <w:sz w:val="21"/>
+          <w:szCs w:val="21"/>
+        </w:rPr>
+        <w:t xml:space="preserve">&amp;lt;div className=&amp;quot;flex ... flex-col&amp;quot;&amp;gt;</w:t>
+      </w:r>
+      <w:r>
+        <w:rPr>
+          <w:sz w:val="21"/>
+          <w:szCs w:val="21"/>
+        </w:rPr>
+        <w:t xml:space="preserve"> sarmalayıcıya
+hem </w:t>
+      </w:r>
+      <w:r>
+        <w:rPr>
+          <w:rFonts w:ascii="Consolas" w:cs="Consolas" w:eastAsia="Consolas" w:hAnsi="Consolas"/>
+          <w:color w:val="1F5F56"/>
+          <w:sz w:val="21"/>
+          <w:szCs w:val="21"/>
+        </w:rPr>
+        <w:t xml:space="preserve">&amp;lt;main&amp;gt;</w:t>
+      </w:r>
+      <w:r>
+        <w:rPr>
+          <w:sz w:val="21"/>
+          <w:szCs w:val="21"/>
+        </w:rPr>
+        <w:t xml:space="preserve">&amp;#39;e eklenerek çözüldü.</w:t>
       </w:r>
     </w:p>
     <w:p>
@@ -6272,56 +6598,213 @@
           <w:sz w:val="21"/>
           <w:szCs w:val="21"/>
         </w:rPr>
-        <w:t xml:space="preserve">Kalan sayfa/grid düzenleri (stat kartları, form grid&amp;#39;leri, modal
-genişlikleri) breakpoint&amp;#39;lerle (</w:t>
-      </w:r>
-      <w:r>
-        <w:rPr>
-          <w:rFonts w:ascii="Consolas" w:cs="Consolas" w:eastAsia="Consolas" w:hAnsi="Consolas"/>
-          <w:color w:val="1F5F56"/>
-          <w:sz w:val="21"/>
-          <w:szCs w:val="21"/>
-        </w:rPr>
-        <w:t xml:space="preserve">sm:</w:t>
-      </w:r>
-      <w:r>
-        <w:rPr>
-          <w:sz w:val="21"/>
-          <w:szCs w:val="21"/>
-        </w:rPr>
-        <w:t xml:space="preserve">/</w:t>
-      </w:r>
-      <w:r>
-        <w:rPr>
-          <w:rFonts w:ascii="Consolas" w:cs="Consolas" w:eastAsia="Consolas" w:hAnsi="Consolas"/>
-          <w:color w:val="1F5F56"/>
-          <w:sz w:val="21"/>
-          <w:szCs w:val="21"/>
-        </w:rPr>
-        <w:t xml:space="preserve">md:</w:t>
-      </w:r>
-      <w:r>
-        <w:rPr>
-          <w:sz w:val="21"/>
-          <w:szCs w:val="21"/>
-        </w:rPr>
-        <w:t xml:space="preserve">/</w:t>
-      </w:r>
-      <w:r>
-        <w:rPr>
-          <w:rFonts w:ascii="Consolas" w:cs="Consolas" w:eastAsia="Consolas" w:hAnsi="Consolas"/>
-          <w:color w:val="1F5F56"/>
-          <w:sz w:val="21"/>
-          <w:szCs w:val="21"/>
-        </w:rPr>
-        <w:t xml:space="preserve">lg:</w:t>
-      </w:r>
-      <w:r>
-        <w:rPr>
-          <w:sz w:val="21"/>
-          <w:szCs w:val="21"/>
-        </w:rPr>
-        <w:t xml:space="preserve">) gözden geçirilir</w:t>
+        <w:t xml:space="preserve">10.3 — Sayfa/grid düzenlerini gözden geçir</w:t>
+      </w:r>
+      <w:r>
+        <w:rPr>
+          <w:sz w:val="21"/>
+          <w:szCs w:val="21"/>
+        </w:rPr>
+        <w:t xml:space="preserve"> — ✅ Tamamlandı. Sabit
+</w:t>
+      </w:r>
+      <w:r>
+        <w:rPr>
+          <w:rFonts w:ascii="Consolas" w:cs="Consolas" w:eastAsia="Consolas" w:hAnsi="Consolas"/>
+          <w:color w:val="1F5F56"/>
+          <w:sz w:val="21"/>
+          <w:szCs w:val="21"/>
+        </w:rPr>
+        <w:t xml:space="preserve">grid-cols-2</w:t>
+      </w:r>
+      <w:r>
+        <w:rPr>
+          <w:sz w:val="21"/>
+          <w:szCs w:val="21"/>
+        </w:rPr>
+        <w:t xml:space="preserve"> form grid&amp;#39;leri (</w:t>
+      </w:r>
+      <w:r>
+        <w:rPr>
+          <w:rFonts w:ascii="Consolas" w:cs="Consolas" w:eastAsia="Consolas" w:hAnsi="Consolas"/>
+          <w:color w:val="1F5F56"/>
+          <w:sz w:val="21"/>
+          <w:szCs w:val="21"/>
+        </w:rPr>
+        <w:t xml:space="preserve">add-user-modal.tsx</w:t>
+      </w:r>
+      <w:r>
+        <w:rPr>
+          <w:sz w:val="21"/>
+          <w:szCs w:val="21"/>
+        </w:rPr>
+        <w:t xml:space="preserve"> ×4,
+</w:t>
+      </w:r>
+      <w:r>
+        <w:rPr>
+          <w:rFonts w:ascii="Consolas" w:cs="Consolas" w:eastAsia="Consolas" w:hAnsi="Consolas"/>
+          <w:color w:val="1F5F56"/>
+          <w:sz w:val="21"/>
+          <w:szCs w:val="21"/>
+        </w:rPr>
+        <w:t xml:space="preserve">edit-product-modal.tsx</w:t>
+      </w:r>
+      <w:r>
+        <w:rPr>
+          <w:sz w:val="21"/>
+          <w:szCs w:val="21"/>
+        </w:rPr>
+        <w:t xml:space="preserve"> ×2, </w:t>
+      </w:r>
+      <w:r>
+        <w:rPr>
+          <w:rFonts w:ascii="Consolas" w:cs="Consolas" w:eastAsia="Consolas" w:hAnsi="Consolas"/>
+          <w:color w:val="1F5F56"/>
+          <w:sz w:val="21"/>
+          <w:szCs w:val="21"/>
+        </w:rPr>
+        <w:t xml:space="preserve">dealers/[id]/page.tsx</w:t>
+      </w:r>
+      <w:r>
+        <w:rPr>
+          <w:sz w:val="21"/>
+          <w:szCs w:val="21"/>
+        </w:rPr>
+        <w:t xml:space="preserve"> ×1)
+</w:t>
+      </w:r>
+      <w:r>
+        <w:rPr>
+          <w:rFonts w:ascii="Consolas" w:cs="Consolas" w:eastAsia="Consolas" w:hAnsi="Consolas"/>
+          <w:color w:val="1F5F56"/>
+          <w:sz w:val="21"/>
+          <w:szCs w:val="21"/>
+        </w:rPr>
+        <w:t xml:space="preserve">grid-cols-1 sm:grid-cols-2</w:t>
+      </w:r>
+      <w:r>
+        <w:rPr>
+          <w:sz w:val="21"/>
+          <w:szCs w:val="21"/>
+        </w:rPr>
+        <w:t xml:space="preserve"> yapıldı. Filtre/araç çubukları
+(</w:t>
+      </w:r>
+      <w:r>
+        <w:rPr>
+          <w:rFonts w:ascii="Consolas" w:cs="Consolas" w:eastAsia="Consolas" w:hAnsi="Consolas"/>
+          <w:color w:val="1F5F56"/>
+          <w:sz w:val="21"/>
+          <w:szCs w:val="21"/>
+        </w:rPr>
+        <w:t xml:space="preserve">period-filter.tsx</w:t>
+      </w:r>
+      <w:r>
+        <w:rPr>
+          <w:sz w:val="21"/>
+          <w:szCs w:val="21"/>
+        </w:rPr>
+        <w:t xml:space="preserve">, </w:t>
+      </w:r>
+      <w:r>
+        <w:rPr>
+          <w:rFonts w:ascii="Consolas" w:cs="Consolas" w:eastAsia="Consolas" w:hAnsi="Consolas"/>
+          <w:color w:val="1F5F56"/>
+          <w:sz w:val="21"/>
+          <w:szCs w:val="21"/>
+        </w:rPr>
+        <w:t xml:space="preserve">brand-filter-buttons.tsx</w:t>
+      </w:r>
+      <w:r>
+        <w:rPr>
+          <w:sz w:val="21"/>
+          <w:szCs w:val="21"/>
+        </w:rPr>
+        <w:t xml:space="preserve">,
+</w:t>
+      </w:r>
+      <w:r>
+        <w:rPr>
+          <w:rFonts w:ascii="Consolas" w:cs="Consolas" w:eastAsia="Consolas" w:hAnsi="Consolas"/>
+          <w:color w:val="1F5F56"/>
+          <w:sz w:val="21"/>
+          <w:szCs w:val="21"/>
+        </w:rPr>
+        <w:t xml:space="preserve">dealer-filter-form.tsx</w:t>
+      </w:r>
+      <w:r>
+        <w:rPr>
+          <w:sz w:val="21"/>
+          <w:szCs w:val="21"/>
+        </w:rPr>
+        <w:t xml:space="preserve">) zaten </w:t>
+      </w:r>
+      <w:r>
+        <w:rPr>
+          <w:rFonts w:ascii="Consolas" w:cs="Consolas" w:eastAsia="Consolas" w:hAnsi="Consolas"/>
+          <w:color w:val="1F5F56"/>
+          <w:sz w:val="21"/>
+          <w:szCs w:val="21"/>
+        </w:rPr>
+        <w:t xml:space="preserve">flex-wrap</w:t>
+      </w:r>
+      <w:r>
+        <w:rPr>
+          <w:sz w:val="21"/>
+          <w:szCs w:val="21"/>
+        </w:rPr>
+        <w:t xml:space="preserve"> kullanıyordu, değişiklik
+gerekmedi; stat kartı grid&amp;#39;leri (</w:t>
+      </w:r>
+      <w:r>
+        <w:rPr>
+          <w:rFonts w:ascii="Consolas" w:cs="Consolas" w:eastAsia="Consolas" w:hAnsi="Consolas"/>
+          <w:color w:val="1F5F56"/>
+          <w:sz w:val="21"/>
+          <w:szCs w:val="21"/>
+        </w:rPr>
+        <w:t xml:space="preserve">admin/page.tsx</w:t>
+      </w:r>
+      <w:r>
+        <w:rPr>
+          <w:sz w:val="21"/>
+          <w:szCs w:val="21"/>
+        </w:rPr>
+        <w:t xml:space="preserve">, </w:t>
+      </w:r>
+      <w:r>
+        <w:rPr>
+          <w:rFonts w:ascii="Consolas" w:cs="Consolas" w:eastAsia="Consolas" w:hAnsi="Consolas"/>
+          <w:color w:val="1F5F56"/>
+          <w:sz w:val="21"/>
+          <w:szCs w:val="21"/>
+        </w:rPr>
+        <w:t xml:space="preserve">dealer/page.tsx</w:t>
+      </w:r>
+      <w:r>
+        <w:rPr>
+          <w:sz w:val="21"/>
+          <w:szCs w:val="21"/>
+        </w:rPr>
+        <w:t xml:space="preserve">,
+</w:t>
+      </w:r>
+      <w:r>
+        <w:rPr>
+          <w:rFonts w:ascii="Consolas" w:cs="Consolas" w:eastAsia="Consolas" w:hAnsi="Consolas"/>
+          <w:color w:val="1F5F56"/>
+          <w:sz w:val="21"/>
+          <w:szCs w:val="21"/>
+        </w:rPr>
+        <w:t xml:space="preserve">ledger/page.tsx</w:t>
+      </w:r>
+      <w:r>
+        <w:rPr>
+          <w:sz w:val="21"/>
+          <w:szCs w:val="21"/>
+        </w:rPr>
+        <w:t xml:space="preserve">) zaten responsive&amp;#39;ti.</w:t>
       </w:r>
     </w:p>
     <w:p>
@@ -6346,7 +6829,828 @@
         </w:rPr>
         <w:t xml:space="preserve"> admin ve dealer panelleri bir telefon ekranında
 (375px genişlik) yatay kaydırma gerektirmeden, sidebar erişilebilir
-şekilde kullanılabiliyor.</w:t>
+şekilde kullanılabiliyor. Chrome&amp;#39;da 557px genişlikte hem admin hem bayi
+(impersonation ile) oturumunda uçtan uca doğrulandı: hamburger/drawer/
+backdrop akışı, tablo scroll&amp;#39;ları, modal grid stack&amp;#39;i; masaüstünde
+(1400px) önceki davranış (sticky sidebar, daralt/genişlet) değişmeden
+kaldı.</w:t>
+      </w:r>
+    </w:p>
+    <w:p>
+      <w:pPr>
+        <w:pStyle w:val="Heading2"/>
+        <w:spacing w:after="100" w:before="220"/>
+      </w:pPr>
+      <w:r>
+        <w:rPr>
+          <w:color w:val="1A2420"/>
+        </w:rPr>
+        <w:t xml:space="preserve">Faz 11 — Bayi Denetim (Stok Mutabakatı)</w:t>
+      </w:r>
+    </w:p>
+    <w:p>
+      <w:pPr>
+        <w:spacing w:after="120"/>
+      </w:pPr>
+      <w:r>
+        <w:rPr>
+          <w:color w:val="1A2420"/>
+          <w:sz w:val="21"/>
+          <w:szCs w:val="21"/>
+        </w:rPr>
+        <w:t xml:space="preserve">Hedef: Musluoğlu markasının aylık bayi stok sayımı/satış mutabakatını
+şu an elle yürüttüğü Excel dosyasının (24 şube sekmesi, kırılgan
+</w:t>
+      </w:r>
+      <w:r>
+        <w:rPr>
+          <w:rFonts w:ascii="Consolas" w:cs="Consolas" w:eastAsia="Consolas" w:hAnsi="Consolas"/>
+          <w:color w:val="1A2420"/>
+          <w:sz w:val="21"/>
+          <w:szCs w:val="21"/>
+        </w:rPr>
+        <w:t xml:space="preserve">INDIRECT</w:t>
+      </w:r>
+      <w:r>
+        <w:rPr>
+          <w:color w:val="1A2420"/>
+          <w:sz w:val="21"/>
+          <w:szCs w:val="21"/>
+        </w:rPr>
+        <w:t xml:space="preserve">/</w:t>
+      </w:r>
+      <w:r>
+        <w:rPr>
+          <w:rFonts w:ascii="Consolas" w:cs="Consolas" w:eastAsia="Consolas" w:hAnsi="Consolas"/>
+          <w:color w:val="1A2420"/>
+          <w:sz w:val="21"/>
+          <w:szCs w:val="21"/>
+        </w:rPr>
+        <w:t xml:space="preserve">VLOOKUP</w:t>
+      </w:r>
+      <w:r>
+        <w:rPr>
+          <w:color w:val="1A2420"/>
+          <w:sz w:val="21"/>
+          <w:szCs w:val="21"/>
+        </w:rPr>
+        <w:t xml:space="preserve"> formülleri, versiyon kontrolü yok) yerini alacak
+bir modül. Sayfa iskeletleri ve nav girişleri şimdiden eklendi
+(</w:t>
+      </w:r>
+      <w:r>
+        <w:rPr>
+          <w:rFonts w:ascii="Consolas" w:cs="Consolas" w:eastAsia="Consolas" w:hAnsi="Consolas"/>
+          <w:color w:val="1A2420"/>
+          <w:sz w:val="21"/>
+          <w:szCs w:val="21"/>
+        </w:rPr>
+        <w:t xml:space="preserve">src/app/admin/audit/</w:t>
+      </w:r>
+      <w:r>
+        <w:rPr>
+          <w:color w:val="1A2420"/>
+          <w:sz w:val="21"/>
+          <w:szCs w:val="21"/>
+        </w:rPr>
+        <w:t xml:space="preserve">, </w:t>
+      </w:r>
+      <w:r>
+        <w:rPr>
+          <w:rFonts w:ascii="Consolas" w:cs="Consolas" w:eastAsia="Consolas" w:hAnsi="Consolas"/>
+          <w:color w:val="1A2420"/>
+          <w:sz w:val="21"/>
+          <w:szCs w:val="21"/>
+        </w:rPr>
+        <w:t xml:space="preserve">src/app/dealer/audit/</w:t>
+      </w:r>
+      <w:r>
+        <w:rPr>
+          <w:color w:val="1A2420"/>
+          <w:sz w:val="21"/>
+          <w:szCs w:val="21"/>
+        </w:rPr>
+        <w:t xml:space="preserve"> — </w:t>
+      </w:r>
+      <w:r>
+        <w:rPr>
+          <w:rFonts w:ascii="Consolas" w:cs="Consolas" w:eastAsia="Consolas" w:hAnsi="Consolas"/>
+          <w:color w:val="1A2420"/>
+          <w:sz w:val="21"/>
+          <w:szCs w:val="21"/>
+        </w:rPr>
+        <w:t xml:space="preserve">ComingSoon</w:t>
+      </w:r>
+      <w:r>
+        <w:rPr>
+          <w:color w:val="1A2420"/>
+          <w:sz w:val="21"/>
+          <w:szCs w:val="21"/>
+        </w:rPr>
+        <w:t xml:space="preserve">
+bileşeniyle &amp;quot;Yapım aşamasında&amp;quot; gösteriyor); bu fazın kapsamı gerçek
+işlevi uygulamak. Kapsam v1&amp;#39;de </w:t>
+      </w:r>
+      <w:r>
+        <w:rPr>
+          <w:b/>
+          <w:bCs/>
+          <w:color w:val="1A2420"/>
+          <w:sz w:val="21"/>
+          <w:szCs w:val="21"/>
+        </w:rPr>
+        <w:t xml:space="preserve">yalnızca Musluoğlu markası</w:t>
+      </w:r>
+      <w:r>
+        <w:rPr>
+          <w:color w:val="1A2420"/>
+          <w:sz w:val="21"/>
+          <w:szCs w:val="21"/>
+        </w:rPr>
+        <w:t xml:space="preserve"> (30 ürün,
+24 bayi — zaten </w:t>
+      </w:r>
+      <w:r>
+        <w:rPr>
+          <w:rFonts w:ascii="Consolas" w:cs="Consolas" w:eastAsia="Consolas" w:hAnsi="Consolas"/>
+          <w:color w:val="1A2420"/>
+          <w:sz w:val="21"/>
+          <w:szCs w:val="21"/>
+        </w:rPr>
+        <w:t xml:space="preserve">brands</w:t>
+      </w:r>
+      <w:r>
+        <w:rPr>
+          <w:color w:val="1A2420"/>
+          <w:sz w:val="21"/>
+          <w:szCs w:val="21"/>
+        </w:rPr>
+        <w:t xml:space="preserve">/</w:t>
+      </w:r>
+      <w:r>
+        <w:rPr>
+          <w:rFonts w:ascii="Consolas" w:cs="Consolas" w:eastAsia="Consolas" w:hAnsi="Consolas"/>
+          <w:color w:val="1A2420"/>
+          <w:sz w:val="21"/>
+          <w:szCs w:val="21"/>
+        </w:rPr>
+        <w:t xml:space="preserve">products</w:t>
+      </w:r>
+      <w:r>
+        <w:rPr>
+          <w:color w:val="1A2420"/>
+          <w:sz w:val="21"/>
+          <w:szCs w:val="21"/>
+        </w:rPr>
+        <w:t xml:space="preserve">/</w:t>
+      </w:r>
+      <w:r>
+        <w:rPr>
+          <w:rFonts w:ascii="Consolas" w:cs="Consolas" w:eastAsia="Consolas" w:hAnsi="Consolas"/>
+          <w:color w:val="1A2420"/>
+          <w:sz w:val="21"/>
+          <w:szCs w:val="21"/>
+        </w:rPr>
+        <w:t xml:space="preserve">categories</w:t>
+      </w:r>
+      <w:r>
+        <w:rPr>
+          <w:color w:val="1A2420"/>
+          <w:sz w:val="21"/>
+          <w:szCs w:val="21"/>
+        </w:rPr>
+        <w:t xml:space="preserve">/</w:t>
+      </w:r>
+      <w:r>
+        <w:rPr>
+          <w:rFonts w:ascii="Consolas" w:cs="Consolas" w:eastAsia="Consolas" w:hAnsi="Consolas"/>
+          <w:color w:val="1A2420"/>
+          <w:sz w:val="21"/>
+          <w:szCs w:val="21"/>
+        </w:rPr>
+        <w:t xml:space="preserve">dealers</w:t>
+      </w:r>
+      <w:r>
+        <w:rPr>
+          <w:color w:val="1A2420"/>
+          <w:sz w:val="21"/>
+          <w:szCs w:val="21"/>
+        </w:rPr>
+        <w:t xml:space="preserve">&amp;#39;ta kayıtlı,
+yeniden oluşturulmayacak).</w:t>
+      </w:r>
+    </w:p>
+    <w:p>
+      <w:pPr>
+        <w:spacing w:after="120"/>
+      </w:pPr>
+      <w:r>
+        <w:rPr>
+          <w:b/>
+          <w:bCs/>
+          <w:color w:val="1A2420"/>
+          <w:sz w:val="21"/>
+          <w:szCs w:val="21"/>
+        </w:rPr>
+        <w:t xml:space="preserve">İş mantığı</w:t>
+      </w:r>
+      <w:r>
+        <w:rPr>
+          <w:color w:val="1A2420"/>
+          <w:sz w:val="21"/>
+          <w:szCs w:val="21"/>
+        </w:rPr>
+        <w:t xml:space="preserve"> (Excel&amp;#39;den çıkarıldı, gerçek bir satırla doğrulandı —
+DEMETEVLER/CEVİZLİ BAKLAVA: 17.545+159×3.6−24.07−18.8=547.075 →
+×1.08(kutu)=590.841 → ×0.99(Ankara sapma)=584.93, Excel&amp;#39;deki hücreyle
+birebir eşleşiyor): bayi dönem başına ürün bazlı 5 değer girer —
+Dönem Başı Sayım(kg), Alım(tepsi), Fire(kg), Dönem Sonu Sayım(kg),
+Satılan(kg) — artı dönem başına Diğer Satışlar (TL, örn. gramajlı
+dondurma satışları/poşet/kutu) ve Mevcut Ciro (kasadan okunan gerçek
+ciro). Sistem hesaplar: </w:t>
+      </w:r>
+      <w:r>
+        <w:rPr>
+          <w:rFonts w:ascii="Consolas" w:cs="Consolas" w:eastAsia="Consolas" w:hAnsi="Consolas"/>
+          <w:color w:val="1A2420"/>
+          <w:sz w:val="21"/>
+          <w:szCs w:val="21"/>
+        </w:rPr>
+        <w:t xml:space="preserve">Alım(kg)=Alım(tepsi)×Tepsi Kg</w:t>
+      </w:r>
+      <w:r>
+        <w:rPr>
+          <w:color w:val="1A2420"/>
+          <w:sz w:val="21"/>
+          <w:szCs w:val="21"/>
+        </w:rPr>
+        <w:t xml:space="preserve"> →
+</w:t>
+      </w:r>
+      <w:r>
+        <w:rPr>
+          <w:rFonts w:ascii="Consolas" w:cs="Consolas" w:eastAsia="Consolas" w:hAnsi="Consolas"/>
+          <w:color w:val="1A2420"/>
+          <w:sz w:val="21"/>
+          <w:szCs w:val="21"/>
+        </w:rPr>
+        <w:t xml:space="preserve">Satılması Gereken=Başı+Alım(kg)−Fire−Sonu</w:t>
+      </w:r>
+      <w:r>
+        <w:rPr>
+          <w:color w:val="1A2420"/>
+          <w:sz w:val="21"/>
+          <w:szCs w:val="21"/>
+        </w:rPr>
+        <w:t xml:space="preserve"> →
+</w:t>
+      </w:r>
+      <w:r>
+        <w:rPr>
+          <w:rFonts w:ascii="Consolas" w:cs="Consolas" w:eastAsia="Consolas" w:hAnsi="Consolas"/>
+          <w:color w:val="1A2420"/>
+          <w:sz w:val="21"/>
+          <w:szCs w:val="21"/>
+        </w:rPr>
+        <w:t xml:space="preserve">Kutu Dahil=×(1+Kutu Oranı)</w:t>
+      </w:r>
+      <w:r>
+        <w:rPr>
+          <w:color w:val="1A2420"/>
+          <w:sz w:val="21"/>
+          <w:szCs w:val="21"/>
+        </w:rPr>
+        <w:t xml:space="preserve"> →
+</w:t>
+      </w:r>
+      <w:r>
+        <w:rPr>
+          <w:rFonts w:ascii="Consolas" w:cs="Consolas" w:eastAsia="Consolas" w:hAnsi="Consolas"/>
+          <w:color w:val="1A2420"/>
+          <w:sz w:val="21"/>
+          <w:szCs w:val="21"/>
+        </w:rPr>
+        <w:t xml:space="preserve">Net Beklenen=Kutu Dahil×(1−Sapma Oranı)</w:t>
+      </w:r>
+      <w:r>
+        <w:rPr>
+          <w:color w:val="1A2420"/>
+          <w:sz w:val="21"/>
+          <w:szCs w:val="21"/>
+        </w:rPr>
+        <w:t xml:space="preserve"> (</w:t>
+      </w:r>
+      <w:r>
+        <w:rPr>
+          <w:b/>
+          <w:bCs/>
+          <w:color w:val="1A2420"/>
+          <w:sz w:val="21"/>
+          <w:szCs w:val="21"/>
+        </w:rPr>
+        <w:t xml:space="preserve">Börekler kategorisinde
+sapma düşülmez</w:t>
+      </w:r>
+      <w:r>
+        <w:rPr>
+          <w:color w:val="1A2420"/>
+          <w:sz w:val="21"/>
+          <w:szCs w:val="21"/>
+        </w:rPr>
+        <w:t xml:space="preserve">) → </w:t>
+      </w:r>
+      <w:r>
+        <w:rPr>
+          <w:rFonts w:ascii="Consolas" w:cs="Consolas" w:eastAsia="Consolas" w:hAnsi="Consolas"/>
+          <w:color w:val="1A2420"/>
+          <w:sz w:val="21"/>
+          <w:szCs w:val="21"/>
+        </w:rPr>
+        <w:t xml:space="preserve">Fark(kg)=Satılan−Net Beklenen</w:t>
+      </w:r>
+      <w:r>
+        <w:rPr>
+          <w:color w:val="1A2420"/>
+          <w:sz w:val="21"/>
+          <w:szCs w:val="21"/>
+        </w:rPr>
+        <w:t xml:space="preserve">,
+</w:t>
+      </w:r>
+      <w:r>
+        <w:rPr>
+          <w:rFonts w:ascii="Consolas" w:cs="Consolas" w:eastAsia="Consolas" w:hAnsi="Consolas"/>
+          <w:color w:val="1A2420"/>
+          <w:sz w:val="21"/>
+          <w:szCs w:val="21"/>
+        </w:rPr>
+        <w:t xml:space="preserve">Fark(TL)=Fark×Fiyat</w:t>
+      </w:r>
+      <w:r>
+        <w:rPr>
+          <w:color w:val="1A2420"/>
+          <w:sz w:val="21"/>
+          <w:szCs w:val="21"/>
+        </w:rPr>
+        <w:t xml:space="preserve">; dönem toplamında &amp;quot;Yapması Gereken Ciro&amp;quot;
+(=Σ Net Beklenen×Fiyat + Diğer Satışlar), &amp;quot;Mevcut Ciro&amp;quot; ile
+karşılaştırılır. Kutu Oranı %8 sabit; Sapma Oranı bölgeye göre değişir
+(Excel&amp;#39;de Ankara %1, İstanbul %3).</w:t>
+      </w:r>
+    </w:p>
+    <w:p>
+      <w:pPr>
+        <w:spacing w:after="120"/>
+      </w:pPr>
+      <w:r>
+        <w:rPr>
+          <w:b/>
+          <w:bCs/>
+          <w:color w:val="1A2420"/>
+          <w:sz w:val="21"/>
+          <w:szCs w:val="21"/>
+        </w:rPr>
+        <w:t xml:space="preserve">Kilit akışı:</w:t>
+      </w:r>
+      <w:r>
+        <w:rPr>
+          <w:color w:val="1A2420"/>
+          <w:sz w:val="21"/>
+          <w:szCs w:val="21"/>
+        </w:rPr>
+        <w:t xml:space="preserve"> bayi verisini girer → &amp;quot;Gönder ve Kilitle&amp;quot; ile kilitler
+→ kilitliyken salt-okunur → sadece admin kilidi açabilir → açıldıktan
+sonra bayi veya admin düzenleyebilir.</w:t>
+      </w:r>
+    </w:p>
+    <w:p>
+      <w:pPr>
+        <w:spacing w:after="120"/>
+      </w:pPr>
+      <w:r>
+        <w:rPr>
+          <w:b/>
+          <w:bCs/>
+          <w:color w:val="1A2420"/>
+          <w:sz w:val="21"/>
+          <w:szCs w:val="21"/>
+        </w:rPr>
+        <w:t xml:space="preserve">Veri modeli (taslak):</w:t>
+      </w:r>
+    </w:p>
+    <w:p>
+      <w:pPr>
+        <w:pStyle w:val="ListParagraph"/>
+        <w:numPr>
+          <w:ilvl w:val="0"/>
+          <w:numId w:val="1"/>
+        </w:numPr>
+        <w:spacing w:after="60"/>
+      </w:pPr>
+      <w:r>
+        <w:rPr>
+          <w:rFonts w:ascii="Consolas" w:cs="Consolas" w:eastAsia="Consolas" w:hAnsi="Consolas"/>
+          <w:color w:val="1F5F56"/>
+          <w:sz w:val="21"/>
+          <w:szCs w:val="21"/>
+        </w:rPr>
+        <w:t xml:space="preserve">products.trayWeightKg</w:t>
+      </w:r>
+      <w:r>
+        <w:rPr>
+          <w:sz w:val="21"/>
+          <w:szCs w:val="21"/>
+        </w:rPr>
+        <w:t xml:space="preserve"> — tepsi ağırlığı (kg), sadece denetime dahil
+ürünlerde dolu</w:t>
+      </w:r>
+    </w:p>
+    <w:p>
+      <w:pPr>
+        <w:pStyle w:val="ListParagraph"/>
+        <w:numPr>
+          <w:ilvl w:val="0"/>
+          <w:numId w:val="1"/>
+        </w:numPr>
+        <w:spacing w:after="60"/>
+      </w:pPr>
+      <w:r>
+        <w:rPr>
+          <w:rFonts w:ascii="Consolas" w:cs="Consolas" w:eastAsia="Consolas" w:hAnsi="Consolas"/>
+          <w:color w:val="1F5F56"/>
+          <w:sz w:val="21"/>
+          <w:szCs w:val="21"/>
+        </w:rPr>
+        <w:t xml:space="preserve">auditRegions</w:t>
+      </w:r>
+      <w:r>
+        <w:rPr>
+          <w:sz w:val="21"/>
+          <w:szCs w:val="21"/>
+        </w:rPr>
+        <w:t xml:space="preserve"> — bölge + kutu/sapma oranı; </w:t>
+      </w:r>
+      <w:r>
+        <w:rPr>
+          <w:rFonts w:ascii="Consolas" w:cs="Consolas" w:eastAsia="Consolas" w:hAnsi="Consolas"/>
+          <w:color w:val="1F5F56"/>
+          <w:sz w:val="21"/>
+          <w:szCs w:val="21"/>
+        </w:rPr>
+        <w:t xml:space="preserve">dealers.auditRegionId</w:t>
+      </w:r>
+      <w:r>
+        <w:rPr>
+          <w:sz w:val="21"/>
+          <w:szCs w:val="21"/>
+        </w:rPr>
+        <w:t xml:space="preserve">
+ile bağlanır (mevcut </w:t>
+      </w:r>
+      <w:r>
+        <w:rPr>
+          <w:rFonts w:ascii="Consolas" w:cs="Consolas" w:eastAsia="Consolas" w:hAnsi="Consolas"/>
+          <w:color w:val="1F5F56"/>
+          <w:sz w:val="21"/>
+          <w:szCs w:val="21"/>
+        </w:rPr>
+        <w:t xml:space="preserve">dealers.il</w:t>
+      </w:r>
+      <w:r>
+        <w:rPr>
+          <w:sz w:val="21"/>
+          <w:szCs w:val="21"/>
+        </w:rPr>
+        <w:t xml:space="preserve">/</w:t>
+      </w:r>
+      <w:r>
+        <w:rPr>
+          <w:rFonts w:ascii="Consolas" w:cs="Consolas" w:eastAsia="Consolas" w:hAnsi="Consolas"/>
+          <w:color w:val="1F5F56"/>
+          <w:sz w:val="21"/>
+          <w:szCs w:val="21"/>
+        </w:rPr>
+        <w:t xml:space="preserve">bolge</w:t>
+      </w:r>
+      <w:r>
+        <w:rPr>
+          <w:sz w:val="21"/>
+          <w:szCs w:val="21"/>
+        </w:rPr>
+        <w:t xml:space="preserve"> alanları tutarsız/boş
+olduğu için ayrı bir bölge kavramı gerekiyor)</w:t>
+      </w:r>
+    </w:p>
+    <w:p>
+      <w:pPr>
+        <w:pStyle w:val="ListParagraph"/>
+        <w:numPr>
+          <w:ilvl w:val="0"/>
+          <w:numId w:val="1"/>
+        </w:numPr>
+        <w:spacing w:after="60"/>
+      </w:pPr>
+      <w:r>
+        <w:rPr>
+          <w:rFonts w:ascii="Consolas" w:cs="Consolas" w:eastAsia="Consolas" w:hAnsi="Consolas"/>
+          <w:color w:val="1F5F56"/>
+          <w:sz w:val="21"/>
+          <w:szCs w:val="21"/>
+        </w:rPr>
+        <w:t xml:space="preserve">auditPeriods</w:t>
+      </w:r>
+      <w:r>
+        <w:rPr>
+          <w:sz w:val="21"/>
+          <w:szCs w:val="21"/>
+        </w:rPr>
+        <w:t xml:space="preserve"> — dönem (başlangıç/bitiş), admin açar; bir dönem tüm
+Musluoğlu bayilerini aynı anda kapsar</w:t>
+      </w:r>
+    </w:p>
+    <w:p>
+      <w:pPr>
+        <w:pStyle w:val="ListParagraph"/>
+        <w:numPr>
+          <w:ilvl w:val="0"/>
+          <w:numId w:val="1"/>
+        </w:numPr>
+        <w:spacing w:after="60"/>
+      </w:pPr>
+      <w:r>
+        <w:rPr>
+          <w:rFonts w:ascii="Consolas" w:cs="Consolas" w:eastAsia="Consolas" w:hAnsi="Consolas"/>
+          <w:color w:val="1F5F56"/>
+          <w:sz w:val="21"/>
+          <w:szCs w:val="21"/>
+        </w:rPr>
+        <w:t xml:space="preserve">auditEntries</w:t>
+      </w:r>
+      <w:r>
+        <w:rPr>
+          <w:sz w:val="21"/>
+          <w:szCs w:val="21"/>
+        </w:rPr>
+        <w:t xml:space="preserve"> — bayi+dönem başına 1 satır: durum (taslak/kilitli),
+kutu/sapma oranı snapshot&amp;#39;ı (oranlar sonradan değişse bile geçmiş
+denetim etkilenmesin diye — </w:t>
+      </w:r>
+      <w:r>
+        <w:rPr>
+          <w:rFonts w:ascii="Consolas" w:cs="Consolas" w:eastAsia="Consolas" w:hAnsi="Consolas"/>
+          <w:color w:val="1F5F56"/>
+          <w:sz w:val="21"/>
+          <w:szCs w:val="21"/>
+        </w:rPr>
+        <w:t xml:space="preserve">orderItems.vatRate</w:t>
+      </w:r>
+      <w:r>
+        <w:rPr>
+          <w:sz w:val="21"/>
+          <w:szCs w:val="21"/>
+        </w:rPr>
+        <w:t xml:space="preserve"> snapshot deseniyle
+aynı mantık), Mevcut Ciro, gönderim/kilit açma izleri. Yeni dönem
+açıldığında Dönem Başı Sayım, bir önceki dönemin Dönem Sonu
+Sayım&amp;#39;ından otomatik devreder (düzenlenebilir)</w:t>
+      </w:r>
+    </w:p>
+    <w:p>
+      <w:pPr>
+        <w:pStyle w:val="ListParagraph"/>
+        <w:numPr>
+          <w:ilvl w:val="0"/>
+          <w:numId w:val="1"/>
+        </w:numPr>
+        <w:spacing w:after="60"/>
+      </w:pPr>
+      <w:r>
+        <w:rPr>
+          <w:rFonts w:ascii="Consolas" w:cs="Consolas" w:eastAsia="Consolas" w:hAnsi="Consolas"/>
+          <w:color w:val="1F5F56"/>
+          <w:sz w:val="21"/>
+          <w:szCs w:val="21"/>
+        </w:rPr>
+        <w:t xml:space="preserve">auditEntryItems</w:t>
+      </w:r>
+      <w:r>
+        <w:rPr>
+          <w:sz w:val="21"/>
+          <w:szCs w:val="21"/>
+        </w:rPr>
+        <w:t xml:space="preserve"> — bayi+dönem+ürün başına 5 girdi alanı; hesaplanan
+alanlar (Alım kg, Fark kg/TL, ciro vb.) saklanmaz, </w:t>
+      </w:r>
+      <w:r>
+        <w:rPr>
+          <w:rFonts w:ascii="Consolas" w:cs="Consolas" w:eastAsia="Consolas" w:hAnsi="Consolas"/>
+          <w:color w:val="1F5F56"/>
+          <w:sz w:val="21"/>
+          <w:szCs w:val="21"/>
+        </w:rPr>
+        <w:t xml:space="preserve">products.unitPrice</w:t>
+      </w:r>
+      <w:r>
+        <w:rPr>
+          <w:sz w:val="21"/>
+          <w:szCs w:val="21"/>
+        </w:rPr>
+        <w:t xml:space="preserve">
+ve oran snapshot&amp;#39;larından anlık hesaplanır (Excel&amp;#39;deki ayrı
+fiyat-geçmişi listesi kullanılmaz, basitleştirilir)</w:t>
+      </w:r>
+    </w:p>
+    <w:p>
+      <w:pPr>
+        <w:pStyle w:val="ListParagraph"/>
+        <w:numPr>
+          <w:ilvl w:val="0"/>
+          <w:numId w:val="1"/>
+        </w:numPr>
+        <w:spacing w:after="60"/>
+      </w:pPr>
+      <w:r>
+        <w:rPr>
+          <w:rFonts w:ascii="Consolas" w:cs="Consolas" w:eastAsia="Consolas" w:hAnsi="Consolas"/>
+          <w:color w:val="1F5F56"/>
+          <w:sz w:val="21"/>
+          <w:szCs w:val="21"/>
+        </w:rPr>
+        <w:t xml:space="preserve">auditOtherSaleTypes</w:t>
+      </w:r>
+      <w:r>
+        <w:rPr>
+          <w:sz w:val="21"/>
+          <w:szCs w:val="21"/>
+        </w:rPr>
+        <w:t xml:space="preserve"> + </w:t>
+      </w:r>
+      <w:r>
+        <w:rPr>
+          <w:rFonts w:ascii="Consolas" w:cs="Consolas" w:eastAsia="Consolas" w:hAnsi="Consolas"/>
+          <w:color w:val="1F5F56"/>
+          <w:sz w:val="21"/>
+          <w:szCs w:val="21"/>
+        </w:rPr>
+        <w:t xml:space="preserve">auditEntryOtherSales</w:t>
+      </w:r>
+      <w:r>
+        <w:rPr>
+          <w:sz w:val="21"/>
+          <w:szCs w:val="21"/>
+        </w:rPr>
+        <w:t xml:space="preserve"> — admin yönetimli
+diğer satış kalemleri (sabit liste değil)</w:t>
+      </w:r>
+    </w:p>
+    <w:p>
+      <w:pPr>
+        <w:spacing w:after="120"/>
+      </w:pPr>
+      <w:r>
+        <w:rPr>
+          <w:b/>
+          <w:bCs/>
+          <w:color w:val="1A2420"/>
+          <w:sz w:val="21"/>
+          <w:szCs w:val="21"/>
+        </w:rPr>
+        <w:t xml:space="preserve">Sayfa planı:</w:t>
+      </w:r>
+    </w:p>
+    <w:p>
+      <w:pPr>
+        <w:pStyle w:val="ListParagraph"/>
+        <w:numPr>
+          <w:ilvl w:val="0"/>
+          <w:numId w:val="1"/>
+        </w:numPr>
+        <w:spacing w:after="60"/>
+      </w:pPr>
+      <w:r>
+        <w:rPr>
+          <w:rFonts w:ascii="Consolas" w:cs="Consolas" w:eastAsia="Consolas" w:hAnsi="Consolas"/>
+          <w:color w:val="1F5F56"/>
+          <w:sz w:val="21"/>
+          <w:szCs w:val="21"/>
+        </w:rPr>
+        <w:t xml:space="preserve">/dealer/audit</w:t>
+      </w:r>
+      <w:r>
+        <w:rPr>
+          <w:sz w:val="21"/>
+          <w:szCs w:val="21"/>
+        </w:rPr>
+        <w:t xml:space="preserve"> — kategoriye göre gruplanmış giriş formu (Tatlılar/
+Börekler), diğer satışlar, Mevcut Ciro, &amp;quot;Gönder ve Kilitle&amp;quot; butonu;
+kilitliyken salt-okunur + geçmiş dönemler</w:t>
+      </w:r>
+    </w:p>
+    <w:p>
+      <w:pPr>
+        <w:pStyle w:val="ListParagraph"/>
+        <w:numPr>
+          <w:ilvl w:val="0"/>
+          <w:numId w:val="1"/>
+        </w:numPr>
+        <w:spacing w:after="60"/>
+      </w:pPr>
+      <w:r>
+        <w:rPr>
+          <w:rFonts w:ascii="Consolas" w:cs="Consolas" w:eastAsia="Consolas" w:hAnsi="Consolas"/>
+          <w:color w:val="1F5F56"/>
+          <w:sz w:val="21"/>
+          <w:szCs w:val="21"/>
+        </w:rPr>
+        <w:t xml:space="preserve">/admin/audit</w:t>
+      </w:r>
+      <w:r>
+        <w:rPr>
+          <w:sz w:val="21"/>
+          <w:szCs w:val="21"/>
+        </w:rPr>
+        <w:t xml:space="preserve"> — dönem aç/kapa, bayi durum tablosu (gönderilmedi/
+taslak/kilitli), kilit aç, bölge bazlı İCMAL-benzeri karşılaştırma
+tablosu (Yapması Gereken / Mevcut Ciro / Fark) + grafikler (bayi
+bazlı fark, bölge bazlı ciro karşılaştırması — repo&amp;#39;da hiç chart
+kütüphanesi yok, </w:t>
+      </w:r>
+      <w:r>
+        <w:rPr>
+          <w:rFonts w:ascii="Consolas" w:cs="Consolas" w:eastAsia="Consolas" w:hAnsi="Consolas"/>
+          <w:color w:val="1F5F56"/>
+          <w:sz w:val="21"/>
+          <w:szCs w:val="21"/>
+        </w:rPr>
+        <w:t xml:space="preserve">recharts</w:t>
+      </w:r>
+      <w:r>
+        <w:rPr>
+          <w:sz w:val="21"/>
+          <w:szCs w:val="21"/>
+        </w:rPr>
+        <w:t xml:space="preserve"> eklenmesi öneriliyor); ayrıca bölge/oran
+ve diğer-satış-kalemi yönetimi için küçük bir ayarlar bölümü</w:t>
+      </w:r>
+    </w:p>
+    <w:p>
+      <w:pPr>
+        <w:pStyle w:val="ListParagraph"/>
+        <w:numPr>
+          <w:ilvl w:val="0"/>
+          <w:numId w:val="1"/>
+        </w:numPr>
+        <w:spacing w:after="60"/>
+      </w:pPr>
+      <w:r>
+        <w:rPr>
+          <w:sz w:val="21"/>
+          <w:szCs w:val="21"/>
+        </w:rPr>
+        <w:t xml:space="preserve">Bayi düzenleme sayfasına (</w:t>
+      </w:r>
+      <w:r>
+        <w:rPr>
+          <w:rFonts w:ascii="Consolas" w:cs="Consolas" w:eastAsia="Consolas" w:hAnsi="Consolas"/>
+          <w:color w:val="1F5F56"/>
+          <w:sz w:val="21"/>
+          <w:szCs w:val="21"/>
+        </w:rPr>
+        <w:t xml:space="preserve">/admin/dealers/[id]</w:t>
+      </w:r>
+      <w:r>
+        <w:rPr>
+          <w:sz w:val="21"/>
+          <w:szCs w:val="21"/>
+        </w:rPr>
+        <w:t xml:space="preserve">) &amp;quot;Denetim Bölgesi&amp;quot;
+seçici, ürün düzenleme modaline &amp;quot;Tepsi Kg&amp;quot; alanı eklenir</w:t>
+      </w:r>
+    </w:p>
+    <w:p>
+      <w:pPr>
+        <w:spacing w:after="120"/>
+      </w:pPr>
+      <w:r>
+        <w:rPr>
+          <w:b/>
+          <w:bCs/>
+          <w:color w:val="1A2420"/>
+          <w:sz w:val="21"/>
+          <w:szCs w:val="21"/>
+        </w:rPr>
+        <w:t xml:space="preserve">Çıkış kriteri —</w:t>
+      </w:r>
+      <w:r>
+        <w:rPr>
+          <w:color w:val="1A2420"/>
+          <w:sz w:val="21"/>
+          <w:szCs w:val="21"/>
+        </w:rPr>
+        <w:t xml:space="preserve"> her iki panelde de gerçek veriyle çalışıyor; kilit
+akışı uçtan uca doğrulanmış; bölge/bayi karşılaştırma tablosu ve
+grafikler doğru rakamları gösteriyor; &amp;quot;Yapım aşamasında&amp;quot; yer tutucusu
+kaldırılmış.</w:t>
       </w:r>
     </w:p>
     <w:p>

</xml_diff>

<commit_message>
Faz 12: Docker entegrasyonu, sistem logları ve self-hosted Neon
- Dockerfile/docker-compose.yml ile uygulama Docker'da paketlendi
  (standalone output, AUTH_TRUST_HOST).
- Admin paneline /admin/logs eklendi: system_logs tablosu, logger
  yardımcı fonksiyonu, instrumentation.ts'teki onRequestError hook'uyla
  yakalanmamış sunucu hataları otomatik loglanıyor.
- neon-local/ altında Neon'un self-hosted docker-compose yığını (8
  container) Windows'a özgü sorunlar giderilerek çalışır hale getirildi.
- src/db/index.ts, hem bulut hem self-hosted Neon'u destekleyen
  drizzle-orm/node-postgres sürücüsüne geçirildi.
- Roadmap'e Faz 12 eklendi, PDF/DOCX yeniden üretildi.

Co-Authored-By: Claude Sonnet 5 <noreply@anthropic.com>
</commit_message>
<xml_diff>
--- a/docs/output/roadmap.docx
+++ b/docs/output/roadmap.docx
@@ -59,7 +59,7 @@
           <w:sz w:val="17"/>
           <w:szCs w:val="17"/>
         </w:rPr>
-        <w:t xml:space="preserve">Oluşturulma tarihi: 12 Eylül 2026</w:t>
+        <w:t xml:space="preserve">Oluşturulma tarihi: 23 Eylül 2026</w:t>
       </w:r>
     </w:p>
     <w:p>
@@ -7651,6 +7651,449 @@
 akışı uçtan uca doğrulanmış; bölge/bayi karşılaştırma tablosu ve
 grafikler doğru rakamları gösteriyor; &amp;quot;Yapım aşamasında&amp;quot; yer tutucusu
 kaldırılmış.</w:t>
+      </w:r>
+    </w:p>
+    <w:p>
+      <w:pPr>
+        <w:pStyle w:val="Heading2"/>
+        <w:spacing w:after="100" w:before="220"/>
+      </w:pPr>
+      <w:r>
+        <w:rPr>
+          <w:color w:val="1A2420"/>
+        </w:rPr>
+        <w:t xml:space="preserve">Faz 12 — Docker Entegrasyonu, Sistem Logları &amp;amp; Self-Hosted Neon ✅ Tamamlandı</w:t>
+      </w:r>
+    </w:p>
+    <w:p>
+      <w:pPr>
+        <w:spacing w:after="120"/>
+      </w:pPr>
+      <w:r>
+        <w:rPr>
+          <w:color w:val="1A2420"/>
+          <w:sz w:val="21"/>
+          <w:szCs w:val="21"/>
+        </w:rPr>
+        <w:t xml:space="preserve">Hedef: Uygulamayı Docker ile paketleyip çalıştırılabilir hale getirmek,
+admin panelinde temel bir sistem log ekranı sunmak ve yerel geliştirme
+için Neon&amp;#39;un self-hosted (Docker) sürümünü entegre etmek.</w:t>
+      </w:r>
+    </w:p>
+    <w:p>
+      <w:pPr>
+        <w:pStyle w:val="ListParagraph"/>
+        <w:numPr>
+          <w:ilvl w:val="0"/>
+          <w:numId w:val="1"/>
+        </w:numPr>
+        <w:spacing w:after="60"/>
+      </w:pPr>
+      <w:r>
+        <w:rPr>
+          <w:sz w:val="21"/>
+          <w:szCs w:val="21"/>
+        </w:rPr>
+        <w:t xml:space="preserve">12.1 — Docker paketleme</w:t>
+      </w:r>
+      <w:r>
+        <w:rPr>
+          <w:sz w:val="21"/>
+          <w:szCs w:val="21"/>
+        </w:rPr>
+        <w:t xml:space="preserve"> — ✅ Tamamlandı. Çok aşamalı </w:t>
+      </w:r>
+      <w:r>
+        <w:rPr>
+          <w:rFonts w:ascii="Consolas" w:cs="Consolas" w:eastAsia="Consolas" w:hAnsi="Consolas"/>
+          <w:color w:val="1F5F56"/>
+          <w:sz w:val="21"/>
+          <w:szCs w:val="21"/>
+        </w:rPr>
+        <w:t xml:space="preserve">Dockerfile</w:t>
+      </w:r>
+      <w:r>
+        <w:rPr>
+          <w:sz w:val="21"/>
+          <w:szCs w:val="21"/>
+        </w:rPr>
+        <w:t xml:space="preserve">
+(deps → builder → runner, </w:t>
+      </w:r>
+      <w:r>
+        <w:rPr>
+          <w:rFonts w:ascii="Consolas" w:cs="Consolas" w:eastAsia="Consolas" w:hAnsi="Consolas"/>
+          <w:color w:val="1F5F56"/>
+          <w:sz w:val="21"/>
+          <w:szCs w:val="21"/>
+        </w:rPr>
+        <w:t xml:space="preserve">node:22-alpine</w:t>
+      </w:r>
+      <w:r>
+        <w:rPr>
+          <w:sz w:val="21"/>
+          <w:szCs w:val="21"/>
+        </w:rPr>
+        <w:t xml:space="preserve">, </w:t>
+      </w:r>
+      <w:r>
+        <w:rPr>
+          <w:rFonts w:ascii="Consolas" w:cs="Consolas" w:eastAsia="Consolas" w:hAnsi="Consolas"/>
+          <w:color w:val="1F5F56"/>
+          <w:sz w:val="21"/>
+          <w:szCs w:val="21"/>
+        </w:rPr>
+        <w:t xml:space="preserve">next.config.ts</w:t>
+      </w:r>
+      <w:r>
+        <w:rPr>
+          <w:sz w:val="21"/>
+          <w:szCs w:val="21"/>
+        </w:rPr>
+        <w:t xml:space="preserve">&amp;#39;e
+eklenen </w:t>
+      </w:r>
+      <w:r>
+        <w:rPr>
+          <w:rFonts w:ascii="Consolas" w:cs="Consolas" w:eastAsia="Consolas" w:hAnsi="Consolas"/>
+          <w:color w:val="1F5F56"/>
+          <w:sz w:val="21"/>
+          <w:szCs w:val="21"/>
+        </w:rPr>
+        <w:t xml:space="preserve">output: &amp;quot;standalone&amp;quot;</w:t>
+      </w:r>
+      <w:r>
+        <w:rPr>
+          <w:sz w:val="21"/>
+          <w:szCs w:val="21"/>
+        </w:rPr>
+        <w:t xml:space="preserve">), </w:t>
+      </w:r>
+      <w:r>
+        <w:rPr>
+          <w:rFonts w:ascii="Consolas" w:cs="Consolas" w:eastAsia="Consolas" w:hAnsi="Consolas"/>
+          <w:color w:val="1F5F56"/>
+          <w:sz w:val="21"/>
+          <w:szCs w:val="21"/>
+        </w:rPr>
+        <w:t xml:space="preserve">.dockerignore</w:t>
+      </w:r>
+      <w:r>
+        <w:rPr>
+          <w:sz w:val="21"/>
+          <w:szCs w:val="21"/>
+        </w:rPr>
+        <w:t xml:space="preserve">, </w:t>
+      </w:r>
+      <w:r>
+        <w:rPr>
+          <w:rFonts w:ascii="Consolas" w:cs="Consolas" w:eastAsia="Consolas" w:hAnsi="Consolas"/>
+          <w:color w:val="1F5F56"/>
+          <w:sz w:val="21"/>
+          <w:szCs w:val="21"/>
+        </w:rPr>
+        <w:t xml:space="preserve">docker-compose.yml</w:t>
+      </w:r>
+      <w:r>
+        <w:rPr>
+          <w:sz w:val="21"/>
+          <w:szCs w:val="21"/>
+        </w:rPr>
+        <w:t xml:space="preserve">.
+Auth.js&amp;#39;in container&amp;#39;ın </w:t>
+      </w:r>
+      <w:r>
+        <w:rPr>
+          <w:rFonts w:ascii="Consolas" w:cs="Consolas" w:eastAsia="Consolas" w:hAnsi="Consolas"/>
+          <w:color w:val="1F5F56"/>
+          <w:sz w:val="21"/>
+          <w:szCs w:val="21"/>
+        </w:rPr>
+        <w:t xml:space="preserve">0.0.0.0</w:t>
+      </w:r>
+      <w:r>
+        <w:rPr>
+          <w:sz w:val="21"/>
+          <w:szCs w:val="21"/>
+        </w:rPr>
+        <w:t xml:space="preserve"> host&amp;#39;una güven duymayıp
+</w:t>
+      </w:r>
+      <w:r>
+        <w:rPr>
+          <w:rFonts w:ascii="Consolas" w:cs="Consolas" w:eastAsia="Consolas" w:hAnsi="Consolas"/>
+          <w:color w:val="1F5F56"/>
+          <w:sz w:val="21"/>
+          <w:szCs w:val="21"/>
+        </w:rPr>
+        <w:t xml:space="preserve">UntrustedHost</w:t>
+      </w:r>
+      <w:r>
+        <w:rPr>
+          <w:sz w:val="21"/>
+          <w:szCs w:val="21"/>
+        </w:rPr>
+        <w:t xml:space="preserve"> hatası vermesi </w:t>
+      </w:r>
+      <w:r>
+        <w:rPr>
+          <w:rFonts w:ascii="Consolas" w:cs="Consolas" w:eastAsia="Consolas" w:hAnsi="Consolas"/>
+          <w:color w:val="1F5F56"/>
+          <w:sz w:val="21"/>
+          <w:szCs w:val="21"/>
+        </w:rPr>
+        <w:t xml:space="preserve">AUTH_TRUST_HOST=true</w:t>
+      </w:r>
+      <w:r>
+        <w:rPr>
+          <w:sz w:val="21"/>
+          <w:szCs w:val="21"/>
+        </w:rPr>
+        <w:t xml:space="preserve"> ile çözüldü.</w:t>
+      </w:r>
+    </w:p>
+    <w:p>
+      <w:pPr>
+        <w:pStyle w:val="ListParagraph"/>
+        <w:numPr>
+          <w:ilvl w:val="0"/>
+          <w:numId w:val="1"/>
+        </w:numPr>
+        <w:spacing w:after="60"/>
+      </w:pPr>
+      <w:r>
+        <w:rPr>
+          <w:sz w:val="21"/>
+          <w:szCs w:val="21"/>
+        </w:rPr>
+        <w:t xml:space="preserve">12.2 — Sistem Logları ekranı</w:t>
+      </w:r>
+      <w:r>
+        <w:rPr>
+          <w:sz w:val="21"/>
+          <w:szCs w:val="21"/>
+        </w:rPr>
+        <w:t xml:space="preserve"> — ✅ Tamamlandı. Yeni </w:t>
+      </w:r>
+      <w:r>
+        <w:rPr>
+          <w:rFonts w:ascii="Consolas" w:cs="Consolas" w:eastAsia="Consolas" w:hAnsi="Consolas"/>
+          <w:color w:val="1F5F56"/>
+          <w:sz w:val="21"/>
+          <w:szCs w:val="21"/>
+        </w:rPr>
+        <w:t xml:space="preserve">system_logs</w:t>
+      </w:r>
+      <w:r>
+        <w:rPr>
+          <w:sz w:val="21"/>
+          <w:szCs w:val="21"/>
+        </w:rPr>
+        <w:t xml:space="preserve">
+tablosu (seviye: info/warn/error, mesaj, kaynak route, </w:t>
+      </w:r>
+      <w:r>
+        <w:rPr>
+          <w:rFonts w:ascii="Consolas" w:cs="Consolas" w:eastAsia="Consolas" w:hAnsi="Consolas"/>
+          <w:color w:val="1F5F56"/>
+          <w:sz w:val="21"/>
+          <w:szCs w:val="21"/>
+        </w:rPr>
+        <w:t xml:space="preserve">meta</w:t>
+      </w:r>
+      <w:r>
+        <w:rPr>
+          <w:sz w:val="21"/>
+          <w:szCs w:val="21"/>
+        </w:rPr>
+        <w:t xml:space="preserve"> jsonb),
+</w:t>
+      </w:r>
+      <w:r>
+        <w:rPr>
+          <w:rFonts w:ascii="Consolas" w:cs="Consolas" w:eastAsia="Consolas" w:hAnsi="Consolas"/>
+          <w:color w:val="1F5F56"/>
+          <w:sz w:val="21"/>
+          <w:szCs w:val="21"/>
+        </w:rPr>
+        <w:t xml:space="preserve">src/lib/logger.ts</w:t>
+      </w:r>
+      <w:r>
+        <w:rPr>
+          <w:sz w:val="21"/>
+          <w:szCs w:val="21"/>
+        </w:rPr>
+        <w:t xml:space="preserve"> yazma yardımcı fonksiyonu, </w:t>
+      </w:r>
+      <w:r>
+        <w:rPr>
+          <w:rFonts w:ascii="Consolas" w:cs="Consolas" w:eastAsia="Consolas" w:hAnsi="Consolas"/>
+          <w:color w:val="1F5F56"/>
+          <w:sz w:val="21"/>
+          <w:szCs w:val="21"/>
+        </w:rPr>
+        <w:t xml:space="preserve">src/instrumentation.ts</w:t>
+      </w:r>
+      <w:r>
+        <w:rPr>
+          <w:sz w:val="21"/>
+          <w:szCs w:val="21"/>
+        </w:rPr>
+        <w:t xml:space="preserve">
+içindeki Next.js </w:t>
+      </w:r>
+      <w:r>
+        <w:rPr>
+          <w:rFonts w:ascii="Consolas" w:cs="Consolas" w:eastAsia="Consolas" w:hAnsi="Consolas"/>
+          <w:color w:val="1F5F56"/>
+          <w:sz w:val="21"/>
+          <w:szCs w:val="21"/>
+        </w:rPr>
+        <w:t xml:space="preserve">onRequestError</w:t>
+      </w:r>
+      <w:r>
+        <w:rPr>
+          <w:sz w:val="21"/>
+          <w:szCs w:val="21"/>
+        </w:rPr>
+        <w:t xml:space="preserve"> hook&amp;#39;uyla yakalanmamış sunucu
+hataları (route/API/server action fark etmeksizin) otomatik loglanıyor.
+</w:t>
+      </w:r>
+      <w:r>
+        <w:rPr>
+          <w:rFonts w:ascii="Consolas" w:cs="Consolas" w:eastAsia="Consolas" w:hAnsi="Consolas"/>
+          <w:color w:val="1F5F56"/>
+          <w:sz w:val="21"/>
+          <w:szCs w:val="21"/>
+        </w:rPr>
+        <w:t xml:space="preserve">/admin/logs</w:t>
+      </w:r>
+      <w:r>
+        <w:rPr>
+          <w:sz w:val="21"/>
+          <w:szCs w:val="21"/>
+        </w:rPr>
+        <w:t xml:space="preserve"> sayfası (seviyeye göre filtrelenebilir, son 200 kayıt) +
+sidebar girişi eklendi; kasıtlı bir hatayla uçtan uca doğrulandı.</w:t>
+      </w:r>
+    </w:p>
+    <w:p>
+      <w:pPr>
+        <w:pStyle w:val="ListParagraph"/>
+        <w:numPr>
+          <w:ilvl w:val="0"/>
+          <w:numId w:val="1"/>
+        </w:numPr>
+        <w:spacing w:after="60"/>
+      </w:pPr>
+      <w:r>
+        <w:rPr>
+          <w:sz w:val="21"/>
+          <w:szCs w:val="21"/>
+        </w:rPr>
+        <w:t xml:space="preserve">12.3 — Self-hosted Neon (Docker)</w:t>
+      </w:r>
+      <w:r>
+        <w:rPr>
+          <w:sz w:val="21"/>
+          <w:szCs w:val="21"/>
+        </w:rPr>
+        <w:t xml:space="preserve"> — ✅ Tamamlandı. </w:t>
+      </w:r>
+      <w:r>
+        <w:rPr>
+          <w:rFonts w:ascii="Consolas" w:cs="Consolas" w:eastAsia="Consolas" w:hAnsi="Consolas"/>
+          <w:color w:val="1F5F56"/>
+          <w:sz w:val="21"/>
+          <w:szCs w:val="21"/>
+        </w:rPr>
+        <w:t xml:space="preserve">neon-local/</w:t>
+      </w:r>
+      <w:r>
+        <w:rPr>
+          <w:sz w:val="21"/>
+          <w:szCs w:val="21"/>
+        </w:rPr>
+        <w:t xml:space="preserve">
+altında Neon&amp;#39;un resmi docker-compose referansı uyarlanarak (pageserver</w:t>
+      </w:r>
+    </w:p>
+    <w:p>
+      <w:pPr>
+        <w:spacing w:after="120"/>
+      </w:pPr>
+      <w:r>
+        <w:rPr>
+          <w:b/>
+          <w:bCs/>
+          <w:color w:val="1A2420"/>
+          <w:sz w:val="21"/>
+          <w:szCs w:val="21"/>
+        </w:rPr>
+        <w:t xml:space="preserve">Çıkış kriteri —</w:t>
+      </w:r>
+      <w:r>
+        <w:rPr>
+          <w:color w:val="1A2420"/>
+          <w:sz w:val="21"/>
+          <w:szCs w:val="21"/>
+        </w:rPr>
+        <w:t xml:space="preserve"> </w:t>
+      </w:r>
+      <w:r>
+        <w:rPr>
+          <w:rFonts w:ascii="Consolas" w:cs="Consolas" w:eastAsia="Consolas" w:hAnsi="Consolas"/>
+          <w:color w:val="1A2420"/>
+          <w:sz w:val="21"/>
+          <w:szCs w:val="21"/>
+        </w:rPr>
+        <w:t xml:space="preserve">docker compose up --build</w:t>
+      </w:r>
+      <w:r>
+        <w:rPr>
+          <w:color w:val="1A2420"/>
+          <w:sz w:val="21"/>
+          <w:szCs w:val="21"/>
+        </w:rPr>
+        <w:t xml:space="preserve"> ile uygulama ayağa
+kalkıyor; admin panelinde gerçek bir hata </w:t>
+      </w:r>
+      <w:r>
+        <w:rPr>
+          <w:rFonts w:ascii="Consolas" w:cs="Consolas" w:eastAsia="Consolas" w:hAnsi="Consolas"/>
+          <w:color w:val="1A2420"/>
+          <w:sz w:val="21"/>
+          <w:szCs w:val="21"/>
+        </w:rPr>
+        <w:t xml:space="preserve">/admin/logs</w:t>
+      </w:r>
+      <w:r>
+        <w:rPr>
+          <w:color w:val="1A2420"/>
+          <w:sz w:val="21"/>
+          <w:szCs w:val="21"/>
+        </w:rPr>
+        <w:t xml:space="preserve">&amp;#39;ta görünüyor;
+</w:t>
+      </w:r>
+      <w:r>
+        <w:rPr>
+          <w:rFonts w:ascii="Consolas" w:cs="Consolas" w:eastAsia="Consolas" w:hAnsi="Consolas"/>
+          <w:color w:val="1A2420"/>
+          <w:sz w:val="21"/>
+          <w:szCs w:val="21"/>
+        </w:rPr>
+        <w:t xml:space="preserve">neon-local</w:t>
+      </w:r>
+      <w:r>
+        <w:rPr>
+          <w:color w:val="1A2420"/>
+          <w:sz w:val="21"/>
+          <w:szCs w:val="21"/>
+        </w:rPr>
+        <w:t xml:space="preserve"> yığını başlatılıp ana uygulama ona bağlandığında giriş ve
+sayfa erişimleri gerçek bir admin hesabıyla uçtan uca doğrulandı.</w:t>
       </w:r>
     </w:p>
     <w:p>

</xml_diff>

<commit_message>
Faz 13: Redis önbellek ve RabbitMQ sipariş olay altyapısı
- src/lib/redis.ts: cache-aside yardımcı fonksiyon; admin dashboard'daki
  8 paralel agregasyon sorgusu 60s cache'leniyor, Redis yoksa DB'ye düşer.
- src/lib/rabbitmq.ts + order-events.ts: sipariş durum geçişleri artık
  tek bir recordOrderStatusChange() üzerinden yazılıyor ve order.status
  fanout exchange'ine yayınlanıyor (henüz tüketici yok, altyapı).
- docker-compose.yml: redis, redis-commander, rabbitmq servisleri eklendi.
- Roadmap'e Faz 13 eklendi, PDF/DOCX yeniden üretildi.

Co-Authored-By: Claude Sonnet 5 <noreply@anthropic.com>
</commit_message>
<xml_diff>
--- a/docs/output/roadmap.docx
+++ b/docs/output/roadmap.docx
@@ -8094,6 +8094,643 @@
         </w:rPr>
         <w:t xml:space="preserve"> yığını başlatılıp ana uygulama ona bağlandığında giriş ve
 sayfa erişimleri gerçek bir admin hesabıyla uçtan uca doğrulandı.</w:t>
+      </w:r>
+    </w:p>
+    <w:p>
+      <w:pPr>
+        <w:pStyle w:val="Heading2"/>
+        <w:spacing w:after="100" w:before="220"/>
+      </w:pPr>
+      <w:r>
+        <w:rPr>
+          <w:color w:val="1A2420"/>
+        </w:rPr>
+        <w:t xml:space="preserve">Faz 13 — Redis Önbellek &amp;amp; RabbitMQ Olay Altyapısı ✅ Tamamlandı</w:t>
+      </w:r>
+    </w:p>
+    <w:p>
+      <w:pPr>
+        <w:spacing w:after="120"/>
+      </w:pPr>
+      <w:r>
+        <w:rPr>
+          <w:color w:val="1A2420"/>
+          <w:sz w:val="21"/>
+          <w:szCs w:val="21"/>
+        </w:rPr>
+        <w:t xml:space="preserve">Hedef: Docker&amp;#39;daki Redis ve RabbitMQ&amp;#39;yu uygulamaya bağlamak — Redis&amp;#39;i
+rapor/sorgu önbelleği, RabbitMQ&amp;#39;yu sipariş durum olaylarının yayınlandığı
+bir altyapı olarak.</w:t>
+      </w:r>
+    </w:p>
+    <w:p>
+      <w:pPr>
+        <w:pStyle w:val="ListParagraph"/>
+        <w:numPr>
+          <w:ilvl w:val="0"/>
+          <w:numId w:val="1"/>
+        </w:numPr>
+        <w:spacing w:after="60"/>
+      </w:pPr>
+      <w:r>
+        <w:rPr>
+          <w:sz w:val="21"/>
+          <w:szCs w:val="21"/>
+        </w:rPr>
+        <w:t xml:space="preserve">13.1 — Redis: admin dashboard önbelleği</w:t>
+      </w:r>
+      <w:r>
+        <w:rPr>
+          <w:sz w:val="21"/>
+          <w:szCs w:val="21"/>
+        </w:rPr>
+        <w:t xml:space="preserve"> — ✅ Tamamlandı.
+</w:t>
+      </w:r>
+      <w:r>
+        <w:rPr>
+          <w:rFonts w:ascii="Consolas" w:cs="Consolas" w:eastAsia="Consolas" w:hAnsi="Consolas"/>
+          <w:color w:val="1F5F56"/>
+          <w:sz w:val="21"/>
+          <w:szCs w:val="21"/>
+        </w:rPr>
+        <w:t xml:space="preserve">src/lib/redis.ts</w:t>
+      </w:r>
+      <w:r>
+        <w:rPr>
+          <w:sz w:val="21"/>
+          <w:szCs w:val="21"/>
+        </w:rPr>
+        <w:t xml:space="preserve">&amp;#39;teki </w:t>
+      </w:r>
+      <w:r>
+        <w:rPr>
+          <w:rFonts w:ascii="Consolas" w:cs="Consolas" w:eastAsia="Consolas" w:hAnsi="Consolas"/>
+          <w:color w:val="1F5F56"/>
+          <w:sz w:val="21"/>
+          <w:szCs w:val="21"/>
+        </w:rPr>
+        <w:t xml:space="preserve">cached(key, ttl, fn)</w:t>
+      </w:r>
+      <w:r>
+        <w:rPr>
+          <w:sz w:val="21"/>
+          <w:szCs w:val="21"/>
+        </w:rPr>
+        <w:t xml:space="preserve"> cache-aside yardımcı
+fonksiyonu; </w:t>
+      </w:r>
+      <w:r>
+        <w:rPr>
+          <w:rFonts w:ascii="Consolas" w:cs="Consolas" w:eastAsia="Consolas" w:hAnsi="Consolas"/>
+          <w:color w:val="1F5F56"/>
+          <w:sz w:val="21"/>
+          <w:szCs w:val="21"/>
+        </w:rPr>
+        <w:t xml:space="preserve">REDIS_URL</w:t>
+      </w:r>
+      <w:r>
+        <w:rPr>
+          <w:sz w:val="21"/>
+          <w:szCs w:val="21"/>
+        </w:rPr>
+        <w:t xml:space="preserve"> tanımsızsa veya Redis&amp;#39;e erişilemiyorsa sessizce
+</w:t>
+      </w:r>
+      <w:r>
+        <w:rPr>
+          <w:rFonts w:ascii="Consolas" w:cs="Consolas" w:eastAsia="Consolas" w:hAnsi="Consolas"/>
+          <w:color w:val="1F5F56"/>
+          <w:sz w:val="21"/>
+          <w:szCs w:val="21"/>
+        </w:rPr>
+        <w:t xml:space="preserve">fn()</w:t>
+      </w:r>
+      <w:r>
+        <w:rPr>
+          <w:sz w:val="21"/>
+          <w:szCs w:val="21"/>
+        </w:rPr>
+        <w:t xml:space="preserve">&amp;#39;e (doğrudan DB sorgusuna) düşüyor, hiçbir sayfayı kırmıyor.
+</w:t>
+      </w:r>
+      <w:r>
+        <w:rPr>
+          <w:rFonts w:ascii="Consolas" w:cs="Consolas" w:eastAsia="Consolas" w:hAnsi="Consolas"/>
+          <w:color w:val="1F5F56"/>
+          <w:sz w:val="21"/>
+          <w:szCs w:val="21"/>
+        </w:rPr>
+        <w:t xml:space="preserve">/admin</w:t>
+      </w:r>
+      <w:r>
+        <w:rPr>
+          <w:sz w:val="21"/>
+          <w:szCs w:val="21"/>
+        </w:rPr>
+        <w:t xml:space="preserve"> (Genel Bakış) sayfasındaki 8 paralel agregasyon sorgusu 60
+saniye cache&amp;#39;leniyor — repodaki tek gerçek &amp;quot;ağır rapor&amp;quot; ekranı bu
+(</w:t>
+      </w:r>
+      <w:r>
+        <w:rPr>
+          <w:rFonts w:ascii="Consolas" w:cs="Consolas" w:eastAsia="Consolas" w:hAnsi="Consolas"/>
+          <w:color w:val="1F5F56"/>
+          <w:sz w:val="21"/>
+          <w:szCs w:val="21"/>
+        </w:rPr>
+        <w:t xml:space="preserve">/admin/reports</w:t>
+      </w:r>
+      <w:r>
+        <w:rPr>
+          <w:sz w:val="21"/>
+          <w:szCs w:val="21"/>
+        </w:rPr>
+        <w:t xml:space="preserve"> hâlâ yapım aşamasında yer tutucu). Cache anahtarı
+</w:t>
+      </w:r>
+      <w:r>
+        <w:rPr>
+          <w:rFonts w:ascii="Consolas" w:cs="Consolas" w:eastAsia="Consolas" w:hAnsi="Consolas"/>
+          <w:color w:val="1F5F56"/>
+          <w:sz w:val="21"/>
+          <w:szCs w:val="21"/>
+        </w:rPr>
+        <w:t xml:space="preserve">companyId</w:t>
+      </w:r>
+      <w:r>
+        <w:rPr>
+          <w:sz w:val="21"/>
+          <w:szCs w:val="21"/>
+        </w:rPr>
+        <w:t xml:space="preserve"> + dönem/filtre parametrelerini kapsıyor; JSON round-trip&amp;#39;te
+</w:t>
+      </w:r>
+      <w:r>
+        <w:rPr>
+          <w:rFonts w:ascii="Consolas" w:cs="Consolas" w:eastAsia="Consolas" w:hAnsi="Consolas"/>
+          <w:color w:val="1F5F56"/>
+          <w:sz w:val="21"/>
+          <w:szCs w:val="21"/>
+        </w:rPr>
+        <w:t xml:space="preserve">trendRows.createdAt</w:t>
+      </w:r>
+      <w:r>
+        <w:rPr>
+          <w:sz w:val="21"/>
+          <w:szCs w:val="21"/>
+        </w:rPr>
+        <w:t xml:space="preserve"> string&amp;#39;e dönüştüğü için </w:t>
+      </w:r>
+      <w:r>
+        <w:rPr>
+          <w:rFonts w:ascii="Consolas" w:cs="Consolas" w:eastAsia="Consolas" w:hAnsi="Consolas"/>
+          <w:color w:val="1F5F56"/>
+          <w:sz w:val="21"/>
+          <w:szCs w:val="21"/>
+        </w:rPr>
+        <w:t xml:space="preserve">bucketKeyForDate</w:t>
+      </w:r>
+      <w:r>
+        <w:rPr>
+          <w:sz w:val="21"/>
+          <w:szCs w:val="21"/>
+        </w:rPr>
+        <w:t xml:space="preserve">&amp;#39;in
+beklediği </w:t>
+      </w:r>
+      <w:r>
+        <w:rPr>
+          <w:rFonts w:ascii="Consolas" w:cs="Consolas" w:eastAsia="Consolas" w:hAnsi="Consolas"/>
+          <w:color w:val="1F5F56"/>
+          <w:sz w:val="21"/>
+          <w:szCs w:val="21"/>
+        </w:rPr>
+        <w:t xml:space="preserve">Date</w:t>
+      </w:r>
+      <w:r>
+        <w:rPr>
+          <w:sz w:val="21"/>
+          <w:szCs w:val="21"/>
+        </w:rPr>
+        <w:t xml:space="preserve">&amp;#39;e geri çevriliyor (aksi halde grafik bucket&amp;#39;ları sessizce
+yanlış hesaplanırdı). Gerçek admin girişiyle doğrulandı: dashboard
+yüklendi, Redis&amp;#39;te </w:t>
+      </w:r>
+      <w:r>
+        <w:rPr>
+          <w:rFonts w:ascii="Consolas" w:cs="Consolas" w:eastAsia="Consolas" w:hAnsi="Consolas"/>
+          <w:color w:val="1F5F56"/>
+          <w:sz w:val="21"/>
+          <w:szCs w:val="21"/>
+        </w:rPr>
+        <w:t xml:space="preserve">admin:overview:...</w:t>
+      </w:r>
+      <w:r>
+        <w:rPr>
+          <w:sz w:val="21"/>
+          <w:szCs w:val="21"/>
+        </w:rPr>
+        <w:t xml:space="preserve"> anahtarı TTL≈60s ile göründü.</w:t>
+      </w:r>
+    </w:p>
+    <w:p>
+      <w:pPr>
+        <w:pStyle w:val="ListParagraph"/>
+        <w:numPr>
+          <w:ilvl w:val="0"/>
+          <w:numId w:val="1"/>
+        </w:numPr>
+        <w:spacing w:after="60"/>
+      </w:pPr>
+      <w:r>
+        <w:rPr>
+          <w:sz w:val="21"/>
+          <w:szCs w:val="21"/>
+        </w:rPr>
+        <w:t xml:space="preserve">13.2 — RabbitMQ: sipariş durum olay yayını</w:t>
+      </w:r>
+      <w:r>
+        <w:rPr>
+          <w:sz w:val="21"/>
+          <w:szCs w:val="21"/>
+        </w:rPr>
+        <w:t xml:space="preserve"> — ✅ Tamamlandı.
+</w:t>
+      </w:r>
+      <w:r>
+        <w:rPr>
+          <w:rFonts w:ascii="Consolas" w:cs="Consolas" w:eastAsia="Consolas" w:hAnsi="Consolas"/>
+          <w:color w:val="1F5F56"/>
+          <w:sz w:val="21"/>
+          <w:szCs w:val="21"/>
+        </w:rPr>
+        <w:t xml:space="preserve">src/lib/rabbitmq.ts</w:t>
+      </w:r>
+      <w:r>
+        <w:rPr>
+          <w:sz w:val="21"/>
+          <w:szCs w:val="21"/>
+        </w:rPr>
+        <w:t xml:space="preserve">, </w:t>
+      </w:r>
+      <w:r>
+        <w:rPr>
+          <w:rFonts w:ascii="Consolas" w:cs="Consolas" w:eastAsia="Consolas" w:hAnsi="Consolas"/>
+          <w:color w:val="1F5F56"/>
+          <w:sz w:val="21"/>
+          <w:szCs w:val="21"/>
+        </w:rPr>
+        <w:t xml:space="preserve">order.status</w:t>
+      </w:r>
+      <w:r>
+        <w:rPr>
+          <w:sz w:val="21"/>
+          <w:szCs w:val="21"/>
+        </w:rPr>
+        <w:t xml:space="preserve"> adında dayanıklı (durable) bir
+fanout exchange&amp;#39;e yayın yapıyor — henüz hiçbir tüketici (queue) bağlı
+değil, bu sadece ileride bir tüketici eklenebilecek bir olay akışı
+altyapısı (</w:t>
+      </w:r>
+      <w:r>
+        <w:rPr>
+          <w:rFonts w:ascii="Consolas" w:cs="Consolas" w:eastAsia="Consolas" w:hAnsi="Consolas"/>
+          <w:color w:val="1F5F56"/>
+          <w:sz w:val="21"/>
+          <w:szCs w:val="21"/>
+        </w:rPr>
+        <w:t xml:space="preserve">RABBITMQ_URL</w:t>
+      </w:r>
+      <w:r>
+        <w:rPr>
+          <w:sz w:val="21"/>
+          <w:szCs w:val="21"/>
+        </w:rPr>
+        <w:t xml:space="preserve"> tanımsızsa yayın sessizce no-op). Daha önce
+</w:t>
+      </w:r>
+      <w:r>
+        <w:rPr>
+          <w:rFonts w:ascii="Consolas" w:cs="Consolas" w:eastAsia="Consolas" w:hAnsi="Consolas"/>
+          <w:color w:val="1F5F56"/>
+          <w:sz w:val="21"/>
+          <w:szCs w:val="21"/>
+        </w:rPr>
+        <w:t xml:space="preserve">admin/orders/actions.ts</w:t>
+      </w:r>
+      <w:r>
+        <w:rPr>
+          <w:sz w:val="21"/>
+          <w:szCs w:val="21"/>
+        </w:rPr>
+        <w:t xml:space="preserve"> ve </w:t>
+      </w:r>
+      <w:r>
+        <w:rPr>
+          <w:rFonts w:ascii="Consolas" w:cs="Consolas" w:eastAsia="Consolas" w:hAnsi="Consolas"/>
+          <w:color w:val="1F5F56"/>
+          <w:sz w:val="21"/>
+          <w:szCs w:val="21"/>
+        </w:rPr>
+        <w:t xml:space="preserve">dealer/actions.ts</w:t>
+      </w:r>
+      <w:r>
+        <w:rPr>
+          <w:sz w:val="21"/>
+          <w:szCs w:val="21"/>
+        </w:rPr>
+        <w:t xml:space="preserve">&amp;#39;te 6 ayrı yerde tekrar
+eden </w:t>
+      </w:r>
+      <w:r>
+        <w:rPr>
+          <w:rFonts w:ascii="Consolas" w:cs="Consolas" w:eastAsia="Consolas" w:hAnsi="Consolas"/>
+          <w:color w:val="1F5F56"/>
+          <w:sz w:val="21"/>
+          <w:szCs w:val="21"/>
+        </w:rPr>
+        <w:t xml:space="preserve">db.insert(orderStatusHistory).values(...)</w:t>
+      </w:r>
+      <w:r>
+        <w:rPr>
+          <w:sz w:val="21"/>
+          <w:szCs w:val="21"/>
+        </w:rPr>
+        <w:t xml:space="preserve"> çağrısı,
+</w:t>
+      </w:r>
+      <w:r>
+        <w:rPr>
+          <w:rFonts w:ascii="Consolas" w:cs="Consolas" w:eastAsia="Consolas" w:hAnsi="Consolas"/>
+          <w:color w:val="1F5F56"/>
+          <w:sz w:val="21"/>
+          <w:szCs w:val="21"/>
+        </w:rPr>
+        <w:t xml:space="preserve">src/lib/order-events.ts</w:t>
+      </w:r>
+      <w:r>
+        <w:rPr>
+          <w:sz w:val="21"/>
+          <w:szCs w:val="21"/>
+        </w:rPr>
+        <w:t xml:space="preserve">&amp;#39;teki tek bir </w:t>
+      </w:r>
+      <w:r>
+        <w:rPr>
+          <w:rFonts w:ascii="Consolas" w:cs="Consolas" w:eastAsia="Consolas" w:hAnsi="Consolas"/>
+          <w:color w:val="1F5F56"/>
+          <w:sz w:val="21"/>
+          <w:szCs w:val="21"/>
+        </w:rPr>
+        <w:t xml:space="preserve">recordOrderStatusChange()</w:t>
+      </w:r>
+      <w:r>
+        <w:rPr>
+          <w:sz w:val="21"/>
+          <w:szCs w:val="21"/>
+        </w:rPr>
+        <w:t xml:space="preserve">
+fonksiyonunda birleştirildi (davranış değişmedi, sadece merkezileşti);
+bu fonksiyon geçmiş satırını yazdıktan sonra olayı fire-and-forget
+yayınlıyor — broker&amp;#39;da bir sorun asla sipariş/checkout akışını
+kesmiyor. Exchange&amp;#39;e bağlanan geçici bir test kuyruğuyla gerçek bir
+mesajın yayınlanıp tüketildiği doğrulandı.</w:t>
+      </w:r>
+    </w:p>
+    <w:p>
+      <w:pPr>
+        <w:pStyle w:val="ListParagraph"/>
+        <w:numPr>
+          <w:ilvl w:val="0"/>
+          <w:numId w:val="1"/>
+        </w:numPr>
+        <w:spacing w:after="60"/>
+      </w:pPr>
+      <w:r>
+        <w:rPr>
+          <w:sz w:val="21"/>
+          <w:szCs w:val="21"/>
+        </w:rPr>
+        <w:t xml:space="preserve">13.3 — Docker Compose servisleri</w:t>
+      </w:r>
+      <w:r>
+        <w:rPr>
+          <w:sz w:val="21"/>
+          <w:szCs w:val="21"/>
+        </w:rPr>
+        <w:t xml:space="preserve"> — ✅ Tamamlandı. </w:t>
+      </w:r>
+      <w:r>
+        <w:rPr>
+          <w:rFonts w:ascii="Consolas" w:cs="Consolas" w:eastAsia="Consolas" w:hAnsi="Consolas"/>
+          <w:color w:val="1F5F56"/>
+          <w:sz w:val="21"/>
+          <w:szCs w:val="21"/>
+        </w:rPr>
+        <w:t xml:space="preserve">redis</w:t>
+      </w:r>
+      <w:r>
+        <w:rPr>
+          <w:sz w:val="21"/>
+          <w:szCs w:val="21"/>
+        </w:rPr>
+        <w:t xml:space="preserve"> (6379),
+</w:t>
+      </w:r>
+      <w:r>
+        <w:rPr>
+          <w:rFonts w:ascii="Consolas" w:cs="Consolas" w:eastAsia="Consolas" w:hAnsi="Consolas"/>
+          <w:color w:val="1F5F56"/>
+          <w:sz w:val="21"/>
+          <w:szCs w:val="21"/>
+        </w:rPr>
+        <w:t xml:space="preserve">redis-commander</w:t>
+      </w:r>
+      <w:r>
+        <w:rPr>
+          <w:sz w:val="21"/>
+          <w:szCs w:val="21"/>
+        </w:rPr>
+        <w:t xml:space="preserve"> (8081 — anahtarları görsel incelemek için) ve
+</w:t>
+      </w:r>
+      <w:r>
+        <w:rPr>
+          <w:rFonts w:ascii="Consolas" w:cs="Consolas" w:eastAsia="Consolas" w:hAnsi="Consolas"/>
+          <w:color w:val="1F5F56"/>
+          <w:sz w:val="21"/>
+          <w:szCs w:val="21"/>
+        </w:rPr>
+        <w:t xml:space="preserve">rabbitmq</w:t>
+      </w:r>
+      <w:r>
+        <w:rPr>
+          <w:sz w:val="21"/>
+          <w:szCs w:val="21"/>
+        </w:rPr>
+        <w:t xml:space="preserve"> (5672 + </w:t>
+      </w:r>
+      <w:r>
+        <w:rPr>
+          <w:rFonts w:ascii="Consolas" w:cs="Consolas" w:eastAsia="Consolas" w:hAnsi="Consolas"/>
+          <w:color w:val="1F5F56"/>
+          <w:sz w:val="21"/>
+          <w:szCs w:val="21"/>
+        </w:rPr>
+        <w:t xml:space="preserve">rabbitmq_management</w:t>
+      </w:r>
+      <w:r>
+        <w:rPr>
+          <w:sz w:val="21"/>
+          <w:szCs w:val="21"/>
+        </w:rPr>
+        <w:t xml:space="preserve"> eklentisi ile 15672&amp;#39;de
+yönetim arayüzü, guest/guest) servisleri ana </w:t>
+      </w:r>
+      <w:r>
+        <w:rPr>
+          <w:rFonts w:ascii="Consolas" w:cs="Consolas" w:eastAsia="Consolas" w:hAnsi="Consolas"/>
+          <w:color w:val="1F5F56"/>
+          <w:sz w:val="21"/>
+          <w:szCs w:val="21"/>
+        </w:rPr>
+        <w:t xml:space="preserve">docker-compose.yml</w:t>
+      </w:r>
+      <w:r>
+        <w:rPr>
+          <w:sz w:val="21"/>
+          <w:szCs w:val="21"/>
+        </w:rPr>
+        <w:t xml:space="preserve">&amp;#39;e
+eklendi; </w:t>
+      </w:r>
+      <w:r>
+        <w:rPr>
+          <w:rFonts w:ascii="Consolas" w:cs="Consolas" w:eastAsia="Consolas" w:hAnsi="Consolas"/>
+          <w:color w:val="1F5F56"/>
+          <w:sz w:val="21"/>
+          <w:szCs w:val="21"/>
+        </w:rPr>
+        <w:t xml:space="preserve">app</w:t>
+      </w:r>
+      <w:r>
+        <w:rPr>
+          <w:sz w:val="21"/>
+          <w:szCs w:val="21"/>
+        </w:rPr>
+        <w:t xml:space="preserve"> servisine </w:t>
+      </w:r>
+      <w:r>
+        <w:rPr>
+          <w:rFonts w:ascii="Consolas" w:cs="Consolas" w:eastAsia="Consolas" w:hAnsi="Consolas"/>
+          <w:color w:val="1F5F56"/>
+          <w:sz w:val="21"/>
+          <w:szCs w:val="21"/>
+        </w:rPr>
+        <w:t xml:space="preserve">REDIS_URL</w:t>
+      </w:r>
+      <w:r>
+        <w:rPr>
+          <w:sz w:val="21"/>
+          <w:szCs w:val="21"/>
+        </w:rPr>
+        <w:t xml:space="preserve">/</w:t>
+      </w:r>
+      <w:r>
+        <w:rPr>
+          <w:rFonts w:ascii="Consolas" w:cs="Consolas" w:eastAsia="Consolas" w:hAnsi="Consolas"/>
+          <w:color w:val="1F5F56"/>
+          <w:sz w:val="21"/>
+          <w:szCs w:val="21"/>
+        </w:rPr>
+        <w:t xml:space="preserve">RABBITMQ_URL</w:t>
+      </w:r>
+      <w:r>
+        <w:rPr>
+          <w:sz w:val="21"/>
+          <w:szCs w:val="21"/>
+        </w:rPr>
+        <w:t xml:space="preserve"> verildi. </w:t>
+      </w:r>
+      <w:r>
+        <w:rPr>
+          <w:rFonts w:ascii="Consolas" w:cs="Consolas" w:eastAsia="Consolas" w:hAnsi="Consolas"/>
+          <w:color w:val="1F5F56"/>
+          <w:sz w:val="21"/>
+          <w:szCs w:val="21"/>
+        </w:rPr>
+        <w:t xml:space="preserve">npm run dev</w:t>
+      </w:r>
+      <w:r>
+        <w:rPr>
+          <w:sz w:val="21"/>
+          <w:szCs w:val="21"/>
+        </w:rPr>
+        <w:t xml:space="preserve"> (Docker dışı) etkilenmiyor — bu değişkenler tanımsız olunca ilgili
+özellikler sessizce devre dışı kalıyor.</w:t>
+      </w:r>
+    </w:p>
+    <w:p>
+      <w:pPr>
+        <w:spacing w:after="120"/>
+      </w:pPr>
+      <w:r>
+        <w:rPr>
+          <w:b/>
+          <w:bCs/>
+          <w:color w:val="1A2420"/>
+          <w:sz w:val="21"/>
+          <w:szCs w:val="21"/>
+        </w:rPr>
+        <w:t xml:space="preserve">Çıkış kriteri —</w:t>
+      </w:r>
+      <w:r>
+        <w:rPr>
+          <w:color w:val="1A2420"/>
+          <w:sz w:val="21"/>
+          <w:szCs w:val="21"/>
+        </w:rPr>
+        <w:t xml:space="preserve"> </w:t>
+      </w:r>
+      <w:r>
+        <w:rPr>
+          <w:rFonts w:ascii="Consolas" w:cs="Consolas" w:eastAsia="Consolas" w:hAnsi="Consolas"/>
+          <w:color w:val="1A2420"/>
+          <w:sz w:val="21"/>
+          <w:szCs w:val="21"/>
+        </w:rPr>
+        <w:t xml:space="preserve">docker compose up --build</w:t>
+      </w:r>
+      <w:r>
+        <w:rPr>
+          <w:color w:val="1A2420"/>
+          <w:sz w:val="21"/>
+          <w:szCs w:val="21"/>
+        </w:rPr>
+        <w:t xml:space="preserve"> ile redis/rabbitmq/
+redis-commander ayağa kalkıyor; admin dashboard&amp;#39;u yükledikten sonra
+Redis&amp;#39;te ilgili anahtar TTL&amp;#39;li olarak görünüyor; bir sipariş durum
+geçişinde </w:t>
+      </w:r>
+      <w:r>
+        <w:rPr>
+          <w:rFonts w:ascii="Consolas" w:cs="Consolas" w:eastAsia="Consolas" w:hAnsi="Consolas"/>
+          <w:color w:val="1A2420"/>
+          <w:sz w:val="21"/>
+          <w:szCs w:val="21"/>
+        </w:rPr>
+        <w:t xml:space="preserve">order.status</w:t>
+      </w:r>
+      <w:r>
+        <w:rPr>
+          <w:color w:val="1A2420"/>
+          <w:sz w:val="21"/>
+          <w:szCs w:val="21"/>
+        </w:rPr>
+        <w:t xml:space="preserve"> exchange&amp;#39;ine gerçek bir mesaj yayınlandığı
+doğrulandı; her iki bileşen de opsiyonel — yokluklarında uygulama normal
+çalışmaya devam ediyor.</w:t>
       </w:r>
     </w:p>
     <w:p>
@@ -10728,7 +11365,7 @@
                 <w:sz w:val="18"/>
                 <w:szCs w:val="18"/>
               </w:rPr>
-              <w:t xml:space="preserve">Upstash Redis</w:t>
+              <w:t xml:space="preserve">Redis (Faz 13&amp;#39;te self-hosted/Docker olarak entegre edildi)</w:t>
             </w:r>
           </w:p>
         </w:tc>
@@ -10748,7 +11385,7 @@
                 <w:sz w:val="18"/>
                 <w:szCs w:val="18"/>
               </w:rPr>
-              <w:t xml:space="preserve">Serverless uyumlu; rapor sorgu sonuçları ve oturum verisi için.</w:t>
+              <w:t xml:space="preserve">Rapor sorgu sonuçları için; Upstash yerine Docker&amp;#39;da çalıştırılıyor — bkz. Faz 13.</w:t>
             </w:r>
           </w:p>
         </w:tc>

</xml_diff>

<commit_message>
Faz 14: Denetim/etkinlik kaydı, log dışa aktarma ve Postman duman testleri
- src/lib/activity-log.ts: admin/bayi aksiyonlarında (marka, bayi, ürün,
  sipariş, ayarlar, şifre sıfırlama, auth) tek merkezden denetim kaydı —
  ip/tarayıcı/OS/cihaz tipini ua-parser-js ile ayrıştırıp system_logs'a yazar
- /admin/logs: seviye filtresi ve satır görünümü iyileştirildi, CSV dışa
  aktarma route'u eklendi
- postman/: uygulamaya karşı çalışan Newman duman testi koleksiyonu;
  docker-compose.yml'e "test" profiliyle tetiklenen newman servisi eklendi
- projeyi-baslat.bat / projeyi-durdur.bat: Docker/Redis/RabbitMQ/Neon
  servisleriyle birlikte projeyi başlatma/durdurma script'leri
- roadmap.md: Faz 5'in 2c230d1'de geri alındığına dair not eklendi

Co-Authored-By: Claude Sonnet 5 <noreply@anthropic.com>
</commit_message>
<xml_diff>
--- a/docs/output/roadmap.docx
+++ b/docs/output/roadmap.docx
@@ -4065,7 +4065,151 @@
         <w:rPr>
           <w:color w:val="1A2420"/>
         </w:rPr>
-        <w:t xml:space="preserve">Faz 5 — Raporlama &amp;amp; Analitik ✅ Tamamlandı</w:t>
+        <w:t xml:space="preserve">Faz 5 — Raporlama &amp;amp; Analitik ↩️ Geri Alındı</w:t>
+      </w:r>
+    </w:p>
+    <w:p>
+      <w:pPr>
+        <w:pBdr>
+          <w:left w:val="single" w:color="A85A26" w:sz="18" w:space="10"/>
+        </w:pBdr>
+        <w:shd w:fill="EEF1EF" w:val="clear"/>
+        <w:spacing w:after="160" w:before="160"/>
+        <w:ind w:left="340"/>
+      </w:pPr>
+      <w:r>
+        <w:rPr>
+          <w:b/>
+          <w:bCs/>
+          <w:i/>
+          <w:iCs/>
+          <w:color w:val="4B5750"/>
+          <w:sz w:val="20"/>
+          <w:szCs w:val="20"/>
+        </w:rPr>
+        <w:t xml:space="preserve">Geri alım notu:</w:t>
+      </w:r>
+      <w:r>
+        <w:rPr>
+          <w:i/>
+          <w:iCs/>
+          <w:color w:val="4B5750"/>
+          <w:sz w:val="20"/>
+          <w:szCs w:val="20"/>
+        </w:rPr>
+        <w:t xml:space="preserve"> Aşağıdaki iş gerçekten tamamlanmış ve teslim
+edilmişti, ancak </w:t>
+      </w:r>
+      <w:r>
+        <w:rPr>
+          <w:rFonts w:ascii="Consolas" w:cs="Consolas" w:eastAsia="Consolas" w:hAnsi="Consolas"/>
+          <w:i/>
+          <w:iCs/>
+          <w:color w:val="4B5750"/>
+          <w:sz w:val="20"/>
+          <w:szCs w:val="20"/>
+        </w:rPr>
+        <w:t xml:space="preserve">2c230d1</w:t>
+      </w:r>
+      <w:r>
+        <w:rPr>
+          <w:i/>
+          <w:iCs/>
+          <w:color w:val="4B5750"/>
+          <w:sz w:val="20"/>
+          <w:szCs w:val="20"/>
+        </w:rPr>
+        <w:t xml:space="preserve"> commit&amp;#39;inde (</w:t>
+      </w:r>
+      <w:r>
+        <w:rPr>
+          <w:rFonts w:ascii="Consolas" w:cs="Consolas" w:eastAsia="Consolas" w:hAnsi="Consolas"/>
+          <w:i/>
+          <w:iCs/>
+          <w:color w:val="4B5750"/>
+          <w:sz w:val="20"/>
+          <w:szCs w:val="20"/>
+        </w:rPr>
+        <w:t xml:space="preserve">src/lib/reports.ts</w:t>
+      </w:r>
+      <w:r>
+        <w:rPr>
+          <w:i/>
+          <w:iCs/>
+          <w:color w:val="4B5750"/>
+          <w:sz w:val="20"/>
+          <w:szCs w:val="20"/>
+        </w:rPr>
+        <w:t xml:space="preserve">,
+</w:t>
+      </w:r>
+      <w:r>
+        <w:rPr>
+          <w:rFonts w:ascii="Consolas" w:cs="Consolas" w:eastAsia="Consolas" w:hAnsi="Consolas"/>
+          <w:i/>
+          <w:iCs/>
+          <w:color w:val="4B5750"/>
+          <w:sz w:val="20"/>
+          <w:szCs w:val="20"/>
+        </w:rPr>
+        <w:t xml:space="preserve">src/app/admin/reports/export/route.ts</w:t>
+      </w:r>
+      <w:r>
+        <w:rPr>
+          <w:i/>
+          <w:iCs/>
+          <w:color w:val="4B5750"/>
+          <w:sz w:val="20"/>
+          <w:szCs w:val="20"/>
+        </w:rPr>
+        <w:t xml:space="preserve">,
+</w:t>
+      </w:r>
+      <w:r>
+        <w:rPr>
+          <w:rFonts w:ascii="Consolas" w:cs="Consolas" w:eastAsia="Consolas" w:hAnsi="Consolas"/>
+          <w:i/>
+          <w:iCs/>
+          <w:color w:val="4B5750"/>
+          <w:sz w:val="20"/>
+          <w:szCs w:val="20"/>
+        </w:rPr>
+        <w:t xml:space="preserve">src/app/admin/reports/reports-filters.tsx</w:t>
+      </w:r>
+      <w:r>
+        <w:rPr>
+          <w:i/>
+          <w:iCs/>
+          <w:color w:val="4B5750"/>
+          <w:sz w:val="20"/>
+          <w:szCs w:val="20"/>
+        </w:rPr>
+        <w:t xml:space="preserve"> silinerek) </w:t>
+      </w:r>
+      <w:r>
+        <w:rPr>
+          <w:rFonts w:ascii="Consolas" w:cs="Consolas" w:eastAsia="Consolas" w:hAnsi="Consolas"/>
+          <w:i/>
+          <w:iCs/>
+          <w:color w:val="4B5750"/>
+          <w:sz w:val="20"/>
+          <w:szCs w:val="20"/>
+        </w:rPr>
+        <w:t xml:space="preserve">/admin/reports</w:t>
+      </w:r>
+      <w:r>
+        <w:rPr>
+          <w:i/>
+          <w:iCs/>
+          <w:color w:val="4B5750"/>
+          <w:sz w:val="20"/>
+          <w:szCs w:val="20"/>
+        </w:rPr>
+        <w:t xml:space="preserve">
+yeniden &amp;quot;yapım aşamasında&amp;quot; yer tutucusuna çevrildi. Bu bölüm, ileride
+yeniden yapılırken referans olması için olduğu gibi bırakıldı — durum
+etiketi dışında içerik güncel koda değil, o zamanki teslimatın kaydına
+aittir.</w:t>
       </w:r>
     </w:p>
     <w:p>

</xml_diff>

<commit_message>
Roadmap: Faz 14 - marka bazli siparis zaman penceresi plani eklendi
Marka bazinda siparis alimini acip kapatabilme, gun/tarih/saat
kisitlamalari ve tum markalara karsi baskin firma capinda genel ayar
icin plan roadmap.md'ye eklendi (henuz uygulanmadi).

Co-Authored-By: Claude Sonnet 5 <noreply@anthropic.com>
</commit_message>
<xml_diff>
--- a/docs/output/roadmap.docx
+++ b/docs/output/roadmap.docx
@@ -59,7 +59,7 @@
           <w:sz w:val="17"/>
           <w:szCs w:val="17"/>
         </w:rPr>
-        <w:t xml:space="preserve">Oluşturulma tarihi: 23 Eylül 2026</w:t>
+        <w:t xml:space="preserve">Oluşturulma tarihi: 3 Ekim 2026</w:t>
       </w:r>
     </w:p>
     <w:p>
@@ -8875,6 +8875,576 @@
         <w:t xml:space="preserve"> exchange&amp;#39;ine gerçek bir mesaj yayınlandığı
 doğrulandı; her iki bileşen de opsiyonel — yokluklarında uygulama normal
 çalışmaya devam ediyor.</w:t>
+      </w:r>
+    </w:p>
+    <w:p>
+      <w:pPr>
+        <w:pStyle w:val="Heading2"/>
+        <w:spacing w:after="100" w:before="220"/>
+      </w:pPr>
+      <w:r>
+        <w:rPr>
+          <w:color w:val="1A2420"/>
+        </w:rPr>
+        <w:t xml:space="preserve">Faz 14 — Marka Bazlı Sipariş Zaman Penceresi (Gün/Tarih/Saat Kısıtlamaları)</w:t>
+      </w:r>
+    </w:p>
+    <w:p>
+      <w:pPr>
+        <w:spacing w:after="120"/>
+      </w:pPr>
+      <w:r>
+        <w:rPr>
+          <w:color w:val="1A2420"/>
+          <w:sz w:val="21"/>
+          <w:szCs w:val="21"/>
+        </w:rPr>
+        <w:t xml:space="preserve">Hedef: Bir markanın sipariş alıp almayacağını ve ne zaman alacağını admin&amp;#39;in
+tek tıkla açıp kapatabildiği, markaya özgü gün/tarih/saat kısıtlamalarıyla
+kontrol edebildiği bir sistem — üstüne, tüm markalara karşı baskın (daha
+gevşek bir marka ayarını asla geçersiz kılamayan, sadece daha da
+sıkılaştırabilen) firma çapında bir genel ayar.</w:t>
+      </w:r>
+    </w:p>
+    <w:p>
+      <w:pPr>
+        <w:spacing w:after="120"/>
+      </w:pPr>
+      <w:r>
+        <w:rPr>
+          <w:b/>
+          <w:bCs/>
+          <w:color w:val="1A2420"/>
+          <w:sz w:val="21"/>
+          <w:szCs w:val="21"/>
+        </w:rPr>
+        <w:t xml:space="preserve">İş mantığı — &amp;quot;baskın genel ayar&amp;quot; kuralı:</w:t>
+      </w:r>
+      <w:r>
+        <w:rPr>
+          <w:color w:val="1A2420"/>
+          <w:sz w:val="21"/>
+          <w:szCs w:val="21"/>
+        </w:rPr>
+        <w:t xml:space="preserve"> her markanın kendi sipariş
+penceresi (gün/tarih/saat) olabilir, ama firma çapındaki genel pencere her
+zaman üstte bir tavan olarak çalışır: efektif pencere = genel pencere ∩
+marka penceresi (ikisinin kesişimi). Örnek: Musluoğlu saat 22:00&amp;#39;a kadar
+sipariş kabul ediyor ama genel ayarda son sipariş saati 21:00 ise, efektif
+son saat 21:00&amp;#39;dir — Musluoğlu&amp;#39;nun kendi ayarı genel ayarı gevşetemez,
+yalnızca kendi başına daha da sıkı bir kısıtlama ekleyebilir (örn. markaya
+özel 20:00 gibi daha erken bir saat koyarsa o zaman devreye girer). Aynı
+kesişim mantığı gün (haftanın hangi günleri sipariş alınır) ve tarih
+aralığı (örn. bayram/tatil kapatması) için de geçerli. Marka veya genel
+ayarda bir alan boş/tanımsız bırakılırsa o alanda kısıtlama yok sayılır
+(kısıtlama koymamak = her zaman izinli). Markanın &amp;quot;sipariş alımı&amp;quot; anahtarı
+kapalıysa (genel ayardan bağımsız) o marka hiç sipariş alamaz; genel
+ayardaki ana kapatma anahtarı kapalıysa hiçbir marka sipariş alamaz (tüm
+markalar için tek seferde acil durdurma).</w:t>
+      </w:r>
+    </w:p>
+    <w:p>
+      <w:pPr>
+        <w:spacing w:after="120"/>
+      </w:pPr>
+      <w:r>
+        <w:rPr>
+          <w:b/>
+          <w:bCs/>
+          <w:color w:val="1A2420"/>
+          <w:sz w:val="21"/>
+          <w:szCs w:val="21"/>
+        </w:rPr>
+        <w:t xml:space="preserve">Veri modeli (taslak):</w:t>
+      </w:r>
+    </w:p>
+    <w:p>
+      <w:pPr>
+        <w:pStyle w:val="ListParagraph"/>
+        <w:numPr>
+          <w:ilvl w:val="0"/>
+          <w:numId w:val="1"/>
+        </w:numPr>
+        <w:spacing w:after="60"/>
+      </w:pPr>
+      <w:r>
+        <w:rPr>
+          <w:rFonts w:ascii="Consolas" w:cs="Consolas" w:eastAsia="Consolas" w:hAnsi="Consolas"/>
+          <w:color w:val="1F5F56"/>
+          <w:sz w:val="21"/>
+          <w:szCs w:val="21"/>
+        </w:rPr>
+        <w:t xml:space="preserve">companies</w:t>
+      </w:r>
+      <w:r>
+        <w:rPr>
+          <w:sz w:val="21"/>
+          <w:szCs w:val="21"/>
+        </w:rPr>
+        <w:t xml:space="preserve">&amp;#39;e eklenecek genel ayar alanları: </w:t>
+      </w:r>
+      <w:r>
+        <w:rPr>
+          <w:rFonts w:ascii="Consolas" w:cs="Consolas" w:eastAsia="Consolas" w:hAnsi="Consolas"/>
+          <w:color w:val="1F5F56"/>
+          <w:sz w:val="21"/>
+          <w:szCs w:val="21"/>
+        </w:rPr>
+        <w:t xml:space="preserve">order_window_enabled</w:t>
+      </w:r>
+      <w:r>
+        <w:rPr>
+          <w:sz w:val="21"/>
+          <w:szCs w:val="21"/>
+        </w:rPr>
+        <w:t xml:space="preserve">
+(boolean, DEFAULT true — ana acil-durdurma anahtarı),
+</w:t>
+      </w:r>
+      <w:r>
+        <w:rPr>
+          <w:rFonts w:ascii="Consolas" w:cs="Consolas" w:eastAsia="Consolas" w:hAnsi="Consolas"/>
+          <w:color w:val="1F5F56"/>
+          <w:sz w:val="21"/>
+          <w:szCs w:val="21"/>
+        </w:rPr>
+        <w:t xml:space="preserve">order_allowed_days</w:t>
+      </w:r>
+      <w:r>
+        <w:rPr>
+          <w:sz w:val="21"/>
+          <w:szCs w:val="21"/>
+        </w:rPr>
+        <w:t xml:space="preserve"> (haftanın günleri, NULL = kısıtlama yok),
+</w:t>
+      </w:r>
+      <w:r>
+        <w:rPr>
+          <w:rFonts w:ascii="Consolas" w:cs="Consolas" w:eastAsia="Consolas" w:hAnsi="Consolas"/>
+          <w:color w:val="1F5F56"/>
+          <w:sz w:val="21"/>
+          <w:szCs w:val="21"/>
+        </w:rPr>
+        <w:t xml:space="preserve">order_start_time</w:t>
+      </w:r>
+      <w:r>
+        <w:rPr>
+          <w:sz w:val="21"/>
+          <w:szCs w:val="21"/>
+        </w:rPr>
+        <w:t xml:space="preserve"> / </w:t>
+      </w:r>
+      <w:r>
+        <w:rPr>
+          <w:rFonts w:ascii="Consolas" w:cs="Consolas" w:eastAsia="Consolas" w:hAnsi="Consolas"/>
+          <w:color w:val="1F5F56"/>
+          <w:sz w:val="21"/>
+          <w:szCs w:val="21"/>
+        </w:rPr>
+        <w:t xml:space="preserve">order_end_time</w:t>
+      </w:r>
+      <w:r>
+        <w:rPr>
+          <w:sz w:val="21"/>
+          <w:szCs w:val="21"/>
+        </w:rPr>
+        <w:t xml:space="preserve"> (time, NULL = kısıtlama yok),
+</w:t>
+      </w:r>
+      <w:r>
+        <w:rPr>
+          <w:rFonts w:ascii="Consolas" w:cs="Consolas" w:eastAsia="Consolas" w:hAnsi="Consolas"/>
+          <w:color w:val="1F5F56"/>
+          <w:sz w:val="21"/>
+          <w:szCs w:val="21"/>
+        </w:rPr>
+        <w:t xml:space="preserve">order_window_start_date</w:t>
+      </w:r>
+      <w:r>
+        <w:rPr>
+          <w:sz w:val="21"/>
+          <w:szCs w:val="21"/>
+        </w:rPr>
+        <w:t xml:space="preserve"> / </w:t>
+      </w:r>
+      <w:r>
+        <w:rPr>
+          <w:rFonts w:ascii="Consolas" w:cs="Consolas" w:eastAsia="Consolas" w:hAnsi="Consolas"/>
+          <w:color w:val="1F5F56"/>
+          <w:sz w:val="21"/>
+          <w:szCs w:val="21"/>
+        </w:rPr>
+        <w:t xml:space="preserve">order_window_end_date</w:t>
+      </w:r>
+      <w:r>
+        <w:rPr>
+          <w:sz w:val="21"/>
+          <w:szCs w:val="21"/>
+        </w:rPr>
+        <w:t xml:space="preserve"> (date, NULL =
+kısıtlama yok — tatil/bayram gibi dönemsel kapatmalar için)</w:t>
+      </w:r>
+    </w:p>
+    <w:p>
+      <w:pPr>
+        <w:pStyle w:val="ListParagraph"/>
+        <w:numPr>
+          <w:ilvl w:val="0"/>
+          <w:numId w:val="1"/>
+        </w:numPr>
+        <w:spacing w:after="60"/>
+      </w:pPr>
+      <w:r>
+        <w:rPr>
+          <w:rFonts w:ascii="Consolas" w:cs="Consolas" w:eastAsia="Consolas" w:hAnsi="Consolas"/>
+          <w:color w:val="1F5F56"/>
+          <w:sz w:val="21"/>
+          <w:szCs w:val="21"/>
+        </w:rPr>
+        <w:t xml:space="preserve">brands</w:t>
+      </w:r>
+      <w:r>
+        <w:rPr>
+          <w:sz w:val="21"/>
+          <w:szCs w:val="21"/>
+        </w:rPr>
+        <w:t xml:space="preserve">&amp;#39;e aynı şemayla marka bazlı kolonlar (</w:t>
+      </w:r>
+      <w:r>
+        <w:rPr>
+          <w:rFonts w:ascii="Consolas" w:cs="Consolas" w:eastAsia="Consolas" w:hAnsi="Consolas"/>
+          <w:color w:val="1F5F56"/>
+          <w:sz w:val="21"/>
+          <w:szCs w:val="21"/>
+        </w:rPr>
+        <w:t xml:space="preserve">order_window_enabled</w:t>
+      </w:r>
+      <w:r>
+        <w:rPr>
+          <w:sz w:val="21"/>
+          <w:szCs w:val="21"/>
+        </w:rPr>
+        <w:t xml:space="preserve">,
+</w:t>
+      </w:r>
+      <w:r>
+        <w:rPr>
+          <w:rFonts w:ascii="Consolas" w:cs="Consolas" w:eastAsia="Consolas" w:hAnsi="Consolas"/>
+          <w:color w:val="1F5F56"/>
+          <w:sz w:val="21"/>
+          <w:szCs w:val="21"/>
+        </w:rPr>
+        <w:t xml:space="preserve">order_allowed_days</w:t>
+      </w:r>
+      <w:r>
+        <w:rPr>
+          <w:sz w:val="21"/>
+          <w:szCs w:val="21"/>
+        </w:rPr>
+        <w:t xml:space="preserve">, </w:t>
+      </w:r>
+      <w:r>
+        <w:rPr>
+          <w:rFonts w:ascii="Consolas" w:cs="Consolas" w:eastAsia="Consolas" w:hAnsi="Consolas"/>
+          <w:color w:val="1F5F56"/>
+          <w:sz w:val="21"/>
+          <w:szCs w:val="21"/>
+        </w:rPr>
+        <w:t xml:space="preserve">order_start_time</w:t>
+      </w:r>
+      <w:r>
+        <w:rPr>
+          <w:sz w:val="21"/>
+          <w:szCs w:val="21"/>
+        </w:rPr>
+        <w:t xml:space="preserve">, </w:t>
+      </w:r>
+      <w:r>
+        <w:rPr>
+          <w:rFonts w:ascii="Consolas" w:cs="Consolas" w:eastAsia="Consolas" w:hAnsi="Consolas"/>
+          <w:color w:val="1F5F56"/>
+          <w:sz w:val="21"/>
+          <w:szCs w:val="21"/>
+        </w:rPr>
+        <w:t xml:space="preserve">order_end_time</w:t>
+      </w:r>
+      <w:r>
+        <w:rPr>
+          <w:sz w:val="21"/>
+          <w:szCs w:val="21"/>
+        </w:rPr>
+        <w:t xml:space="preserve">,
+</w:t>
+      </w:r>
+      <w:r>
+        <w:rPr>
+          <w:rFonts w:ascii="Consolas" w:cs="Consolas" w:eastAsia="Consolas" w:hAnsi="Consolas"/>
+          <w:color w:val="1F5F56"/>
+          <w:sz w:val="21"/>
+          <w:szCs w:val="21"/>
+        </w:rPr>
+        <w:t xml:space="preserve">order_window_start_date</w:t>
+      </w:r>
+      <w:r>
+        <w:rPr>
+          <w:sz w:val="21"/>
+          <w:szCs w:val="21"/>
+        </w:rPr>
+        <w:t xml:space="preserve">, </w:t>
+      </w:r>
+      <w:r>
+        <w:rPr>
+          <w:rFonts w:ascii="Consolas" w:cs="Consolas" w:eastAsia="Consolas" w:hAnsi="Consolas"/>
+          <w:color w:val="1F5F56"/>
+          <w:sz w:val="21"/>
+          <w:szCs w:val="21"/>
+        </w:rPr>
+        <w:t xml:space="preserve">order_window_end_date</w:t>
+      </w:r>
+      <w:r>
+        <w:rPr>
+          <w:sz w:val="21"/>
+          <w:szCs w:val="21"/>
+        </w:rPr>
+        <w:t xml:space="preserve">) — genel ayarla birebir
+aynı alan seti, farkı sadece hangi seviyede tutulduğu</w:t>
+      </w:r>
+    </w:p>
+    <w:p>
+      <w:pPr>
+        <w:pStyle w:val="ListParagraph"/>
+        <w:numPr>
+          <w:ilvl w:val="0"/>
+          <w:numId w:val="1"/>
+        </w:numPr>
+        <w:spacing w:after="60"/>
+      </w:pPr>
+      <w:r>
+        <w:rPr>
+          <w:sz w:val="21"/>
+          <w:szCs w:val="21"/>
+        </w:rPr>
+        <w:t xml:space="preserve">Efektif pencereyi hesaplayan tek bir yardımcı fonksiyon (ör.
+</w:t>
+      </w:r>
+      <w:r>
+        <w:rPr>
+          <w:rFonts w:ascii="Consolas" w:cs="Consolas" w:eastAsia="Consolas" w:hAnsi="Consolas"/>
+          <w:color w:val="1F5F56"/>
+          <w:sz w:val="21"/>
+          <w:szCs w:val="21"/>
+        </w:rPr>
+        <w:t xml:space="preserve">src/lib/order-window.ts::isOrderingAllowed(brand, companySettings, now)</w:t>
+      </w:r>
+      <w:r>
+        <w:rPr>
+          <w:sz w:val="21"/>
+          <w:szCs w:val="21"/>
+        </w:rPr>
+        <w:t xml:space="preserve">)
+— hem server action&amp;#39;da (</w:t>
+      </w:r>
+      <w:r>
+        <w:rPr>
+          <w:rFonts w:ascii="Consolas" w:cs="Consolas" w:eastAsia="Consolas" w:hAnsi="Consolas"/>
+          <w:color w:val="1F5F56"/>
+          <w:sz w:val="21"/>
+          <w:szCs w:val="21"/>
+        </w:rPr>
+        <w:t xml:space="preserve">createOrder</w:t>
+      </w:r>
+      <w:r>
+        <w:rPr>
+          <w:sz w:val="21"/>
+          <w:szCs w:val="21"/>
+        </w:rPr>
+        <w:t xml:space="preserve">) hem UI&amp;#39;da (katalog/sepet) aynı
+mantığı çağırır, iki yerde ayrı ayrı yazılmaz</w:t>
+      </w:r>
+    </w:p>
+    <w:p>
+      <w:pPr>
+        <w:spacing w:after="120"/>
+      </w:pPr>
+      <w:r>
+        <w:rPr>
+          <w:b/>
+          <w:bCs/>
+          <w:color w:val="1A2420"/>
+          <w:sz w:val="21"/>
+          <w:szCs w:val="21"/>
+        </w:rPr>
+        <w:t xml:space="preserve">UI (admin, </w:t>
+      </w:r>
+      <w:r>
+        <w:rPr>
+          <w:rFonts w:ascii="Consolas" w:cs="Consolas" w:eastAsia="Consolas" w:hAnsi="Consolas"/>
+          <w:b/>
+          <w:bCs/>
+          <w:color w:val="1A2420"/>
+          <w:sz w:val="21"/>
+          <w:szCs w:val="21"/>
+        </w:rPr>
+        <w:t xml:space="preserve">/admin/settings</w:t>
+      </w:r>
+      <w:r>
+        <w:rPr>
+          <w:b/>
+          <w:bCs/>
+          <w:color w:val="1A2420"/>
+          <w:sz w:val="21"/>
+          <w:szCs w:val="21"/>
+        </w:rPr>
+        <w:t xml:space="preserve"> sayfasına yeni bölüm):</w:t>
+      </w:r>
+    </w:p>
+    <w:p>
+      <w:pPr>
+        <w:pStyle w:val="ListParagraph"/>
+        <w:numPr>
+          <w:ilvl w:val="0"/>
+          <w:numId w:val="1"/>
+        </w:numPr>
+        <w:spacing w:after="60"/>
+      </w:pPr>
+      <w:r>
+        <w:rPr>
+          <w:sz w:val="21"/>
+          <w:szCs w:val="21"/>
+        </w:rPr>
+        <w:t xml:space="preserve">Sayfanın üstünde her zaman açık, katlanmayan bir &amp;quot;Genel Sipariş
+Kısıtlamaları&amp;quot; kartı — ana aç/kapa anahtarı + gün/tarih/saat alanları;
+&amp;quot;tüm markalara karşı baskındır&amp;quot; uyarı metniyle işaretli</w:t>
+      </w:r>
+    </w:p>
+    <w:p>
+      <w:pPr>
+        <w:pStyle w:val="ListParagraph"/>
+        <w:numPr>
+          <w:ilvl w:val="0"/>
+          <w:numId w:val="1"/>
+        </w:numPr>
+        <w:spacing w:after="60"/>
+      </w:pPr>
+      <w:r>
+        <w:rPr>
+          <w:sz w:val="21"/>
+          <w:szCs w:val="21"/>
+        </w:rPr>
+        <w:t xml:space="preserve">Altında her marka adı (DilimBörek, Musluoğlu, ...) kendi başlığı bir
+accordion/disclosure satırı olarak listelenir — başlığa tıklanınca o
+markanın aç/kapa anahtarı + gün/tarih/saat alanları expand olur, tekrar
+tıklanınca kapanır; birden fazla marka aynı anda açık kalabilir</w:t>
+      </w:r>
+    </w:p>
+    <w:p>
+      <w:pPr>
+        <w:pStyle w:val="ListParagraph"/>
+        <w:numPr>
+          <w:ilvl w:val="0"/>
+          <w:numId w:val="1"/>
+        </w:numPr>
+        <w:spacing w:after="60"/>
+      </w:pPr>
+      <w:r>
+        <w:rPr>
+          <w:sz w:val="21"/>
+          <w:szCs w:val="21"/>
+        </w:rPr>
+        <w:t xml:space="preserve">Her markanın başlığında mevcut durumun özeti (örn. &amp;quot;Açık · Pzt-Cmt
+09:00-21:00&amp;quot; ya da &amp;quot;Kapalı&amp;quot;) — accordion kapalıyken bile durum tek
+bakışta görünür</w:t>
+      </w:r>
+    </w:p>
+    <w:p>
+      <w:pPr>
+        <w:spacing w:after="120"/>
+      </w:pPr>
+      <w:r>
+        <w:rPr>
+          <w:b/>
+          <w:bCs/>
+          <w:color w:val="1A2420"/>
+          <w:sz w:val="21"/>
+          <w:szCs w:val="21"/>
+        </w:rPr>
+        <w:t xml:space="preserve">Bayi tarafı etkisi:</w:t>
+      </w:r>
+    </w:p>
+    <w:p>
+      <w:pPr>
+        <w:pStyle w:val="ListParagraph"/>
+        <w:numPr>
+          <w:ilvl w:val="0"/>
+          <w:numId w:val="1"/>
+        </w:numPr>
+        <w:spacing w:after="60"/>
+      </w:pPr>
+      <w:r>
+        <w:rPr>
+          <w:sz w:val="21"/>
+          <w:szCs w:val="21"/>
+        </w:rPr>
+        <w:t xml:space="preserve">Pencere dışındaysa bayi kataloğunda o markanın &amp;quot;Sepete Ekle&amp;quot;/checkout
+akışı devre dışı bırakılır, nedeni açıklayan bir banner gösterilir (örn.
+&amp;quot;Bu marka için sipariş saatleri: 09:00-21:00, Pzt-Cmt — şu an sipariş
+alınmıyor&amp;quot;)</w:t>
+      </w:r>
+    </w:p>
+    <w:p>
+      <w:pPr>
+        <w:pStyle w:val="ListParagraph"/>
+        <w:numPr>
+          <w:ilvl w:val="0"/>
+          <w:numId w:val="1"/>
+        </w:numPr>
+        <w:spacing w:after="60"/>
+      </w:pPr>
+      <w:r>
+        <w:rPr>
+          <w:rFonts w:ascii="Consolas" w:cs="Consolas" w:eastAsia="Consolas" w:hAnsi="Consolas"/>
+          <w:color w:val="1F5F56"/>
+          <w:sz w:val="21"/>
+          <w:szCs w:val="21"/>
+        </w:rPr>
+        <w:t xml:space="preserve">createOrder</w:t>
+      </w:r>
+      <w:r>
+        <w:rPr>
+          <w:sz w:val="21"/>
+          <w:szCs w:val="21"/>
+        </w:rPr>
+        <w:t xml:space="preserve"> server action&amp;#39;ı aynı kontrolü sunucu tarafında tekrarlar —
+client&amp;#39;a güvenilmez (mevcut fiyat/KDV/sipariş katı doğrulama ilkesiyle
+aynı desen)</w:t>
+      </w:r>
+    </w:p>
+    <w:p>
+      <w:pPr>
+        <w:spacing w:after="120"/>
+      </w:pPr>
+      <w:r>
+        <w:rPr>
+          <w:b/>
+          <w:bCs/>
+          <w:color w:val="1A2420"/>
+          <w:sz w:val="21"/>
+          <w:szCs w:val="21"/>
+        </w:rPr>
+        <w:t xml:space="preserve">Çıkış kriteri —</w:t>
+      </w:r>
+      <w:r>
+        <w:rPr>
+          <w:color w:val="1A2420"/>
+          <w:sz w:val="21"/>
+          <w:szCs w:val="21"/>
+        </w:rPr>
+        <w:t xml:space="preserve"> admin bir markanın sipariş alımını tek tıkla kapatıp
+açabiliyor; markaya gün/tarih/saat kısıtlaması koyduğunda bayi panelinde
+pencere dışı anlarda o markaya sipariş verilemiyor; genel ayar bir
+markanın kendi ayarından daha sıkıysa genel ayar kazanıyor (örnekte: genel
+21:00 son saat, marka 22:00 son saat ayarlamış olsa bile sipariş 21:00&amp;#39;da
+kesiliyor) — hem UI hem sunucu tarafında doğrulandı.</w:t>
       </w:r>
     </w:p>
     <w:p>

</xml_diff>

<commit_message>
Roadmap: Faz 5'in eski kapsami kaldirildi, kullanici talebine gore yeniden tanimlanacak, oncelik sirasi eklendi
- Geri alinan Faz 5 (marka bazli satis/pasif bayi raporu, Excel export)
  roadmap.md'den tamamen kaldirildi; kullanicinin tek tek verecegi rapor
  talepleri geldikce kapsam yeniden yazilacak
- Kullanilmayan exceljs bagimliligi (Faz 5'ten kalan, kodda hic
  referansi yoktu) kaldirildi
- /admin/reports placeholder metni eski kapsamı varsaymayacak sekilde
  guncellendi
- Henuz yapilmamis fazlar icin oncelik sirasi eklendi: Faz 14 -> 11 ->
  9 -> 5 -> 8 -> 6 -> 7 (tamamlanmis fazlarin numaralari degismedi)

Co-Authored-By: Claude Sonnet 5 <noreply@anthropic.com>
</commit_message>
<xml_diff>
--- a/docs/output/roadmap.docx
+++ b/docs/output/roadmap.docx
@@ -216,12 +216,107 @@
           <w:sz w:val="21"/>
           <w:szCs w:val="21"/>
         </w:rPr>
-        <w:t xml:space="preserve">Yedi faz; her biri bir öncekinin üstüne çalışır durumda kalacak şekilde
-kurgulandı. Sanal POS entegrasyonu bilerek en sona bırakıldı — mock sağlayıcı
-arayüzü Faz 3&amp;#39;te kurulduğu için Faz 6 bir &amp;quot;değiştirme&amp;quot; işlemi, yeniden yazma
-değil. Aynı gerekçeyle bir ERP entegrasyonu ihtimali de en sona (Faz 7)
-bırakıldı; Faz 4&amp;#39;teki sipariş düzenleme/silme özelliği bu ihtimali gözeterek
+        <w:t xml:space="preserve">Her faz bir öncekinin üstüne çalışır durumda kalacak şekilde kurgulandı.
+Sanal POS entegrasyonu bilerek sona bırakıldı — mock sağlayıcı arayüzü
+Faz 3&amp;#39;te kurulduğu için Faz 6 bir &amp;quot;değiştirme&amp;quot; işlemi, yeniden yazma değil.
+Aynı gerekçeyle bir ERP entegrasyonu ihtimali de sona (Faz 7) bırakıldı;
+Faz 4&amp;#39;teki sipariş düzenleme/silme özelliği bu ihtimali gözeterek
 tasarlanacak (bkz. Faz 4 ve Faz 7 notları) ki ileride yeniden tasarlanmasın.</w:t>
+      </w:r>
+    </w:p>
+    <w:p>
+      <w:pPr>
+        <w:spacing w:after="120"/>
+      </w:pPr>
+      <w:r>
+        <w:rPr>
+          <w:color w:val="1A2420"/>
+          <w:sz w:val="21"/>
+          <w:szCs w:val="21"/>
+        </w:rPr>
+        <w:t xml:space="preserve">Faz numaraları </w:t>
+      </w:r>
+      <w:r>
+        <w:rPr>
+          <w:b/>
+          <w:bCs/>
+          <w:color w:val="1A2420"/>
+          <w:sz w:val="21"/>
+          <w:szCs w:val="21"/>
+        </w:rPr>
+        <w:t xml:space="preserve">tamamlanma sırasını</w:t>
+      </w:r>
+      <w:r>
+        <w:rPr>
+          <w:color w:val="1A2420"/>
+          <w:sz w:val="21"/>
+          <w:szCs w:val="21"/>
+        </w:rPr>
+        <w:t xml:space="preserve"> yansıtır (ör. Faz 12/13, henüz
+yapılmamış Faz 8/9/11&amp;#39;den önce tamamlandı); aşağıdaki sıra bu yüzden sabit
+bırakıldı — bitmiş bir fazın numarasını değiştirmek, o numarayla referans
+veren commit mesajlarıyla tutarsızlık yaratır. Henüz yapılmamış fazlar için
+</w:t>
+      </w:r>
+      <w:r>
+        <w:rPr>
+          <w:b/>
+          <w:bCs/>
+          <w:color w:val="1A2420"/>
+          <w:sz w:val="21"/>
+          <w:szCs w:val="21"/>
+        </w:rPr>
+        <w:t xml:space="preserve">uygulama önceliği</w:t>
+      </w:r>
+      <w:r>
+        <w:rPr>
+          <w:color w:val="1A2420"/>
+          <w:sz w:val="21"/>
+          <w:szCs w:val="21"/>
+        </w:rPr>
+        <w:t xml:space="preserve"> ise farklı ve ayrı bir sıralamadır:</w:t>
+      </w:r>
+    </w:p>
+    <w:p>
+      <w:pPr>
+        <w:pBdr>
+          <w:left w:val="single" w:color="A85A26" w:sz="18" w:space="10"/>
+        </w:pBdr>
+        <w:shd w:fill="EEF1EF" w:val="clear"/>
+        <w:spacing w:after="160" w:before="160"/>
+        <w:ind w:left="340"/>
+      </w:pPr>
+      <w:r>
+        <w:rPr>
+          <w:b/>
+          <w:bCs/>
+          <w:i/>
+          <w:iCs/>
+          <w:color w:val="4B5750"/>
+          <w:sz w:val="20"/>
+          <w:szCs w:val="20"/>
+        </w:rPr>
+        <w:t xml:space="preserve">Öncelik Sırası (henüz yapılmamış fazlar, etki/bağımlılık sırasına
+göre) —</w:t>
+      </w:r>
+      <w:r>
+        <w:rPr>
+          <w:i/>
+          <w:iCs/>
+          <w:color w:val="4B5750"/>
+          <w:sz w:val="20"/>
+          <w:szCs w:val="20"/>
+        </w:rPr>
+        <w:t xml:space="preserve"> Faz 14 → Faz 11 → Faz 9 → Faz 5 → Faz 8 → Faz 6 → Faz 7.
+Gerekçe: Faz 14 (sipariş zaman penceresi) ve Faz 11 (bayi denetimi) dışa
+bağımlı değil, küçük/izole kapsamlı ve canlı operasyonu doğrudan
+etkiliyor; Faz 9 operasyon ekibinin günlük ihtiyacı, sayfa iskeletleri
+hazır; Faz 5 kapsamı henüz tanımsız (yukarıdaki not), kullanıcıdan gelen
+rapor talepleri netleşince bu sırada ele alınacak; Faz 8 daha büyük/4 alt
+adımlı bir iş ama günlük sipariş akışını bloklamıyor; Faz 6 gerçek bir
+banka/PSP seçimi gibi dış bir karara bağlı; Faz 7 &amp;quot;hangi ERP&amp;#39;ye
+bağlanılacağı belli değil&amp;quot; diyen en büyük bilinmeyen/risk olduğu için en
+sonda. Bu sıra, projenin ilerleyişine göre güncellenebilir.</w:t>
       </w:r>
     </w:p>
     <w:p>
@@ -4065,7 +4160,7 @@
         <w:rPr>
           <w:color w:val="1A2420"/>
         </w:rPr>
-        <w:t xml:space="preserve">Faz 5 — Raporlama &amp;amp; Analitik ↩️ Geri Alındı</w:t>
+        <w:t xml:space="preserve">Faz 5 — Raporlama &amp;amp; Analitik (kapsam belirlenecek)</w:t>
       </w:r>
     </w:p>
     <w:p>
@@ -4087,7 +4182,7 @@
           <w:sz w:val="20"/>
           <w:szCs w:val="20"/>
         </w:rPr>
-        <w:t xml:space="preserve">Geri alım notu:</w:t>
+        <w:t xml:space="preserve">Not:</w:t>
       </w:r>
       <w:r>
         <w:rPr>
@@ -4097,8 +4192,8 @@
           <w:sz w:val="20"/>
           <w:szCs w:val="20"/>
         </w:rPr>
-        <w:t xml:space="preserve"> Aşağıdaki iş gerçekten tamamlanmış ve teslim
-edilmişti, ancak </w:t>
+        <w:t xml:space="preserve"> Bu fazın önceki tasarımı (marka bazlı satış raporu + pasif bayi
+raporu, Excel export) </w:t>
       </w:r>
       <w:r>
         <w:rPr>
@@ -4119,7 +4214,8 @@
           <w:sz w:val="20"/>
           <w:szCs w:val="20"/>
         </w:rPr>
-        <w:t xml:space="preserve"> commit&amp;#39;inde (</w:t>
+        <w:t xml:space="preserve"> commit&amp;#39;inde tamamen geri alındı
+(</w:t>
       </w:r>
       <w:r>
         <w:rPr>
@@ -4140,8 +4236,7 @@
           <w:sz w:val="20"/>
           <w:szCs w:val="20"/>
         </w:rPr>
-        <w:t xml:space="preserve">,
-</w:t>
+        <w:t xml:space="preserve">, </w:t>
       </w:r>
       <w:r>
         <w:rPr>
@@ -4184,7 +4279,7 @@
           <w:sz w:val="20"/>
           <w:szCs w:val="20"/>
         </w:rPr>
-        <w:t xml:space="preserve"> silinerek) </w:t>
+        <w:t xml:space="preserve"> silindi, </w:t>
       </w:r>
       <w:r>
         <w:rPr>
@@ -4206,10 +4301,11 @@
           <w:szCs w:val="20"/>
         </w:rPr>
         <w:t xml:space="preserve">
-yeniden &amp;quot;yapım aşamasında&amp;quot; yer tutucusuna çevrildi. Bu bölüm, ileride
-yeniden yapılırken referans olması için olduğu gibi bırakıldı — durum
-etiketi dışında içerik güncel koda değil, o zamanki teslimatın kaydına
-aittir.</w:t>
+&amp;quot;yapım aşamasında&amp;quot; yer tutucusuna döndü) ve bu kayıt artık referans
+amacıyla da tutulmuyor — o rapor tasarımı istenen kapsamla örtüşmüyordu.
+Faz kapsamı, kullanıcının &amp;quot;şu konuda bir rapor olsun&amp;quot; şeklinde tek tek
+vereceği somut rapor taleplerine göre ileride yeniden tanımlanacak;
+aşağıdaki hedef ve çıkış kriteri o zaman yazılacak.</w:t>
       </w:r>
     </w:p>
     <w:p>
@@ -4222,440 +4318,7 @@
           <w:sz w:val="21"/>
           <w:szCs w:val="21"/>
         </w:rPr>
-        <w:t xml:space="preserve">Hedef: Filtrelenebilir, dışa aktarılabilir raporlama motoru.</w:t>
-      </w:r>
-    </w:p>
-    <w:p>
-      <w:pPr>
-        <w:pStyle w:val="ListParagraph"/>
-        <w:numPr>
-          <w:ilvl w:val="0"/>
-          <w:numId w:val="1"/>
-        </w:numPr>
-        <w:spacing w:after="60"/>
-      </w:pPr>
-      <w:r>
-        <w:rPr>
-          <w:sz w:val="21"/>
-          <w:szCs w:val="21"/>
-        </w:rPr>
-        <w:t xml:space="preserve">Marka / tarih aralığı filtreleriyle dinamik tablo ve grafikler</w:t>
-      </w:r>
-      <w:r>
-        <w:rPr>
-          <w:sz w:val="21"/>
-          <w:szCs w:val="21"/>
-        </w:rPr>
-        <w:t xml:space="preserve"> — ✅
-Tamamlandı. Ürün bazlı filtre şimdilik kapsam dışı bırakıldı; bayi bazlı
-filtre de eklenmedi — bayiler raporlarda sadece gruplanmış çıktı (en çok
-sipariş/ciro yapan bayiler) olarak görünüyor, filtre girdisi değil.
-Admin genel bakış (</w:t>
-      </w:r>
-      <w:r>
-        <w:rPr>
-          <w:rFonts w:ascii="Consolas" w:cs="Consolas" w:eastAsia="Consolas" w:hAnsi="Consolas"/>
-          <w:color w:val="1F5F56"/>
-          <w:sz w:val="21"/>
-          <w:szCs w:val="21"/>
-        </w:rPr>
-        <w:t xml:space="preserve">src/app/admin/page.tsx</w:t>
-      </w:r>
-      <w:r>
-        <w:rPr>
-          <w:sz w:val="21"/>
-          <w:szCs w:val="21"/>
-        </w:rPr>
-        <w:t xml:space="preserve">) ve siparişler
-(</w:t>
-      </w:r>
-      <w:r>
-        <w:rPr>
-          <w:rFonts w:ascii="Consolas" w:cs="Consolas" w:eastAsia="Consolas" w:hAnsi="Consolas"/>
-          <w:color w:val="1F5F56"/>
-          <w:sz w:val="21"/>
-          <w:szCs w:val="21"/>
-        </w:rPr>
-        <w:t xml:space="preserve">src/app/admin/orders/</w:t>
-      </w:r>
-      <w:r>
-        <w:rPr>
-          <w:sz w:val="21"/>
-          <w:szCs w:val="21"/>
-        </w:rPr>
-        <w:t xml:space="preserve">) ekranlarına dönem filtresi
-(</w:t>
-      </w:r>
-      <w:r>
-        <w:rPr>
-          <w:rFonts w:ascii="Consolas" w:cs="Consolas" w:eastAsia="Consolas" w:hAnsi="Consolas"/>
-          <w:color w:val="1F5F56"/>
-          <w:sz w:val="21"/>
-          <w:szCs w:val="21"/>
-        </w:rPr>
-        <w:t xml:space="preserve">src/components/period-filter.tsx</w:t>
-      </w:r>
-      <w:r>
-        <w:rPr>
-          <w:sz w:val="21"/>
-          <w:szCs w:val="21"/>
-        </w:rPr>
-        <w:t xml:space="preserve">, </w:t>
-      </w:r>
-      <w:r>
-        <w:rPr>
-          <w:rFonts w:ascii="Consolas" w:cs="Consolas" w:eastAsia="Consolas" w:hAnsi="Consolas"/>
-          <w:color w:val="1F5F56"/>
-          <w:sz w:val="21"/>
-          <w:szCs w:val="21"/>
-        </w:rPr>
-        <w:t xml:space="preserve">src/lib/date-range.ts</w:t>
-      </w:r>
-      <w:r>
-        <w:rPr>
-          <w:sz w:val="21"/>
-          <w:szCs w:val="21"/>
-        </w:rPr>
-        <w:t xml:space="preserve">) ve marka
-filtresi (</w:t>
-      </w:r>
-      <w:r>
-        <w:rPr>
-          <w:rFonts w:ascii="Consolas" w:cs="Consolas" w:eastAsia="Consolas" w:hAnsi="Consolas"/>
-          <w:color w:val="1F5F56"/>
-          <w:sz w:val="21"/>
-          <w:szCs w:val="21"/>
-        </w:rPr>
-        <w:t xml:space="preserve">src/components/brand-filter-buttons.tsx</w:t>
-      </w:r>
-      <w:r>
-        <w:rPr>
-          <w:sz w:val="21"/>
-          <w:szCs w:val="21"/>
-        </w:rPr>
-        <w:t xml:space="preserve">,
-</w:t>
-      </w:r>
-      <w:r>
-        <w:rPr>
-          <w:rFonts w:ascii="Consolas" w:cs="Consolas" w:eastAsia="Consolas" w:hAnsi="Consolas"/>
-          <w:color w:val="1F5F56"/>
-          <w:sz w:val="21"/>
-          <w:szCs w:val="21"/>
-        </w:rPr>
-        <w:t xml:space="preserve">src/components/by-brand-toggle.tsx</w:t>
-      </w:r>
-      <w:r>
-        <w:rPr>
-          <w:sz w:val="21"/>
-          <w:szCs w:val="21"/>
-        </w:rPr>
-        <w:t xml:space="preserve">) eklendi; grafikler seçilen döneme
-göre saat/gün/hafta/ay bucket&amp;#39;larına bölünüyor
-(</w:t>
-      </w:r>
-      <w:r>
-        <w:rPr>
-          <w:rFonts w:ascii="Consolas" w:cs="Consolas" w:eastAsia="Consolas" w:hAnsi="Consolas"/>
-          <w:color w:val="1F5F56"/>
-          <w:sz w:val="21"/>
-          <w:szCs w:val="21"/>
-        </w:rPr>
-        <w:t xml:space="preserve">src/lib/chart-buckets.ts</w:t>
-      </w:r>
-      <w:r>
-        <w:rPr>
-          <w:sz w:val="21"/>
-          <w:szCs w:val="21"/>
-        </w:rPr>
-        <w:t xml:space="preserve">, </w:t>
-      </w:r>
-      <w:r>
-        <w:rPr>
-          <w:rFonts w:ascii="Consolas" w:cs="Consolas" w:eastAsia="Consolas" w:hAnsi="Consolas"/>
-          <w:color w:val="1F5F56"/>
-          <w:sz w:val="21"/>
-          <w:szCs w:val="21"/>
-        </w:rPr>
-        <w:t xml:space="preserve">src/components/grouped-bar-chart.tsx</w:t>
-      </w:r>
-      <w:r>
-        <w:rPr>
-          <w:sz w:val="21"/>
-          <w:szCs w:val="21"/>
-        </w:rPr>
-        <w:t xml:space="preserve">).</w:t>
-      </w:r>
-    </w:p>
-    <w:p>
-      <w:pPr>
-        <w:pStyle w:val="ListParagraph"/>
-        <w:numPr>
-          <w:ilvl w:val="0"/>
-          <w:numId w:val="1"/>
-        </w:numPr>
-        <w:spacing w:after="60"/>
-      </w:pPr>
-      <w:r>
-        <w:rPr>
-          <w:sz w:val="21"/>
-          <w:szCs w:val="21"/>
-        </w:rPr>
-        <w:t xml:space="preserve">Excel (.xlsx) export</w:t>
-      </w:r>
-      <w:r>
-        <w:rPr>
-          <w:sz w:val="21"/>
-          <w:szCs w:val="21"/>
-        </w:rPr>
-        <w:t xml:space="preserve"> — ✅ Tamamlandı, sadece Excel ile — CSV şimdilik
-kapsam dışı, PDF ise ileride sayısı az birkaç belirli rapor için ayrıca
-ele alınacak. Yeni </w:t>
-      </w:r>
-      <w:r>
-        <w:rPr>
-          <w:rFonts w:ascii="Consolas" w:cs="Consolas" w:eastAsia="Consolas" w:hAnsi="Consolas"/>
-          <w:color w:val="1F5F56"/>
-          <w:sz w:val="21"/>
-          <w:szCs w:val="21"/>
-        </w:rPr>
-        <w:t xml:space="preserve">/admin/reports</w:t>
-      </w:r>
-      <w:r>
-        <w:rPr>
-          <w:sz w:val="21"/>
-          <w:szCs w:val="21"/>
-        </w:rPr>
-        <w:t xml:space="preserve"> sayfası (</w:t>
-      </w:r>
-      <w:r>
-        <w:rPr>
-          <w:rFonts w:ascii="Consolas" w:cs="Consolas" w:eastAsia="Consolas" w:hAnsi="Consolas"/>
-          <w:color w:val="1F5F56"/>
-          <w:sz w:val="21"/>
-          <w:szCs w:val="21"/>
-        </w:rPr>
-        <w:t xml:space="preserve">src/app/admin/reports/</w:t>
-      </w:r>
-      <w:r>
-        <w:rPr>
-          <w:sz w:val="21"/>
-          <w:szCs w:val="21"/>
-        </w:rPr>
-        <w:t xml:space="preserve">)
-altında marka bazlı satış raporu ve pasif bayi raporu için birer
-&amp;quot;Excel&amp;#39;e Aktar&amp;quot; butonu; indirme, seçili filtrelerle aynı sorguyu tekrar
-çalıştırıp </w:t>
-      </w:r>
-      <w:r>
-        <w:rPr>
-          <w:rFonts w:ascii="Consolas" w:cs="Consolas" w:eastAsia="Consolas" w:hAnsi="Consolas"/>
-          <w:color w:val="1F5F56"/>
-          <w:sz w:val="21"/>
-          <w:szCs w:val="21"/>
-        </w:rPr>
-        <w:t xml:space="preserve">exceljs</w:t>
-      </w:r>
-      <w:r>
-        <w:rPr>
-          <w:sz w:val="21"/>
-          <w:szCs w:val="21"/>
-        </w:rPr>
-        <w:t xml:space="preserve"> ile </w:t>
-      </w:r>
-      <w:r>
-        <w:rPr>
-          <w:rFonts w:ascii="Consolas" w:cs="Consolas" w:eastAsia="Consolas" w:hAnsi="Consolas"/>
-          <w:color w:val="1F5F56"/>
-          <w:sz w:val="21"/>
-          <w:szCs w:val="21"/>
-        </w:rPr>
-        <w:t xml:space="preserve">.xlsx</w:t>
-      </w:r>
-      <w:r>
-        <w:rPr>
-          <w:sz w:val="21"/>
-          <w:szCs w:val="21"/>
-        </w:rPr>
-        <w:t xml:space="preserve"> üreten bir route handler&amp;#39;dan geçiyor
-(</w:t>
-      </w:r>
-      <w:r>
-        <w:rPr>
-          <w:rFonts w:ascii="Consolas" w:cs="Consolas" w:eastAsia="Consolas" w:hAnsi="Consolas"/>
-          <w:color w:val="1F5F56"/>
-          <w:sz w:val="21"/>
-          <w:szCs w:val="21"/>
-        </w:rPr>
-        <w:t xml:space="preserve">src/app/admin/reports/export/route.ts</w:t>
-      </w:r>
-      <w:r>
-        <w:rPr>
-          <w:sz w:val="21"/>
-          <w:szCs w:val="21"/>
-        </w:rPr>
-        <w:t xml:space="preserve">). Rapor sorguları
-</w:t>
-      </w:r>
-      <w:r>
-        <w:rPr>
-          <w:rFonts w:ascii="Consolas" w:cs="Consolas" w:eastAsia="Consolas" w:hAnsi="Consolas"/>
-          <w:color w:val="1F5F56"/>
-          <w:sz w:val="21"/>
-          <w:szCs w:val="21"/>
-        </w:rPr>
-        <w:t xml:space="preserve">src/lib/reports.ts</w:t>
-      </w:r>
-      <w:r>
-        <w:rPr>
-          <w:sz w:val="21"/>
-          <w:szCs w:val="21"/>
-        </w:rPr>
-        <w:t xml:space="preserve">&amp;#39;te toplandı ki sayfa ve export handler&amp;#39;ı aynı
-mantığı kullansın.</w:t>
-      </w:r>
-    </w:p>
-    <w:p>
-      <w:pPr>
-        <w:pStyle w:val="ListParagraph"/>
-        <w:numPr>
-          <w:ilvl w:val="0"/>
-          <w:numId w:val="1"/>
-        </w:numPr>
-        <w:spacing w:after="60"/>
-      </w:pPr>
-      <w:r>
-        <w:rPr>
-          <w:sz w:val="21"/>
-          <w:szCs w:val="21"/>
-        </w:rPr>
-        <w:t xml:space="preserve">Sipariş vermeyen bayi raporu</w:t>
-      </w:r>
-      <w:r>
-        <w:rPr>
-          <w:sz w:val="21"/>
-          <w:szCs w:val="21"/>
-        </w:rPr>
-        <w:t xml:space="preserve"> — ✅ Tamamlandı — pasif bayi takibi için
-Payna Grup Portal karşılaştırmasından gelen ek kapsam. </w:t>
-      </w:r>
-      <w:r>
-        <w:rPr>
-          <w:rFonts w:ascii="Consolas" w:cs="Consolas" w:eastAsia="Consolas" w:hAnsi="Consolas"/>
-          <w:color w:val="1F5F56"/>
-          <w:sz w:val="21"/>
-          <w:szCs w:val="21"/>
-        </w:rPr>
-        <w:t xml:space="preserve">/admin/reports</w:t>
-      </w:r>
-      <w:r>
-        <w:rPr>
-          <w:sz w:val="21"/>
-          <w:szCs w:val="21"/>
-        </w:rPr>
-        <w:t xml:space="preserve">
-sayfasında Bugün / Dün / 1 Hafta / 2 Hafta (en sıkı uç) eşiği seçilebiliyor
-(</w:t>
-      </w:r>
-      <w:r>
-        <w:rPr>
-          <w:rFonts w:ascii="Consolas" w:cs="Consolas" w:eastAsia="Consolas" w:hAnsi="Consolas"/>
-          <w:color w:val="1F5F56"/>
-          <w:sz w:val="21"/>
-          <w:szCs w:val="21"/>
-        </w:rPr>
-        <w:t xml:space="preserve">src/lib/inactive-threshold.ts</w:t>
-      </w:r>
-      <w:r>
-        <w:rPr>
-          <w:sz w:val="21"/>
-          <w:szCs w:val="21"/>
-        </w:rPr>
-        <w:t xml:space="preserve">, </w:t>
-      </w:r>
-      <w:r>
-        <w:rPr>
-          <w:rFonts w:ascii="Consolas" w:cs="Consolas" w:eastAsia="Consolas" w:hAnsi="Consolas"/>
-          <w:color w:val="1F5F56"/>
-          <w:sz w:val="21"/>
-          <w:szCs w:val="21"/>
-        </w:rPr>
-        <w:t xml:space="preserve">src/app/admin/reports/reports-filters.tsx</w:t>
-      </w:r>
-      <w:r>
-        <w:rPr>
-          <w:sz w:val="21"/>
-          <w:szCs w:val="21"/>
-        </w:rPr>
-        <w:t xml:space="preserve">);
-hiç sipariş vermemiş ya da eşik gün sayısından uzun süredir sipariş vermemiş bayiler, hangi
-marka(lar)a bağlı oldukları ve son sipariş tarihiyle birlikte listeleniyor
-(</w:t>
-      </w:r>
-      <w:r>
-        <w:rPr>
-          <w:rFonts w:ascii="Consolas" w:cs="Consolas" w:eastAsia="Consolas" w:hAnsi="Consolas"/>
-          <w:color w:val="1F5F56"/>
-          <w:sz w:val="21"/>
-          <w:szCs w:val="21"/>
-        </w:rPr>
-        <w:t xml:space="preserve">getInactiveDealersReport</w:t>
-      </w:r>
-      <w:r>
-        <w:rPr>
-          <w:sz w:val="21"/>
-          <w:szCs w:val="21"/>
-        </w:rPr>
-        <w:t xml:space="preserve">, </w:t>
-      </w:r>
-      <w:r>
-        <w:rPr>
-          <w:rFonts w:ascii="Consolas" w:cs="Consolas" w:eastAsia="Consolas" w:hAnsi="Consolas"/>
-          <w:color w:val="1F5F56"/>
-          <w:sz w:val="21"/>
-          <w:szCs w:val="21"/>
-        </w:rPr>
-        <w:t xml:space="preserve">src/lib/reports.ts</w:t>
-      </w:r>
-      <w:r>
-        <w:rPr>
-          <w:sz w:val="21"/>
-          <w:szCs w:val="21"/>
-        </w:rPr>
-        <w:t xml:space="preserve">). İptal/red edilen
-siparişler &amp;quot;sipariş verdi&amp;quot; sayılmıyor — genel bakış istatistikleriyle
-aynı kural (</w:t>
-      </w:r>
-      <w:r>
-        <w:rPr>
-          <w:rFonts w:ascii="Consolas" w:cs="Consolas" w:eastAsia="Consolas" w:hAnsi="Consolas"/>
-          <w:color w:val="1F5F56"/>
-          <w:sz w:val="21"/>
-          <w:szCs w:val="21"/>
-        </w:rPr>
-        <w:t xml:space="preserve">EXCLUDED_FROM_STATS_STATUSES</w:t>
-      </w:r>
-      <w:r>
-        <w:rPr>
-          <w:sz w:val="21"/>
-          <w:szCs w:val="21"/>
-        </w:rPr>
-        <w:t xml:space="preserve">).</w:t>
-      </w:r>
-    </w:p>
-    <w:p>
-      <w:pPr>
-        <w:spacing w:after="120"/>
-      </w:pPr>
-      <w:r>
-        <w:rPr>
-          <w:color w:val="1A2420"/>
-          <w:sz w:val="21"/>
-          <w:szCs w:val="21"/>
-        </w:rPr>
-        <w:t xml:space="preserve">Kapsam dışı bırakıldı: büyüyen veri hacmi için özet tablo / materialized
-view stratejisi — genel bakış grafikleri mevcut hacimde yeterli
-performans sağlıyor, ileride ihtiyaç olursa ayrı bir işe konu edilecek.</w:t>
+        <w:t xml:space="preserve">Hedef: TBD — kullanıcıdan gelecek rapor taleplerine göre belirlenecek.</w:t>
       </w:r>
     </w:p>
     <w:p>
@@ -4678,8 +4341,7 @@
           <w:sz w:val="21"/>
           <w:szCs w:val="21"/>
         </w:rPr>
-        <w:t xml:space="preserve"> bir firma yetkilisi son üç ayın marka bazlı satışlarını
-filtreleyip Excel&amp;#39;e aktarabiliyor.</w:t>
+        <w:t xml:space="preserve"> TBD.</w:t>
       </w:r>
     </w:p>
     <w:p>

</xml_diff>

<commit_message>
"Kapida Odeme" terimini sistem genelinde "Merkezde Odeme" olarak degistir
Gorunen tum metinler guncellendi: odeme yontemi etiketi
(PAYMENT_METHOD_LABELS), bayi/checkout uyari mesajlari, cari limit
yardimci metinleri, tahsil edilemedi defter notu, roadmap.md ve
product-overview.md. Ic kod tarafindaki enum degeri (cash_on_delivery)
kasitli olarak degismedi - bu saf bir goruntu/terminoloji degisikligi,
veritabani semasini etkilemiyor.

Co-Authored-By: Claude Sonnet 5 <noreply@anthropic.com>
</commit_message>
<xml_diff>
--- a/docs/output/roadmap.docx
+++ b/docs/output/roadmap.docx
@@ -180,7 +180,7 @@
           <w:sz w:val="21"/>
           <w:szCs w:val="21"/>
         </w:rPr>
-        <w:t xml:space="preserve"> — Cari · Nakit/Kapıda Ödeme · Sanal POS (mock)</w:t>
+        <w:t xml:space="preserve"> — Cari · Nakit/Merkezde Ödeme · Sanal POS (mock)</w:t>
       </w:r>
     </w:p>
     <w:p>
@@ -1572,7 +1572,7 @@
           <w:sz w:val="21"/>
           <w:szCs w:val="21"/>
         </w:rPr>
-        <w:t xml:space="preserve"> cari/kapıda ödeme
+        <w:t xml:space="preserve"> cari/merkezde ödeme
 siparişlerini </w:t>
       </w:r>
       <w:r>
@@ -1955,7 +1955,7 @@
           <w:sz w:val="21"/>
           <w:szCs w:val="21"/>
         </w:rPr>
-        <w:t xml:space="preserve"> üç ödeme tipiyle de (cari, kapıda ödeme, sanal POS
+        <w:t xml:space="preserve"> üç ödeme tipiyle de (cari, merkezde ödeme, sanal POS
 başarılı/başarısız) uçtan uca sipariş oluşturulabiliyor; admin panelde durum
 geçişleri izlenebiliyor. Tarayıcıda doğrulandı.</w:t>
       </w:r>
@@ -2414,7 +2414,7 @@
           <w:sz w:val="21"/>
           <w:szCs w:val="21"/>
         </w:rPr>
-        <w:t xml:space="preserve">), kapıda ödemesi tahsil
+        <w:t xml:space="preserve">), merkezde ödemesi tahsil
 edilemeyen siparişin (</w:t>
       </w:r>
       <w:r>
@@ -5630,7 +5630,7 @@
         </w:rPr>
         <w:t xml:space="preserve">) — günlük
 kapanış özeti/mutabakat: o gün alınan siparişlerin ödeme tipine göre
-(cari/kapıda ödeme/sanal POS) dökümü, tahsil edilen/edilemeyen
+(cari/merkezde ödeme/sanal POS) dökümü, tahsil edilen/edilemeyen
 tutarlar. Bayi tarafında yalnızca kendi siparişleri. Kapsam (bir
 &amp;quot;günü kapatma&amp;quot; aksiyonu olup olmayacağı) uygulama aşamasında
 netleşecek</w:t>
@@ -10987,7 +10987,7 @@
           <w:sz w:val="21"/>
           <w:szCs w:val="21"/>
         </w:rPr>
-        <w:t xml:space="preserve">Nakit / Kapıda Ödeme:</w:t>
+        <w:t xml:space="preserve">Nakit / Merkezde Ödeme:</w:t>
       </w:r>
       <w:r>
         <w:rPr>

</xml_diff>